<commit_message>
V3R mirror 2026-03-19 21:04 UTC
</commit_message>
<xml_diff>
--- a/conduit/logs/session_sync_log.docx
+++ b/conduit/logs/session_sync_log.docx
@@ -21595,6 +21595,4357 @@
           <w:rtl w:val="0"/>
         </w:rPr>
         <w:t xml:space="preserve"> 2 0 2 6 / 0 3 / 1 9   0 6 : 4 8 : 5 0   I N F O     :   </w:t>
+        <w:br w:type="textWrapping"/>
+        <w:t xml:space="preserve"> </w:t>
+      </w:r>
+    </w:p>
+    <w:p>
+      <w:pPr>
+        <w:keepNext w:val="0"/>
+        <w:keepLines w:val="0"/>
+        <w:pageBreakBefore w:val="0"/>
+        <w:widowControl w:val="0"/>
+        <w:pBdr>
+          <w:top w:space="0" w:sz="0" w:val="nil"/>
+          <w:left w:space="0" w:sz="0" w:val="nil"/>
+          <w:bottom w:space="0" w:sz="0" w:val="nil"/>
+          <w:right w:space="0" w:sz="0" w:val="nil"/>
+          <w:between w:space="0" w:sz="0" w:val="nil"/>
+        </w:pBdr>
+        <w:shd w:fill="auto" w:val="clear"/>
+        <w:spacing w:after="0" w:before="0" w:line="276" w:lineRule="auto"/>
+        <w:ind w:left="0" w:right="0" w:firstLine="0"/>
+        <w:jc w:val="left"/>
+        <w:rPr/>
+      </w:pPr>
+      <w:r>
+        <w:rPr>
+          <w:rtl w:val="0"/>
+        </w:rPr>
+        <w:t xml:space="preserve"> T r a n s f e r r e d :       </w:t>
+        <w:tab/>
+        <w:t xml:space="preserve">                     0   B   /   0   B ,   - ,   0   B / s ,   E T A   - </w:t>
+        <w:br w:type="textWrapping"/>
+        <w:t xml:space="preserve"> </w:t>
+      </w:r>
+    </w:p>
+    <w:p>
+      <w:pPr>
+        <w:keepNext w:val="0"/>
+        <w:keepLines w:val="0"/>
+        <w:pageBreakBefore w:val="0"/>
+        <w:widowControl w:val="0"/>
+        <w:pBdr>
+          <w:top w:space="0" w:sz="0" w:val="nil"/>
+          <w:left w:space="0" w:sz="0" w:val="nil"/>
+          <w:bottom w:space="0" w:sz="0" w:val="nil"/>
+          <w:right w:space="0" w:sz="0" w:val="nil"/>
+          <w:between w:space="0" w:sz="0" w:val="nil"/>
+        </w:pBdr>
+        <w:shd w:fill="auto" w:val="clear"/>
+        <w:spacing w:after="0" w:before="0" w:line="276" w:lineRule="auto"/>
+        <w:ind w:left="0" w:right="0" w:firstLine="0"/>
+        <w:jc w:val="left"/>
+        <w:rPr/>
+      </w:pPr>
+      <w:r>
+        <w:rPr>
+          <w:rtl w:val="0"/>
+        </w:rPr>
+        <w:t xml:space="preserve"> C h e c k s :                                   2   /   2 ,   1 0 0 % ,   L i s t e d   6 </w:t>
+        <w:br w:type="textWrapping"/>
+        <w:t xml:space="preserve"> </w:t>
+      </w:r>
+    </w:p>
+    <w:p>
+      <w:pPr>
+        <w:keepNext w:val="0"/>
+        <w:keepLines w:val="0"/>
+        <w:pageBreakBefore w:val="0"/>
+        <w:widowControl w:val="0"/>
+        <w:pBdr>
+          <w:top w:space="0" w:sz="0" w:val="nil"/>
+          <w:left w:space="0" w:sz="0" w:val="nil"/>
+          <w:bottom w:space="0" w:sz="0" w:val="nil"/>
+          <w:right w:space="0" w:sz="0" w:val="nil"/>
+          <w:between w:space="0" w:sz="0" w:val="nil"/>
+        </w:pBdr>
+        <w:shd w:fill="auto" w:val="clear"/>
+        <w:spacing w:after="0" w:before="0" w:line="276" w:lineRule="auto"/>
+        <w:ind w:left="0" w:right="0" w:firstLine="0"/>
+        <w:jc w:val="left"/>
+        <w:rPr/>
+      </w:pPr>
+      <w:r>
+        <w:rPr>
+          <w:rtl w:val="0"/>
+        </w:rPr>
+        <w:t xml:space="preserve"> E l a p s e d   t i m e :                   0 . 3 s </w:t>
+        <w:br w:type="textWrapping"/>
+        <w:t xml:space="preserve"> </w:t>
+      </w:r>
+    </w:p>
+    <w:p>
+      <w:pPr>
+        <w:keepNext w:val="0"/>
+        <w:keepLines w:val="0"/>
+        <w:pageBreakBefore w:val="0"/>
+        <w:widowControl w:val="0"/>
+        <w:pBdr>
+          <w:top w:space="0" w:sz="0" w:val="nil"/>
+          <w:left w:space="0" w:sz="0" w:val="nil"/>
+          <w:bottom w:space="0" w:sz="0" w:val="nil"/>
+          <w:right w:space="0" w:sz="0" w:val="nil"/>
+          <w:between w:space="0" w:sz="0" w:val="nil"/>
+        </w:pBdr>
+        <w:shd w:fill="auto" w:val="clear"/>
+        <w:spacing w:after="0" w:before="0" w:line="276" w:lineRule="auto"/>
+        <w:ind w:left="0" w:right="0" w:firstLine="0"/>
+        <w:jc w:val="left"/>
+        <w:rPr/>
+      </w:pPr>
+      <w:r>
+        <w:rPr>
+          <w:rtl w:val="0"/>
+        </w:rPr>
+        <w:t xml:space="preserve"> </w:t>
+        <w:br w:type="textWrapping"/>
+        <w:t xml:space="preserve"> </w:t>
+      </w:r>
+    </w:p>
+    <w:p>
+      <w:pPr>
+        <w:keepNext w:val="0"/>
+        <w:keepLines w:val="0"/>
+        <w:pageBreakBefore w:val="0"/>
+        <w:widowControl w:val="0"/>
+        <w:pBdr>
+          <w:top w:space="0" w:sz="0" w:val="nil"/>
+          <w:left w:space="0" w:sz="0" w:val="nil"/>
+          <w:bottom w:space="0" w:sz="0" w:val="nil"/>
+          <w:right w:space="0" w:sz="0" w:val="nil"/>
+          <w:between w:space="0" w:sz="0" w:val="nil"/>
+        </w:pBdr>
+        <w:shd w:fill="auto" w:val="clear"/>
+        <w:spacing w:after="0" w:before="0" w:line="276" w:lineRule="auto"/>
+        <w:ind w:left="0" w:right="0" w:firstLine="0"/>
+        <w:jc w:val="left"/>
+        <w:rPr/>
+      </w:pPr>
+      <w:r>
+        <w:rPr>
+          <w:rtl w:val="0"/>
+        </w:rPr>
+        <w:t xml:space="preserve"> [Stage 6] Frameworks sync complete</w:t>
+        <w:br w:type="textWrapping"/>
+      </w:r>
+    </w:p>
+    <w:p>
+      <w:pPr>
+        <w:keepNext w:val="0"/>
+        <w:keepLines w:val="0"/>
+        <w:pageBreakBefore w:val="0"/>
+        <w:widowControl w:val="0"/>
+        <w:pBdr>
+          <w:top w:space="0" w:sz="0" w:val="nil"/>
+          <w:left w:space="0" w:sz="0" w:val="nil"/>
+          <w:bottom w:space="0" w:sz="0" w:val="nil"/>
+          <w:right w:space="0" w:sz="0" w:val="nil"/>
+          <w:between w:space="0" w:sz="0" w:val="nil"/>
+        </w:pBdr>
+        <w:shd w:fill="auto" w:val="clear"/>
+        <w:spacing w:after="0" w:before="0" w:line="276" w:lineRule="auto"/>
+        <w:ind w:left="0" w:right="0" w:firstLine="0"/>
+        <w:jc w:val="left"/>
+        <w:rPr/>
+      </w:pPr>
+      <w:r>
+        <w:rPr>
+          <w:rtl w:val="0"/>
+        </w:rPr>
+        <w:t xml:space="preserve">r c l o n e . e x e   :   2 0 2 6 / 0 3 / 1 9   0 6 : 4 8 : 5 5   I N F O     :   l o g s / s e s s i o n _ s y n c _ l o g . t x t :   C o p i e d   ( r e p l a c e d   e x i s t i n g ) </w:t>
+        <w:br w:type="textWrapping"/>
+        <w:t xml:space="preserve"> </w:t>
+      </w:r>
+    </w:p>
+    <w:p>
+      <w:pPr>
+        <w:keepNext w:val="0"/>
+        <w:keepLines w:val="0"/>
+        <w:pageBreakBefore w:val="0"/>
+        <w:widowControl w:val="0"/>
+        <w:pBdr>
+          <w:top w:space="0" w:sz="0" w:val="nil"/>
+          <w:left w:space="0" w:sz="0" w:val="nil"/>
+          <w:bottom w:space="0" w:sz="0" w:val="nil"/>
+          <w:right w:space="0" w:sz="0" w:val="nil"/>
+          <w:between w:space="0" w:sz="0" w:val="nil"/>
+        </w:pBdr>
+        <w:shd w:fill="auto" w:val="clear"/>
+        <w:spacing w:after="0" w:before="0" w:line="276" w:lineRule="auto"/>
+        <w:ind w:left="0" w:right="0" w:firstLine="0"/>
+        <w:jc w:val="left"/>
+        <w:rPr/>
+      </w:pPr>
+      <w:r>
+        <w:rPr>
+          <w:rtl w:val="0"/>
+        </w:rPr>
+        <w:t xml:space="preserve"> A t   C : \ U s e r s \ S o u r c e - 1 \ D e s k t o p \ r c l o n e \ c o n d u i t _ s y n c . p s 1 : 5 5   c h a r : 1 </w:t>
+        <w:br w:type="textWrapping"/>
+        <w:t xml:space="preserve"> </w:t>
+      </w:r>
+    </w:p>
+    <w:p>
+      <w:pPr>
+        <w:keepNext w:val="0"/>
+        <w:keepLines w:val="0"/>
+        <w:pageBreakBefore w:val="0"/>
+        <w:widowControl w:val="0"/>
+        <w:pBdr>
+          <w:top w:space="0" w:sz="0" w:val="nil"/>
+          <w:left w:space="0" w:sz="0" w:val="nil"/>
+          <w:bottom w:space="0" w:sz="0" w:val="nil"/>
+          <w:right w:space="0" w:sz="0" w:val="nil"/>
+          <w:between w:space="0" w:sz="0" w:val="nil"/>
+        </w:pBdr>
+        <w:shd w:fill="auto" w:val="clear"/>
+        <w:spacing w:after="0" w:before="0" w:line="276" w:lineRule="auto"/>
+        <w:ind w:left="0" w:right="0" w:firstLine="0"/>
+        <w:jc w:val="left"/>
+        <w:rPr/>
+      </w:pPr>
+      <w:r>
+        <w:rPr>
+          <w:rtl w:val="0"/>
+        </w:rPr>
+        <w:t xml:space="preserve"> +   &amp;   $ r c l o n e   c o p y   - - f i l t e r - f r o m   $ f i l t e r   $ s o u r c e C o n d u i t   g d r i v e : V 3 R / c o n d u i   . . . </w:t>
+        <w:br w:type="textWrapping"/>
+        <w:t xml:space="preserve"> </w:t>
+      </w:r>
+    </w:p>
+    <w:p>
+      <w:pPr>
+        <w:keepNext w:val="0"/>
+        <w:keepLines w:val="0"/>
+        <w:pageBreakBefore w:val="0"/>
+        <w:widowControl w:val="0"/>
+        <w:pBdr>
+          <w:top w:space="0" w:sz="0" w:val="nil"/>
+          <w:left w:space="0" w:sz="0" w:val="nil"/>
+          <w:bottom w:space="0" w:sz="0" w:val="nil"/>
+          <w:right w:space="0" w:sz="0" w:val="nil"/>
+          <w:between w:space="0" w:sz="0" w:val="nil"/>
+        </w:pBdr>
+        <w:shd w:fill="auto" w:val="clear"/>
+        <w:spacing w:after="0" w:before="0" w:line="276" w:lineRule="auto"/>
+        <w:ind w:left="0" w:right="0" w:firstLine="0"/>
+        <w:jc w:val="left"/>
+        <w:rPr/>
+      </w:pPr>
+      <w:r>
+        <w:rPr>
+          <w:rtl w:val="0"/>
+        </w:rPr>
+        <w:t xml:space="preserve"> +   ~ ~ ~ ~ ~ ~ ~ ~ ~ ~ ~ ~ ~ ~ ~ ~ ~ ~ ~ ~ ~ ~ ~ ~ ~ ~ ~ ~ ~ ~ ~ ~ ~ ~ ~ ~ ~ ~ ~ ~ ~ ~ ~ ~ ~ ~ ~ ~ ~ ~ ~ ~ ~ ~ ~ ~ ~ ~ ~ ~ ~ ~ ~ ~ ~ ~ ~ ~ ~ </w:t>
+        <w:br w:type="textWrapping"/>
+        <w:t xml:space="preserve"> </w:t>
+      </w:r>
+    </w:p>
+    <w:p>
+      <w:pPr>
+        <w:keepNext w:val="0"/>
+        <w:keepLines w:val="0"/>
+        <w:pageBreakBefore w:val="0"/>
+        <w:widowControl w:val="0"/>
+        <w:pBdr>
+          <w:top w:space="0" w:sz="0" w:val="nil"/>
+          <w:left w:space="0" w:sz="0" w:val="nil"/>
+          <w:bottom w:space="0" w:sz="0" w:val="nil"/>
+          <w:right w:space="0" w:sz="0" w:val="nil"/>
+          <w:between w:space="0" w:sz="0" w:val="nil"/>
+        </w:pBdr>
+        <w:shd w:fill="auto" w:val="clear"/>
+        <w:spacing w:after="0" w:before="0" w:line="276" w:lineRule="auto"/>
+        <w:ind w:left="0" w:right="0" w:firstLine="0"/>
+        <w:jc w:val="left"/>
+        <w:rPr/>
+      </w:pPr>
+      <w:r>
+        <w:rPr>
+          <w:rtl w:val="0"/>
+        </w:rPr>
+        <w:t xml:space="preserve">         +   C a t e g o r y I n f o                     :   N o t S p e c i f i e d :   ( 2 0 2 6 / 0 3 / 1 9   0 6 : 4 . . . l a c e d   e x i s t i n g ) : S t r i n g )   [ ] ,   R e m o t e E x c e p t i o n </w:t>
+        <w:br w:type="textWrapping"/>
+        <w:t xml:space="preserve"> </w:t>
+      </w:r>
+    </w:p>
+    <w:p>
+      <w:pPr>
+        <w:keepNext w:val="0"/>
+        <w:keepLines w:val="0"/>
+        <w:pageBreakBefore w:val="0"/>
+        <w:widowControl w:val="0"/>
+        <w:pBdr>
+          <w:top w:space="0" w:sz="0" w:val="nil"/>
+          <w:left w:space="0" w:sz="0" w:val="nil"/>
+          <w:bottom w:space="0" w:sz="0" w:val="nil"/>
+          <w:right w:space="0" w:sz="0" w:val="nil"/>
+          <w:between w:space="0" w:sz="0" w:val="nil"/>
+        </w:pBdr>
+        <w:shd w:fill="auto" w:val="clear"/>
+        <w:spacing w:after="0" w:before="0" w:line="276" w:lineRule="auto"/>
+        <w:ind w:left="0" w:right="0" w:firstLine="0"/>
+        <w:jc w:val="left"/>
+        <w:rPr/>
+      </w:pPr>
+      <w:r>
+        <w:rPr>
+          <w:rtl w:val="0"/>
+        </w:rPr>
+        <w:t xml:space="preserve">         +   F u l l y Q u a l i f i e d E r r o r I d   :   N a t i v e C o m m a n d E r r o r </w:t>
+        <w:br w:type="textWrapping"/>
+        <w:t xml:space="preserve"> </w:t>
+      </w:r>
+    </w:p>
+    <w:p>
+      <w:pPr>
+        <w:keepNext w:val="0"/>
+        <w:keepLines w:val="0"/>
+        <w:pageBreakBefore w:val="0"/>
+        <w:widowControl w:val="0"/>
+        <w:pBdr>
+          <w:top w:space="0" w:sz="0" w:val="nil"/>
+          <w:left w:space="0" w:sz="0" w:val="nil"/>
+          <w:bottom w:space="0" w:sz="0" w:val="nil"/>
+          <w:right w:space="0" w:sz="0" w:val="nil"/>
+          <w:between w:space="0" w:sz="0" w:val="nil"/>
+        </w:pBdr>
+        <w:shd w:fill="auto" w:val="clear"/>
+        <w:spacing w:after="0" w:before="0" w:line="276" w:lineRule="auto"/>
+        <w:ind w:left="0" w:right="0" w:firstLine="0"/>
+        <w:jc w:val="left"/>
+        <w:rPr/>
+      </w:pPr>
+      <w:r>
+        <w:rPr>
+          <w:rtl w:val="0"/>
+        </w:rPr>
+        <w:t xml:space="preserve">   </w:t>
+        <w:br w:type="textWrapping"/>
+        <w:t xml:space="preserve"> </w:t>
+      </w:r>
+    </w:p>
+    <w:p>
+      <w:pPr>
+        <w:keepNext w:val="0"/>
+        <w:keepLines w:val="0"/>
+        <w:pageBreakBefore w:val="0"/>
+        <w:widowControl w:val="0"/>
+        <w:pBdr>
+          <w:top w:space="0" w:sz="0" w:val="nil"/>
+          <w:left w:space="0" w:sz="0" w:val="nil"/>
+          <w:bottom w:space="0" w:sz="0" w:val="nil"/>
+          <w:right w:space="0" w:sz="0" w:val="nil"/>
+          <w:between w:space="0" w:sz="0" w:val="nil"/>
+        </w:pBdr>
+        <w:shd w:fill="auto" w:val="clear"/>
+        <w:spacing w:after="0" w:before="0" w:line="276" w:lineRule="auto"/>
+        <w:ind w:left="0" w:right="0" w:firstLine="0"/>
+        <w:jc w:val="left"/>
+        <w:rPr/>
+      </w:pPr>
+      <w:r>
+        <w:rPr>
+          <w:rtl w:val="0"/>
+        </w:rPr>
+        <w:t xml:space="preserve"> 2 0 2 6 / 0 3 / 1 9   0 6 : 4 8 : 5 5   I N F O     :   l o g s :   S e t   d i r e c t o r y   m o d i f i c a t i o n   t i m e   ( u s i n g   S e t M o d T i m e ) </w:t>
+        <w:br w:type="textWrapping"/>
+        <w:t xml:space="preserve"> </w:t>
+      </w:r>
+    </w:p>
+    <w:p>
+      <w:pPr>
+        <w:keepNext w:val="0"/>
+        <w:keepLines w:val="0"/>
+        <w:pageBreakBefore w:val="0"/>
+        <w:widowControl w:val="0"/>
+        <w:pBdr>
+          <w:top w:space="0" w:sz="0" w:val="nil"/>
+          <w:left w:space="0" w:sz="0" w:val="nil"/>
+          <w:bottom w:space="0" w:sz="0" w:val="nil"/>
+          <w:right w:space="0" w:sz="0" w:val="nil"/>
+          <w:between w:space="0" w:sz="0" w:val="nil"/>
+        </w:pBdr>
+        <w:shd w:fill="auto" w:val="clear"/>
+        <w:spacing w:after="0" w:before="0" w:line="276" w:lineRule="auto"/>
+        <w:ind w:left="0" w:right="0" w:firstLine="0"/>
+        <w:jc w:val="left"/>
+        <w:rPr/>
+      </w:pPr>
+      <w:r>
+        <w:rPr>
+          <w:rtl w:val="0"/>
+        </w:rPr>
+        <w:t xml:space="preserve"> 2 0 2 6 / 0 3 / 1 9   0 6 : 4 8 : 5 5   I N F O     :   </w:t>
+        <w:br w:type="textWrapping"/>
+        <w:t xml:space="preserve"> </w:t>
+      </w:r>
+    </w:p>
+    <w:p>
+      <w:pPr>
+        <w:keepNext w:val="0"/>
+        <w:keepLines w:val="0"/>
+        <w:pageBreakBefore w:val="0"/>
+        <w:widowControl w:val="0"/>
+        <w:pBdr>
+          <w:top w:space="0" w:sz="0" w:val="nil"/>
+          <w:left w:space="0" w:sz="0" w:val="nil"/>
+          <w:bottom w:space="0" w:sz="0" w:val="nil"/>
+          <w:right w:space="0" w:sz="0" w:val="nil"/>
+          <w:between w:space="0" w:sz="0" w:val="nil"/>
+        </w:pBdr>
+        <w:shd w:fill="auto" w:val="clear"/>
+        <w:spacing w:after="0" w:before="0" w:line="276" w:lineRule="auto"/>
+        <w:ind w:left="0" w:right="0" w:firstLine="0"/>
+        <w:jc w:val="left"/>
+        <w:rPr/>
+      </w:pPr>
+      <w:r>
+        <w:rPr>
+          <w:rtl w:val="0"/>
+        </w:rPr>
+        <w:t xml:space="preserve"> T r a n s f e r r e d :       </w:t>
+        <w:tab/>
+        <w:t xml:space="preserve">       7 7 . 6 5 6   K i B   /   7 7 . 6 5 6   K i B ,   1 0 0 % ,   3 8 . 8 2 8   K i B / s ,   E T A   0 s </w:t>
+        <w:br w:type="textWrapping"/>
+        <w:t xml:space="preserve"> </w:t>
+      </w:r>
+    </w:p>
+    <w:p>
+      <w:pPr>
+        <w:keepNext w:val="0"/>
+        <w:keepLines w:val="0"/>
+        <w:pageBreakBefore w:val="0"/>
+        <w:widowControl w:val="0"/>
+        <w:pBdr>
+          <w:top w:space="0" w:sz="0" w:val="nil"/>
+          <w:left w:space="0" w:sz="0" w:val="nil"/>
+          <w:bottom w:space="0" w:sz="0" w:val="nil"/>
+          <w:right w:space="0" w:sz="0" w:val="nil"/>
+          <w:between w:space="0" w:sz="0" w:val="nil"/>
+        </w:pBdr>
+        <w:shd w:fill="auto" w:val="clear"/>
+        <w:spacing w:after="0" w:before="0" w:line="276" w:lineRule="auto"/>
+        <w:ind w:left="0" w:right="0" w:firstLine="0"/>
+        <w:jc w:val="left"/>
+        <w:rPr/>
+      </w:pPr>
+      <w:r>
+        <w:rPr>
+          <w:rtl w:val="0"/>
+        </w:rPr>
+        <w:t xml:space="preserve"> C h e c k s :                                   7   /   7 ,   1 0 0 % ,   L i s t e d   4 1 </w:t>
+        <w:br w:type="textWrapping"/>
+        <w:t xml:space="preserve"> </w:t>
+      </w:r>
+    </w:p>
+    <w:p>
+      <w:pPr>
+        <w:keepNext w:val="0"/>
+        <w:keepLines w:val="0"/>
+        <w:pageBreakBefore w:val="0"/>
+        <w:widowControl w:val="0"/>
+        <w:pBdr>
+          <w:top w:space="0" w:sz="0" w:val="nil"/>
+          <w:left w:space="0" w:sz="0" w:val="nil"/>
+          <w:bottom w:space="0" w:sz="0" w:val="nil"/>
+          <w:right w:space="0" w:sz="0" w:val="nil"/>
+          <w:between w:space="0" w:sz="0" w:val="nil"/>
+        </w:pBdr>
+        <w:shd w:fill="auto" w:val="clear"/>
+        <w:spacing w:after="0" w:before="0" w:line="276" w:lineRule="auto"/>
+        <w:ind w:left="0" w:right="0" w:firstLine="0"/>
+        <w:jc w:val="left"/>
+        <w:rPr/>
+      </w:pPr>
+      <w:r>
+        <w:rPr>
+          <w:rtl w:val="0"/>
+        </w:rPr>
+        <w:t xml:space="preserve"> T r a n s f e r r e d :                         1   /   1 ,   1 0 0 % </w:t>
+        <w:br w:type="textWrapping"/>
+        <w:t xml:space="preserve"> </w:t>
+      </w:r>
+    </w:p>
+    <w:p>
+      <w:pPr>
+        <w:keepNext w:val="0"/>
+        <w:keepLines w:val="0"/>
+        <w:pageBreakBefore w:val="0"/>
+        <w:widowControl w:val="0"/>
+        <w:pBdr>
+          <w:top w:space="0" w:sz="0" w:val="nil"/>
+          <w:left w:space="0" w:sz="0" w:val="nil"/>
+          <w:bottom w:space="0" w:sz="0" w:val="nil"/>
+          <w:right w:space="0" w:sz="0" w:val="nil"/>
+          <w:between w:space="0" w:sz="0" w:val="nil"/>
+        </w:pBdr>
+        <w:shd w:fill="auto" w:val="clear"/>
+        <w:spacing w:after="0" w:before="0" w:line="276" w:lineRule="auto"/>
+        <w:ind w:left="0" w:right="0" w:firstLine="0"/>
+        <w:jc w:val="left"/>
+        <w:rPr/>
+      </w:pPr>
+      <w:r>
+        <w:rPr>
+          <w:rtl w:val="0"/>
+        </w:rPr>
+        <w:t xml:space="preserve"> E l a p s e d   t i m e :                   2 . 5 s </w:t>
+        <w:br w:type="textWrapping"/>
+        <w:t xml:space="preserve"> </w:t>
+      </w:r>
+    </w:p>
+    <w:p>
+      <w:pPr>
+        <w:keepNext w:val="0"/>
+        <w:keepLines w:val="0"/>
+        <w:pageBreakBefore w:val="0"/>
+        <w:widowControl w:val="0"/>
+        <w:pBdr>
+          <w:top w:space="0" w:sz="0" w:val="nil"/>
+          <w:left w:space="0" w:sz="0" w:val="nil"/>
+          <w:bottom w:space="0" w:sz="0" w:val="nil"/>
+          <w:right w:space="0" w:sz="0" w:val="nil"/>
+          <w:between w:space="0" w:sz="0" w:val="nil"/>
+        </w:pBdr>
+        <w:shd w:fill="auto" w:val="clear"/>
+        <w:spacing w:after="0" w:before="0" w:line="276" w:lineRule="auto"/>
+        <w:ind w:left="0" w:right="0" w:firstLine="0"/>
+        <w:jc w:val="left"/>
+        <w:rPr/>
+      </w:pPr>
+      <w:r>
+        <w:rPr>
+          <w:rtl w:val="0"/>
+        </w:rPr>
+        <w:t xml:space="preserve"> </w:t>
+        <w:br w:type="textWrapping"/>
+        <w:t xml:space="preserve"> </w:t>
+      </w:r>
+    </w:p>
+    <w:p>
+      <w:pPr>
+        <w:keepNext w:val="0"/>
+        <w:keepLines w:val="0"/>
+        <w:pageBreakBefore w:val="0"/>
+        <w:widowControl w:val="0"/>
+        <w:pBdr>
+          <w:top w:space="0" w:sz="0" w:val="nil"/>
+          <w:left w:space="0" w:sz="0" w:val="nil"/>
+          <w:bottom w:space="0" w:sz="0" w:val="nil"/>
+          <w:right w:space="0" w:sz="0" w:val="nil"/>
+          <w:between w:space="0" w:sz="0" w:val="nil"/>
+        </w:pBdr>
+        <w:shd w:fill="auto" w:val="clear"/>
+        <w:spacing w:after="0" w:before="0" w:line="276" w:lineRule="auto"/>
+        <w:ind w:left="0" w:right="0" w:firstLine="0"/>
+        <w:jc w:val="left"/>
+        <w:rPr/>
+      </w:pPr>
+      <w:r>
+        <w:rPr>
+          <w:rtl w:val="0"/>
+        </w:rPr>
+        <w:t xml:space="preserve"> [Stage 7] CONDUIT sync complete</w:t>
+        <w:br w:type="textWrapping"/>
+      </w:r>
+    </w:p>
+    <w:p>
+      <w:pPr>
+        <w:keepNext w:val="0"/>
+        <w:keepLines w:val="0"/>
+        <w:pageBreakBefore w:val="0"/>
+        <w:widowControl w:val="0"/>
+        <w:pBdr>
+          <w:top w:space="0" w:sz="0" w:val="nil"/>
+          <w:left w:space="0" w:sz="0" w:val="nil"/>
+          <w:bottom w:space="0" w:sz="0" w:val="nil"/>
+          <w:right w:space="0" w:sz="0" w:val="nil"/>
+          <w:between w:space="0" w:sz="0" w:val="nil"/>
+        </w:pBdr>
+        <w:shd w:fill="auto" w:val="clear"/>
+        <w:spacing w:after="0" w:before="0" w:line="276" w:lineRule="auto"/>
+        <w:ind w:left="0" w:right="0" w:firstLine="0"/>
+        <w:jc w:val="left"/>
+        <w:rPr/>
+      </w:pPr>
+      <w:r>
+        <w:rPr>
+          <w:rtl w:val="0"/>
+        </w:rPr>
+        <w:t xml:space="preserve">r c l o n e . e x e   :   2 0 2 6 / 0 3 / 1 9   0 6 : 4 8 : 5 7   I N F O     :   c o d i n g :   S e t   d i r e c t o r y   m o d i f i c a t i o n   t i m e   ( u s i n g   S e t M o d T i m e ) </w:t>
+        <w:br w:type="textWrapping"/>
+        <w:t xml:space="preserve"> </w:t>
+      </w:r>
+    </w:p>
+    <w:p>
+      <w:pPr>
+        <w:keepNext w:val="0"/>
+        <w:keepLines w:val="0"/>
+        <w:pageBreakBefore w:val="0"/>
+        <w:widowControl w:val="0"/>
+        <w:pBdr>
+          <w:top w:space="0" w:sz="0" w:val="nil"/>
+          <w:left w:space="0" w:sz="0" w:val="nil"/>
+          <w:bottom w:space="0" w:sz="0" w:val="nil"/>
+          <w:right w:space="0" w:sz="0" w:val="nil"/>
+          <w:between w:space="0" w:sz="0" w:val="nil"/>
+        </w:pBdr>
+        <w:shd w:fill="auto" w:val="clear"/>
+        <w:spacing w:after="0" w:before="0" w:line="276" w:lineRule="auto"/>
+        <w:ind w:left="0" w:right="0" w:firstLine="0"/>
+        <w:jc w:val="left"/>
+        <w:rPr/>
+      </w:pPr>
+      <w:r>
+        <w:rPr>
+          <w:rtl w:val="0"/>
+        </w:rPr>
+        <w:t xml:space="preserve"> A t   C : \ U s e r s \ S o u r c e - 1 \ D e s k t o p \ r c l o n e \ c o n d u i t _ s y n c . p s 1 : 5 9   c h a r : 1 </w:t>
+        <w:br w:type="textWrapping"/>
+        <w:t xml:space="preserve"> </w:t>
+      </w:r>
+    </w:p>
+    <w:p>
+      <w:pPr>
+        <w:keepNext w:val="0"/>
+        <w:keepLines w:val="0"/>
+        <w:pageBreakBefore w:val="0"/>
+        <w:widowControl w:val="0"/>
+        <w:pBdr>
+          <w:top w:space="0" w:sz="0" w:val="nil"/>
+          <w:left w:space="0" w:sz="0" w:val="nil"/>
+          <w:bottom w:space="0" w:sz="0" w:val="nil"/>
+          <w:right w:space="0" w:sz="0" w:val="nil"/>
+          <w:between w:space="0" w:sz="0" w:val="nil"/>
+        </w:pBdr>
+        <w:shd w:fill="auto" w:val="clear"/>
+        <w:spacing w:after="0" w:before="0" w:line="276" w:lineRule="auto"/>
+        <w:ind w:left="0" w:right="0" w:firstLine="0"/>
+        <w:jc w:val="left"/>
+        <w:rPr/>
+      </w:pPr>
+      <w:r>
+        <w:rPr>
+          <w:rtl w:val="0"/>
+        </w:rPr>
+        <w:t xml:space="preserve"> +   &amp;   $ r c l o n e   c o p y   - - f i l t e r - f r o m   $ f i l t e r   " $ s o u r c e N e x u s \ r e p o r t s "   g d r i v e : V 3   . . . </w:t>
+        <w:br w:type="textWrapping"/>
+        <w:t xml:space="preserve"> </w:t>
+      </w:r>
+    </w:p>
+    <w:p>
+      <w:pPr>
+        <w:keepNext w:val="0"/>
+        <w:keepLines w:val="0"/>
+        <w:pageBreakBefore w:val="0"/>
+        <w:widowControl w:val="0"/>
+        <w:pBdr>
+          <w:top w:space="0" w:sz="0" w:val="nil"/>
+          <w:left w:space="0" w:sz="0" w:val="nil"/>
+          <w:bottom w:space="0" w:sz="0" w:val="nil"/>
+          <w:right w:space="0" w:sz="0" w:val="nil"/>
+          <w:between w:space="0" w:sz="0" w:val="nil"/>
+        </w:pBdr>
+        <w:shd w:fill="auto" w:val="clear"/>
+        <w:spacing w:after="0" w:before="0" w:line="276" w:lineRule="auto"/>
+        <w:ind w:left="0" w:right="0" w:firstLine="0"/>
+        <w:jc w:val="left"/>
+        <w:rPr/>
+      </w:pPr>
+      <w:r>
+        <w:rPr>
+          <w:rtl w:val="0"/>
+        </w:rPr>
+        <w:t xml:space="preserve"> +   ~ ~ ~ ~ ~ ~ ~ ~ ~ ~ ~ ~ ~ ~ ~ ~ ~ ~ ~ ~ ~ ~ ~ ~ ~ ~ ~ ~ ~ ~ ~ ~ ~ ~ ~ ~ ~ ~ ~ ~ ~ ~ ~ ~ ~ ~ ~ ~ ~ ~ ~ ~ ~ ~ ~ ~ ~ ~ ~ ~ ~ ~ ~ ~ ~ ~ ~ ~ ~ </w:t>
+        <w:br w:type="textWrapping"/>
+        <w:t xml:space="preserve"> </w:t>
+      </w:r>
+    </w:p>
+    <w:p>
+      <w:pPr>
+        <w:keepNext w:val="0"/>
+        <w:keepLines w:val="0"/>
+        <w:pageBreakBefore w:val="0"/>
+        <w:widowControl w:val="0"/>
+        <w:pBdr>
+          <w:top w:space="0" w:sz="0" w:val="nil"/>
+          <w:left w:space="0" w:sz="0" w:val="nil"/>
+          <w:bottom w:space="0" w:sz="0" w:val="nil"/>
+          <w:right w:space="0" w:sz="0" w:val="nil"/>
+          <w:between w:space="0" w:sz="0" w:val="nil"/>
+        </w:pBdr>
+        <w:shd w:fill="auto" w:val="clear"/>
+        <w:spacing w:after="0" w:before="0" w:line="276" w:lineRule="auto"/>
+        <w:ind w:left="0" w:right="0" w:firstLine="0"/>
+        <w:jc w:val="left"/>
+        <w:rPr/>
+      </w:pPr>
+      <w:r>
+        <w:rPr>
+          <w:rtl w:val="0"/>
+        </w:rPr>
+        <w:t xml:space="preserve">         +   C a t e g o r y I n f o                     :   N o t S p e c i f i e d :   ( 2 0 2 6 / 0 3 / 1 9   0 6 : 4 . . . i n g   S e t M o d T i m e ) : S t r i n g )   [ ] ,   R e m o t e E x c e p t i o n </w:t>
+        <w:br w:type="textWrapping"/>
+        <w:t xml:space="preserve"> </w:t>
+      </w:r>
+    </w:p>
+    <w:p>
+      <w:pPr>
+        <w:keepNext w:val="0"/>
+        <w:keepLines w:val="0"/>
+        <w:pageBreakBefore w:val="0"/>
+        <w:widowControl w:val="0"/>
+        <w:pBdr>
+          <w:top w:space="0" w:sz="0" w:val="nil"/>
+          <w:left w:space="0" w:sz="0" w:val="nil"/>
+          <w:bottom w:space="0" w:sz="0" w:val="nil"/>
+          <w:right w:space="0" w:sz="0" w:val="nil"/>
+          <w:between w:space="0" w:sz="0" w:val="nil"/>
+        </w:pBdr>
+        <w:shd w:fill="auto" w:val="clear"/>
+        <w:spacing w:after="0" w:before="0" w:line="276" w:lineRule="auto"/>
+        <w:ind w:left="0" w:right="0" w:firstLine="0"/>
+        <w:jc w:val="left"/>
+        <w:rPr/>
+      </w:pPr>
+      <w:r>
+        <w:rPr>
+          <w:rtl w:val="0"/>
+        </w:rPr>
+        <w:t xml:space="preserve">         +   F u l l y Q u a l i f i e d E r r o r I d   :   N a t i v e C o m m a n d E r r o r </w:t>
+        <w:br w:type="textWrapping"/>
+        <w:t xml:space="preserve"> </w:t>
+      </w:r>
+    </w:p>
+    <w:p>
+      <w:pPr>
+        <w:keepNext w:val="0"/>
+        <w:keepLines w:val="0"/>
+        <w:pageBreakBefore w:val="0"/>
+        <w:widowControl w:val="0"/>
+        <w:pBdr>
+          <w:top w:space="0" w:sz="0" w:val="nil"/>
+          <w:left w:space="0" w:sz="0" w:val="nil"/>
+          <w:bottom w:space="0" w:sz="0" w:val="nil"/>
+          <w:right w:space="0" w:sz="0" w:val="nil"/>
+          <w:between w:space="0" w:sz="0" w:val="nil"/>
+        </w:pBdr>
+        <w:shd w:fill="auto" w:val="clear"/>
+        <w:spacing w:after="0" w:before="0" w:line="276" w:lineRule="auto"/>
+        <w:ind w:left="0" w:right="0" w:firstLine="0"/>
+        <w:jc w:val="left"/>
+        <w:rPr/>
+      </w:pPr>
+      <w:r>
+        <w:rPr>
+          <w:rtl w:val="0"/>
+        </w:rPr>
+        <w:t xml:space="preserve">   </w:t>
+        <w:br w:type="textWrapping"/>
+        <w:t xml:space="preserve"> </w:t>
+      </w:r>
+    </w:p>
+    <w:p>
+      <w:pPr>
+        <w:keepNext w:val="0"/>
+        <w:keepLines w:val="0"/>
+        <w:pageBreakBefore w:val="0"/>
+        <w:widowControl w:val="0"/>
+        <w:pBdr>
+          <w:top w:space="0" w:sz="0" w:val="nil"/>
+          <w:left w:space="0" w:sz="0" w:val="nil"/>
+          <w:bottom w:space="0" w:sz="0" w:val="nil"/>
+          <w:right w:space="0" w:sz="0" w:val="nil"/>
+          <w:between w:space="0" w:sz="0" w:val="nil"/>
+        </w:pBdr>
+        <w:shd w:fill="auto" w:val="clear"/>
+        <w:spacing w:after="0" w:before="0" w:line="276" w:lineRule="auto"/>
+        <w:ind w:left="0" w:right="0" w:firstLine="0"/>
+        <w:jc w:val="left"/>
+        <w:rPr/>
+      </w:pPr>
+      <w:r>
+        <w:rPr>
+          <w:rtl w:val="0"/>
+        </w:rPr>
+        <w:t xml:space="preserve"> 2 0 2 6 / 0 3 / 1 9   0 6 : 4 8 : 5 7   I N F O     :   p r o j e c t :   S e t   d i r e c t o r y   m o d i f i c a t i o n   t i m e   ( u s i n g   S e t M o d T i m e ) </w:t>
+        <w:br w:type="textWrapping"/>
+        <w:t xml:space="preserve"> </w:t>
+      </w:r>
+    </w:p>
+    <w:p>
+      <w:pPr>
+        <w:keepNext w:val="0"/>
+        <w:keepLines w:val="0"/>
+        <w:pageBreakBefore w:val="0"/>
+        <w:widowControl w:val="0"/>
+        <w:pBdr>
+          <w:top w:space="0" w:sz="0" w:val="nil"/>
+          <w:left w:space="0" w:sz="0" w:val="nil"/>
+          <w:bottom w:space="0" w:sz="0" w:val="nil"/>
+          <w:right w:space="0" w:sz="0" w:val="nil"/>
+          <w:between w:space="0" w:sz="0" w:val="nil"/>
+        </w:pBdr>
+        <w:shd w:fill="auto" w:val="clear"/>
+        <w:spacing w:after="0" w:before="0" w:line="276" w:lineRule="auto"/>
+        <w:ind w:left="0" w:right="0" w:firstLine="0"/>
+        <w:jc w:val="left"/>
+        <w:rPr/>
+      </w:pPr>
+      <w:r>
+        <w:rPr>
+          <w:rtl w:val="0"/>
+        </w:rPr>
+        <w:t xml:space="preserve"> 2 0 2 6 / 0 3 / 1 9   0 6 : 4 8 : 5 9   I N F O     :   p r o j e c t / V 3 R   P r o j e c t   N E X U S   R e p o r t   6   -   C l a u d e . t x t :   C o p i e d   ( n e w ) </w:t>
+        <w:br w:type="textWrapping"/>
+        <w:t xml:space="preserve"> </w:t>
+      </w:r>
+    </w:p>
+    <w:p>
+      <w:pPr>
+        <w:keepNext w:val="0"/>
+        <w:keepLines w:val="0"/>
+        <w:pageBreakBefore w:val="0"/>
+        <w:widowControl w:val="0"/>
+        <w:pBdr>
+          <w:top w:space="0" w:sz="0" w:val="nil"/>
+          <w:left w:space="0" w:sz="0" w:val="nil"/>
+          <w:bottom w:space="0" w:sz="0" w:val="nil"/>
+          <w:right w:space="0" w:sz="0" w:val="nil"/>
+          <w:between w:space="0" w:sz="0" w:val="nil"/>
+        </w:pBdr>
+        <w:shd w:fill="auto" w:val="clear"/>
+        <w:spacing w:after="0" w:before="0" w:line="276" w:lineRule="auto"/>
+        <w:ind w:left="0" w:right="0" w:firstLine="0"/>
+        <w:jc w:val="left"/>
+        <w:rPr/>
+      </w:pPr>
+      <w:r>
+        <w:rPr>
+          <w:rtl w:val="0"/>
+        </w:rPr>
+        <w:t xml:space="preserve"> 2 0 2 6 / 0 3 / 1 9   0 6 : 4 8 : 5 9   I N F O     :   c o d i n g / V 3 R   P r o j e c t   N E X U S   C o d i n g   R e p o r t   6   -   C l a u d e . t x t :   C o p i e d   ( n e w ) </w:t>
+        <w:br w:type="textWrapping"/>
+        <w:t xml:space="preserve"> </w:t>
+      </w:r>
+    </w:p>
+    <w:p>
+      <w:pPr>
+        <w:keepNext w:val="0"/>
+        <w:keepLines w:val="0"/>
+        <w:pageBreakBefore w:val="0"/>
+        <w:widowControl w:val="0"/>
+        <w:pBdr>
+          <w:top w:space="0" w:sz="0" w:val="nil"/>
+          <w:left w:space="0" w:sz="0" w:val="nil"/>
+          <w:bottom w:space="0" w:sz="0" w:val="nil"/>
+          <w:right w:space="0" w:sz="0" w:val="nil"/>
+          <w:between w:space="0" w:sz="0" w:val="nil"/>
+        </w:pBdr>
+        <w:shd w:fill="auto" w:val="clear"/>
+        <w:spacing w:after="0" w:before="0" w:line="276" w:lineRule="auto"/>
+        <w:ind w:left="0" w:right="0" w:firstLine="0"/>
+        <w:jc w:val="left"/>
+        <w:rPr/>
+      </w:pPr>
+      <w:r>
+        <w:rPr>
+          <w:rtl w:val="0"/>
+        </w:rPr>
+        <w:t xml:space="preserve"> 2 0 2 6 / 0 3 / 1 9   0 6 : 4 9 : 0 0   I N F O     :   c o d i n g :   S e t   d i r e c t o r y   m o d i f i c a t i o n   t i m e   ( u s i n g   S e t M o d T i m e ) </w:t>
+        <w:br w:type="textWrapping"/>
+        <w:t xml:space="preserve"> </w:t>
+      </w:r>
+    </w:p>
+    <w:p>
+      <w:pPr>
+        <w:keepNext w:val="0"/>
+        <w:keepLines w:val="0"/>
+        <w:pageBreakBefore w:val="0"/>
+        <w:widowControl w:val="0"/>
+        <w:pBdr>
+          <w:top w:space="0" w:sz="0" w:val="nil"/>
+          <w:left w:space="0" w:sz="0" w:val="nil"/>
+          <w:bottom w:space="0" w:sz="0" w:val="nil"/>
+          <w:right w:space="0" w:sz="0" w:val="nil"/>
+          <w:between w:space="0" w:sz="0" w:val="nil"/>
+        </w:pBdr>
+        <w:shd w:fill="auto" w:val="clear"/>
+        <w:spacing w:after="0" w:before="0" w:line="276" w:lineRule="auto"/>
+        <w:ind w:left="0" w:right="0" w:firstLine="0"/>
+        <w:jc w:val="left"/>
+        <w:rPr/>
+      </w:pPr>
+      <w:r>
+        <w:rPr>
+          <w:rtl w:val="0"/>
+        </w:rPr>
+        <w:t xml:space="preserve"> 2 0 2 6 / 0 3 / 1 9   0 6 : 4 9 : 0 0   I N F O     :   p r o j e c t :   S e t   d i r e c t o r y   m o d i f i c a t i o n   t i m e   ( u s i n g   S e t M o d T i m e ) </w:t>
+        <w:br w:type="textWrapping"/>
+        <w:t xml:space="preserve"> </w:t>
+      </w:r>
+    </w:p>
+    <w:p>
+      <w:pPr>
+        <w:keepNext w:val="0"/>
+        <w:keepLines w:val="0"/>
+        <w:pageBreakBefore w:val="0"/>
+        <w:widowControl w:val="0"/>
+        <w:pBdr>
+          <w:top w:space="0" w:sz="0" w:val="nil"/>
+          <w:left w:space="0" w:sz="0" w:val="nil"/>
+          <w:bottom w:space="0" w:sz="0" w:val="nil"/>
+          <w:right w:space="0" w:sz="0" w:val="nil"/>
+          <w:between w:space="0" w:sz="0" w:val="nil"/>
+        </w:pBdr>
+        <w:shd w:fill="auto" w:val="clear"/>
+        <w:spacing w:after="0" w:before="0" w:line="276" w:lineRule="auto"/>
+        <w:ind w:left="0" w:right="0" w:firstLine="0"/>
+        <w:jc w:val="left"/>
+        <w:rPr/>
+      </w:pPr>
+      <w:r>
+        <w:rPr>
+          <w:rtl w:val="0"/>
+        </w:rPr>
+        <w:t xml:space="preserve"> 2 0 2 6 / 0 3 / 1 9   0 6 : 4 9 : 0 0   I N F O     :   </w:t>
+        <w:br w:type="textWrapping"/>
+        <w:t xml:space="preserve"> </w:t>
+      </w:r>
+    </w:p>
+    <w:p>
+      <w:pPr>
+        <w:keepNext w:val="0"/>
+        <w:keepLines w:val="0"/>
+        <w:pageBreakBefore w:val="0"/>
+        <w:widowControl w:val="0"/>
+        <w:pBdr>
+          <w:top w:space="0" w:sz="0" w:val="nil"/>
+          <w:left w:space="0" w:sz="0" w:val="nil"/>
+          <w:bottom w:space="0" w:sz="0" w:val="nil"/>
+          <w:right w:space="0" w:sz="0" w:val="nil"/>
+          <w:between w:space="0" w:sz="0" w:val="nil"/>
+        </w:pBdr>
+        <w:shd w:fill="auto" w:val="clear"/>
+        <w:spacing w:after="0" w:before="0" w:line="276" w:lineRule="auto"/>
+        <w:ind w:left="0" w:right="0" w:firstLine="0"/>
+        <w:jc w:val="left"/>
+        <w:rPr/>
+      </w:pPr>
+      <w:r>
+        <w:rPr>
+          <w:rtl w:val="0"/>
+        </w:rPr>
+        <w:t xml:space="preserve"> T r a n s f e r r e d :       </w:t>
+        <w:tab/>
+        <w:t xml:space="preserve">       2 0 . 8 1 2   K i B   /   2 0 . 8 1 2   K i B ,   1 0 0 % ,   6 . 9 3 7   K i B / s ,   E T A   0 s </w:t>
+        <w:br w:type="textWrapping"/>
+        <w:t xml:space="preserve"> </w:t>
+      </w:r>
+    </w:p>
+    <w:p>
+      <w:pPr>
+        <w:keepNext w:val="0"/>
+        <w:keepLines w:val="0"/>
+        <w:pageBreakBefore w:val="0"/>
+        <w:widowControl w:val="0"/>
+        <w:pBdr>
+          <w:top w:space="0" w:sz="0" w:val="nil"/>
+          <w:left w:space="0" w:sz="0" w:val="nil"/>
+          <w:bottom w:space="0" w:sz="0" w:val="nil"/>
+          <w:right w:space="0" w:sz="0" w:val="nil"/>
+          <w:between w:space="0" w:sz="0" w:val="nil"/>
+        </w:pBdr>
+        <w:shd w:fill="auto" w:val="clear"/>
+        <w:spacing w:after="0" w:before="0" w:line="276" w:lineRule="auto"/>
+        <w:ind w:left="0" w:right="0" w:firstLine="0"/>
+        <w:jc w:val="left"/>
+        <w:rPr/>
+      </w:pPr>
+      <w:r>
+        <w:rPr>
+          <w:rtl w:val="0"/>
+        </w:rPr>
+        <w:t xml:space="preserve"> C h e c k s :                                 1 0   /   1 0 ,   1 0 0 % ,   L i s t e d   3 7 </w:t>
+        <w:br w:type="textWrapping"/>
+        <w:t xml:space="preserve"> </w:t>
+      </w:r>
+    </w:p>
+    <w:p>
+      <w:pPr>
+        <w:keepNext w:val="0"/>
+        <w:keepLines w:val="0"/>
+        <w:pageBreakBefore w:val="0"/>
+        <w:widowControl w:val="0"/>
+        <w:pBdr>
+          <w:top w:space="0" w:sz="0" w:val="nil"/>
+          <w:left w:space="0" w:sz="0" w:val="nil"/>
+          <w:bottom w:space="0" w:sz="0" w:val="nil"/>
+          <w:right w:space="0" w:sz="0" w:val="nil"/>
+          <w:between w:space="0" w:sz="0" w:val="nil"/>
+        </w:pBdr>
+        <w:shd w:fill="auto" w:val="clear"/>
+        <w:spacing w:after="0" w:before="0" w:line="276" w:lineRule="auto"/>
+        <w:ind w:left="0" w:right="0" w:firstLine="0"/>
+        <w:jc w:val="left"/>
+        <w:rPr/>
+      </w:pPr>
+      <w:r>
+        <w:rPr>
+          <w:rtl w:val="0"/>
+        </w:rPr>
+        <w:t xml:space="preserve"> T r a n s f e r r e d :                         2   /   2 ,   1 0 0 % </w:t>
+        <w:br w:type="textWrapping"/>
+        <w:t xml:space="preserve"> </w:t>
+      </w:r>
+    </w:p>
+    <w:p>
+      <w:pPr>
+        <w:keepNext w:val="0"/>
+        <w:keepLines w:val="0"/>
+        <w:pageBreakBefore w:val="0"/>
+        <w:widowControl w:val="0"/>
+        <w:pBdr>
+          <w:top w:space="0" w:sz="0" w:val="nil"/>
+          <w:left w:space="0" w:sz="0" w:val="nil"/>
+          <w:bottom w:space="0" w:sz="0" w:val="nil"/>
+          <w:right w:space="0" w:sz="0" w:val="nil"/>
+          <w:between w:space="0" w:sz="0" w:val="nil"/>
+        </w:pBdr>
+        <w:shd w:fill="auto" w:val="clear"/>
+        <w:spacing w:after="0" w:before="0" w:line="276" w:lineRule="auto"/>
+        <w:ind w:left="0" w:right="0" w:firstLine="0"/>
+        <w:jc w:val="left"/>
+        <w:rPr/>
+      </w:pPr>
+      <w:r>
+        <w:rPr>
+          <w:rtl w:val="0"/>
+        </w:rPr>
+        <w:t xml:space="preserve"> E l a p s e d   t i m e :                   3 . 5 s </w:t>
+        <w:br w:type="textWrapping"/>
+        <w:t xml:space="preserve"> </w:t>
+      </w:r>
+    </w:p>
+    <w:p>
+      <w:pPr>
+        <w:keepNext w:val="0"/>
+        <w:keepLines w:val="0"/>
+        <w:pageBreakBefore w:val="0"/>
+        <w:widowControl w:val="0"/>
+        <w:pBdr>
+          <w:top w:space="0" w:sz="0" w:val="nil"/>
+          <w:left w:space="0" w:sz="0" w:val="nil"/>
+          <w:bottom w:space="0" w:sz="0" w:val="nil"/>
+          <w:right w:space="0" w:sz="0" w:val="nil"/>
+          <w:between w:space="0" w:sz="0" w:val="nil"/>
+        </w:pBdr>
+        <w:shd w:fill="auto" w:val="clear"/>
+        <w:spacing w:after="0" w:before="0" w:line="276" w:lineRule="auto"/>
+        <w:ind w:left="0" w:right="0" w:firstLine="0"/>
+        <w:jc w:val="left"/>
+        <w:rPr/>
+      </w:pPr>
+      <w:r>
+        <w:rPr>
+          <w:rtl w:val="0"/>
+        </w:rPr>
+        <w:t xml:space="preserve"> </w:t>
+        <w:br w:type="textWrapping"/>
+        <w:t xml:space="preserve"> </w:t>
+      </w:r>
+    </w:p>
+    <w:p>
+      <w:pPr>
+        <w:keepNext w:val="0"/>
+        <w:keepLines w:val="0"/>
+        <w:pageBreakBefore w:val="0"/>
+        <w:widowControl w:val="0"/>
+        <w:pBdr>
+          <w:top w:space="0" w:sz="0" w:val="nil"/>
+          <w:left w:space="0" w:sz="0" w:val="nil"/>
+          <w:bottom w:space="0" w:sz="0" w:val="nil"/>
+          <w:right w:space="0" w:sz="0" w:val="nil"/>
+          <w:between w:space="0" w:sz="0" w:val="nil"/>
+        </w:pBdr>
+        <w:shd w:fill="auto" w:val="clear"/>
+        <w:spacing w:after="0" w:before="0" w:line="276" w:lineRule="auto"/>
+        <w:ind w:left="0" w:right="0" w:firstLine="0"/>
+        <w:jc w:val="left"/>
+        <w:rPr/>
+      </w:pPr>
+      <w:r>
+        <w:rPr>
+          <w:rtl w:val="0"/>
+        </w:rPr>
+        <w:t xml:space="preserve"> [Stage 8] NEXUS sync complete</w:t>
+        <w:br w:type="textWrapping"/>
+      </w:r>
+    </w:p>
+    <w:p>
+      <w:pPr>
+        <w:keepNext w:val="0"/>
+        <w:keepLines w:val="0"/>
+        <w:pageBreakBefore w:val="0"/>
+        <w:widowControl w:val="0"/>
+        <w:pBdr>
+          <w:top w:space="0" w:sz="0" w:val="nil"/>
+          <w:left w:space="0" w:sz="0" w:val="nil"/>
+          <w:bottom w:space="0" w:sz="0" w:val="nil"/>
+          <w:right w:space="0" w:sz="0" w:val="nil"/>
+          <w:between w:space="0" w:sz="0" w:val="nil"/>
+        </w:pBdr>
+        <w:shd w:fill="auto" w:val="clear"/>
+        <w:spacing w:after="0" w:before="0" w:line="276" w:lineRule="auto"/>
+        <w:ind w:left="0" w:right="0" w:firstLine="0"/>
+        <w:jc w:val="left"/>
+        <w:rPr/>
+      </w:pPr>
+      <w:r>
+        <w:rPr>
+          <w:rtl w:val="0"/>
+        </w:rPr>
+        <w:t xml:space="preserve">r c l o n e . e x e   :   2 0 2 6 / 0 3 / 1 9   0 6 : 4 9 : 0 3   I N F O     :   T h e r e   w a s   n o t h i n g   t o   t r a n s f e r </w:t>
+        <w:br w:type="textWrapping"/>
+        <w:t xml:space="preserve"> </w:t>
+      </w:r>
+    </w:p>
+    <w:p>
+      <w:pPr>
+        <w:keepNext w:val="0"/>
+        <w:keepLines w:val="0"/>
+        <w:pageBreakBefore w:val="0"/>
+        <w:widowControl w:val="0"/>
+        <w:pBdr>
+          <w:top w:space="0" w:sz="0" w:val="nil"/>
+          <w:left w:space="0" w:sz="0" w:val="nil"/>
+          <w:bottom w:space="0" w:sz="0" w:val="nil"/>
+          <w:right w:space="0" w:sz="0" w:val="nil"/>
+          <w:between w:space="0" w:sz="0" w:val="nil"/>
+        </w:pBdr>
+        <w:shd w:fill="auto" w:val="clear"/>
+        <w:spacing w:after="0" w:before="0" w:line="276" w:lineRule="auto"/>
+        <w:ind w:left="0" w:right="0" w:firstLine="0"/>
+        <w:jc w:val="left"/>
+        <w:rPr/>
+      </w:pPr>
+      <w:r>
+        <w:rPr>
+          <w:rtl w:val="0"/>
+        </w:rPr>
+        <w:t xml:space="preserve"> A t   C : \ U s e r s \ S o u r c e - 1 \ D e s k t o p \ r c l o n e \ c o n d u i t _ s y n c . p s 1 : 6 3   c h a r : 1 </w:t>
+        <w:br w:type="textWrapping"/>
+        <w:t xml:space="preserve"> </w:t>
+      </w:r>
+    </w:p>
+    <w:p>
+      <w:pPr>
+        <w:keepNext w:val="0"/>
+        <w:keepLines w:val="0"/>
+        <w:pageBreakBefore w:val="0"/>
+        <w:widowControl w:val="0"/>
+        <w:pBdr>
+          <w:top w:space="0" w:sz="0" w:val="nil"/>
+          <w:left w:space="0" w:sz="0" w:val="nil"/>
+          <w:bottom w:space="0" w:sz="0" w:val="nil"/>
+          <w:right w:space="0" w:sz="0" w:val="nil"/>
+          <w:between w:space="0" w:sz="0" w:val="nil"/>
+        </w:pBdr>
+        <w:shd w:fill="auto" w:val="clear"/>
+        <w:spacing w:after="0" w:before="0" w:line="276" w:lineRule="auto"/>
+        <w:ind w:left="0" w:right="0" w:firstLine="0"/>
+        <w:jc w:val="left"/>
+        <w:rPr/>
+      </w:pPr>
+      <w:r>
+        <w:rPr>
+          <w:rtl w:val="0"/>
+        </w:rPr>
+        <w:t xml:space="preserve"> +   &amp;   $ r c l o n e   c o p y   - - f i l t e r - f r o m   $ f i l t e r   $ s o u r c e D a t a   g d r i v e : V 3 R / d a t a /   - v     . . . </w:t>
+        <w:br w:type="textWrapping"/>
+        <w:t xml:space="preserve"> </w:t>
+      </w:r>
+    </w:p>
+    <w:p>
+      <w:pPr>
+        <w:keepNext w:val="0"/>
+        <w:keepLines w:val="0"/>
+        <w:pageBreakBefore w:val="0"/>
+        <w:widowControl w:val="0"/>
+        <w:pBdr>
+          <w:top w:space="0" w:sz="0" w:val="nil"/>
+          <w:left w:space="0" w:sz="0" w:val="nil"/>
+          <w:bottom w:space="0" w:sz="0" w:val="nil"/>
+          <w:right w:space="0" w:sz="0" w:val="nil"/>
+          <w:between w:space="0" w:sz="0" w:val="nil"/>
+        </w:pBdr>
+        <w:shd w:fill="auto" w:val="clear"/>
+        <w:spacing w:after="0" w:before="0" w:line="276" w:lineRule="auto"/>
+        <w:ind w:left="0" w:right="0" w:firstLine="0"/>
+        <w:jc w:val="left"/>
+        <w:rPr/>
+      </w:pPr>
+      <w:r>
+        <w:rPr>
+          <w:rtl w:val="0"/>
+        </w:rPr>
+        <w:t xml:space="preserve"> +   ~ ~ ~ ~ ~ ~ ~ ~ ~ ~ ~ ~ ~ ~ ~ ~ ~ ~ ~ ~ ~ ~ ~ ~ ~ ~ ~ ~ ~ ~ ~ ~ ~ ~ ~ ~ ~ ~ ~ ~ ~ ~ ~ ~ ~ ~ ~ ~ ~ ~ ~ ~ ~ ~ ~ ~ ~ ~ ~ ~ ~ ~ ~ ~ ~ ~ ~ ~ ~ </w:t>
+        <w:br w:type="textWrapping"/>
+        <w:t xml:space="preserve"> </w:t>
+      </w:r>
+    </w:p>
+    <w:p>
+      <w:pPr>
+        <w:keepNext w:val="0"/>
+        <w:keepLines w:val="0"/>
+        <w:pageBreakBefore w:val="0"/>
+        <w:widowControl w:val="0"/>
+        <w:pBdr>
+          <w:top w:space="0" w:sz="0" w:val="nil"/>
+          <w:left w:space="0" w:sz="0" w:val="nil"/>
+          <w:bottom w:space="0" w:sz="0" w:val="nil"/>
+          <w:right w:space="0" w:sz="0" w:val="nil"/>
+          <w:between w:space="0" w:sz="0" w:val="nil"/>
+        </w:pBdr>
+        <w:shd w:fill="auto" w:val="clear"/>
+        <w:spacing w:after="0" w:before="0" w:line="276" w:lineRule="auto"/>
+        <w:ind w:left="0" w:right="0" w:firstLine="0"/>
+        <w:jc w:val="left"/>
+        <w:rPr/>
+      </w:pPr>
+      <w:r>
+        <w:rPr>
+          <w:rtl w:val="0"/>
+        </w:rPr>
+        <w:t xml:space="preserve">         +   C a t e g o r y I n f o                     :   N o t S p e c i f i e d :   ( 2 0 2 6 / 0 3 / 1 9   0 6 : 4 . . . i n g   t o   t r a n s f e r : S t r i n g )   [ ] ,   R e m o t e E x c e p t i o n </w:t>
+        <w:br w:type="textWrapping"/>
+        <w:t xml:space="preserve"> </w:t>
+      </w:r>
+    </w:p>
+    <w:p>
+      <w:pPr>
+        <w:keepNext w:val="0"/>
+        <w:keepLines w:val="0"/>
+        <w:pageBreakBefore w:val="0"/>
+        <w:widowControl w:val="0"/>
+        <w:pBdr>
+          <w:top w:space="0" w:sz="0" w:val="nil"/>
+          <w:left w:space="0" w:sz="0" w:val="nil"/>
+          <w:bottom w:space="0" w:sz="0" w:val="nil"/>
+          <w:right w:space="0" w:sz="0" w:val="nil"/>
+          <w:between w:space="0" w:sz="0" w:val="nil"/>
+        </w:pBdr>
+        <w:shd w:fill="auto" w:val="clear"/>
+        <w:spacing w:after="0" w:before="0" w:line="276" w:lineRule="auto"/>
+        <w:ind w:left="0" w:right="0" w:firstLine="0"/>
+        <w:jc w:val="left"/>
+        <w:rPr/>
+      </w:pPr>
+      <w:r>
+        <w:rPr>
+          <w:rtl w:val="0"/>
+        </w:rPr>
+        <w:t xml:space="preserve">         +   F u l l y Q u a l i f i e d E r r o r I d   :   N a t i v e C o m m a n d E r r o r </w:t>
+        <w:br w:type="textWrapping"/>
+        <w:t xml:space="preserve"> </w:t>
+      </w:r>
+    </w:p>
+    <w:p>
+      <w:pPr>
+        <w:keepNext w:val="0"/>
+        <w:keepLines w:val="0"/>
+        <w:pageBreakBefore w:val="0"/>
+        <w:widowControl w:val="0"/>
+        <w:pBdr>
+          <w:top w:space="0" w:sz="0" w:val="nil"/>
+          <w:left w:space="0" w:sz="0" w:val="nil"/>
+          <w:bottom w:space="0" w:sz="0" w:val="nil"/>
+          <w:right w:space="0" w:sz="0" w:val="nil"/>
+          <w:between w:space="0" w:sz="0" w:val="nil"/>
+        </w:pBdr>
+        <w:shd w:fill="auto" w:val="clear"/>
+        <w:spacing w:after="0" w:before="0" w:line="276" w:lineRule="auto"/>
+        <w:ind w:left="0" w:right="0" w:firstLine="0"/>
+        <w:jc w:val="left"/>
+        <w:rPr/>
+      </w:pPr>
+      <w:r>
+        <w:rPr>
+          <w:rtl w:val="0"/>
+        </w:rPr>
+        <w:t xml:space="preserve">   </w:t>
+        <w:br w:type="textWrapping"/>
+        <w:t xml:space="preserve"> </w:t>
+      </w:r>
+    </w:p>
+    <w:p>
+      <w:pPr>
+        <w:keepNext w:val="0"/>
+        <w:keepLines w:val="0"/>
+        <w:pageBreakBefore w:val="0"/>
+        <w:widowControl w:val="0"/>
+        <w:pBdr>
+          <w:top w:space="0" w:sz="0" w:val="nil"/>
+          <w:left w:space="0" w:sz="0" w:val="nil"/>
+          <w:bottom w:space="0" w:sz="0" w:val="nil"/>
+          <w:right w:space="0" w:sz="0" w:val="nil"/>
+          <w:between w:space="0" w:sz="0" w:val="nil"/>
+        </w:pBdr>
+        <w:shd w:fill="auto" w:val="clear"/>
+        <w:spacing w:after="0" w:before="0" w:line="276" w:lineRule="auto"/>
+        <w:ind w:left="0" w:right="0" w:firstLine="0"/>
+        <w:jc w:val="left"/>
+        <w:rPr/>
+      </w:pPr>
+      <w:r>
+        <w:rPr>
+          <w:rtl w:val="0"/>
+        </w:rPr>
+        <w:t xml:space="preserve"> 2 0 2 6 / 0 3 / 1 9   0 6 : 4 9 : 0 3   I N F O     :   </w:t>
+        <w:br w:type="textWrapping"/>
+        <w:t xml:space="preserve"> </w:t>
+      </w:r>
+    </w:p>
+    <w:p>
+      <w:pPr>
+        <w:keepNext w:val="0"/>
+        <w:keepLines w:val="0"/>
+        <w:pageBreakBefore w:val="0"/>
+        <w:widowControl w:val="0"/>
+        <w:pBdr>
+          <w:top w:space="0" w:sz="0" w:val="nil"/>
+          <w:left w:space="0" w:sz="0" w:val="nil"/>
+          <w:bottom w:space="0" w:sz="0" w:val="nil"/>
+          <w:right w:space="0" w:sz="0" w:val="nil"/>
+          <w:between w:space="0" w:sz="0" w:val="nil"/>
+        </w:pBdr>
+        <w:shd w:fill="auto" w:val="clear"/>
+        <w:spacing w:after="0" w:before="0" w:line="276" w:lineRule="auto"/>
+        <w:ind w:left="0" w:right="0" w:firstLine="0"/>
+        <w:jc w:val="left"/>
+        <w:rPr/>
+      </w:pPr>
+      <w:r>
+        <w:rPr>
+          <w:rtl w:val="0"/>
+        </w:rPr>
+        <w:t xml:space="preserve"> T r a n s f e r r e d :       </w:t>
+        <w:tab/>
+        <w:t xml:space="preserve">                     0   B   /   0   B ,   - ,   0   B / s ,   E T A   - </w:t>
+        <w:br w:type="textWrapping"/>
+        <w:t xml:space="preserve"> </w:t>
+      </w:r>
+    </w:p>
+    <w:p>
+      <w:pPr>
+        <w:keepNext w:val="0"/>
+        <w:keepLines w:val="0"/>
+        <w:pageBreakBefore w:val="0"/>
+        <w:widowControl w:val="0"/>
+        <w:pBdr>
+          <w:top w:space="0" w:sz="0" w:val="nil"/>
+          <w:left w:space="0" w:sz="0" w:val="nil"/>
+          <w:bottom w:space="0" w:sz="0" w:val="nil"/>
+          <w:right w:space="0" w:sz="0" w:val="nil"/>
+          <w:between w:space="0" w:sz="0" w:val="nil"/>
+        </w:pBdr>
+        <w:shd w:fill="auto" w:val="clear"/>
+        <w:spacing w:after="0" w:before="0" w:line="276" w:lineRule="auto"/>
+        <w:ind w:left="0" w:right="0" w:firstLine="0"/>
+        <w:jc w:val="left"/>
+        <w:rPr/>
+      </w:pPr>
+      <w:r>
+        <w:rPr>
+          <w:rtl w:val="0"/>
+        </w:rPr>
+        <w:t xml:space="preserve"> C h e c k s :                                   5   /   5 ,   1 0 0 % ,   L i s t e d   1 5 </w:t>
+        <w:br w:type="textWrapping"/>
+        <w:t xml:space="preserve"> </w:t>
+      </w:r>
+    </w:p>
+    <w:p>
+      <w:pPr>
+        <w:keepNext w:val="0"/>
+        <w:keepLines w:val="0"/>
+        <w:pageBreakBefore w:val="0"/>
+        <w:widowControl w:val="0"/>
+        <w:pBdr>
+          <w:top w:space="0" w:sz="0" w:val="nil"/>
+          <w:left w:space="0" w:sz="0" w:val="nil"/>
+          <w:bottom w:space="0" w:sz="0" w:val="nil"/>
+          <w:right w:space="0" w:sz="0" w:val="nil"/>
+          <w:between w:space="0" w:sz="0" w:val="nil"/>
+        </w:pBdr>
+        <w:shd w:fill="auto" w:val="clear"/>
+        <w:spacing w:after="0" w:before="0" w:line="276" w:lineRule="auto"/>
+        <w:ind w:left="0" w:right="0" w:firstLine="0"/>
+        <w:jc w:val="left"/>
+        <w:rPr/>
+      </w:pPr>
+      <w:r>
+        <w:rPr>
+          <w:rtl w:val="0"/>
+        </w:rPr>
+        <w:t xml:space="preserve"> E l a p s e d   t i m e :                   0 . 4 s </w:t>
+        <w:br w:type="textWrapping"/>
+        <w:t xml:space="preserve"> </w:t>
+      </w:r>
+    </w:p>
+    <w:p>
+      <w:pPr>
+        <w:keepNext w:val="0"/>
+        <w:keepLines w:val="0"/>
+        <w:pageBreakBefore w:val="0"/>
+        <w:widowControl w:val="0"/>
+        <w:pBdr>
+          <w:top w:space="0" w:sz="0" w:val="nil"/>
+          <w:left w:space="0" w:sz="0" w:val="nil"/>
+          <w:bottom w:space="0" w:sz="0" w:val="nil"/>
+          <w:right w:space="0" w:sz="0" w:val="nil"/>
+          <w:between w:space="0" w:sz="0" w:val="nil"/>
+        </w:pBdr>
+        <w:shd w:fill="auto" w:val="clear"/>
+        <w:spacing w:after="0" w:before="0" w:line="276" w:lineRule="auto"/>
+        <w:ind w:left="0" w:right="0" w:firstLine="0"/>
+        <w:jc w:val="left"/>
+        <w:rPr/>
+      </w:pPr>
+      <w:r>
+        <w:rPr>
+          <w:rtl w:val="0"/>
+        </w:rPr>
+        <w:t xml:space="preserve"> </w:t>
+        <w:br w:type="textWrapping"/>
+        <w:t xml:space="preserve"> </w:t>
+      </w:r>
+    </w:p>
+    <w:p>
+      <w:pPr>
+        <w:keepNext w:val="0"/>
+        <w:keepLines w:val="0"/>
+        <w:pageBreakBefore w:val="0"/>
+        <w:widowControl w:val="0"/>
+        <w:pBdr>
+          <w:top w:space="0" w:sz="0" w:val="nil"/>
+          <w:left w:space="0" w:sz="0" w:val="nil"/>
+          <w:bottom w:space="0" w:sz="0" w:val="nil"/>
+          <w:right w:space="0" w:sz="0" w:val="nil"/>
+          <w:between w:space="0" w:sz="0" w:val="nil"/>
+        </w:pBdr>
+        <w:shd w:fill="auto" w:val="clear"/>
+        <w:spacing w:after="0" w:before="0" w:line="276" w:lineRule="auto"/>
+        <w:ind w:left="0" w:right="0" w:firstLine="0"/>
+        <w:jc w:val="left"/>
+        <w:rPr/>
+      </w:pPr>
+      <w:r>
+        <w:rPr>
+          <w:rtl w:val="0"/>
+        </w:rPr>
+        <w:t xml:space="preserve"> [Stage 9] Data sync complete</w:t>
+        <w:br w:type="textWrapping"/>
+      </w:r>
+    </w:p>
+    <w:p>
+      <w:pPr>
+        <w:keepNext w:val="0"/>
+        <w:keepLines w:val="0"/>
+        <w:pageBreakBefore w:val="0"/>
+        <w:widowControl w:val="0"/>
+        <w:pBdr>
+          <w:top w:space="0" w:sz="0" w:val="nil"/>
+          <w:left w:space="0" w:sz="0" w:val="nil"/>
+          <w:bottom w:space="0" w:sz="0" w:val="nil"/>
+          <w:right w:space="0" w:sz="0" w:val="nil"/>
+          <w:between w:space="0" w:sz="0" w:val="nil"/>
+        </w:pBdr>
+        <w:shd w:fill="auto" w:val="clear"/>
+        <w:spacing w:after="0" w:before="0" w:line="276" w:lineRule="auto"/>
+        <w:ind w:left="0" w:right="0" w:firstLine="0"/>
+        <w:jc w:val="left"/>
+        <w:rPr/>
+      </w:pPr>
+      <w:r>
+        <w:rPr>
+          <w:rtl w:val="0"/>
+        </w:rPr>
+        <w:t xml:space="preserve">Reminder: Run Apps Script converter for new Doc pairs.</w:t>
+        <w:br w:type="textWrapping"/>
+      </w:r>
+    </w:p>
+    <w:p>
+      <w:pPr>
+        <w:keepNext w:val="0"/>
+        <w:keepLines w:val="0"/>
+        <w:pageBreakBefore w:val="0"/>
+        <w:widowControl w:val="0"/>
+        <w:pBdr>
+          <w:top w:space="0" w:sz="0" w:val="nil"/>
+          <w:left w:space="0" w:sz="0" w:val="nil"/>
+          <w:bottom w:space="0" w:sz="0" w:val="nil"/>
+          <w:right w:space="0" w:sz="0" w:val="nil"/>
+          <w:between w:space="0" w:sz="0" w:val="nil"/>
+        </w:pBdr>
+        <w:shd w:fill="auto" w:val="clear"/>
+        <w:spacing w:after="0" w:before="0" w:line="276" w:lineRule="auto"/>
+        <w:ind w:left="0" w:right="0" w:firstLine="0"/>
+        <w:jc w:val="left"/>
+        <w:rPr/>
+      </w:pPr>
+      <w:r>
+        <w:rPr>
+          <w:rtl w:val="0"/>
+        </w:rPr>
+        <w:t xml:space="preserve">========================================</w:t>
+        <w:br w:type="textWrapping"/>
+      </w:r>
+    </w:p>
+    <w:p>
+      <w:pPr>
+        <w:keepNext w:val="0"/>
+        <w:keepLines w:val="0"/>
+        <w:pageBreakBefore w:val="0"/>
+        <w:widowControl w:val="0"/>
+        <w:pBdr>
+          <w:top w:space="0" w:sz="0" w:val="nil"/>
+          <w:left w:space="0" w:sz="0" w:val="nil"/>
+          <w:bottom w:space="0" w:sz="0" w:val="nil"/>
+          <w:right w:space="0" w:sz="0" w:val="nil"/>
+          <w:between w:space="0" w:sz="0" w:val="nil"/>
+        </w:pBdr>
+        <w:shd w:fill="auto" w:val="clear"/>
+        <w:spacing w:after="0" w:before="0" w:line="276" w:lineRule="auto"/>
+        <w:ind w:left="0" w:right="0" w:firstLine="0"/>
+        <w:jc w:val="left"/>
+        <w:rPr/>
+      </w:pPr>
+      <w:r>
+        <w:rPr>
+          <w:rtl w:val="0"/>
+        </w:rPr>
+        <w:t xml:space="preserve">[Stage 1] Version rotation complete</w:t>
+        <w:br w:type="textWrapping"/>
+      </w:r>
+    </w:p>
+    <w:p>
+      <w:pPr>
+        <w:keepNext w:val="0"/>
+        <w:keepLines w:val="0"/>
+        <w:pageBreakBefore w:val="0"/>
+        <w:widowControl w:val="0"/>
+        <w:pBdr>
+          <w:top w:space="0" w:sz="0" w:val="nil"/>
+          <w:left w:space="0" w:sz="0" w:val="nil"/>
+          <w:bottom w:space="0" w:sz="0" w:val="nil"/>
+          <w:right w:space="0" w:sz="0" w:val="nil"/>
+          <w:between w:space="0" w:sz="0" w:val="nil"/>
+        </w:pBdr>
+        <w:shd w:fill="auto" w:val="clear"/>
+        <w:spacing w:after="0" w:before="0" w:line="276" w:lineRule="auto"/>
+        <w:ind w:left="0" w:right="0" w:firstLine="0"/>
+        <w:jc w:val="left"/>
+        <w:rPr/>
+      </w:pPr>
+      <w:r>
+        <w:rPr>
+          <w:rtl w:val="0"/>
+        </w:rPr>
+        <w:t xml:space="preserve">r c l o n e . e x e   :   2 0 2 6 / 0 3 / 1 9   1 2 : 1 1 : 4 2   I N F O     :   s c r a t c h / k e y _ g o o g l e . j s o n :   C o p i e d   ( n e w ) </w:t>
+        <w:br w:type="textWrapping"/>
+        <w:t xml:space="preserve"> </w:t>
+      </w:r>
+    </w:p>
+    <w:p>
+      <w:pPr>
+        <w:keepNext w:val="0"/>
+        <w:keepLines w:val="0"/>
+        <w:pageBreakBefore w:val="0"/>
+        <w:widowControl w:val="0"/>
+        <w:pBdr>
+          <w:top w:space="0" w:sz="0" w:val="nil"/>
+          <w:left w:space="0" w:sz="0" w:val="nil"/>
+          <w:bottom w:space="0" w:sz="0" w:val="nil"/>
+          <w:right w:space="0" w:sz="0" w:val="nil"/>
+          <w:between w:space="0" w:sz="0" w:val="nil"/>
+        </w:pBdr>
+        <w:shd w:fill="auto" w:val="clear"/>
+        <w:spacing w:after="0" w:before="0" w:line="276" w:lineRule="auto"/>
+        <w:ind w:left="0" w:right="0" w:firstLine="0"/>
+        <w:jc w:val="left"/>
+        <w:rPr/>
+      </w:pPr>
+      <w:r>
+        <w:rPr>
+          <w:rtl w:val="0"/>
+        </w:rPr>
+        <w:t xml:space="preserve"> A t   C : \ U s e r s \ S o u r c e - 1 \ D e s k t o p \ r c l o n e \ c o n d u i t _ s y n c . p s 1 : 3 2   c h a r : 1 </w:t>
+        <w:br w:type="textWrapping"/>
+        <w:t xml:space="preserve"> </w:t>
+      </w:r>
+    </w:p>
+    <w:p>
+      <w:pPr>
+        <w:keepNext w:val="0"/>
+        <w:keepLines w:val="0"/>
+        <w:pageBreakBefore w:val="0"/>
+        <w:widowControl w:val="0"/>
+        <w:pBdr>
+          <w:top w:space="0" w:sz="0" w:val="nil"/>
+          <w:left w:space="0" w:sz="0" w:val="nil"/>
+          <w:bottom w:space="0" w:sz="0" w:val="nil"/>
+          <w:right w:space="0" w:sz="0" w:val="nil"/>
+          <w:between w:space="0" w:sz="0" w:val="nil"/>
+        </w:pBdr>
+        <w:shd w:fill="auto" w:val="clear"/>
+        <w:spacing w:after="0" w:before="0" w:line="276" w:lineRule="auto"/>
+        <w:ind w:left="0" w:right="0" w:firstLine="0"/>
+        <w:jc w:val="left"/>
+        <w:rPr/>
+      </w:pPr>
+      <w:r>
+        <w:rPr>
+          <w:rtl w:val="0"/>
+        </w:rPr>
+        <w:t xml:space="preserve"> +   &amp;   $ r c l o n e   c o p y   - - f i l t e r - f r o m   $ f i l t e r   $ s o u r c e E c r   g d r i v e : V 3 R / c o d e / c u r r e   . . . </w:t>
+        <w:br w:type="textWrapping"/>
+        <w:t xml:space="preserve"> </w:t>
+      </w:r>
+    </w:p>
+    <w:p>
+      <w:pPr>
+        <w:keepNext w:val="0"/>
+        <w:keepLines w:val="0"/>
+        <w:pageBreakBefore w:val="0"/>
+        <w:widowControl w:val="0"/>
+        <w:pBdr>
+          <w:top w:space="0" w:sz="0" w:val="nil"/>
+          <w:left w:space="0" w:sz="0" w:val="nil"/>
+          <w:bottom w:space="0" w:sz="0" w:val="nil"/>
+          <w:right w:space="0" w:sz="0" w:val="nil"/>
+          <w:between w:space="0" w:sz="0" w:val="nil"/>
+        </w:pBdr>
+        <w:shd w:fill="auto" w:val="clear"/>
+        <w:spacing w:after="0" w:before="0" w:line="276" w:lineRule="auto"/>
+        <w:ind w:left="0" w:right="0" w:firstLine="0"/>
+        <w:jc w:val="left"/>
+        <w:rPr/>
+      </w:pPr>
+      <w:r>
+        <w:rPr>
+          <w:rtl w:val="0"/>
+        </w:rPr>
+        <w:t xml:space="preserve"> +   ~ ~ ~ ~ ~ ~ ~ ~ ~ ~ ~ ~ ~ ~ ~ ~ ~ ~ ~ ~ ~ ~ ~ ~ ~ ~ ~ ~ ~ ~ ~ ~ ~ ~ ~ ~ ~ ~ ~ ~ ~ ~ ~ ~ ~ ~ ~ ~ ~ ~ ~ ~ ~ ~ ~ ~ ~ ~ ~ ~ ~ ~ ~ ~ ~ ~ ~ ~ ~ </w:t>
+        <w:br w:type="textWrapping"/>
+        <w:t xml:space="preserve"> </w:t>
+      </w:r>
+    </w:p>
+    <w:p>
+      <w:pPr>
+        <w:keepNext w:val="0"/>
+        <w:keepLines w:val="0"/>
+        <w:pageBreakBefore w:val="0"/>
+        <w:widowControl w:val="0"/>
+        <w:pBdr>
+          <w:top w:space="0" w:sz="0" w:val="nil"/>
+          <w:left w:space="0" w:sz="0" w:val="nil"/>
+          <w:bottom w:space="0" w:sz="0" w:val="nil"/>
+          <w:right w:space="0" w:sz="0" w:val="nil"/>
+          <w:between w:space="0" w:sz="0" w:val="nil"/>
+        </w:pBdr>
+        <w:shd w:fill="auto" w:val="clear"/>
+        <w:spacing w:after="0" w:before="0" w:line="276" w:lineRule="auto"/>
+        <w:ind w:left="0" w:right="0" w:firstLine="0"/>
+        <w:jc w:val="left"/>
+        <w:rPr/>
+      </w:pPr>
+      <w:r>
+        <w:rPr>
+          <w:rtl w:val="0"/>
+        </w:rPr>
+        <w:t xml:space="preserve">         +   C a t e g o r y I n f o                     :   N o t S p e c i f i e d :   ( 2 0 2 6 / 0 3 / 1 9   1 2 : 1 . . . n :   C o p i e d   ( n e w ) : S t r i n g )   [ ] ,   R e m o t e E x c e p t i o n </w:t>
+        <w:br w:type="textWrapping"/>
+        <w:t xml:space="preserve"> </w:t>
+      </w:r>
+    </w:p>
+    <w:p>
+      <w:pPr>
+        <w:keepNext w:val="0"/>
+        <w:keepLines w:val="0"/>
+        <w:pageBreakBefore w:val="0"/>
+        <w:widowControl w:val="0"/>
+        <w:pBdr>
+          <w:top w:space="0" w:sz="0" w:val="nil"/>
+          <w:left w:space="0" w:sz="0" w:val="nil"/>
+          <w:bottom w:space="0" w:sz="0" w:val="nil"/>
+          <w:right w:space="0" w:sz="0" w:val="nil"/>
+          <w:between w:space="0" w:sz="0" w:val="nil"/>
+        </w:pBdr>
+        <w:shd w:fill="auto" w:val="clear"/>
+        <w:spacing w:after="0" w:before="0" w:line="276" w:lineRule="auto"/>
+        <w:ind w:left="0" w:right="0" w:firstLine="0"/>
+        <w:jc w:val="left"/>
+        <w:rPr/>
+      </w:pPr>
+      <w:r>
+        <w:rPr>
+          <w:rtl w:val="0"/>
+        </w:rPr>
+        <w:t xml:space="preserve">         +   F u l l y Q u a l i f i e d E r r o r I d   :   N a t i v e C o m m a n d E r r o r </w:t>
+        <w:br w:type="textWrapping"/>
+        <w:t xml:space="preserve"> </w:t>
+      </w:r>
+    </w:p>
+    <w:p>
+      <w:pPr>
+        <w:keepNext w:val="0"/>
+        <w:keepLines w:val="0"/>
+        <w:pageBreakBefore w:val="0"/>
+        <w:widowControl w:val="0"/>
+        <w:pBdr>
+          <w:top w:space="0" w:sz="0" w:val="nil"/>
+          <w:left w:space="0" w:sz="0" w:val="nil"/>
+          <w:bottom w:space="0" w:sz="0" w:val="nil"/>
+          <w:right w:space="0" w:sz="0" w:val="nil"/>
+          <w:between w:space="0" w:sz="0" w:val="nil"/>
+        </w:pBdr>
+        <w:shd w:fill="auto" w:val="clear"/>
+        <w:spacing w:after="0" w:before="0" w:line="276" w:lineRule="auto"/>
+        <w:ind w:left="0" w:right="0" w:firstLine="0"/>
+        <w:jc w:val="left"/>
+        <w:rPr/>
+      </w:pPr>
+      <w:r>
+        <w:rPr>
+          <w:rtl w:val="0"/>
+        </w:rPr>
+        <w:t xml:space="preserve">   </w:t>
+        <w:br w:type="textWrapping"/>
+        <w:t xml:space="preserve"> </w:t>
+      </w:r>
+    </w:p>
+    <w:p>
+      <w:pPr>
+        <w:keepNext w:val="0"/>
+        <w:keepLines w:val="0"/>
+        <w:pageBreakBefore w:val="0"/>
+        <w:widowControl w:val="0"/>
+        <w:pBdr>
+          <w:top w:space="0" w:sz="0" w:val="nil"/>
+          <w:left w:space="0" w:sz="0" w:val="nil"/>
+          <w:bottom w:space="0" w:sz="0" w:val="nil"/>
+          <w:right w:space="0" w:sz="0" w:val="nil"/>
+          <w:between w:space="0" w:sz="0" w:val="nil"/>
+        </w:pBdr>
+        <w:shd w:fill="auto" w:val="clear"/>
+        <w:spacing w:after="0" w:before="0" w:line="276" w:lineRule="auto"/>
+        <w:ind w:left="0" w:right="0" w:firstLine="0"/>
+        <w:jc w:val="left"/>
+        <w:rPr/>
+      </w:pPr>
+      <w:r>
+        <w:rPr>
+          <w:rtl w:val="0"/>
+        </w:rPr>
+        <w:t xml:space="preserve"> 2 0 2 6 / 0 3 / 1 9   1 2 : 1 1 : 4 2   I N F O     :   s c r a t c h / k e y _ g r o q 2 . j s o n :   C o p i e d   ( n e w ) </w:t>
+        <w:br w:type="textWrapping"/>
+        <w:t xml:space="preserve"> </w:t>
+      </w:r>
+    </w:p>
+    <w:p>
+      <w:pPr>
+        <w:keepNext w:val="0"/>
+        <w:keepLines w:val="0"/>
+        <w:pageBreakBefore w:val="0"/>
+        <w:widowControl w:val="0"/>
+        <w:pBdr>
+          <w:top w:space="0" w:sz="0" w:val="nil"/>
+          <w:left w:space="0" w:sz="0" w:val="nil"/>
+          <w:bottom w:space="0" w:sz="0" w:val="nil"/>
+          <w:right w:space="0" w:sz="0" w:val="nil"/>
+          <w:between w:space="0" w:sz="0" w:val="nil"/>
+        </w:pBdr>
+        <w:shd w:fill="auto" w:val="clear"/>
+        <w:spacing w:after="0" w:before="0" w:line="276" w:lineRule="auto"/>
+        <w:ind w:left="0" w:right="0" w:firstLine="0"/>
+        <w:jc w:val="left"/>
+        <w:rPr/>
+      </w:pPr>
+      <w:r>
+        <w:rPr>
+          <w:rtl w:val="0"/>
+        </w:rPr>
+        <w:t xml:space="preserve"> 2 0 2 6 / 0 3 / 1 9   1 2 : 1 1 : 4 3   I N F O     :   s c r a t c h / k e y _ o p e n r o u t e r . j s o n :   C o p i e d   ( n e w ) </w:t>
+        <w:br w:type="textWrapping"/>
+        <w:t xml:space="preserve"> </w:t>
+      </w:r>
+    </w:p>
+    <w:p>
+      <w:pPr>
+        <w:keepNext w:val="0"/>
+        <w:keepLines w:val="0"/>
+        <w:pageBreakBefore w:val="0"/>
+        <w:widowControl w:val="0"/>
+        <w:pBdr>
+          <w:top w:space="0" w:sz="0" w:val="nil"/>
+          <w:left w:space="0" w:sz="0" w:val="nil"/>
+          <w:bottom w:space="0" w:sz="0" w:val="nil"/>
+          <w:right w:space="0" w:sz="0" w:val="nil"/>
+          <w:between w:space="0" w:sz="0" w:val="nil"/>
+        </w:pBdr>
+        <w:shd w:fill="auto" w:val="clear"/>
+        <w:spacing w:after="0" w:before="0" w:line="276" w:lineRule="auto"/>
+        <w:ind w:left="0" w:right="0" w:firstLine="0"/>
+        <w:jc w:val="left"/>
+        <w:rPr/>
+      </w:pPr>
+      <w:r>
+        <w:rPr>
+          <w:rtl w:val="0"/>
+        </w:rPr>
+        <w:t xml:space="preserve"> 2 0 2 6 / 0 3 / 1 9   1 2 : 1 1 : 4 3   I N F O     :   s c r a t c h :   S e t   d i r e c t o r y   m o d i f i c a t i o n   t i m e   ( u s i n g   D i r S e t M o d T i m e ) </w:t>
+        <w:br w:type="textWrapping"/>
+        <w:t xml:space="preserve"> </w:t>
+      </w:r>
+    </w:p>
+    <w:p>
+      <w:pPr>
+        <w:keepNext w:val="0"/>
+        <w:keepLines w:val="0"/>
+        <w:pageBreakBefore w:val="0"/>
+        <w:widowControl w:val="0"/>
+        <w:pBdr>
+          <w:top w:space="0" w:sz="0" w:val="nil"/>
+          <w:left w:space="0" w:sz="0" w:val="nil"/>
+          <w:bottom w:space="0" w:sz="0" w:val="nil"/>
+          <w:right w:space="0" w:sz="0" w:val="nil"/>
+          <w:between w:space="0" w:sz="0" w:val="nil"/>
+        </w:pBdr>
+        <w:shd w:fill="auto" w:val="clear"/>
+        <w:spacing w:after="0" w:before="0" w:line="276" w:lineRule="auto"/>
+        <w:ind w:left="0" w:right="0" w:firstLine="0"/>
+        <w:jc w:val="left"/>
+        <w:rPr/>
+      </w:pPr>
+      <w:r>
+        <w:rPr>
+          <w:rtl w:val="0"/>
+        </w:rPr>
+        <w:t xml:space="preserve"> 2 0 2 6 / 0 3 / 1 9   1 2 : 1 1 : 4 3   I N F O     :   </w:t>
+        <w:br w:type="textWrapping"/>
+        <w:t xml:space="preserve"> </w:t>
+      </w:r>
+    </w:p>
+    <w:p>
+      <w:pPr>
+        <w:keepNext w:val="0"/>
+        <w:keepLines w:val="0"/>
+        <w:pageBreakBefore w:val="0"/>
+        <w:widowControl w:val="0"/>
+        <w:pBdr>
+          <w:top w:space="0" w:sz="0" w:val="nil"/>
+          <w:left w:space="0" w:sz="0" w:val="nil"/>
+          <w:bottom w:space="0" w:sz="0" w:val="nil"/>
+          <w:right w:space="0" w:sz="0" w:val="nil"/>
+          <w:between w:space="0" w:sz="0" w:val="nil"/>
+        </w:pBdr>
+        <w:shd w:fill="auto" w:val="clear"/>
+        <w:spacing w:after="0" w:before="0" w:line="276" w:lineRule="auto"/>
+        <w:ind w:left="0" w:right="0" w:firstLine="0"/>
+        <w:jc w:val="left"/>
+        <w:rPr/>
+      </w:pPr>
+      <w:r>
+        <w:rPr>
+          <w:rtl w:val="0"/>
+        </w:rPr>
+        <w:t xml:space="preserve"> T r a n s f e r r e d :       </w:t>
+        <w:tab/>
+        <w:t xml:space="preserve">         1 . 0 7 8   K i B   /   1 . 0 7 8   K i B ,   1 0 0 % ,   3 6 8   B / s ,   E T A   0 s </w:t>
+        <w:br w:type="textWrapping"/>
+        <w:t xml:space="preserve"> </w:t>
+      </w:r>
+    </w:p>
+    <w:p>
+      <w:pPr>
+        <w:keepNext w:val="0"/>
+        <w:keepLines w:val="0"/>
+        <w:pageBreakBefore w:val="0"/>
+        <w:widowControl w:val="0"/>
+        <w:pBdr>
+          <w:top w:space="0" w:sz="0" w:val="nil"/>
+          <w:left w:space="0" w:sz="0" w:val="nil"/>
+          <w:bottom w:space="0" w:sz="0" w:val="nil"/>
+          <w:right w:space="0" w:sz="0" w:val="nil"/>
+          <w:between w:space="0" w:sz="0" w:val="nil"/>
+        </w:pBdr>
+        <w:shd w:fill="auto" w:val="clear"/>
+        <w:spacing w:after="0" w:before="0" w:line="276" w:lineRule="auto"/>
+        <w:ind w:left="0" w:right="0" w:firstLine="0"/>
+        <w:jc w:val="left"/>
+        <w:rPr/>
+      </w:pPr>
+      <w:r>
+        <w:rPr>
+          <w:rtl w:val="0"/>
+        </w:rPr>
+        <w:t xml:space="preserve"> C h e c k s :                                   9   /   9 ,   1 0 0 % ,   L i s t e d   3 9 </w:t>
+        <w:br w:type="textWrapping"/>
+        <w:t xml:space="preserve"> </w:t>
+      </w:r>
+    </w:p>
+    <w:p>
+      <w:pPr>
+        <w:keepNext w:val="0"/>
+        <w:keepLines w:val="0"/>
+        <w:pageBreakBefore w:val="0"/>
+        <w:widowControl w:val="0"/>
+        <w:pBdr>
+          <w:top w:space="0" w:sz="0" w:val="nil"/>
+          <w:left w:space="0" w:sz="0" w:val="nil"/>
+          <w:bottom w:space="0" w:sz="0" w:val="nil"/>
+          <w:right w:space="0" w:sz="0" w:val="nil"/>
+          <w:between w:space="0" w:sz="0" w:val="nil"/>
+        </w:pBdr>
+        <w:shd w:fill="auto" w:val="clear"/>
+        <w:spacing w:after="0" w:before="0" w:line="276" w:lineRule="auto"/>
+        <w:ind w:left="0" w:right="0" w:firstLine="0"/>
+        <w:jc w:val="left"/>
+        <w:rPr/>
+      </w:pPr>
+      <w:r>
+        <w:rPr>
+          <w:rtl w:val="0"/>
+        </w:rPr>
+        <w:t xml:space="preserve"> T r a n s f e r r e d :                         3   /   3 ,   1 0 0 % </w:t>
+        <w:br w:type="textWrapping"/>
+        <w:t xml:space="preserve"> </w:t>
+      </w:r>
+    </w:p>
+    <w:p>
+      <w:pPr>
+        <w:keepNext w:val="0"/>
+        <w:keepLines w:val="0"/>
+        <w:pageBreakBefore w:val="0"/>
+        <w:widowControl w:val="0"/>
+        <w:pBdr>
+          <w:top w:space="0" w:sz="0" w:val="nil"/>
+          <w:left w:space="0" w:sz="0" w:val="nil"/>
+          <w:bottom w:space="0" w:sz="0" w:val="nil"/>
+          <w:right w:space="0" w:sz="0" w:val="nil"/>
+          <w:between w:space="0" w:sz="0" w:val="nil"/>
+        </w:pBdr>
+        <w:shd w:fill="auto" w:val="clear"/>
+        <w:spacing w:after="0" w:before="0" w:line="276" w:lineRule="auto"/>
+        <w:ind w:left="0" w:right="0" w:firstLine="0"/>
+        <w:jc w:val="left"/>
+        <w:rPr/>
+      </w:pPr>
+      <w:r>
+        <w:rPr>
+          <w:rtl w:val="0"/>
+        </w:rPr>
+        <w:t xml:space="preserve"> E l a p s e d   t i m e :                   4 . 1 s </w:t>
+        <w:br w:type="textWrapping"/>
+        <w:t xml:space="preserve"> </w:t>
+      </w:r>
+    </w:p>
+    <w:p>
+      <w:pPr>
+        <w:keepNext w:val="0"/>
+        <w:keepLines w:val="0"/>
+        <w:pageBreakBefore w:val="0"/>
+        <w:widowControl w:val="0"/>
+        <w:pBdr>
+          <w:top w:space="0" w:sz="0" w:val="nil"/>
+          <w:left w:space="0" w:sz="0" w:val="nil"/>
+          <w:bottom w:space="0" w:sz="0" w:val="nil"/>
+          <w:right w:space="0" w:sz="0" w:val="nil"/>
+          <w:between w:space="0" w:sz="0" w:val="nil"/>
+        </w:pBdr>
+        <w:shd w:fill="auto" w:val="clear"/>
+        <w:spacing w:after="0" w:before="0" w:line="276" w:lineRule="auto"/>
+        <w:ind w:left="0" w:right="0" w:firstLine="0"/>
+        <w:jc w:val="left"/>
+        <w:rPr/>
+      </w:pPr>
+      <w:r>
+        <w:rPr>
+          <w:rtl w:val="0"/>
+        </w:rPr>
+        <w:t xml:space="preserve"> </w:t>
+        <w:br w:type="textWrapping"/>
+        <w:t xml:space="preserve"> </w:t>
+      </w:r>
+    </w:p>
+    <w:p>
+      <w:pPr>
+        <w:keepNext w:val="0"/>
+        <w:keepLines w:val="0"/>
+        <w:pageBreakBefore w:val="0"/>
+        <w:widowControl w:val="0"/>
+        <w:pBdr>
+          <w:top w:space="0" w:sz="0" w:val="nil"/>
+          <w:left w:space="0" w:sz="0" w:val="nil"/>
+          <w:bottom w:space="0" w:sz="0" w:val="nil"/>
+          <w:right w:space="0" w:sz="0" w:val="nil"/>
+          <w:between w:space="0" w:sz="0" w:val="nil"/>
+        </w:pBdr>
+        <w:shd w:fill="auto" w:val="clear"/>
+        <w:spacing w:after="0" w:before="0" w:line="276" w:lineRule="auto"/>
+        <w:ind w:left="0" w:right="0" w:firstLine="0"/>
+        <w:jc w:val="left"/>
+        <w:rPr/>
+      </w:pPr>
+      <w:r>
+        <w:rPr>
+          <w:rtl w:val="0"/>
+        </w:rPr>
+        <w:t xml:space="preserve"> [Stage 2] ecr-build sync complete</w:t>
+        <w:br w:type="textWrapping"/>
+      </w:r>
+    </w:p>
+    <w:p>
+      <w:pPr>
+        <w:keepNext w:val="0"/>
+        <w:keepLines w:val="0"/>
+        <w:pageBreakBefore w:val="0"/>
+        <w:widowControl w:val="0"/>
+        <w:pBdr>
+          <w:top w:space="0" w:sz="0" w:val="nil"/>
+          <w:left w:space="0" w:sz="0" w:val="nil"/>
+          <w:bottom w:space="0" w:sz="0" w:val="nil"/>
+          <w:right w:space="0" w:sz="0" w:val="nil"/>
+          <w:between w:space="0" w:sz="0" w:val="nil"/>
+        </w:pBdr>
+        <w:shd w:fill="auto" w:val="clear"/>
+        <w:spacing w:after="0" w:before="0" w:line="276" w:lineRule="auto"/>
+        <w:ind w:left="0" w:right="0" w:firstLine="0"/>
+        <w:jc w:val="left"/>
+        <w:rPr/>
+      </w:pPr>
+      <w:r>
+        <w:rPr>
+          <w:rtl w:val="0"/>
+        </w:rPr>
+        <w:t xml:space="preserve">r c l o n e . e x e   :   2 0 2 6 / 0 3 / 1 9   1 2 : 1 1 : 4 6   I N F O     :   T h e r e   w a s   n o t h i n g   t o   t r a n s f e r </w:t>
+        <w:br w:type="textWrapping"/>
+        <w:t xml:space="preserve"> </w:t>
+      </w:r>
+    </w:p>
+    <w:p>
+      <w:pPr>
+        <w:keepNext w:val="0"/>
+        <w:keepLines w:val="0"/>
+        <w:pageBreakBefore w:val="0"/>
+        <w:widowControl w:val="0"/>
+        <w:pBdr>
+          <w:top w:space="0" w:sz="0" w:val="nil"/>
+          <w:left w:space="0" w:sz="0" w:val="nil"/>
+          <w:bottom w:space="0" w:sz="0" w:val="nil"/>
+          <w:right w:space="0" w:sz="0" w:val="nil"/>
+          <w:between w:space="0" w:sz="0" w:val="nil"/>
+        </w:pBdr>
+        <w:shd w:fill="auto" w:val="clear"/>
+        <w:spacing w:after="0" w:before="0" w:line="276" w:lineRule="auto"/>
+        <w:ind w:left="0" w:right="0" w:firstLine="0"/>
+        <w:jc w:val="left"/>
+        <w:rPr/>
+      </w:pPr>
+      <w:r>
+        <w:rPr>
+          <w:rtl w:val="0"/>
+        </w:rPr>
+        <w:t xml:space="preserve"> A t   C : \ U s e r s \ S o u r c e - 1 \ D e s k t o p \ r c l o n e \ c o n d u i t _ s y n c . p s 1 : 3 6   c h a r : 1 </w:t>
+        <w:br w:type="textWrapping"/>
+        <w:t xml:space="preserve"> </w:t>
+      </w:r>
+    </w:p>
+    <w:p>
+      <w:pPr>
+        <w:keepNext w:val="0"/>
+        <w:keepLines w:val="0"/>
+        <w:pageBreakBefore w:val="0"/>
+        <w:widowControl w:val="0"/>
+        <w:pBdr>
+          <w:top w:space="0" w:sz="0" w:val="nil"/>
+          <w:left w:space="0" w:sz="0" w:val="nil"/>
+          <w:bottom w:space="0" w:sz="0" w:val="nil"/>
+          <w:right w:space="0" w:sz="0" w:val="nil"/>
+          <w:between w:space="0" w:sz="0" w:val="nil"/>
+        </w:pBdr>
+        <w:shd w:fill="auto" w:val="clear"/>
+        <w:spacing w:after="0" w:before="0" w:line="276" w:lineRule="auto"/>
+        <w:ind w:left="0" w:right="0" w:firstLine="0"/>
+        <w:jc w:val="left"/>
+        <w:rPr/>
+      </w:pPr>
+      <w:r>
+        <w:rPr>
+          <w:rtl w:val="0"/>
+        </w:rPr>
+        <w:t xml:space="preserve"> +   &amp;   $ r c l o n e   c o p y   - - f i l t e r - f r o m   $ f i l t e r   $ s o u r c e H f   g d r i v e : V 3 R / c o d e / c u r r e n   . . . </w:t>
+        <w:br w:type="textWrapping"/>
+        <w:t xml:space="preserve"> </w:t>
+      </w:r>
+    </w:p>
+    <w:p>
+      <w:pPr>
+        <w:keepNext w:val="0"/>
+        <w:keepLines w:val="0"/>
+        <w:pageBreakBefore w:val="0"/>
+        <w:widowControl w:val="0"/>
+        <w:pBdr>
+          <w:top w:space="0" w:sz="0" w:val="nil"/>
+          <w:left w:space="0" w:sz="0" w:val="nil"/>
+          <w:bottom w:space="0" w:sz="0" w:val="nil"/>
+          <w:right w:space="0" w:sz="0" w:val="nil"/>
+          <w:between w:space="0" w:sz="0" w:val="nil"/>
+        </w:pBdr>
+        <w:shd w:fill="auto" w:val="clear"/>
+        <w:spacing w:after="0" w:before="0" w:line="276" w:lineRule="auto"/>
+        <w:ind w:left="0" w:right="0" w:firstLine="0"/>
+        <w:jc w:val="left"/>
+        <w:rPr/>
+      </w:pPr>
+      <w:r>
+        <w:rPr>
+          <w:rtl w:val="0"/>
+        </w:rPr>
+        <w:t xml:space="preserve"> +   ~ ~ ~ ~ ~ ~ ~ ~ ~ ~ ~ ~ ~ ~ ~ ~ ~ ~ ~ ~ ~ ~ ~ ~ ~ ~ ~ ~ ~ ~ ~ ~ ~ ~ ~ ~ ~ ~ ~ ~ ~ ~ ~ ~ ~ ~ ~ ~ ~ ~ ~ ~ ~ ~ ~ ~ ~ ~ ~ ~ ~ ~ ~ ~ ~ ~ ~ ~ ~ </w:t>
+        <w:br w:type="textWrapping"/>
+        <w:t xml:space="preserve"> </w:t>
+      </w:r>
+    </w:p>
+    <w:p>
+      <w:pPr>
+        <w:keepNext w:val="0"/>
+        <w:keepLines w:val="0"/>
+        <w:pageBreakBefore w:val="0"/>
+        <w:widowControl w:val="0"/>
+        <w:pBdr>
+          <w:top w:space="0" w:sz="0" w:val="nil"/>
+          <w:left w:space="0" w:sz="0" w:val="nil"/>
+          <w:bottom w:space="0" w:sz="0" w:val="nil"/>
+          <w:right w:space="0" w:sz="0" w:val="nil"/>
+          <w:between w:space="0" w:sz="0" w:val="nil"/>
+        </w:pBdr>
+        <w:shd w:fill="auto" w:val="clear"/>
+        <w:spacing w:after="0" w:before="0" w:line="276" w:lineRule="auto"/>
+        <w:ind w:left="0" w:right="0" w:firstLine="0"/>
+        <w:jc w:val="left"/>
+        <w:rPr/>
+      </w:pPr>
+      <w:r>
+        <w:rPr>
+          <w:rtl w:val="0"/>
+        </w:rPr>
+        <w:t xml:space="preserve">         +   C a t e g o r y I n f o                     :   N o t S p e c i f i e d :   ( 2 0 2 6 / 0 3 / 1 9   1 2 : 1 . . . i n g   t o   t r a n s f e r : S t r i n g )   [ ] ,   R e m o t e E x c e p t i o n </w:t>
+        <w:br w:type="textWrapping"/>
+        <w:t xml:space="preserve"> </w:t>
+      </w:r>
+    </w:p>
+    <w:p>
+      <w:pPr>
+        <w:keepNext w:val="0"/>
+        <w:keepLines w:val="0"/>
+        <w:pageBreakBefore w:val="0"/>
+        <w:widowControl w:val="0"/>
+        <w:pBdr>
+          <w:top w:space="0" w:sz="0" w:val="nil"/>
+          <w:left w:space="0" w:sz="0" w:val="nil"/>
+          <w:bottom w:space="0" w:sz="0" w:val="nil"/>
+          <w:right w:space="0" w:sz="0" w:val="nil"/>
+          <w:between w:space="0" w:sz="0" w:val="nil"/>
+        </w:pBdr>
+        <w:shd w:fill="auto" w:val="clear"/>
+        <w:spacing w:after="0" w:before="0" w:line="276" w:lineRule="auto"/>
+        <w:ind w:left="0" w:right="0" w:firstLine="0"/>
+        <w:jc w:val="left"/>
+        <w:rPr/>
+      </w:pPr>
+      <w:r>
+        <w:rPr>
+          <w:rtl w:val="0"/>
+        </w:rPr>
+        <w:t xml:space="preserve">         +   F u l l y Q u a l i f i e d E r r o r I d   :   N a t i v e C o m m a n d E r r o r </w:t>
+        <w:br w:type="textWrapping"/>
+        <w:t xml:space="preserve"> </w:t>
+      </w:r>
+    </w:p>
+    <w:p>
+      <w:pPr>
+        <w:keepNext w:val="0"/>
+        <w:keepLines w:val="0"/>
+        <w:pageBreakBefore w:val="0"/>
+        <w:widowControl w:val="0"/>
+        <w:pBdr>
+          <w:top w:space="0" w:sz="0" w:val="nil"/>
+          <w:left w:space="0" w:sz="0" w:val="nil"/>
+          <w:bottom w:space="0" w:sz="0" w:val="nil"/>
+          <w:right w:space="0" w:sz="0" w:val="nil"/>
+          <w:between w:space="0" w:sz="0" w:val="nil"/>
+        </w:pBdr>
+        <w:shd w:fill="auto" w:val="clear"/>
+        <w:spacing w:after="0" w:before="0" w:line="276" w:lineRule="auto"/>
+        <w:ind w:left="0" w:right="0" w:firstLine="0"/>
+        <w:jc w:val="left"/>
+        <w:rPr/>
+      </w:pPr>
+      <w:r>
+        <w:rPr>
+          <w:rtl w:val="0"/>
+        </w:rPr>
+        <w:t xml:space="preserve">   </w:t>
+        <w:br w:type="textWrapping"/>
+        <w:t xml:space="preserve"> </w:t>
+      </w:r>
+    </w:p>
+    <w:p>
+      <w:pPr>
+        <w:keepNext w:val="0"/>
+        <w:keepLines w:val="0"/>
+        <w:pageBreakBefore w:val="0"/>
+        <w:widowControl w:val="0"/>
+        <w:pBdr>
+          <w:top w:space="0" w:sz="0" w:val="nil"/>
+          <w:left w:space="0" w:sz="0" w:val="nil"/>
+          <w:bottom w:space="0" w:sz="0" w:val="nil"/>
+          <w:right w:space="0" w:sz="0" w:val="nil"/>
+          <w:between w:space="0" w:sz="0" w:val="nil"/>
+        </w:pBdr>
+        <w:shd w:fill="auto" w:val="clear"/>
+        <w:spacing w:after="0" w:before="0" w:line="276" w:lineRule="auto"/>
+        <w:ind w:left="0" w:right="0" w:firstLine="0"/>
+        <w:jc w:val="left"/>
+        <w:rPr/>
+      </w:pPr>
+      <w:r>
+        <w:rPr>
+          <w:rtl w:val="0"/>
+        </w:rPr>
+        <w:t xml:space="preserve"> 2 0 2 6 / 0 3 / 1 9   1 2 : 1 1 : 4 6   I N F O     :   </w:t>
+        <w:br w:type="textWrapping"/>
+        <w:t xml:space="preserve"> </w:t>
+      </w:r>
+    </w:p>
+    <w:p>
+      <w:pPr>
+        <w:keepNext w:val="0"/>
+        <w:keepLines w:val="0"/>
+        <w:pageBreakBefore w:val="0"/>
+        <w:widowControl w:val="0"/>
+        <w:pBdr>
+          <w:top w:space="0" w:sz="0" w:val="nil"/>
+          <w:left w:space="0" w:sz="0" w:val="nil"/>
+          <w:bottom w:space="0" w:sz="0" w:val="nil"/>
+          <w:right w:space="0" w:sz="0" w:val="nil"/>
+          <w:between w:space="0" w:sz="0" w:val="nil"/>
+        </w:pBdr>
+        <w:shd w:fill="auto" w:val="clear"/>
+        <w:spacing w:after="0" w:before="0" w:line="276" w:lineRule="auto"/>
+        <w:ind w:left="0" w:right="0" w:firstLine="0"/>
+        <w:jc w:val="left"/>
+        <w:rPr/>
+      </w:pPr>
+      <w:r>
+        <w:rPr>
+          <w:rtl w:val="0"/>
+        </w:rPr>
+        <w:t xml:space="preserve"> T r a n s f e r r e d :       </w:t>
+        <w:tab/>
+        <w:t xml:space="preserve">                     0   B   /   0   B ,   - ,   0   B / s ,   E T A   - </w:t>
+        <w:br w:type="textWrapping"/>
+        <w:t xml:space="preserve"> </w:t>
+      </w:r>
+    </w:p>
+    <w:p>
+      <w:pPr>
+        <w:keepNext w:val="0"/>
+        <w:keepLines w:val="0"/>
+        <w:pageBreakBefore w:val="0"/>
+        <w:widowControl w:val="0"/>
+        <w:pBdr>
+          <w:top w:space="0" w:sz="0" w:val="nil"/>
+          <w:left w:space="0" w:sz="0" w:val="nil"/>
+          <w:bottom w:space="0" w:sz="0" w:val="nil"/>
+          <w:right w:space="0" w:sz="0" w:val="nil"/>
+          <w:between w:space="0" w:sz="0" w:val="nil"/>
+        </w:pBdr>
+        <w:shd w:fill="auto" w:val="clear"/>
+        <w:spacing w:after="0" w:before="0" w:line="276" w:lineRule="auto"/>
+        <w:ind w:left="0" w:right="0" w:firstLine="0"/>
+        <w:jc w:val="left"/>
+        <w:rPr/>
+      </w:pPr>
+      <w:r>
+        <w:rPr>
+          <w:rtl w:val="0"/>
+        </w:rPr>
+        <w:t xml:space="preserve"> C h e c k s :                                   3   /   3 ,   1 0 0 % ,   L i s t e d   2 9 </w:t>
+        <w:br w:type="textWrapping"/>
+        <w:t xml:space="preserve"> </w:t>
+      </w:r>
+    </w:p>
+    <w:p>
+      <w:pPr>
+        <w:keepNext w:val="0"/>
+        <w:keepLines w:val="0"/>
+        <w:pageBreakBefore w:val="0"/>
+        <w:widowControl w:val="0"/>
+        <w:pBdr>
+          <w:top w:space="0" w:sz="0" w:val="nil"/>
+          <w:left w:space="0" w:sz="0" w:val="nil"/>
+          <w:bottom w:space="0" w:sz="0" w:val="nil"/>
+          <w:right w:space="0" w:sz="0" w:val="nil"/>
+          <w:between w:space="0" w:sz="0" w:val="nil"/>
+        </w:pBdr>
+        <w:shd w:fill="auto" w:val="clear"/>
+        <w:spacing w:after="0" w:before="0" w:line="276" w:lineRule="auto"/>
+        <w:ind w:left="0" w:right="0" w:firstLine="0"/>
+        <w:jc w:val="left"/>
+        <w:rPr/>
+      </w:pPr>
+      <w:r>
+        <w:rPr>
+          <w:rtl w:val="0"/>
+        </w:rPr>
+        <w:t xml:space="preserve"> E l a p s e d   t i m e :                   0 . 3 s </w:t>
+        <w:br w:type="textWrapping"/>
+        <w:t xml:space="preserve"> </w:t>
+      </w:r>
+    </w:p>
+    <w:p>
+      <w:pPr>
+        <w:keepNext w:val="0"/>
+        <w:keepLines w:val="0"/>
+        <w:pageBreakBefore w:val="0"/>
+        <w:widowControl w:val="0"/>
+        <w:pBdr>
+          <w:top w:space="0" w:sz="0" w:val="nil"/>
+          <w:left w:space="0" w:sz="0" w:val="nil"/>
+          <w:bottom w:space="0" w:sz="0" w:val="nil"/>
+          <w:right w:space="0" w:sz="0" w:val="nil"/>
+          <w:between w:space="0" w:sz="0" w:val="nil"/>
+        </w:pBdr>
+        <w:shd w:fill="auto" w:val="clear"/>
+        <w:spacing w:after="0" w:before="0" w:line="276" w:lineRule="auto"/>
+        <w:ind w:left="0" w:right="0" w:firstLine="0"/>
+        <w:jc w:val="left"/>
+        <w:rPr/>
+      </w:pPr>
+      <w:r>
+        <w:rPr>
+          <w:rtl w:val="0"/>
+        </w:rPr>
+        <w:t xml:space="preserve"> </w:t>
+        <w:br w:type="textWrapping"/>
+        <w:t xml:space="preserve"> </w:t>
+      </w:r>
+    </w:p>
+    <w:p>
+      <w:pPr>
+        <w:keepNext w:val="0"/>
+        <w:keepLines w:val="0"/>
+        <w:pageBreakBefore w:val="0"/>
+        <w:widowControl w:val="0"/>
+        <w:pBdr>
+          <w:top w:space="0" w:sz="0" w:val="nil"/>
+          <w:left w:space="0" w:sz="0" w:val="nil"/>
+          <w:bottom w:space="0" w:sz="0" w:val="nil"/>
+          <w:right w:space="0" w:sz="0" w:val="nil"/>
+          <w:between w:space="0" w:sz="0" w:val="nil"/>
+        </w:pBdr>
+        <w:shd w:fill="auto" w:val="clear"/>
+        <w:spacing w:after="0" w:before="0" w:line="276" w:lineRule="auto"/>
+        <w:ind w:left="0" w:right="0" w:firstLine="0"/>
+        <w:jc w:val="left"/>
+        <w:rPr/>
+      </w:pPr>
+      <w:r>
+        <w:rPr>
+          <w:rtl w:val="0"/>
+        </w:rPr>
+        <w:t xml:space="preserve"> [Stage 3] hf-space sync complete</w:t>
+        <w:br w:type="textWrapping"/>
+      </w:r>
+    </w:p>
+    <w:p>
+      <w:pPr>
+        <w:keepNext w:val="0"/>
+        <w:keepLines w:val="0"/>
+        <w:pageBreakBefore w:val="0"/>
+        <w:widowControl w:val="0"/>
+        <w:pBdr>
+          <w:top w:space="0" w:sz="0" w:val="nil"/>
+          <w:left w:space="0" w:sz="0" w:val="nil"/>
+          <w:bottom w:space="0" w:sz="0" w:val="nil"/>
+          <w:right w:space="0" w:sz="0" w:val="nil"/>
+          <w:between w:space="0" w:sz="0" w:val="nil"/>
+        </w:pBdr>
+        <w:shd w:fill="auto" w:val="clear"/>
+        <w:spacing w:after="0" w:before="0" w:line="276" w:lineRule="auto"/>
+        <w:ind w:left="0" w:right="0" w:firstLine="0"/>
+        <w:jc w:val="left"/>
+        <w:rPr/>
+      </w:pPr>
+      <w:r>
+        <w:rPr>
+          <w:rtl w:val="0"/>
+        </w:rPr>
+        <w:t xml:space="preserve">r c l o n e . e x e   :   2 0 2 6 / 0 3 / 1 9   1 2 : 1 1 : 4 7   I N F O     :   T h e r e   w a s   n o t h i n g   t o   t r a n s f e r </w:t>
+        <w:br w:type="textWrapping"/>
+        <w:t xml:space="preserve"> </w:t>
+      </w:r>
+    </w:p>
+    <w:p>
+      <w:pPr>
+        <w:keepNext w:val="0"/>
+        <w:keepLines w:val="0"/>
+        <w:pageBreakBefore w:val="0"/>
+        <w:widowControl w:val="0"/>
+        <w:pBdr>
+          <w:top w:space="0" w:sz="0" w:val="nil"/>
+          <w:left w:space="0" w:sz="0" w:val="nil"/>
+          <w:bottom w:space="0" w:sz="0" w:val="nil"/>
+          <w:right w:space="0" w:sz="0" w:val="nil"/>
+          <w:between w:space="0" w:sz="0" w:val="nil"/>
+        </w:pBdr>
+        <w:shd w:fill="auto" w:val="clear"/>
+        <w:spacing w:after="0" w:before="0" w:line="276" w:lineRule="auto"/>
+        <w:ind w:left="0" w:right="0" w:firstLine="0"/>
+        <w:jc w:val="left"/>
+        <w:rPr/>
+      </w:pPr>
+      <w:r>
+        <w:rPr>
+          <w:rtl w:val="0"/>
+        </w:rPr>
+        <w:t xml:space="preserve"> A t   C : \ U s e r s \ S o u r c e - 1 \ D e s k t o p \ r c l o n e \ c o n d u i t _ s y n c . p s 1 : 4 0   c h a r : 1 </w:t>
+        <w:br w:type="textWrapping"/>
+        <w:t xml:space="preserve"> </w:t>
+      </w:r>
+    </w:p>
+    <w:p>
+      <w:pPr>
+        <w:keepNext w:val="0"/>
+        <w:keepLines w:val="0"/>
+        <w:pageBreakBefore w:val="0"/>
+        <w:widowControl w:val="0"/>
+        <w:pBdr>
+          <w:top w:space="0" w:sz="0" w:val="nil"/>
+          <w:left w:space="0" w:sz="0" w:val="nil"/>
+          <w:bottom w:space="0" w:sz="0" w:val="nil"/>
+          <w:right w:space="0" w:sz="0" w:val="nil"/>
+          <w:between w:space="0" w:sz="0" w:val="nil"/>
+        </w:pBdr>
+        <w:shd w:fill="auto" w:val="clear"/>
+        <w:spacing w:after="0" w:before="0" w:line="276" w:lineRule="auto"/>
+        <w:ind w:left="0" w:right="0" w:firstLine="0"/>
+        <w:jc w:val="left"/>
+        <w:rPr/>
+      </w:pPr>
+      <w:r>
+        <w:rPr>
+          <w:rtl w:val="0"/>
+        </w:rPr>
+        <w:t xml:space="preserve"> +   &amp;   $ r c l o n e   c o p y     " C : \ U s e r s \ S o u r c e - 1 \ D e s k t o p \ V 3 R \ c o d e \ l a s t "   g d r i v e : V 3 R /   . . . </w:t>
+        <w:br w:type="textWrapping"/>
+        <w:t xml:space="preserve"> </w:t>
+      </w:r>
+    </w:p>
+    <w:p>
+      <w:pPr>
+        <w:keepNext w:val="0"/>
+        <w:keepLines w:val="0"/>
+        <w:pageBreakBefore w:val="0"/>
+        <w:widowControl w:val="0"/>
+        <w:pBdr>
+          <w:top w:space="0" w:sz="0" w:val="nil"/>
+          <w:left w:space="0" w:sz="0" w:val="nil"/>
+          <w:bottom w:space="0" w:sz="0" w:val="nil"/>
+          <w:right w:space="0" w:sz="0" w:val="nil"/>
+          <w:between w:space="0" w:sz="0" w:val="nil"/>
+        </w:pBdr>
+        <w:shd w:fill="auto" w:val="clear"/>
+        <w:spacing w:after="0" w:before="0" w:line="276" w:lineRule="auto"/>
+        <w:ind w:left="0" w:right="0" w:firstLine="0"/>
+        <w:jc w:val="left"/>
+        <w:rPr/>
+      </w:pPr>
+      <w:r>
+        <w:rPr>
+          <w:rtl w:val="0"/>
+        </w:rPr>
+        <w:t xml:space="preserve"> +   ~ ~ ~ ~ ~ ~ ~ ~ ~ ~ ~ ~ ~ ~ ~ ~ ~ ~ ~ ~ ~ ~ ~ ~ ~ ~ ~ ~ ~ ~ ~ ~ ~ ~ ~ ~ ~ ~ ~ ~ ~ ~ ~ ~ ~ ~ ~ ~ ~ ~ ~ ~ ~ ~ ~ ~ ~ ~ ~ ~ ~ ~ ~ ~ ~ ~ ~ ~ ~ </w:t>
+        <w:br w:type="textWrapping"/>
+        <w:t xml:space="preserve"> </w:t>
+      </w:r>
+    </w:p>
+    <w:p>
+      <w:pPr>
+        <w:keepNext w:val="0"/>
+        <w:keepLines w:val="0"/>
+        <w:pageBreakBefore w:val="0"/>
+        <w:widowControl w:val="0"/>
+        <w:pBdr>
+          <w:top w:space="0" w:sz="0" w:val="nil"/>
+          <w:left w:space="0" w:sz="0" w:val="nil"/>
+          <w:bottom w:space="0" w:sz="0" w:val="nil"/>
+          <w:right w:space="0" w:sz="0" w:val="nil"/>
+          <w:between w:space="0" w:sz="0" w:val="nil"/>
+        </w:pBdr>
+        <w:shd w:fill="auto" w:val="clear"/>
+        <w:spacing w:after="0" w:before="0" w:line="276" w:lineRule="auto"/>
+        <w:ind w:left="0" w:right="0" w:firstLine="0"/>
+        <w:jc w:val="left"/>
+        <w:rPr/>
+      </w:pPr>
+      <w:r>
+        <w:rPr>
+          <w:rtl w:val="0"/>
+        </w:rPr>
+        <w:t xml:space="preserve">         +   C a t e g o r y I n f o                     :   N o t S p e c i f i e d :   ( 2 0 2 6 / 0 3 / 1 9   1 2 : 1 . . . i n g   t o   t r a n s f e r : S t r i n g )   [ ] ,   R e m o t e E x c e p t i o n </w:t>
+        <w:br w:type="textWrapping"/>
+        <w:t xml:space="preserve"> </w:t>
+      </w:r>
+    </w:p>
+    <w:p>
+      <w:pPr>
+        <w:keepNext w:val="0"/>
+        <w:keepLines w:val="0"/>
+        <w:pageBreakBefore w:val="0"/>
+        <w:widowControl w:val="0"/>
+        <w:pBdr>
+          <w:top w:space="0" w:sz="0" w:val="nil"/>
+          <w:left w:space="0" w:sz="0" w:val="nil"/>
+          <w:bottom w:space="0" w:sz="0" w:val="nil"/>
+          <w:right w:space="0" w:sz="0" w:val="nil"/>
+          <w:between w:space="0" w:sz="0" w:val="nil"/>
+        </w:pBdr>
+        <w:shd w:fill="auto" w:val="clear"/>
+        <w:spacing w:after="0" w:before="0" w:line="276" w:lineRule="auto"/>
+        <w:ind w:left="0" w:right="0" w:firstLine="0"/>
+        <w:jc w:val="left"/>
+        <w:rPr/>
+      </w:pPr>
+      <w:r>
+        <w:rPr>
+          <w:rtl w:val="0"/>
+        </w:rPr>
+        <w:t xml:space="preserve">         +   F u l l y Q u a l i f i e d E r r o r I d   :   N a t i v e C o m m a n d E r r o r </w:t>
+        <w:br w:type="textWrapping"/>
+        <w:t xml:space="preserve"> </w:t>
+      </w:r>
+    </w:p>
+    <w:p>
+      <w:pPr>
+        <w:keepNext w:val="0"/>
+        <w:keepLines w:val="0"/>
+        <w:pageBreakBefore w:val="0"/>
+        <w:widowControl w:val="0"/>
+        <w:pBdr>
+          <w:top w:space="0" w:sz="0" w:val="nil"/>
+          <w:left w:space="0" w:sz="0" w:val="nil"/>
+          <w:bottom w:space="0" w:sz="0" w:val="nil"/>
+          <w:right w:space="0" w:sz="0" w:val="nil"/>
+          <w:between w:space="0" w:sz="0" w:val="nil"/>
+        </w:pBdr>
+        <w:shd w:fill="auto" w:val="clear"/>
+        <w:spacing w:after="0" w:before="0" w:line="276" w:lineRule="auto"/>
+        <w:ind w:left="0" w:right="0" w:firstLine="0"/>
+        <w:jc w:val="left"/>
+        <w:rPr/>
+      </w:pPr>
+      <w:r>
+        <w:rPr>
+          <w:rtl w:val="0"/>
+        </w:rPr>
+        <w:t xml:space="preserve">   </w:t>
+        <w:br w:type="textWrapping"/>
+        <w:t xml:space="preserve"> </w:t>
+      </w:r>
+    </w:p>
+    <w:p>
+      <w:pPr>
+        <w:keepNext w:val="0"/>
+        <w:keepLines w:val="0"/>
+        <w:pageBreakBefore w:val="0"/>
+        <w:widowControl w:val="0"/>
+        <w:pBdr>
+          <w:top w:space="0" w:sz="0" w:val="nil"/>
+          <w:left w:space="0" w:sz="0" w:val="nil"/>
+          <w:bottom w:space="0" w:sz="0" w:val="nil"/>
+          <w:right w:space="0" w:sz="0" w:val="nil"/>
+          <w:between w:space="0" w:sz="0" w:val="nil"/>
+        </w:pBdr>
+        <w:shd w:fill="auto" w:val="clear"/>
+        <w:spacing w:after="0" w:before="0" w:line="276" w:lineRule="auto"/>
+        <w:ind w:left="0" w:right="0" w:firstLine="0"/>
+        <w:jc w:val="left"/>
+        <w:rPr/>
+      </w:pPr>
+      <w:r>
+        <w:rPr>
+          <w:rtl w:val="0"/>
+        </w:rPr>
+        <w:t xml:space="preserve"> 2 0 2 6 / 0 3 / 1 9   1 2 : 1 1 : 4 7   I N F O     :   </w:t>
+        <w:br w:type="textWrapping"/>
+        <w:t xml:space="preserve"> </w:t>
+      </w:r>
+    </w:p>
+    <w:p>
+      <w:pPr>
+        <w:keepNext w:val="0"/>
+        <w:keepLines w:val="0"/>
+        <w:pageBreakBefore w:val="0"/>
+        <w:widowControl w:val="0"/>
+        <w:pBdr>
+          <w:top w:space="0" w:sz="0" w:val="nil"/>
+          <w:left w:space="0" w:sz="0" w:val="nil"/>
+          <w:bottom w:space="0" w:sz="0" w:val="nil"/>
+          <w:right w:space="0" w:sz="0" w:val="nil"/>
+          <w:between w:space="0" w:sz="0" w:val="nil"/>
+        </w:pBdr>
+        <w:shd w:fill="auto" w:val="clear"/>
+        <w:spacing w:after="0" w:before="0" w:line="276" w:lineRule="auto"/>
+        <w:ind w:left="0" w:right="0" w:firstLine="0"/>
+        <w:jc w:val="left"/>
+        <w:rPr/>
+      </w:pPr>
+      <w:r>
+        <w:rPr>
+          <w:rtl w:val="0"/>
+        </w:rPr>
+        <w:t xml:space="preserve"> T r a n s f e r r e d :       </w:t>
+        <w:tab/>
+        <w:t xml:space="preserve">                     0   B   /   0   B ,   - ,   0   B / s ,   E T A   - </w:t>
+        <w:br w:type="textWrapping"/>
+        <w:t xml:space="preserve"> </w:t>
+      </w:r>
+    </w:p>
+    <w:p>
+      <w:pPr>
+        <w:keepNext w:val="0"/>
+        <w:keepLines w:val="0"/>
+        <w:pageBreakBefore w:val="0"/>
+        <w:widowControl w:val="0"/>
+        <w:pBdr>
+          <w:top w:space="0" w:sz="0" w:val="nil"/>
+          <w:left w:space="0" w:sz="0" w:val="nil"/>
+          <w:bottom w:space="0" w:sz="0" w:val="nil"/>
+          <w:right w:space="0" w:sz="0" w:val="nil"/>
+          <w:between w:space="0" w:sz="0" w:val="nil"/>
+        </w:pBdr>
+        <w:shd w:fill="auto" w:val="clear"/>
+        <w:spacing w:after="0" w:before="0" w:line="276" w:lineRule="auto"/>
+        <w:ind w:left="0" w:right="0" w:firstLine="0"/>
+        <w:jc w:val="left"/>
+        <w:rPr/>
+      </w:pPr>
+      <w:r>
+        <w:rPr>
+          <w:rtl w:val="0"/>
+        </w:rPr>
+        <w:t xml:space="preserve"> C h e c k s :                                   8   /   8 ,   1 0 0 % ,   L i s t e d   2 4 </w:t>
+        <w:br w:type="textWrapping"/>
+        <w:t xml:space="preserve"> </w:t>
+      </w:r>
+    </w:p>
+    <w:p>
+      <w:pPr>
+        <w:keepNext w:val="0"/>
+        <w:keepLines w:val="0"/>
+        <w:pageBreakBefore w:val="0"/>
+        <w:widowControl w:val="0"/>
+        <w:pBdr>
+          <w:top w:space="0" w:sz="0" w:val="nil"/>
+          <w:left w:space="0" w:sz="0" w:val="nil"/>
+          <w:bottom w:space="0" w:sz="0" w:val="nil"/>
+          <w:right w:space="0" w:sz="0" w:val="nil"/>
+          <w:between w:space="0" w:sz="0" w:val="nil"/>
+        </w:pBdr>
+        <w:shd w:fill="auto" w:val="clear"/>
+        <w:spacing w:after="0" w:before="0" w:line="276" w:lineRule="auto"/>
+        <w:ind w:left="0" w:right="0" w:firstLine="0"/>
+        <w:jc w:val="left"/>
+        <w:rPr/>
+      </w:pPr>
+      <w:r>
+        <w:rPr>
+          <w:rtl w:val="0"/>
+        </w:rPr>
+        <w:t xml:space="preserve"> E l a p s e d   t i m e :                   0 . 2 s </w:t>
+        <w:br w:type="textWrapping"/>
+        <w:t xml:space="preserve"> </w:t>
+      </w:r>
+    </w:p>
+    <w:p>
+      <w:pPr>
+        <w:keepNext w:val="0"/>
+        <w:keepLines w:val="0"/>
+        <w:pageBreakBefore w:val="0"/>
+        <w:widowControl w:val="0"/>
+        <w:pBdr>
+          <w:top w:space="0" w:sz="0" w:val="nil"/>
+          <w:left w:space="0" w:sz="0" w:val="nil"/>
+          <w:bottom w:space="0" w:sz="0" w:val="nil"/>
+          <w:right w:space="0" w:sz="0" w:val="nil"/>
+          <w:between w:space="0" w:sz="0" w:val="nil"/>
+        </w:pBdr>
+        <w:shd w:fill="auto" w:val="clear"/>
+        <w:spacing w:after="0" w:before="0" w:line="276" w:lineRule="auto"/>
+        <w:ind w:left="0" w:right="0" w:firstLine="0"/>
+        <w:jc w:val="left"/>
+        <w:rPr/>
+      </w:pPr>
+      <w:r>
+        <w:rPr>
+          <w:rtl w:val="0"/>
+        </w:rPr>
+        <w:t xml:space="preserve"> </w:t>
+        <w:br w:type="textWrapping"/>
+        <w:t xml:space="preserve"> </w:t>
+      </w:r>
+    </w:p>
+    <w:p>
+      <w:pPr>
+        <w:keepNext w:val="0"/>
+        <w:keepLines w:val="0"/>
+        <w:pageBreakBefore w:val="0"/>
+        <w:widowControl w:val="0"/>
+        <w:pBdr>
+          <w:top w:space="0" w:sz="0" w:val="nil"/>
+          <w:left w:space="0" w:sz="0" w:val="nil"/>
+          <w:bottom w:space="0" w:sz="0" w:val="nil"/>
+          <w:right w:space="0" w:sz="0" w:val="nil"/>
+          <w:between w:space="0" w:sz="0" w:val="nil"/>
+        </w:pBdr>
+        <w:shd w:fill="auto" w:val="clear"/>
+        <w:spacing w:after="0" w:before="0" w:line="276" w:lineRule="auto"/>
+        <w:ind w:left="0" w:right="0" w:firstLine="0"/>
+        <w:jc w:val="left"/>
+        <w:rPr/>
+      </w:pPr>
+      <w:r>
+        <w:rPr>
+          <w:rtl w:val="0"/>
+        </w:rPr>
+        <w:t xml:space="preserve"> r c l o n e . e x e   :   2 0 2 6 / 0 3 / 1 9   1 2 : 1 1 : 4 9   I N F O     :   T h e r e   w a s   n o t h i n g   t o   t r a n s f e r </w:t>
+        <w:br w:type="textWrapping"/>
+        <w:t xml:space="preserve"> </w:t>
+      </w:r>
+    </w:p>
+    <w:p>
+      <w:pPr>
+        <w:keepNext w:val="0"/>
+        <w:keepLines w:val="0"/>
+        <w:pageBreakBefore w:val="0"/>
+        <w:widowControl w:val="0"/>
+        <w:pBdr>
+          <w:top w:space="0" w:sz="0" w:val="nil"/>
+          <w:left w:space="0" w:sz="0" w:val="nil"/>
+          <w:bottom w:space="0" w:sz="0" w:val="nil"/>
+          <w:right w:space="0" w:sz="0" w:val="nil"/>
+          <w:between w:space="0" w:sz="0" w:val="nil"/>
+        </w:pBdr>
+        <w:shd w:fill="auto" w:val="clear"/>
+        <w:spacing w:after="0" w:before="0" w:line="276" w:lineRule="auto"/>
+        <w:ind w:left="0" w:right="0" w:firstLine="0"/>
+        <w:jc w:val="left"/>
+        <w:rPr/>
+      </w:pPr>
+      <w:r>
+        <w:rPr>
+          <w:rtl w:val="0"/>
+        </w:rPr>
+        <w:t xml:space="preserve"> A t   C : \ U s e r s \ S o u r c e - 1 \ D e s k t o p \ r c l o n e \ c o n d u i t _ s y n c . p s 1 : 4 1   c h a r : 1 </w:t>
+        <w:br w:type="textWrapping"/>
+        <w:t xml:space="preserve"> </w:t>
+      </w:r>
+    </w:p>
+    <w:p>
+      <w:pPr>
+        <w:keepNext w:val="0"/>
+        <w:keepLines w:val="0"/>
+        <w:pageBreakBefore w:val="0"/>
+        <w:widowControl w:val="0"/>
+        <w:pBdr>
+          <w:top w:space="0" w:sz="0" w:val="nil"/>
+          <w:left w:space="0" w:sz="0" w:val="nil"/>
+          <w:bottom w:space="0" w:sz="0" w:val="nil"/>
+          <w:right w:space="0" w:sz="0" w:val="nil"/>
+          <w:between w:space="0" w:sz="0" w:val="nil"/>
+        </w:pBdr>
+        <w:shd w:fill="auto" w:val="clear"/>
+        <w:spacing w:after="0" w:before="0" w:line="276" w:lineRule="auto"/>
+        <w:ind w:left="0" w:right="0" w:firstLine="0"/>
+        <w:jc w:val="left"/>
+        <w:rPr/>
+      </w:pPr>
+      <w:r>
+        <w:rPr>
+          <w:rtl w:val="0"/>
+        </w:rPr>
+        <w:t xml:space="preserve"> +   &amp;   $ r c l o n e   c o p y     " C : \ U s e r s \ S o u r c e - 1 \ D e s k t o p \ V 3 R \ c o d e \ p r e v i o u s "   g d r i v e :   . . . </w:t>
+        <w:br w:type="textWrapping"/>
+        <w:t xml:space="preserve"> </w:t>
+      </w:r>
+    </w:p>
+    <w:p>
+      <w:pPr>
+        <w:keepNext w:val="0"/>
+        <w:keepLines w:val="0"/>
+        <w:pageBreakBefore w:val="0"/>
+        <w:widowControl w:val="0"/>
+        <w:pBdr>
+          <w:top w:space="0" w:sz="0" w:val="nil"/>
+          <w:left w:space="0" w:sz="0" w:val="nil"/>
+          <w:bottom w:space="0" w:sz="0" w:val="nil"/>
+          <w:right w:space="0" w:sz="0" w:val="nil"/>
+          <w:between w:space="0" w:sz="0" w:val="nil"/>
+        </w:pBdr>
+        <w:shd w:fill="auto" w:val="clear"/>
+        <w:spacing w:after="0" w:before="0" w:line="276" w:lineRule="auto"/>
+        <w:ind w:left="0" w:right="0" w:firstLine="0"/>
+        <w:jc w:val="left"/>
+        <w:rPr/>
+      </w:pPr>
+      <w:r>
+        <w:rPr>
+          <w:rtl w:val="0"/>
+        </w:rPr>
+        <w:t xml:space="preserve"> +   ~ ~ ~ ~ ~ ~ ~ ~ ~ ~ ~ ~ ~ ~ ~ ~ ~ ~ ~ ~ ~ ~ ~ ~ ~ ~ ~ ~ ~ ~ ~ ~ ~ ~ ~ ~ ~ ~ ~ ~ ~ ~ ~ ~ ~ ~ ~ ~ ~ ~ ~ ~ ~ ~ ~ ~ ~ ~ ~ ~ ~ ~ ~ ~ ~ ~ ~ ~ ~ </w:t>
+        <w:br w:type="textWrapping"/>
+        <w:t xml:space="preserve"> </w:t>
+      </w:r>
+    </w:p>
+    <w:p>
+      <w:pPr>
+        <w:keepNext w:val="0"/>
+        <w:keepLines w:val="0"/>
+        <w:pageBreakBefore w:val="0"/>
+        <w:widowControl w:val="0"/>
+        <w:pBdr>
+          <w:top w:space="0" w:sz="0" w:val="nil"/>
+          <w:left w:space="0" w:sz="0" w:val="nil"/>
+          <w:bottom w:space="0" w:sz="0" w:val="nil"/>
+          <w:right w:space="0" w:sz="0" w:val="nil"/>
+          <w:between w:space="0" w:sz="0" w:val="nil"/>
+        </w:pBdr>
+        <w:shd w:fill="auto" w:val="clear"/>
+        <w:spacing w:after="0" w:before="0" w:line="276" w:lineRule="auto"/>
+        <w:ind w:left="0" w:right="0" w:firstLine="0"/>
+        <w:jc w:val="left"/>
+        <w:rPr/>
+      </w:pPr>
+      <w:r>
+        <w:rPr>
+          <w:rtl w:val="0"/>
+        </w:rPr>
+        <w:t xml:space="preserve">         +   C a t e g o r y I n f o                     :   N o t S p e c i f i e d :   ( 2 0 2 6 / 0 3 / 1 9   1 2 : 1 . . . i n g   t o   t r a n s f e r : S t r i n g )   [ ] ,   R e m o t e E x c e p t i o n </w:t>
+        <w:br w:type="textWrapping"/>
+        <w:t xml:space="preserve"> </w:t>
+      </w:r>
+    </w:p>
+    <w:p>
+      <w:pPr>
+        <w:keepNext w:val="0"/>
+        <w:keepLines w:val="0"/>
+        <w:pageBreakBefore w:val="0"/>
+        <w:widowControl w:val="0"/>
+        <w:pBdr>
+          <w:top w:space="0" w:sz="0" w:val="nil"/>
+          <w:left w:space="0" w:sz="0" w:val="nil"/>
+          <w:bottom w:space="0" w:sz="0" w:val="nil"/>
+          <w:right w:space="0" w:sz="0" w:val="nil"/>
+          <w:between w:space="0" w:sz="0" w:val="nil"/>
+        </w:pBdr>
+        <w:shd w:fill="auto" w:val="clear"/>
+        <w:spacing w:after="0" w:before="0" w:line="276" w:lineRule="auto"/>
+        <w:ind w:left="0" w:right="0" w:firstLine="0"/>
+        <w:jc w:val="left"/>
+        <w:rPr/>
+      </w:pPr>
+      <w:r>
+        <w:rPr>
+          <w:rtl w:val="0"/>
+        </w:rPr>
+        <w:t xml:space="preserve">         +   F u l l y Q u a l i f i e d E r r o r I d   :   N a t i v e C o m m a n d E r r o r </w:t>
+        <w:br w:type="textWrapping"/>
+        <w:t xml:space="preserve"> </w:t>
+      </w:r>
+    </w:p>
+    <w:p>
+      <w:pPr>
+        <w:keepNext w:val="0"/>
+        <w:keepLines w:val="0"/>
+        <w:pageBreakBefore w:val="0"/>
+        <w:widowControl w:val="0"/>
+        <w:pBdr>
+          <w:top w:space="0" w:sz="0" w:val="nil"/>
+          <w:left w:space="0" w:sz="0" w:val="nil"/>
+          <w:bottom w:space="0" w:sz="0" w:val="nil"/>
+          <w:right w:space="0" w:sz="0" w:val="nil"/>
+          <w:between w:space="0" w:sz="0" w:val="nil"/>
+        </w:pBdr>
+        <w:shd w:fill="auto" w:val="clear"/>
+        <w:spacing w:after="0" w:before="0" w:line="276" w:lineRule="auto"/>
+        <w:ind w:left="0" w:right="0" w:firstLine="0"/>
+        <w:jc w:val="left"/>
+        <w:rPr/>
+      </w:pPr>
+      <w:r>
+        <w:rPr>
+          <w:rtl w:val="0"/>
+        </w:rPr>
+        <w:t xml:space="preserve">   </w:t>
+        <w:br w:type="textWrapping"/>
+        <w:t xml:space="preserve"> </w:t>
+      </w:r>
+    </w:p>
+    <w:p>
+      <w:pPr>
+        <w:keepNext w:val="0"/>
+        <w:keepLines w:val="0"/>
+        <w:pageBreakBefore w:val="0"/>
+        <w:widowControl w:val="0"/>
+        <w:pBdr>
+          <w:top w:space="0" w:sz="0" w:val="nil"/>
+          <w:left w:space="0" w:sz="0" w:val="nil"/>
+          <w:bottom w:space="0" w:sz="0" w:val="nil"/>
+          <w:right w:space="0" w:sz="0" w:val="nil"/>
+          <w:between w:space="0" w:sz="0" w:val="nil"/>
+        </w:pBdr>
+        <w:shd w:fill="auto" w:val="clear"/>
+        <w:spacing w:after="0" w:before="0" w:line="276" w:lineRule="auto"/>
+        <w:ind w:left="0" w:right="0" w:firstLine="0"/>
+        <w:jc w:val="left"/>
+        <w:rPr/>
+      </w:pPr>
+      <w:r>
+        <w:rPr>
+          <w:rtl w:val="0"/>
+        </w:rPr>
+        <w:t xml:space="preserve"> 2 0 2 6 / 0 3 / 1 9   1 2 : 1 1 : 4 9   I N F O     :   </w:t>
+        <w:br w:type="textWrapping"/>
+        <w:t xml:space="preserve"> </w:t>
+      </w:r>
+    </w:p>
+    <w:p>
+      <w:pPr>
+        <w:keepNext w:val="0"/>
+        <w:keepLines w:val="0"/>
+        <w:pageBreakBefore w:val="0"/>
+        <w:widowControl w:val="0"/>
+        <w:pBdr>
+          <w:top w:space="0" w:sz="0" w:val="nil"/>
+          <w:left w:space="0" w:sz="0" w:val="nil"/>
+          <w:bottom w:space="0" w:sz="0" w:val="nil"/>
+          <w:right w:space="0" w:sz="0" w:val="nil"/>
+          <w:between w:space="0" w:sz="0" w:val="nil"/>
+        </w:pBdr>
+        <w:shd w:fill="auto" w:val="clear"/>
+        <w:spacing w:after="0" w:before="0" w:line="276" w:lineRule="auto"/>
+        <w:ind w:left="0" w:right="0" w:firstLine="0"/>
+        <w:jc w:val="left"/>
+        <w:rPr/>
+      </w:pPr>
+      <w:r>
+        <w:rPr>
+          <w:rtl w:val="0"/>
+        </w:rPr>
+        <w:t xml:space="preserve"> T r a n s f e r r e d :       </w:t>
+        <w:tab/>
+        <w:t xml:space="preserve">                     0   B   /   0   B ,   - ,   0   B / s ,   E T A   - </w:t>
+        <w:br w:type="textWrapping"/>
+        <w:t xml:space="preserve"> </w:t>
+      </w:r>
+    </w:p>
+    <w:p>
+      <w:pPr>
+        <w:keepNext w:val="0"/>
+        <w:keepLines w:val="0"/>
+        <w:pageBreakBefore w:val="0"/>
+        <w:widowControl w:val="0"/>
+        <w:pBdr>
+          <w:top w:space="0" w:sz="0" w:val="nil"/>
+          <w:left w:space="0" w:sz="0" w:val="nil"/>
+          <w:bottom w:space="0" w:sz="0" w:val="nil"/>
+          <w:right w:space="0" w:sz="0" w:val="nil"/>
+          <w:between w:space="0" w:sz="0" w:val="nil"/>
+        </w:pBdr>
+        <w:shd w:fill="auto" w:val="clear"/>
+        <w:spacing w:after="0" w:before="0" w:line="276" w:lineRule="auto"/>
+        <w:ind w:left="0" w:right="0" w:firstLine="0"/>
+        <w:jc w:val="left"/>
+        <w:rPr/>
+      </w:pPr>
+      <w:r>
+        <w:rPr>
+          <w:rtl w:val="0"/>
+        </w:rPr>
+        <w:t xml:space="preserve"> C h e c k s :                                   8   /   8 ,   1 0 0 % ,   L i s t e d   2 4 </w:t>
+        <w:br w:type="textWrapping"/>
+        <w:t xml:space="preserve"> </w:t>
+      </w:r>
+    </w:p>
+    <w:p>
+      <w:pPr>
+        <w:keepNext w:val="0"/>
+        <w:keepLines w:val="0"/>
+        <w:pageBreakBefore w:val="0"/>
+        <w:widowControl w:val="0"/>
+        <w:pBdr>
+          <w:top w:space="0" w:sz="0" w:val="nil"/>
+          <w:left w:space="0" w:sz="0" w:val="nil"/>
+          <w:bottom w:space="0" w:sz="0" w:val="nil"/>
+          <w:right w:space="0" w:sz="0" w:val="nil"/>
+          <w:between w:space="0" w:sz="0" w:val="nil"/>
+        </w:pBdr>
+        <w:shd w:fill="auto" w:val="clear"/>
+        <w:spacing w:after="0" w:before="0" w:line="276" w:lineRule="auto"/>
+        <w:ind w:left="0" w:right="0" w:firstLine="0"/>
+        <w:jc w:val="left"/>
+        <w:rPr/>
+      </w:pPr>
+      <w:r>
+        <w:rPr>
+          <w:rtl w:val="0"/>
+        </w:rPr>
+        <w:t xml:space="preserve"> E l a p s e d   t i m e :                   0 . 3 s </w:t>
+        <w:br w:type="textWrapping"/>
+        <w:t xml:space="preserve"> </w:t>
+      </w:r>
+    </w:p>
+    <w:p>
+      <w:pPr>
+        <w:keepNext w:val="0"/>
+        <w:keepLines w:val="0"/>
+        <w:pageBreakBefore w:val="0"/>
+        <w:widowControl w:val="0"/>
+        <w:pBdr>
+          <w:top w:space="0" w:sz="0" w:val="nil"/>
+          <w:left w:space="0" w:sz="0" w:val="nil"/>
+          <w:bottom w:space="0" w:sz="0" w:val="nil"/>
+          <w:right w:space="0" w:sz="0" w:val="nil"/>
+          <w:between w:space="0" w:sz="0" w:val="nil"/>
+        </w:pBdr>
+        <w:shd w:fill="auto" w:val="clear"/>
+        <w:spacing w:after="0" w:before="0" w:line="276" w:lineRule="auto"/>
+        <w:ind w:left="0" w:right="0" w:firstLine="0"/>
+        <w:jc w:val="left"/>
+        <w:rPr/>
+      </w:pPr>
+      <w:r>
+        <w:rPr>
+          <w:rtl w:val="0"/>
+        </w:rPr>
+        <w:t xml:space="preserve"> </w:t>
+        <w:br w:type="textWrapping"/>
+        <w:t xml:space="preserve"> </w:t>
+      </w:r>
+    </w:p>
+    <w:p>
+      <w:pPr>
+        <w:keepNext w:val="0"/>
+        <w:keepLines w:val="0"/>
+        <w:pageBreakBefore w:val="0"/>
+        <w:widowControl w:val="0"/>
+        <w:pBdr>
+          <w:top w:space="0" w:sz="0" w:val="nil"/>
+          <w:left w:space="0" w:sz="0" w:val="nil"/>
+          <w:bottom w:space="0" w:sz="0" w:val="nil"/>
+          <w:right w:space="0" w:sz="0" w:val="nil"/>
+          <w:between w:space="0" w:sz="0" w:val="nil"/>
+        </w:pBdr>
+        <w:shd w:fill="auto" w:val="clear"/>
+        <w:spacing w:after="0" w:before="0" w:line="276" w:lineRule="auto"/>
+        <w:ind w:left="0" w:right="0" w:firstLine="0"/>
+        <w:jc w:val="left"/>
+        <w:rPr/>
+      </w:pPr>
+      <w:r>
+        <w:rPr>
+          <w:rtl w:val="0"/>
+        </w:rPr>
+        <w:t xml:space="preserve"> [Stage 4] Version backup sync complete</w:t>
+        <w:br w:type="textWrapping"/>
+      </w:r>
+    </w:p>
+    <w:p>
+      <w:pPr>
+        <w:keepNext w:val="0"/>
+        <w:keepLines w:val="0"/>
+        <w:pageBreakBefore w:val="0"/>
+        <w:widowControl w:val="0"/>
+        <w:pBdr>
+          <w:top w:space="0" w:sz="0" w:val="nil"/>
+          <w:left w:space="0" w:sz="0" w:val="nil"/>
+          <w:bottom w:space="0" w:sz="0" w:val="nil"/>
+          <w:right w:space="0" w:sz="0" w:val="nil"/>
+          <w:between w:space="0" w:sz="0" w:val="nil"/>
+        </w:pBdr>
+        <w:shd w:fill="auto" w:val="clear"/>
+        <w:spacing w:after="0" w:before="0" w:line="276" w:lineRule="auto"/>
+        <w:ind w:left="0" w:right="0" w:firstLine="0"/>
+        <w:jc w:val="left"/>
+        <w:rPr/>
+      </w:pPr>
+      <w:r>
+        <w:rPr>
+          <w:rtl w:val="0"/>
+        </w:rPr>
+        <w:t xml:space="preserve">r c l o n e . e x e   :   2 0 2 6 / 0 3 / 1 9   1 2 : 1 1 : 5 1   I N F O     :   T h e r e   w a s   n o t h i n g   t o   t r a n s f e r </w:t>
+        <w:br w:type="textWrapping"/>
+        <w:t xml:space="preserve"> </w:t>
+      </w:r>
+    </w:p>
+    <w:p>
+      <w:pPr>
+        <w:keepNext w:val="0"/>
+        <w:keepLines w:val="0"/>
+        <w:pageBreakBefore w:val="0"/>
+        <w:widowControl w:val="0"/>
+        <w:pBdr>
+          <w:top w:space="0" w:sz="0" w:val="nil"/>
+          <w:left w:space="0" w:sz="0" w:val="nil"/>
+          <w:bottom w:space="0" w:sz="0" w:val="nil"/>
+          <w:right w:space="0" w:sz="0" w:val="nil"/>
+          <w:between w:space="0" w:sz="0" w:val="nil"/>
+        </w:pBdr>
+        <w:shd w:fill="auto" w:val="clear"/>
+        <w:spacing w:after="0" w:before="0" w:line="276" w:lineRule="auto"/>
+        <w:ind w:left="0" w:right="0" w:firstLine="0"/>
+        <w:jc w:val="left"/>
+        <w:rPr/>
+      </w:pPr>
+      <w:r>
+        <w:rPr>
+          <w:rtl w:val="0"/>
+        </w:rPr>
+        <w:t xml:space="preserve"> A t   C : \ U s e r s \ S o u r c e - 1 \ D e s k t o p \ r c l o n e \ c o n d u i t _ s y n c . p s 1 : 4 5   c h a r : 1 </w:t>
+        <w:br w:type="textWrapping"/>
+        <w:t xml:space="preserve"> </w:t>
+      </w:r>
+    </w:p>
+    <w:p>
+      <w:pPr>
+        <w:keepNext w:val="0"/>
+        <w:keepLines w:val="0"/>
+        <w:pageBreakBefore w:val="0"/>
+        <w:widowControl w:val="0"/>
+        <w:pBdr>
+          <w:top w:space="0" w:sz="0" w:val="nil"/>
+          <w:left w:space="0" w:sz="0" w:val="nil"/>
+          <w:bottom w:space="0" w:sz="0" w:val="nil"/>
+          <w:right w:space="0" w:sz="0" w:val="nil"/>
+          <w:between w:space="0" w:sz="0" w:val="nil"/>
+        </w:pBdr>
+        <w:shd w:fill="auto" w:val="clear"/>
+        <w:spacing w:after="0" w:before="0" w:line="276" w:lineRule="auto"/>
+        <w:ind w:left="0" w:right="0" w:firstLine="0"/>
+        <w:jc w:val="left"/>
+        <w:rPr/>
+      </w:pPr>
+      <w:r>
+        <w:rPr>
+          <w:rtl w:val="0"/>
+        </w:rPr>
+        <w:t xml:space="preserve"> +   &amp;   $ r c l o n e   c o p y   - - f i l t e r - f r o m   $ f i l t e r   " $ s o u r c e R e p o r t s C o r e \ p r o j e c t "   g d r   . . . </w:t>
+        <w:br w:type="textWrapping"/>
+        <w:t xml:space="preserve"> </w:t>
+      </w:r>
+    </w:p>
+    <w:p>
+      <w:pPr>
+        <w:keepNext w:val="0"/>
+        <w:keepLines w:val="0"/>
+        <w:pageBreakBefore w:val="0"/>
+        <w:widowControl w:val="0"/>
+        <w:pBdr>
+          <w:top w:space="0" w:sz="0" w:val="nil"/>
+          <w:left w:space="0" w:sz="0" w:val="nil"/>
+          <w:bottom w:space="0" w:sz="0" w:val="nil"/>
+          <w:right w:space="0" w:sz="0" w:val="nil"/>
+          <w:between w:space="0" w:sz="0" w:val="nil"/>
+        </w:pBdr>
+        <w:shd w:fill="auto" w:val="clear"/>
+        <w:spacing w:after="0" w:before="0" w:line="276" w:lineRule="auto"/>
+        <w:ind w:left="0" w:right="0" w:firstLine="0"/>
+        <w:jc w:val="left"/>
+        <w:rPr/>
+      </w:pPr>
+      <w:r>
+        <w:rPr>
+          <w:rtl w:val="0"/>
+        </w:rPr>
+        <w:t xml:space="preserve"> +   ~ ~ ~ ~ ~ ~ ~ ~ ~ ~ ~ ~ ~ ~ ~ ~ ~ ~ ~ ~ ~ ~ ~ ~ ~ ~ ~ ~ ~ ~ ~ ~ ~ ~ ~ ~ ~ ~ ~ ~ ~ ~ ~ ~ ~ ~ ~ ~ ~ ~ ~ ~ ~ ~ ~ ~ ~ ~ ~ ~ ~ ~ ~ ~ ~ ~ ~ ~ ~ </w:t>
+        <w:br w:type="textWrapping"/>
+        <w:t xml:space="preserve"> </w:t>
+      </w:r>
+    </w:p>
+    <w:p>
+      <w:pPr>
+        <w:keepNext w:val="0"/>
+        <w:keepLines w:val="0"/>
+        <w:pageBreakBefore w:val="0"/>
+        <w:widowControl w:val="0"/>
+        <w:pBdr>
+          <w:top w:space="0" w:sz="0" w:val="nil"/>
+          <w:left w:space="0" w:sz="0" w:val="nil"/>
+          <w:bottom w:space="0" w:sz="0" w:val="nil"/>
+          <w:right w:space="0" w:sz="0" w:val="nil"/>
+          <w:between w:space="0" w:sz="0" w:val="nil"/>
+        </w:pBdr>
+        <w:shd w:fill="auto" w:val="clear"/>
+        <w:spacing w:after="0" w:before="0" w:line="276" w:lineRule="auto"/>
+        <w:ind w:left="0" w:right="0" w:firstLine="0"/>
+        <w:jc w:val="left"/>
+        <w:rPr/>
+      </w:pPr>
+      <w:r>
+        <w:rPr>
+          <w:rtl w:val="0"/>
+        </w:rPr>
+        <w:t xml:space="preserve">         +   C a t e g o r y I n f o                     :   N o t S p e c i f i e d :   ( 2 0 2 6 / 0 3 / 1 9   1 2 : 1 . . . i n g   t o   t r a n s f e r : S t r i n g )   [ ] ,   R e m o t e E x c e p t i o n </w:t>
+        <w:br w:type="textWrapping"/>
+        <w:t xml:space="preserve"> </w:t>
+      </w:r>
+    </w:p>
+    <w:p>
+      <w:pPr>
+        <w:keepNext w:val="0"/>
+        <w:keepLines w:val="0"/>
+        <w:pageBreakBefore w:val="0"/>
+        <w:widowControl w:val="0"/>
+        <w:pBdr>
+          <w:top w:space="0" w:sz="0" w:val="nil"/>
+          <w:left w:space="0" w:sz="0" w:val="nil"/>
+          <w:bottom w:space="0" w:sz="0" w:val="nil"/>
+          <w:right w:space="0" w:sz="0" w:val="nil"/>
+          <w:between w:space="0" w:sz="0" w:val="nil"/>
+        </w:pBdr>
+        <w:shd w:fill="auto" w:val="clear"/>
+        <w:spacing w:after="0" w:before="0" w:line="276" w:lineRule="auto"/>
+        <w:ind w:left="0" w:right="0" w:firstLine="0"/>
+        <w:jc w:val="left"/>
+        <w:rPr/>
+      </w:pPr>
+      <w:r>
+        <w:rPr>
+          <w:rtl w:val="0"/>
+        </w:rPr>
+        <w:t xml:space="preserve">         +   F u l l y Q u a l i f i e d E r r o r I d   :   N a t i v e C o m m a n d E r r o r </w:t>
+        <w:br w:type="textWrapping"/>
+        <w:t xml:space="preserve"> </w:t>
+      </w:r>
+    </w:p>
+    <w:p>
+      <w:pPr>
+        <w:keepNext w:val="0"/>
+        <w:keepLines w:val="0"/>
+        <w:pageBreakBefore w:val="0"/>
+        <w:widowControl w:val="0"/>
+        <w:pBdr>
+          <w:top w:space="0" w:sz="0" w:val="nil"/>
+          <w:left w:space="0" w:sz="0" w:val="nil"/>
+          <w:bottom w:space="0" w:sz="0" w:val="nil"/>
+          <w:right w:space="0" w:sz="0" w:val="nil"/>
+          <w:between w:space="0" w:sz="0" w:val="nil"/>
+        </w:pBdr>
+        <w:shd w:fill="auto" w:val="clear"/>
+        <w:spacing w:after="0" w:before="0" w:line="276" w:lineRule="auto"/>
+        <w:ind w:left="0" w:right="0" w:firstLine="0"/>
+        <w:jc w:val="left"/>
+        <w:rPr/>
+      </w:pPr>
+      <w:r>
+        <w:rPr>
+          <w:rtl w:val="0"/>
+        </w:rPr>
+        <w:t xml:space="preserve">   </w:t>
+        <w:br w:type="textWrapping"/>
+        <w:t xml:space="preserve"> </w:t>
+      </w:r>
+    </w:p>
+    <w:p>
+      <w:pPr>
+        <w:keepNext w:val="0"/>
+        <w:keepLines w:val="0"/>
+        <w:pageBreakBefore w:val="0"/>
+        <w:widowControl w:val="0"/>
+        <w:pBdr>
+          <w:top w:space="0" w:sz="0" w:val="nil"/>
+          <w:left w:space="0" w:sz="0" w:val="nil"/>
+          <w:bottom w:space="0" w:sz="0" w:val="nil"/>
+          <w:right w:space="0" w:sz="0" w:val="nil"/>
+          <w:between w:space="0" w:sz="0" w:val="nil"/>
+        </w:pBdr>
+        <w:shd w:fill="auto" w:val="clear"/>
+        <w:spacing w:after="0" w:before="0" w:line="276" w:lineRule="auto"/>
+        <w:ind w:left="0" w:right="0" w:firstLine="0"/>
+        <w:jc w:val="left"/>
+        <w:rPr/>
+      </w:pPr>
+      <w:r>
+        <w:rPr>
+          <w:rtl w:val="0"/>
+        </w:rPr>
+        <w:t xml:space="preserve"> 2 0 2 6 / 0 3 / 1 9   1 2 : 1 1 : 5 1   I N F O     :   </w:t>
+        <w:br w:type="textWrapping"/>
+        <w:t xml:space="preserve"> </w:t>
+      </w:r>
+    </w:p>
+    <w:p>
+      <w:pPr>
+        <w:keepNext w:val="0"/>
+        <w:keepLines w:val="0"/>
+        <w:pageBreakBefore w:val="0"/>
+        <w:widowControl w:val="0"/>
+        <w:pBdr>
+          <w:top w:space="0" w:sz="0" w:val="nil"/>
+          <w:left w:space="0" w:sz="0" w:val="nil"/>
+          <w:bottom w:space="0" w:sz="0" w:val="nil"/>
+          <w:right w:space="0" w:sz="0" w:val="nil"/>
+          <w:between w:space="0" w:sz="0" w:val="nil"/>
+        </w:pBdr>
+        <w:shd w:fill="auto" w:val="clear"/>
+        <w:spacing w:after="0" w:before="0" w:line="276" w:lineRule="auto"/>
+        <w:ind w:left="0" w:right="0" w:firstLine="0"/>
+        <w:jc w:val="left"/>
+        <w:rPr/>
+      </w:pPr>
+      <w:r>
+        <w:rPr>
+          <w:rtl w:val="0"/>
+        </w:rPr>
+        <w:t xml:space="preserve"> T r a n s f e r r e d :       </w:t>
+        <w:tab/>
+        <w:t xml:space="preserve">                     0   B   /   0   B ,   - ,   0   B / s ,   E T A   - </w:t>
+        <w:br w:type="textWrapping"/>
+        <w:t xml:space="preserve"> </w:t>
+      </w:r>
+    </w:p>
+    <w:p>
+      <w:pPr>
+        <w:keepNext w:val="0"/>
+        <w:keepLines w:val="0"/>
+        <w:pageBreakBefore w:val="0"/>
+        <w:widowControl w:val="0"/>
+        <w:pBdr>
+          <w:top w:space="0" w:sz="0" w:val="nil"/>
+          <w:left w:space="0" w:sz="0" w:val="nil"/>
+          <w:bottom w:space="0" w:sz="0" w:val="nil"/>
+          <w:right w:space="0" w:sz="0" w:val="nil"/>
+          <w:between w:space="0" w:sz="0" w:val="nil"/>
+        </w:pBdr>
+        <w:shd w:fill="auto" w:val="clear"/>
+        <w:spacing w:after="0" w:before="0" w:line="276" w:lineRule="auto"/>
+        <w:ind w:left="0" w:right="0" w:firstLine="0"/>
+        <w:jc w:val="left"/>
+        <w:rPr/>
+      </w:pPr>
+      <w:r>
+        <w:rPr>
+          <w:rtl w:val="0"/>
+        </w:rPr>
+        <w:t xml:space="preserve"> C h e c k s :                                 1 3   /   1 3 ,   1 0 0 % ,   L i s t e d   3 9 </w:t>
+        <w:br w:type="textWrapping"/>
+        <w:t xml:space="preserve"> </w:t>
+      </w:r>
+    </w:p>
+    <w:p>
+      <w:pPr>
+        <w:keepNext w:val="0"/>
+        <w:keepLines w:val="0"/>
+        <w:pageBreakBefore w:val="0"/>
+        <w:widowControl w:val="0"/>
+        <w:pBdr>
+          <w:top w:space="0" w:sz="0" w:val="nil"/>
+          <w:left w:space="0" w:sz="0" w:val="nil"/>
+          <w:bottom w:space="0" w:sz="0" w:val="nil"/>
+          <w:right w:space="0" w:sz="0" w:val="nil"/>
+          <w:between w:space="0" w:sz="0" w:val="nil"/>
+        </w:pBdr>
+        <w:shd w:fill="auto" w:val="clear"/>
+        <w:spacing w:after="0" w:before="0" w:line="276" w:lineRule="auto"/>
+        <w:ind w:left="0" w:right="0" w:firstLine="0"/>
+        <w:jc w:val="left"/>
+        <w:rPr/>
+      </w:pPr>
+      <w:r>
+        <w:rPr>
+          <w:rtl w:val="0"/>
+        </w:rPr>
+        <w:t xml:space="preserve"> E l a p s e d   t i m e :                   0 . 3 s </w:t>
+        <w:br w:type="textWrapping"/>
+        <w:t xml:space="preserve"> </w:t>
+      </w:r>
+    </w:p>
+    <w:p>
+      <w:pPr>
+        <w:keepNext w:val="0"/>
+        <w:keepLines w:val="0"/>
+        <w:pageBreakBefore w:val="0"/>
+        <w:widowControl w:val="0"/>
+        <w:pBdr>
+          <w:top w:space="0" w:sz="0" w:val="nil"/>
+          <w:left w:space="0" w:sz="0" w:val="nil"/>
+          <w:bottom w:space="0" w:sz="0" w:val="nil"/>
+          <w:right w:space="0" w:sz="0" w:val="nil"/>
+          <w:between w:space="0" w:sz="0" w:val="nil"/>
+        </w:pBdr>
+        <w:shd w:fill="auto" w:val="clear"/>
+        <w:spacing w:after="0" w:before="0" w:line="276" w:lineRule="auto"/>
+        <w:ind w:left="0" w:right="0" w:firstLine="0"/>
+        <w:jc w:val="left"/>
+        <w:rPr/>
+      </w:pPr>
+      <w:r>
+        <w:rPr>
+          <w:rtl w:val="0"/>
+        </w:rPr>
+        <w:t xml:space="preserve"> </w:t>
+        <w:br w:type="textWrapping"/>
+        <w:t xml:space="preserve"> </w:t>
+      </w:r>
+    </w:p>
+    <w:p>
+      <w:pPr>
+        <w:keepNext w:val="0"/>
+        <w:keepLines w:val="0"/>
+        <w:pageBreakBefore w:val="0"/>
+        <w:widowControl w:val="0"/>
+        <w:pBdr>
+          <w:top w:space="0" w:sz="0" w:val="nil"/>
+          <w:left w:space="0" w:sz="0" w:val="nil"/>
+          <w:bottom w:space="0" w:sz="0" w:val="nil"/>
+          <w:right w:space="0" w:sz="0" w:val="nil"/>
+          <w:between w:space="0" w:sz="0" w:val="nil"/>
+        </w:pBdr>
+        <w:shd w:fill="auto" w:val="clear"/>
+        <w:spacing w:after="0" w:before="0" w:line="276" w:lineRule="auto"/>
+        <w:ind w:left="0" w:right="0" w:firstLine="0"/>
+        <w:jc w:val="left"/>
+        <w:rPr/>
+      </w:pPr>
+      <w:r>
+        <w:rPr>
+          <w:rtl w:val="0"/>
+        </w:rPr>
+        <w:t xml:space="preserve"> r c l o n e . e x e   :   2 0 2 6 / 0 3 / 1 9   1 2 : 1 1 : 5 3   I N F O     :   T h e r e   w a s   n o t h i n g   t o   t r a n s f e r </w:t>
+        <w:br w:type="textWrapping"/>
+        <w:t xml:space="preserve"> </w:t>
+      </w:r>
+    </w:p>
+    <w:p>
+      <w:pPr>
+        <w:keepNext w:val="0"/>
+        <w:keepLines w:val="0"/>
+        <w:pageBreakBefore w:val="0"/>
+        <w:widowControl w:val="0"/>
+        <w:pBdr>
+          <w:top w:space="0" w:sz="0" w:val="nil"/>
+          <w:left w:space="0" w:sz="0" w:val="nil"/>
+          <w:bottom w:space="0" w:sz="0" w:val="nil"/>
+          <w:right w:space="0" w:sz="0" w:val="nil"/>
+          <w:between w:space="0" w:sz="0" w:val="nil"/>
+        </w:pBdr>
+        <w:shd w:fill="auto" w:val="clear"/>
+        <w:spacing w:after="0" w:before="0" w:line="276" w:lineRule="auto"/>
+        <w:ind w:left="0" w:right="0" w:firstLine="0"/>
+        <w:jc w:val="left"/>
+        <w:rPr/>
+      </w:pPr>
+      <w:r>
+        <w:rPr>
+          <w:rtl w:val="0"/>
+        </w:rPr>
+        <w:t xml:space="preserve"> A t   C : \ U s e r s \ S o u r c e - 1 \ D e s k t o p \ r c l o n e \ c o n d u i t _ s y n c . p s 1 : 4 6   c h a r : 1 </w:t>
+        <w:br w:type="textWrapping"/>
+        <w:t xml:space="preserve"> </w:t>
+      </w:r>
+    </w:p>
+    <w:p>
+      <w:pPr>
+        <w:keepNext w:val="0"/>
+        <w:keepLines w:val="0"/>
+        <w:pageBreakBefore w:val="0"/>
+        <w:widowControl w:val="0"/>
+        <w:pBdr>
+          <w:top w:space="0" w:sz="0" w:val="nil"/>
+          <w:left w:space="0" w:sz="0" w:val="nil"/>
+          <w:bottom w:space="0" w:sz="0" w:val="nil"/>
+          <w:right w:space="0" w:sz="0" w:val="nil"/>
+          <w:between w:space="0" w:sz="0" w:val="nil"/>
+        </w:pBdr>
+        <w:shd w:fill="auto" w:val="clear"/>
+        <w:spacing w:after="0" w:before="0" w:line="276" w:lineRule="auto"/>
+        <w:ind w:left="0" w:right="0" w:firstLine="0"/>
+        <w:jc w:val="left"/>
+        <w:rPr/>
+      </w:pPr>
+      <w:r>
+        <w:rPr>
+          <w:rtl w:val="0"/>
+        </w:rPr>
+        <w:t xml:space="preserve"> +   &amp;   $ r c l o n e   c o p y   - - f i l t e r - f r o m   $ f i l t e r   " $ s o u r c e R e p o r t s C o r e \ c o d i n g "   g d r i   . . . </w:t>
+        <w:br w:type="textWrapping"/>
+        <w:t xml:space="preserve"> </w:t>
+      </w:r>
+    </w:p>
+    <w:p>
+      <w:pPr>
+        <w:keepNext w:val="0"/>
+        <w:keepLines w:val="0"/>
+        <w:pageBreakBefore w:val="0"/>
+        <w:widowControl w:val="0"/>
+        <w:pBdr>
+          <w:top w:space="0" w:sz="0" w:val="nil"/>
+          <w:left w:space="0" w:sz="0" w:val="nil"/>
+          <w:bottom w:space="0" w:sz="0" w:val="nil"/>
+          <w:right w:space="0" w:sz="0" w:val="nil"/>
+          <w:between w:space="0" w:sz="0" w:val="nil"/>
+        </w:pBdr>
+        <w:shd w:fill="auto" w:val="clear"/>
+        <w:spacing w:after="0" w:before="0" w:line="276" w:lineRule="auto"/>
+        <w:ind w:left="0" w:right="0" w:firstLine="0"/>
+        <w:jc w:val="left"/>
+        <w:rPr/>
+      </w:pPr>
+      <w:r>
+        <w:rPr>
+          <w:rtl w:val="0"/>
+        </w:rPr>
+        <w:t xml:space="preserve"> +   ~ ~ ~ ~ ~ ~ ~ ~ ~ ~ ~ ~ ~ ~ ~ ~ ~ ~ ~ ~ ~ ~ ~ ~ ~ ~ ~ ~ ~ ~ ~ ~ ~ ~ ~ ~ ~ ~ ~ ~ ~ ~ ~ ~ ~ ~ ~ ~ ~ ~ ~ ~ ~ ~ ~ ~ ~ ~ ~ ~ ~ ~ ~ ~ ~ ~ ~ ~ ~ </w:t>
+        <w:br w:type="textWrapping"/>
+        <w:t xml:space="preserve"> </w:t>
+      </w:r>
+    </w:p>
+    <w:p>
+      <w:pPr>
+        <w:keepNext w:val="0"/>
+        <w:keepLines w:val="0"/>
+        <w:pageBreakBefore w:val="0"/>
+        <w:widowControl w:val="0"/>
+        <w:pBdr>
+          <w:top w:space="0" w:sz="0" w:val="nil"/>
+          <w:left w:space="0" w:sz="0" w:val="nil"/>
+          <w:bottom w:space="0" w:sz="0" w:val="nil"/>
+          <w:right w:space="0" w:sz="0" w:val="nil"/>
+          <w:between w:space="0" w:sz="0" w:val="nil"/>
+        </w:pBdr>
+        <w:shd w:fill="auto" w:val="clear"/>
+        <w:spacing w:after="0" w:before="0" w:line="276" w:lineRule="auto"/>
+        <w:ind w:left="0" w:right="0" w:firstLine="0"/>
+        <w:jc w:val="left"/>
+        <w:rPr/>
+      </w:pPr>
+      <w:r>
+        <w:rPr>
+          <w:rtl w:val="0"/>
+        </w:rPr>
+        <w:t xml:space="preserve">         +   C a t e g o r y I n f o                     :   N o t S p e c i f i e d :   ( 2 0 2 6 / 0 3 / 1 9   1 2 : 1 . . . i n g   t o   t r a n s f e r : S t r i n g )   [ ] ,   R e m o t e E x c e p t i o n </w:t>
+        <w:br w:type="textWrapping"/>
+        <w:t xml:space="preserve"> </w:t>
+      </w:r>
+    </w:p>
+    <w:p>
+      <w:pPr>
+        <w:keepNext w:val="0"/>
+        <w:keepLines w:val="0"/>
+        <w:pageBreakBefore w:val="0"/>
+        <w:widowControl w:val="0"/>
+        <w:pBdr>
+          <w:top w:space="0" w:sz="0" w:val="nil"/>
+          <w:left w:space="0" w:sz="0" w:val="nil"/>
+          <w:bottom w:space="0" w:sz="0" w:val="nil"/>
+          <w:right w:space="0" w:sz="0" w:val="nil"/>
+          <w:between w:space="0" w:sz="0" w:val="nil"/>
+        </w:pBdr>
+        <w:shd w:fill="auto" w:val="clear"/>
+        <w:spacing w:after="0" w:before="0" w:line="276" w:lineRule="auto"/>
+        <w:ind w:left="0" w:right="0" w:firstLine="0"/>
+        <w:jc w:val="left"/>
+        <w:rPr/>
+      </w:pPr>
+      <w:r>
+        <w:rPr>
+          <w:rtl w:val="0"/>
+        </w:rPr>
+        <w:t xml:space="preserve">         +   F u l l y Q u a l i f i e d E r r o r I d   :   N a t i v e C o m m a n d E r r o r </w:t>
+        <w:br w:type="textWrapping"/>
+        <w:t xml:space="preserve"> </w:t>
+      </w:r>
+    </w:p>
+    <w:p>
+      <w:pPr>
+        <w:keepNext w:val="0"/>
+        <w:keepLines w:val="0"/>
+        <w:pageBreakBefore w:val="0"/>
+        <w:widowControl w:val="0"/>
+        <w:pBdr>
+          <w:top w:space="0" w:sz="0" w:val="nil"/>
+          <w:left w:space="0" w:sz="0" w:val="nil"/>
+          <w:bottom w:space="0" w:sz="0" w:val="nil"/>
+          <w:right w:space="0" w:sz="0" w:val="nil"/>
+          <w:between w:space="0" w:sz="0" w:val="nil"/>
+        </w:pBdr>
+        <w:shd w:fill="auto" w:val="clear"/>
+        <w:spacing w:after="0" w:before="0" w:line="276" w:lineRule="auto"/>
+        <w:ind w:left="0" w:right="0" w:firstLine="0"/>
+        <w:jc w:val="left"/>
+        <w:rPr/>
+      </w:pPr>
+      <w:r>
+        <w:rPr>
+          <w:rtl w:val="0"/>
+        </w:rPr>
+        <w:t xml:space="preserve">   </w:t>
+        <w:br w:type="textWrapping"/>
+        <w:t xml:space="preserve"> </w:t>
+      </w:r>
+    </w:p>
+    <w:p>
+      <w:pPr>
+        <w:keepNext w:val="0"/>
+        <w:keepLines w:val="0"/>
+        <w:pageBreakBefore w:val="0"/>
+        <w:widowControl w:val="0"/>
+        <w:pBdr>
+          <w:top w:space="0" w:sz="0" w:val="nil"/>
+          <w:left w:space="0" w:sz="0" w:val="nil"/>
+          <w:bottom w:space="0" w:sz="0" w:val="nil"/>
+          <w:right w:space="0" w:sz="0" w:val="nil"/>
+          <w:between w:space="0" w:sz="0" w:val="nil"/>
+        </w:pBdr>
+        <w:shd w:fill="auto" w:val="clear"/>
+        <w:spacing w:after="0" w:before="0" w:line="276" w:lineRule="auto"/>
+        <w:ind w:left="0" w:right="0" w:firstLine="0"/>
+        <w:jc w:val="left"/>
+        <w:rPr/>
+      </w:pPr>
+      <w:r>
+        <w:rPr>
+          <w:rtl w:val="0"/>
+        </w:rPr>
+        <w:t xml:space="preserve"> 2 0 2 6 / 0 3 / 1 9   1 2 : 1 1 : 5 3   I N F O     :   </w:t>
+        <w:br w:type="textWrapping"/>
+        <w:t xml:space="preserve"> </w:t>
+      </w:r>
+    </w:p>
+    <w:p>
+      <w:pPr>
+        <w:keepNext w:val="0"/>
+        <w:keepLines w:val="0"/>
+        <w:pageBreakBefore w:val="0"/>
+        <w:widowControl w:val="0"/>
+        <w:pBdr>
+          <w:top w:space="0" w:sz="0" w:val="nil"/>
+          <w:left w:space="0" w:sz="0" w:val="nil"/>
+          <w:bottom w:space="0" w:sz="0" w:val="nil"/>
+          <w:right w:space="0" w:sz="0" w:val="nil"/>
+          <w:between w:space="0" w:sz="0" w:val="nil"/>
+        </w:pBdr>
+        <w:shd w:fill="auto" w:val="clear"/>
+        <w:spacing w:after="0" w:before="0" w:line="276" w:lineRule="auto"/>
+        <w:ind w:left="0" w:right="0" w:firstLine="0"/>
+        <w:jc w:val="left"/>
+        <w:rPr/>
+      </w:pPr>
+      <w:r>
+        <w:rPr>
+          <w:rtl w:val="0"/>
+        </w:rPr>
+        <w:t xml:space="preserve"> T r a n s f e r r e d :       </w:t>
+        <w:tab/>
+        <w:t xml:space="preserve">                     0   B   /   0   B ,   - ,   0   B / s ,   E T A   - </w:t>
+        <w:br w:type="textWrapping"/>
+        <w:t xml:space="preserve"> </w:t>
+      </w:r>
+    </w:p>
+    <w:p>
+      <w:pPr>
+        <w:keepNext w:val="0"/>
+        <w:keepLines w:val="0"/>
+        <w:pageBreakBefore w:val="0"/>
+        <w:widowControl w:val="0"/>
+        <w:pBdr>
+          <w:top w:space="0" w:sz="0" w:val="nil"/>
+          <w:left w:space="0" w:sz="0" w:val="nil"/>
+          <w:bottom w:space="0" w:sz="0" w:val="nil"/>
+          <w:right w:space="0" w:sz="0" w:val="nil"/>
+          <w:between w:space="0" w:sz="0" w:val="nil"/>
+        </w:pBdr>
+        <w:shd w:fill="auto" w:val="clear"/>
+        <w:spacing w:after="0" w:before="0" w:line="276" w:lineRule="auto"/>
+        <w:ind w:left="0" w:right="0" w:firstLine="0"/>
+        <w:jc w:val="left"/>
+        <w:rPr/>
+      </w:pPr>
+      <w:r>
+        <w:rPr>
+          <w:rtl w:val="0"/>
+        </w:rPr>
+        <w:t xml:space="preserve"> C h e c k s :                                   5   /   5 ,   1 0 0 % ,   L i s t e d   1 5 </w:t>
+        <w:br w:type="textWrapping"/>
+        <w:t xml:space="preserve"> </w:t>
+      </w:r>
+    </w:p>
+    <w:p>
+      <w:pPr>
+        <w:keepNext w:val="0"/>
+        <w:keepLines w:val="0"/>
+        <w:pageBreakBefore w:val="0"/>
+        <w:widowControl w:val="0"/>
+        <w:pBdr>
+          <w:top w:space="0" w:sz="0" w:val="nil"/>
+          <w:left w:space="0" w:sz="0" w:val="nil"/>
+          <w:bottom w:space="0" w:sz="0" w:val="nil"/>
+          <w:right w:space="0" w:sz="0" w:val="nil"/>
+          <w:between w:space="0" w:sz="0" w:val="nil"/>
+        </w:pBdr>
+        <w:shd w:fill="auto" w:val="clear"/>
+        <w:spacing w:after="0" w:before="0" w:line="276" w:lineRule="auto"/>
+        <w:ind w:left="0" w:right="0" w:firstLine="0"/>
+        <w:jc w:val="left"/>
+        <w:rPr/>
+      </w:pPr>
+      <w:r>
+        <w:rPr>
+          <w:rtl w:val="0"/>
+        </w:rPr>
+        <w:t xml:space="preserve"> E l a p s e d   t i m e :                   0 . 2 s </w:t>
+        <w:br w:type="textWrapping"/>
+        <w:t xml:space="preserve"> </w:t>
+      </w:r>
+    </w:p>
+    <w:p>
+      <w:pPr>
+        <w:keepNext w:val="0"/>
+        <w:keepLines w:val="0"/>
+        <w:pageBreakBefore w:val="0"/>
+        <w:widowControl w:val="0"/>
+        <w:pBdr>
+          <w:top w:space="0" w:sz="0" w:val="nil"/>
+          <w:left w:space="0" w:sz="0" w:val="nil"/>
+          <w:bottom w:space="0" w:sz="0" w:val="nil"/>
+          <w:right w:space="0" w:sz="0" w:val="nil"/>
+          <w:between w:space="0" w:sz="0" w:val="nil"/>
+        </w:pBdr>
+        <w:shd w:fill="auto" w:val="clear"/>
+        <w:spacing w:after="0" w:before="0" w:line="276" w:lineRule="auto"/>
+        <w:ind w:left="0" w:right="0" w:firstLine="0"/>
+        <w:jc w:val="left"/>
+        <w:rPr/>
+      </w:pPr>
+      <w:r>
+        <w:rPr>
+          <w:rtl w:val="0"/>
+        </w:rPr>
+        <w:t xml:space="preserve"> </w:t>
+        <w:br w:type="textWrapping"/>
+        <w:t xml:space="preserve"> </w:t>
+      </w:r>
+    </w:p>
+    <w:p>
+      <w:pPr>
+        <w:keepNext w:val="0"/>
+        <w:keepLines w:val="0"/>
+        <w:pageBreakBefore w:val="0"/>
+        <w:widowControl w:val="0"/>
+        <w:pBdr>
+          <w:top w:space="0" w:sz="0" w:val="nil"/>
+          <w:left w:space="0" w:sz="0" w:val="nil"/>
+          <w:bottom w:space="0" w:sz="0" w:val="nil"/>
+          <w:right w:space="0" w:sz="0" w:val="nil"/>
+          <w:between w:space="0" w:sz="0" w:val="nil"/>
+        </w:pBdr>
+        <w:shd w:fill="auto" w:val="clear"/>
+        <w:spacing w:after="0" w:before="0" w:line="276" w:lineRule="auto"/>
+        <w:ind w:left="0" w:right="0" w:firstLine="0"/>
+        <w:jc w:val="left"/>
+        <w:rPr/>
+      </w:pPr>
+      <w:r>
+        <w:rPr>
+          <w:rtl w:val="0"/>
+        </w:rPr>
+        <w:t xml:space="preserve"> r c l o n e . e x e   :   2 0 2 6 / 0 3 / 1 9   1 2 : 1 1 : 5 5   I N F O     :   T h e r e   w a s   n o t h i n g   t o   t r a n s f e r </w:t>
+        <w:br w:type="textWrapping"/>
+        <w:t xml:space="preserve"> </w:t>
+      </w:r>
+    </w:p>
+    <w:p>
+      <w:pPr>
+        <w:keepNext w:val="0"/>
+        <w:keepLines w:val="0"/>
+        <w:pageBreakBefore w:val="0"/>
+        <w:widowControl w:val="0"/>
+        <w:pBdr>
+          <w:top w:space="0" w:sz="0" w:val="nil"/>
+          <w:left w:space="0" w:sz="0" w:val="nil"/>
+          <w:bottom w:space="0" w:sz="0" w:val="nil"/>
+          <w:right w:space="0" w:sz="0" w:val="nil"/>
+          <w:between w:space="0" w:sz="0" w:val="nil"/>
+        </w:pBdr>
+        <w:shd w:fill="auto" w:val="clear"/>
+        <w:spacing w:after="0" w:before="0" w:line="276" w:lineRule="auto"/>
+        <w:ind w:left="0" w:right="0" w:firstLine="0"/>
+        <w:jc w:val="left"/>
+        <w:rPr/>
+      </w:pPr>
+      <w:r>
+        <w:rPr>
+          <w:rtl w:val="0"/>
+        </w:rPr>
+        <w:t xml:space="preserve"> A t   C : \ U s e r s \ S o u r c e - 1 \ D e s k t o p \ r c l o n e \ c o n d u i t _ s y n c . p s 1 : 4 7   c h a r : 1 </w:t>
+        <w:br w:type="textWrapping"/>
+        <w:t xml:space="preserve"> </w:t>
+      </w:r>
+    </w:p>
+    <w:p>
+      <w:pPr>
+        <w:keepNext w:val="0"/>
+        <w:keepLines w:val="0"/>
+        <w:pageBreakBefore w:val="0"/>
+        <w:widowControl w:val="0"/>
+        <w:pBdr>
+          <w:top w:space="0" w:sz="0" w:val="nil"/>
+          <w:left w:space="0" w:sz="0" w:val="nil"/>
+          <w:bottom w:space="0" w:sz="0" w:val="nil"/>
+          <w:right w:space="0" w:sz="0" w:val="nil"/>
+          <w:between w:space="0" w:sz="0" w:val="nil"/>
+        </w:pBdr>
+        <w:shd w:fill="auto" w:val="clear"/>
+        <w:spacing w:after="0" w:before="0" w:line="276" w:lineRule="auto"/>
+        <w:ind w:left="0" w:right="0" w:firstLine="0"/>
+        <w:jc w:val="left"/>
+        <w:rPr/>
+      </w:pPr>
+      <w:r>
+        <w:rPr>
+          <w:rtl w:val="0"/>
+        </w:rPr>
+        <w:t xml:space="preserve"> +   &amp;   $ r c l o n e   c o p y   - - f i l t e r - f r o m   $ f i l t e r   " $ s o u r c e R e p o r t s C o r e \ h a n d o f f s "   g d   . . . </w:t>
+        <w:br w:type="textWrapping"/>
+        <w:t xml:space="preserve"> </w:t>
+      </w:r>
+    </w:p>
+    <w:p>
+      <w:pPr>
+        <w:keepNext w:val="0"/>
+        <w:keepLines w:val="0"/>
+        <w:pageBreakBefore w:val="0"/>
+        <w:widowControl w:val="0"/>
+        <w:pBdr>
+          <w:top w:space="0" w:sz="0" w:val="nil"/>
+          <w:left w:space="0" w:sz="0" w:val="nil"/>
+          <w:bottom w:space="0" w:sz="0" w:val="nil"/>
+          <w:right w:space="0" w:sz="0" w:val="nil"/>
+          <w:between w:space="0" w:sz="0" w:val="nil"/>
+        </w:pBdr>
+        <w:shd w:fill="auto" w:val="clear"/>
+        <w:spacing w:after="0" w:before="0" w:line="276" w:lineRule="auto"/>
+        <w:ind w:left="0" w:right="0" w:firstLine="0"/>
+        <w:jc w:val="left"/>
+        <w:rPr/>
+      </w:pPr>
+      <w:r>
+        <w:rPr>
+          <w:rtl w:val="0"/>
+        </w:rPr>
+        <w:t xml:space="preserve"> +   ~ ~ ~ ~ ~ ~ ~ ~ ~ ~ ~ ~ ~ ~ ~ ~ ~ ~ ~ ~ ~ ~ ~ ~ ~ ~ ~ ~ ~ ~ ~ ~ ~ ~ ~ ~ ~ ~ ~ ~ ~ ~ ~ ~ ~ ~ ~ ~ ~ ~ ~ ~ ~ ~ ~ ~ ~ ~ ~ ~ ~ ~ ~ ~ ~ ~ ~ ~ ~ </w:t>
+        <w:br w:type="textWrapping"/>
+        <w:t xml:space="preserve"> </w:t>
+      </w:r>
+    </w:p>
+    <w:p>
+      <w:pPr>
+        <w:keepNext w:val="0"/>
+        <w:keepLines w:val="0"/>
+        <w:pageBreakBefore w:val="0"/>
+        <w:widowControl w:val="0"/>
+        <w:pBdr>
+          <w:top w:space="0" w:sz="0" w:val="nil"/>
+          <w:left w:space="0" w:sz="0" w:val="nil"/>
+          <w:bottom w:space="0" w:sz="0" w:val="nil"/>
+          <w:right w:space="0" w:sz="0" w:val="nil"/>
+          <w:between w:space="0" w:sz="0" w:val="nil"/>
+        </w:pBdr>
+        <w:shd w:fill="auto" w:val="clear"/>
+        <w:spacing w:after="0" w:before="0" w:line="276" w:lineRule="auto"/>
+        <w:ind w:left="0" w:right="0" w:firstLine="0"/>
+        <w:jc w:val="left"/>
+        <w:rPr/>
+      </w:pPr>
+      <w:r>
+        <w:rPr>
+          <w:rtl w:val="0"/>
+        </w:rPr>
+        <w:t xml:space="preserve">         +   C a t e g o r y I n f o                     :   N o t S p e c i f i e d :   ( 2 0 2 6 / 0 3 / 1 9   1 2 : 1 . . . i n g   t o   t r a n s f e r : S t r i n g )   [ ] ,   R e m o t e E x c e p t i o n </w:t>
+        <w:br w:type="textWrapping"/>
+        <w:t xml:space="preserve"> </w:t>
+      </w:r>
+    </w:p>
+    <w:p>
+      <w:pPr>
+        <w:keepNext w:val="0"/>
+        <w:keepLines w:val="0"/>
+        <w:pageBreakBefore w:val="0"/>
+        <w:widowControl w:val="0"/>
+        <w:pBdr>
+          <w:top w:space="0" w:sz="0" w:val="nil"/>
+          <w:left w:space="0" w:sz="0" w:val="nil"/>
+          <w:bottom w:space="0" w:sz="0" w:val="nil"/>
+          <w:right w:space="0" w:sz="0" w:val="nil"/>
+          <w:between w:space="0" w:sz="0" w:val="nil"/>
+        </w:pBdr>
+        <w:shd w:fill="auto" w:val="clear"/>
+        <w:spacing w:after="0" w:before="0" w:line="276" w:lineRule="auto"/>
+        <w:ind w:left="0" w:right="0" w:firstLine="0"/>
+        <w:jc w:val="left"/>
+        <w:rPr/>
+      </w:pPr>
+      <w:r>
+        <w:rPr>
+          <w:rtl w:val="0"/>
+        </w:rPr>
+        <w:t xml:space="preserve">         +   F u l l y Q u a l i f i e d E r r o r I d   :   N a t i v e C o m m a n d E r r o r </w:t>
+        <w:br w:type="textWrapping"/>
+        <w:t xml:space="preserve"> </w:t>
+      </w:r>
+    </w:p>
+    <w:p>
+      <w:pPr>
+        <w:keepNext w:val="0"/>
+        <w:keepLines w:val="0"/>
+        <w:pageBreakBefore w:val="0"/>
+        <w:widowControl w:val="0"/>
+        <w:pBdr>
+          <w:top w:space="0" w:sz="0" w:val="nil"/>
+          <w:left w:space="0" w:sz="0" w:val="nil"/>
+          <w:bottom w:space="0" w:sz="0" w:val="nil"/>
+          <w:right w:space="0" w:sz="0" w:val="nil"/>
+          <w:between w:space="0" w:sz="0" w:val="nil"/>
+        </w:pBdr>
+        <w:shd w:fill="auto" w:val="clear"/>
+        <w:spacing w:after="0" w:before="0" w:line="276" w:lineRule="auto"/>
+        <w:ind w:left="0" w:right="0" w:firstLine="0"/>
+        <w:jc w:val="left"/>
+        <w:rPr/>
+      </w:pPr>
+      <w:r>
+        <w:rPr>
+          <w:rtl w:val="0"/>
+        </w:rPr>
+        <w:t xml:space="preserve">   </w:t>
+        <w:br w:type="textWrapping"/>
+        <w:t xml:space="preserve"> </w:t>
+      </w:r>
+    </w:p>
+    <w:p>
+      <w:pPr>
+        <w:keepNext w:val="0"/>
+        <w:keepLines w:val="0"/>
+        <w:pageBreakBefore w:val="0"/>
+        <w:widowControl w:val="0"/>
+        <w:pBdr>
+          <w:top w:space="0" w:sz="0" w:val="nil"/>
+          <w:left w:space="0" w:sz="0" w:val="nil"/>
+          <w:bottom w:space="0" w:sz="0" w:val="nil"/>
+          <w:right w:space="0" w:sz="0" w:val="nil"/>
+          <w:between w:space="0" w:sz="0" w:val="nil"/>
+        </w:pBdr>
+        <w:shd w:fill="auto" w:val="clear"/>
+        <w:spacing w:after="0" w:before="0" w:line="276" w:lineRule="auto"/>
+        <w:ind w:left="0" w:right="0" w:firstLine="0"/>
+        <w:jc w:val="left"/>
+        <w:rPr/>
+      </w:pPr>
+      <w:r>
+        <w:rPr>
+          <w:rtl w:val="0"/>
+        </w:rPr>
+        <w:t xml:space="preserve"> 2 0 2 6 / 0 3 / 1 9   1 2 : 1 1 : 5 5   I N F O     :   </w:t>
+        <w:br w:type="textWrapping"/>
+        <w:t xml:space="preserve"> </w:t>
+      </w:r>
+    </w:p>
+    <w:p>
+      <w:pPr>
+        <w:keepNext w:val="0"/>
+        <w:keepLines w:val="0"/>
+        <w:pageBreakBefore w:val="0"/>
+        <w:widowControl w:val="0"/>
+        <w:pBdr>
+          <w:top w:space="0" w:sz="0" w:val="nil"/>
+          <w:left w:space="0" w:sz="0" w:val="nil"/>
+          <w:bottom w:space="0" w:sz="0" w:val="nil"/>
+          <w:right w:space="0" w:sz="0" w:val="nil"/>
+          <w:between w:space="0" w:sz="0" w:val="nil"/>
+        </w:pBdr>
+        <w:shd w:fill="auto" w:val="clear"/>
+        <w:spacing w:after="0" w:before="0" w:line="276" w:lineRule="auto"/>
+        <w:ind w:left="0" w:right="0" w:firstLine="0"/>
+        <w:jc w:val="left"/>
+        <w:rPr/>
+      </w:pPr>
+      <w:r>
+        <w:rPr>
+          <w:rtl w:val="0"/>
+        </w:rPr>
+        <w:t xml:space="preserve"> T r a n s f e r r e d :       </w:t>
+        <w:tab/>
+        <w:t xml:space="preserve">                     0   B   /   0   B ,   - ,   0   B / s ,   E T A   - </w:t>
+        <w:br w:type="textWrapping"/>
+        <w:t xml:space="preserve"> </w:t>
+      </w:r>
+    </w:p>
+    <w:p>
+      <w:pPr>
+        <w:keepNext w:val="0"/>
+        <w:keepLines w:val="0"/>
+        <w:pageBreakBefore w:val="0"/>
+        <w:widowControl w:val="0"/>
+        <w:pBdr>
+          <w:top w:space="0" w:sz="0" w:val="nil"/>
+          <w:left w:space="0" w:sz="0" w:val="nil"/>
+          <w:bottom w:space="0" w:sz="0" w:val="nil"/>
+          <w:right w:space="0" w:sz="0" w:val="nil"/>
+          <w:between w:space="0" w:sz="0" w:val="nil"/>
+        </w:pBdr>
+        <w:shd w:fill="auto" w:val="clear"/>
+        <w:spacing w:after="0" w:before="0" w:line="276" w:lineRule="auto"/>
+        <w:ind w:left="0" w:right="0" w:firstLine="0"/>
+        <w:jc w:val="left"/>
+        <w:rPr/>
+      </w:pPr>
+      <w:r>
+        <w:rPr>
+          <w:rtl w:val="0"/>
+        </w:rPr>
+        <w:t xml:space="preserve"> C h e c k s :                                   1   /   1 ,   1 0 0 % ,   L i s t e d   3 </w:t>
+        <w:br w:type="textWrapping"/>
+        <w:t xml:space="preserve"> </w:t>
+      </w:r>
+    </w:p>
+    <w:p>
+      <w:pPr>
+        <w:keepNext w:val="0"/>
+        <w:keepLines w:val="0"/>
+        <w:pageBreakBefore w:val="0"/>
+        <w:widowControl w:val="0"/>
+        <w:pBdr>
+          <w:top w:space="0" w:sz="0" w:val="nil"/>
+          <w:left w:space="0" w:sz="0" w:val="nil"/>
+          <w:bottom w:space="0" w:sz="0" w:val="nil"/>
+          <w:right w:space="0" w:sz="0" w:val="nil"/>
+          <w:between w:space="0" w:sz="0" w:val="nil"/>
+        </w:pBdr>
+        <w:shd w:fill="auto" w:val="clear"/>
+        <w:spacing w:after="0" w:before="0" w:line="276" w:lineRule="auto"/>
+        <w:ind w:left="0" w:right="0" w:firstLine="0"/>
+        <w:jc w:val="left"/>
+        <w:rPr/>
+      </w:pPr>
+      <w:r>
+        <w:rPr>
+          <w:rtl w:val="0"/>
+        </w:rPr>
+        <w:t xml:space="preserve"> E l a p s e d   t i m e :                   0 . 3 s </w:t>
+        <w:br w:type="textWrapping"/>
+        <w:t xml:space="preserve"> </w:t>
+      </w:r>
+    </w:p>
+    <w:p>
+      <w:pPr>
+        <w:keepNext w:val="0"/>
+        <w:keepLines w:val="0"/>
+        <w:pageBreakBefore w:val="0"/>
+        <w:widowControl w:val="0"/>
+        <w:pBdr>
+          <w:top w:space="0" w:sz="0" w:val="nil"/>
+          <w:left w:space="0" w:sz="0" w:val="nil"/>
+          <w:bottom w:space="0" w:sz="0" w:val="nil"/>
+          <w:right w:space="0" w:sz="0" w:val="nil"/>
+          <w:between w:space="0" w:sz="0" w:val="nil"/>
+        </w:pBdr>
+        <w:shd w:fill="auto" w:val="clear"/>
+        <w:spacing w:after="0" w:before="0" w:line="276" w:lineRule="auto"/>
+        <w:ind w:left="0" w:right="0" w:firstLine="0"/>
+        <w:jc w:val="left"/>
+        <w:rPr/>
+      </w:pPr>
+      <w:r>
+        <w:rPr>
+          <w:rtl w:val="0"/>
+        </w:rPr>
+        <w:t xml:space="preserve"> </w:t>
+        <w:br w:type="textWrapping"/>
+        <w:t xml:space="preserve"> </w:t>
+      </w:r>
+    </w:p>
+    <w:p>
+      <w:pPr>
+        <w:keepNext w:val="0"/>
+        <w:keepLines w:val="0"/>
+        <w:pageBreakBefore w:val="0"/>
+        <w:widowControl w:val="0"/>
+        <w:pBdr>
+          <w:top w:space="0" w:sz="0" w:val="nil"/>
+          <w:left w:space="0" w:sz="0" w:val="nil"/>
+          <w:bottom w:space="0" w:sz="0" w:val="nil"/>
+          <w:right w:space="0" w:sz="0" w:val="nil"/>
+          <w:between w:space="0" w:sz="0" w:val="nil"/>
+        </w:pBdr>
+        <w:shd w:fill="auto" w:val="clear"/>
+        <w:spacing w:after="0" w:before="0" w:line="276" w:lineRule="auto"/>
+        <w:ind w:left="0" w:right="0" w:firstLine="0"/>
+        <w:jc w:val="left"/>
+        <w:rPr/>
+      </w:pPr>
+      <w:r>
+        <w:rPr>
+          <w:rtl w:val="0"/>
+        </w:rPr>
+        <w:t xml:space="preserve"> [Stage 5] Core reports sync complete</w:t>
+        <w:br w:type="textWrapping"/>
+      </w:r>
+    </w:p>
+    <w:p>
+      <w:pPr>
+        <w:keepNext w:val="0"/>
+        <w:keepLines w:val="0"/>
+        <w:pageBreakBefore w:val="0"/>
+        <w:widowControl w:val="0"/>
+        <w:pBdr>
+          <w:top w:space="0" w:sz="0" w:val="nil"/>
+          <w:left w:space="0" w:sz="0" w:val="nil"/>
+          <w:bottom w:space="0" w:sz="0" w:val="nil"/>
+          <w:right w:space="0" w:sz="0" w:val="nil"/>
+          <w:between w:space="0" w:sz="0" w:val="nil"/>
+        </w:pBdr>
+        <w:shd w:fill="auto" w:val="clear"/>
+        <w:spacing w:after="0" w:before="0" w:line="276" w:lineRule="auto"/>
+        <w:ind w:left="0" w:right="0" w:firstLine="0"/>
+        <w:jc w:val="left"/>
+        <w:rPr/>
+      </w:pPr>
+      <w:r>
+        <w:rPr>
+          <w:rtl w:val="0"/>
+        </w:rPr>
+        <w:t xml:space="preserve">r c l o n e . e x e   :   2 0 2 6 / 0 3 / 1 9   1 2 : 1 1 : 5 6   I N F O     :   T h e r e   w a s   n o t h i n g   t o   t r a n s f e r </w:t>
+        <w:br w:type="textWrapping"/>
+        <w:t xml:space="preserve"> </w:t>
+      </w:r>
+    </w:p>
+    <w:p>
+      <w:pPr>
+        <w:keepNext w:val="0"/>
+        <w:keepLines w:val="0"/>
+        <w:pageBreakBefore w:val="0"/>
+        <w:widowControl w:val="0"/>
+        <w:pBdr>
+          <w:top w:space="0" w:sz="0" w:val="nil"/>
+          <w:left w:space="0" w:sz="0" w:val="nil"/>
+          <w:bottom w:space="0" w:sz="0" w:val="nil"/>
+          <w:right w:space="0" w:sz="0" w:val="nil"/>
+          <w:between w:space="0" w:sz="0" w:val="nil"/>
+        </w:pBdr>
+        <w:shd w:fill="auto" w:val="clear"/>
+        <w:spacing w:after="0" w:before="0" w:line="276" w:lineRule="auto"/>
+        <w:ind w:left="0" w:right="0" w:firstLine="0"/>
+        <w:jc w:val="left"/>
+        <w:rPr/>
+      </w:pPr>
+      <w:r>
+        <w:rPr>
+          <w:rtl w:val="0"/>
+        </w:rPr>
+        <w:t xml:space="preserve"> A t   C : \ U s e r s \ S o u r c e - 1 \ D e s k t o p \ r c l o n e \ c o n d u i t _ s y n c . p s 1 : 5 1   c h a r : 1 </w:t>
+        <w:br w:type="textWrapping"/>
+        <w:t xml:space="preserve"> </w:t>
+      </w:r>
+    </w:p>
+    <w:p>
+      <w:pPr>
+        <w:keepNext w:val="0"/>
+        <w:keepLines w:val="0"/>
+        <w:pageBreakBefore w:val="0"/>
+        <w:widowControl w:val="0"/>
+        <w:pBdr>
+          <w:top w:space="0" w:sz="0" w:val="nil"/>
+          <w:left w:space="0" w:sz="0" w:val="nil"/>
+          <w:bottom w:space="0" w:sz="0" w:val="nil"/>
+          <w:right w:space="0" w:sz="0" w:val="nil"/>
+          <w:between w:space="0" w:sz="0" w:val="nil"/>
+        </w:pBdr>
+        <w:shd w:fill="auto" w:val="clear"/>
+        <w:spacing w:after="0" w:before="0" w:line="276" w:lineRule="auto"/>
+        <w:ind w:left="0" w:right="0" w:firstLine="0"/>
+        <w:jc w:val="left"/>
+        <w:rPr/>
+      </w:pPr>
+      <w:r>
+        <w:rPr>
+          <w:rtl w:val="0"/>
+        </w:rPr>
+        <w:t xml:space="preserve"> +   &amp;   $ r c l o n e   c o p y   - - f i l t e r - f r o m   $ f i l t e r   " $ s o u r c e F r a m e w o r k s \ c u r r e n t "   g d r i   . . . </w:t>
+        <w:br w:type="textWrapping"/>
+        <w:t xml:space="preserve"> </w:t>
+      </w:r>
+    </w:p>
+    <w:p>
+      <w:pPr>
+        <w:keepNext w:val="0"/>
+        <w:keepLines w:val="0"/>
+        <w:pageBreakBefore w:val="0"/>
+        <w:widowControl w:val="0"/>
+        <w:pBdr>
+          <w:top w:space="0" w:sz="0" w:val="nil"/>
+          <w:left w:space="0" w:sz="0" w:val="nil"/>
+          <w:bottom w:space="0" w:sz="0" w:val="nil"/>
+          <w:right w:space="0" w:sz="0" w:val="nil"/>
+          <w:between w:space="0" w:sz="0" w:val="nil"/>
+        </w:pBdr>
+        <w:shd w:fill="auto" w:val="clear"/>
+        <w:spacing w:after="0" w:before="0" w:line="276" w:lineRule="auto"/>
+        <w:ind w:left="0" w:right="0" w:firstLine="0"/>
+        <w:jc w:val="left"/>
+        <w:rPr/>
+      </w:pPr>
+      <w:r>
+        <w:rPr>
+          <w:rtl w:val="0"/>
+        </w:rPr>
+        <w:t xml:space="preserve"> +   ~ ~ ~ ~ ~ ~ ~ ~ ~ ~ ~ ~ ~ ~ ~ ~ ~ ~ ~ ~ ~ ~ ~ ~ ~ ~ ~ ~ ~ ~ ~ ~ ~ ~ ~ ~ ~ ~ ~ ~ ~ ~ ~ ~ ~ ~ ~ ~ ~ ~ ~ ~ ~ ~ ~ ~ ~ ~ ~ ~ ~ ~ ~ ~ ~ ~ ~ ~ ~ </w:t>
+        <w:br w:type="textWrapping"/>
+        <w:t xml:space="preserve"> </w:t>
+      </w:r>
+    </w:p>
+    <w:p>
+      <w:pPr>
+        <w:keepNext w:val="0"/>
+        <w:keepLines w:val="0"/>
+        <w:pageBreakBefore w:val="0"/>
+        <w:widowControl w:val="0"/>
+        <w:pBdr>
+          <w:top w:space="0" w:sz="0" w:val="nil"/>
+          <w:left w:space="0" w:sz="0" w:val="nil"/>
+          <w:bottom w:space="0" w:sz="0" w:val="nil"/>
+          <w:right w:space="0" w:sz="0" w:val="nil"/>
+          <w:between w:space="0" w:sz="0" w:val="nil"/>
+        </w:pBdr>
+        <w:shd w:fill="auto" w:val="clear"/>
+        <w:spacing w:after="0" w:before="0" w:line="276" w:lineRule="auto"/>
+        <w:ind w:left="0" w:right="0" w:firstLine="0"/>
+        <w:jc w:val="left"/>
+        <w:rPr/>
+      </w:pPr>
+      <w:r>
+        <w:rPr>
+          <w:rtl w:val="0"/>
+        </w:rPr>
+        <w:t xml:space="preserve">         +   C a t e g o r y I n f o                     :   N o t S p e c i f i e d :   ( 2 0 2 6 / 0 3 / 1 9   1 2 : 1 . . . i n g   t o   t r a n s f e r : S t r i n g )   [ ] ,   R e m o t e E x c e p t i o n </w:t>
+        <w:br w:type="textWrapping"/>
+        <w:t xml:space="preserve"> </w:t>
+      </w:r>
+    </w:p>
+    <w:p>
+      <w:pPr>
+        <w:keepNext w:val="0"/>
+        <w:keepLines w:val="0"/>
+        <w:pageBreakBefore w:val="0"/>
+        <w:widowControl w:val="0"/>
+        <w:pBdr>
+          <w:top w:space="0" w:sz="0" w:val="nil"/>
+          <w:left w:space="0" w:sz="0" w:val="nil"/>
+          <w:bottom w:space="0" w:sz="0" w:val="nil"/>
+          <w:right w:space="0" w:sz="0" w:val="nil"/>
+          <w:between w:space="0" w:sz="0" w:val="nil"/>
+        </w:pBdr>
+        <w:shd w:fill="auto" w:val="clear"/>
+        <w:spacing w:after="0" w:before="0" w:line="276" w:lineRule="auto"/>
+        <w:ind w:left="0" w:right="0" w:firstLine="0"/>
+        <w:jc w:val="left"/>
+        <w:rPr/>
+      </w:pPr>
+      <w:r>
+        <w:rPr>
+          <w:rtl w:val="0"/>
+        </w:rPr>
+        <w:t xml:space="preserve">         +   F u l l y Q u a l i f i e d E r r o r I d   :   N a t i v e C o m m a n d E r r o r </w:t>
+        <w:br w:type="textWrapping"/>
+        <w:t xml:space="preserve"> </w:t>
+      </w:r>
+    </w:p>
+    <w:p>
+      <w:pPr>
+        <w:keepNext w:val="0"/>
+        <w:keepLines w:val="0"/>
+        <w:pageBreakBefore w:val="0"/>
+        <w:widowControl w:val="0"/>
+        <w:pBdr>
+          <w:top w:space="0" w:sz="0" w:val="nil"/>
+          <w:left w:space="0" w:sz="0" w:val="nil"/>
+          <w:bottom w:space="0" w:sz="0" w:val="nil"/>
+          <w:right w:space="0" w:sz="0" w:val="nil"/>
+          <w:between w:space="0" w:sz="0" w:val="nil"/>
+        </w:pBdr>
+        <w:shd w:fill="auto" w:val="clear"/>
+        <w:spacing w:after="0" w:before="0" w:line="276" w:lineRule="auto"/>
+        <w:ind w:left="0" w:right="0" w:firstLine="0"/>
+        <w:jc w:val="left"/>
+        <w:rPr/>
+      </w:pPr>
+      <w:r>
+        <w:rPr>
+          <w:rtl w:val="0"/>
+        </w:rPr>
+        <w:t xml:space="preserve">   </w:t>
+        <w:br w:type="textWrapping"/>
+        <w:t xml:space="preserve"> </w:t>
+      </w:r>
+    </w:p>
+    <w:p>
+      <w:pPr>
+        <w:keepNext w:val="0"/>
+        <w:keepLines w:val="0"/>
+        <w:pageBreakBefore w:val="0"/>
+        <w:widowControl w:val="0"/>
+        <w:pBdr>
+          <w:top w:space="0" w:sz="0" w:val="nil"/>
+          <w:left w:space="0" w:sz="0" w:val="nil"/>
+          <w:bottom w:space="0" w:sz="0" w:val="nil"/>
+          <w:right w:space="0" w:sz="0" w:val="nil"/>
+          <w:between w:space="0" w:sz="0" w:val="nil"/>
+        </w:pBdr>
+        <w:shd w:fill="auto" w:val="clear"/>
+        <w:spacing w:after="0" w:before="0" w:line="276" w:lineRule="auto"/>
+        <w:ind w:left="0" w:right="0" w:firstLine="0"/>
+        <w:jc w:val="left"/>
+        <w:rPr/>
+      </w:pPr>
+      <w:r>
+        <w:rPr>
+          <w:rtl w:val="0"/>
+        </w:rPr>
+        <w:t xml:space="preserve"> 2 0 2 6 / 0 3 / 1 9   1 2 : 1 1 : 5 6   I N F O     :   </w:t>
         <w:br w:type="textWrapping"/>
         <w:t xml:space="preserve"> </w:t>
       </w:r>

</xml_diff>

<commit_message>
V3R mirror 2026-03-21 00:01 UTC
</commit_message>
<xml_diff>
--- a/conduit/logs/session_sync_log.docx
+++ b/conduit/logs/session_sync_log.docx
@@ -25946,6 +25946,4217 @@
           <w:rtl w:val="0"/>
         </w:rPr>
         <w:t xml:space="preserve"> 2 0 2 6 / 0 3 / 1 9   1 2 : 1 1 : 5 6   I N F O     :   </w:t>
+        <w:br w:type="textWrapping"/>
+        <w:t xml:space="preserve"> </w:t>
+      </w:r>
+    </w:p>
+    <w:p>
+      <w:pPr>
+        <w:keepNext w:val="0"/>
+        <w:keepLines w:val="0"/>
+        <w:pageBreakBefore w:val="0"/>
+        <w:widowControl w:val="0"/>
+        <w:pBdr>
+          <w:top w:space="0" w:sz="0" w:val="nil"/>
+          <w:left w:space="0" w:sz="0" w:val="nil"/>
+          <w:bottom w:space="0" w:sz="0" w:val="nil"/>
+          <w:right w:space="0" w:sz="0" w:val="nil"/>
+          <w:between w:space="0" w:sz="0" w:val="nil"/>
+        </w:pBdr>
+        <w:shd w:fill="auto" w:val="clear"/>
+        <w:spacing w:after="0" w:before="0" w:line="276" w:lineRule="auto"/>
+        <w:ind w:left="0" w:right="0" w:firstLine="0"/>
+        <w:jc w:val="left"/>
+        <w:rPr/>
+      </w:pPr>
+      <w:r>
+        <w:rPr>
+          <w:rtl w:val="0"/>
+        </w:rPr>
+        <w:t xml:space="preserve"> T r a n s f e r r e d :       </w:t>
+        <w:tab/>
+        <w:t xml:space="preserve">                     0   B   /   0   B ,   - ,   0   B / s ,   E T A   - </w:t>
+        <w:br w:type="textWrapping"/>
+        <w:t xml:space="preserve"> </w:t>
+      </w:r>
+    </w:p>
+    <w:p>
+      <w:pPr>
+        <w:keepNext w:val="0"/>
+        <w:keepLines w:val="0"/>
+        <w:pageBreakBefore w:val="0"/>
+        <w:widowControl w:val="0"/>
+        <w:pBdr>
+          <w:top w:space="0" w:sz="0" w:val="nil"/>
+          <w:left w:space="0" w:sz="0" w:val="nil"/>
+          <w:bottom w:space="0" w:sz="0" w:val="nil"/>
+          <w:right w:space="0" w:sz="0" w:val="nil"/>
+          <w:between w:space="0" w:sz="0" w:val="nil"/>
+        </w:pBdr>
+        <w:shd w:fill="auto" w:val="clear"/>
+        <w:spacing w:after="0" w:before="0" w:line="276" w:lineRule="auto"/>
+        <w:ind w:left="0" w:right="0" w:firstLine="0"/>
+        <w:jc w:val="left"/>
+        <w:rPr/>
+      </w:pPr>
+      <w:r>
+        <w:rPr>
+          <w:rtl w:val="0"/>
+        </w:rPr>
+        <w:t xml:space="preserve"> C h e c k s :                                   2   /   2 ,   1 0 0 % ,   L i s t e d   6 </w:t>
+        <w:br w:type="textWrapping"/>
+        <w:t xml:space="preserve"> </w:t>
+      </w:r>
+    </w:p>
+    <w:p>
+      <w:pPr>
+        <w:keepNext w:val="0"/>
+        <w:keepLines w:val="0"/>
+        <w:pageBreakBefore w:val="0"/>
+        <w:widowControl w:val="0"/>
+        <w:pBdr>
+          <w:top w:space="0" w:sz="0" w:val="nil"/>
+          <w:left w:space="0" w:sz="0" w:val="nil"/>
+          <w:bottom w:space="0" w:sz="0" w:val="nil"/>
+          <w:right w:space="0" w:sz="0" w:val="nil"/>
+          <w:between w:space="0" w:sz="0" w:val="nil"/>
+        </w:pBdr>
+        <w:shd w:fill="auto" w:val="clear"/>
+        <w:spacing w:after="0" w:before="0" w:line="276" w:lineRule="auto"/>
+        <w:ind w:left="0" w:right="0" w:firstLine="0"/>
+        <w:jc w:val="left"/>
+        <w:rPr/>
+      </w:pPr>
+      <w:r>
+        <w:rPr>
+          <w:rtl w:val="0"/>
+        </w:rPr>
+        <w:t xml:space="preserve"> E l a p s e d   t i m e :                   0 . 3 s </w:t>
+        <w:br w:type="textWrapping"/>
+        <w:t xml:space="preserve"> </w:t>
+      </w:r>
+    </w:p>
+    <w:p>
+      <w:pPr>
+        <w:keepNext w:val="0"/>
+        <w:keepLines w:val="0"/>
+        <w:pageBreakBefore w:val="0"/>
+        <w:widowControl w:val="0"/>
+        <w:pBdr>
+          <w:top w:space="0" w:sz="0" w:val="nil"/>
+          <w:left w:space="0" w:sz="0" w:val="nil"/>
+          <w:bottom w:space="0" w:sz="0" w:val="nil"/>
+          <w:right w:space="0" w:sz="0" w:val="nil"/>
+          <w:between w:space="0" w:sz="0" w:val="nil"/>
+        </w:pBdr>
+        <w:shd w:fill="auto" w:val="clear"/>
+        <w:spacing w:after="0" w:before="0" w:line="276" w:lineRule="auto"/>
+        <w:ind w:left="0" w:right="0" w:firstLine="0"/>
+        <w:jc w:val="left"/>
+        <w:rPr/>
+      </w:pPr>
+      <w:r>
+        <w:rPr>
+          <w:rtl w:val="0"/>
+        </w:rPr>
+        <w:t xml:space="preserve"> </w:t>
+        <w:br w:type="textWrapping"/>
+        <w:t xml:space="preserve"> </w:t>
+      </w:r>
+    </w:p>
+    <w:p>
+      <w:pPr>
+        <w:keepNext w:val="0"/>
+        <w:keepLines w:val="0"/>
+        <w:pageBreakBefore w:val="0"/>
+        <w:widowControl w:val="0"/>
+        <w:pBdr>
+          <w:top w:space="0" w:sz="0" w:val="nil"/>
+          <w:left w:space="0" w:sz="0" w:val="nil"/>
+          <w:bottom w:space="0" w:sz="0" w:val="nil"/>
+          <w:right w:space="0" w:sz="0" w:val="nil"/>
+          <w:between w:space="0" w:sz="0" w:val="nil"/>
+        </w:pBdr>
+        <w:shd w:fill="auto" w:val="clear"/>
+        <w:spacing w:after="0" w:before="0" w:line="276" w:lineRule="auto"/>
+        <w:ind w:left="0" w:right="0" w:firstLine="0"/>
+        <w:jc w:val="left"/>
+        <w:rPr/>
+      </w:pPr>
+      <w:r>
+        <w:rPr>
+          <w:rtl w:val="0"/>
+        </w:rPr>
+        <w:t xml:space="preserve"> [Stage 6] Frameworks sync complete</w:t>
+        <w:br w:type="textWrapping"/>
+      </w:r>
+    </w:p>
+    <w:p>
+      <w:pPr>
+        <w:keepNext w:val="0"/>
+        <w:keepLines w:val="0"/>
+        <w:pageBreakBefore w:val="0"/>
+        <w:widowControl w:val="0"/>
+        <w:pBdr>
+          <w:top w:space="0" w:sz="0" w:val="nil"/>
+          <w:left w:space="0" w:sz="0" w:val="nil"/>
+          <w:bottom w:space="0" w:sz="0" w:val="nil"/>
+          <w:right w:space="0" w:sz="0" w:val="nil"/>
+          <w:between w:space="0" w:sz="0" w:val="nil"/>
+        </w:pBdr>
+        <w:shd w:fill="auto" w:val="clear"/>
+        <w:spacing w:after="0" w:before="0" w:line="276" w:lineRule="auto"/>
+        <w:ind w:left="0" w:right="0" w:firstLine="0"/>
+        <w:jc w:val="left"/>
+        <w:rPr/>
+      </w:pPr>
+      <w:r>
+        <w:rPr>
+          <w:rtl w:val="0"/>
+        </w:rPr>
+        <w:t xml:space="preserve">r c l o n e . e x e   :   2 0 2 6 / 0 3 / 1 9   1 2 : 1 2 : 0 2   I N F O     :   l o g s / s e s s i o n _ s y n c _ l o g . t x t :   C o p i e d   ( r e p l a c e d   e x i s t i n g ) </w:t>
+        <w:br w:type="textWrapping"/>
+        <w:t xml:space="preserve"> </w:t>
+      </w:r>
+    </w:p>
+    <w:p>
+      <w:pPr>
+        <w:keepNext w:val="0"/>
+        <w:keepLines w:val="0"/>
+        <w:pageBreakBefore w:val="0"/>
+        <w:widowControl w:val="0"/>
+        <w:pBdr>
+          <w:top w:space="0" w:sz="0" w:val="nil"/>
+          <w:left w:space="0" w:sz="0" w:val="nil"/>
+          <w:bottom w:space="0" w:sz="0" w:val="nil"/>
+          <w:right w:space="0" w:sz="0" w:val="nil"/>
+          <w:between w:space="0" w:sz="0" w:val="nil"/>
+        </w:pBdr>
+        <w:shd w:fill="auto" w:val="clear"/>
+        <w:spacing w:after="0" w:before="0" w:line="276" w:lineRule="auto"/>
+        <w:ind w:left="0" w:right="0" w:firstLine="0"/>
+        <w:jc w:val="left"/>
+        <w:rPr/>
+      </w:pPr>
+      <w:r>
+        <w:rPr>
+          <w:rtl w:val="0"/>
+        </w:rPr>
+        <w:t xml:space="preserve"> A t   C : \ U s e r s \ S o u r c e - 1 \ D e s k t o p \ r c l o n e \ c o n d u i t _ s y n c . p s 1 : 5 5   c h a r : 1 </w:t>
+        <w:br w:type="textWrapping"/>
+        <w:t xml:space="preserve"> </w:t>
+      </w:r>
+    </w:p>
+    <w:p>
+      <w:pPr>
+        <w:keepNext w:val="0"/>
+        <w:keepLines w:val="0"/>
+        <w:pageBreakBefore w:val="0"/>
+        <w:widowControl w:val="0"/>
+        <w:pBdr>
+          <w:top w:space="0" w:sz="0" w:val="nil"/>
+          <w:left w:space="0" w:sz="0" w:val="nil"/>
+          <w:bottom w:space="0" w:sz="0" w:val="nil"/>
+          <w:right w:space="0" w:sz="0" w:val="nil"/>
+          <w:between w:space="0" w:sz="0" w:val="nil"/>
+        </w:pBdr>
+        <w:shd w:fill="auto" w:val="clear"/>
+        <w:spacing w:after="0" w:before="0" w:line="276" w:lineRule="auto"/>
+        <w:ind w:left="0" w:right="0" w:firstLine="0"/>
+        <w:jc w:val="left"/>
+        <w:rPr/>
+      </w:pPr>
+      <w:r>
+        <w:rPr>
+          <w:rtl w:val="0"/>
+        </w:rPr>
+        <w:t xml:space="preserve"> +   &amp;   $ r c l o n e   c o p y   - - f i l t e r - f r o m   $ f i l t e r   $ s o u r c e C o n d u i t   g d r i v e : V 3 R / c o n d u i   . . . </w:t>
+        <w:br w:type="textWrapping"/>
+        <w:t xml:space="preserve"> </w:t>
+      </w:r>
+    </w:p>
+    <w:p>
+      <w:pPr>
+        <w:keepNext w:val="0"/>
+        <w:keepLines w:val="0"/>
+        <w:pageBreakBefore w:val="0"/>
+        <w:widowControl w:val="0"/>
+        <w:pBdr>
+          <w:top w:space="0" w:sz="0" w:val="nil"/>
+          <w:left w:space="0" w:sz="0" w:val="nil"/>
+          <w:bottom w:space="0" w:sz="0" w:val="nil"/>
+          <w:right w:space="0" w:sz="0" w:val="nil"/>
+          <w:between w:space="0" w:sz="0" w:val="nil"/>
+        </w:pBdr>
+        <w:shd w:fill="auto" w:val="clear"/>
+        <w:spacing w:after="0" w:before="0" w:line="276" w:lineRule="auto"/>
+        <w:ind w:left="0" w:right="0" w:firstLine="0"/>
+        <w:jc w:val="left"/>
+        <w:rPr/>
+      </w:pPr>
+      <w:r>
+        <w:rPr>
+          <w:rtl w:val="0"/>
+        </w:rPr>
+        <w:t xml:space="preserve"> +   ~ ~ ~ ~ ~ ~ ~ ~ ~ ~ ~ ~ ~ ~ ~ ~ ~ ~ ~ ~ ~ ~ ~ ~ ~ ~ ~ ~ ~ ~ ~ ~ ~ ~ ~ ~ ~ ~ ~ ~ ~ ~ ~ ~ ~ ~ ~ ~ ~ ~ ~ ~ ~ ~ ~ ~ ~ ~ ~ ~ ~ ~ ~ ~ ~ ~ ~ ~ ~ </w:t>
+        <w:br w:type="textWrapping"/>
+        <w:t xml:space="preserve"> </w:t>
+      </w:r>
+    </w:p>
+    <w:p>
+      <w:pPr>
+        <w:keepNext w:val="0"/>
+        <w:keepLines w:val="0"/>
+        <w:pageBreakBefore w:val="0"/>
+        <w:widowControl w:val="0"/>
+        <w:pBdr>
+          <w:top w:space="0" w:sz="0" w:val="nil"/>
+          <w:left w:space="0" w:sz="0" w:val="nil"/>
+          <w:bottom w:space="0" w:sz="0" w:val="nil"/>
+          <w:right w:space="0" w:sz="0" w:val="nil"/>
+          <w:between w:space="0" w:sz="0" w:val="nil"/>
+        </w:pBdr>
+        <w:shd w:fill="auto" w:val="clear"/>
+        <w:spacing w:after="0" w:before="0" w:line="276" w:lineRule="auto"/>
+        <w:ind w:left="0" w:right="0" w:firstLine="0"/>
+        <w:jc w:val="left"/>
+        <w:rPr/>
+      </w:pPr>
+      <w:r>
+        <w:rPr>
+          <w:rtl w:val="0"/>
+        </w:rPr>
+        <w:t xml:space="preserve">         +   C a t e g o r y I n f o                     :   N o t S p e c i f i e d :   ( 2 0 2 6 / 0 3 / 1 9   1 2 : 1 . . . l a c e d   e x i s t i n g ) : S t r i n g )   [ ] ,   R e m o t e E x c e p t i o n </w:t>
+        <w:br w:type="textWrapping"/>
+        <w:t xml:space="preserve"> </w:t>
+      </w:r>
+    </w:p>
+    <w:p>
+      <w:pPr>
+        <w:keepNext w:val="0"/>
+        <w:keepLines w:val="0"/>
+        <w:pageBreakBefore w:val="0"/>
+        <w:widowControl w:val="0"/>
+        <w:pBdr>
+          <w:top w:space="0" w:sz="0" w:val="nil"/>
+          <w:left w:space="0" w:sz="0" w:val="nil"/>
+          <w:bottom w:space="0" w:sz="0" w:val="nil"/>
+          <w:right w:space="0" w:sz="0" w:val="nil"/>
+          <w:between w:space="0" w:sz="0" w:val="nil"/>
+        </w:pBdr>
+        <w:shd w:fill="auto" w:val="clear"/>
+        <w:spacing w:after="0" w:before="0" w:line="276" w:lineRule="auto"/>
+        <w:ind w:left="0" w:right="0" w:firstLine="0"/>
+        <w:jc w:val="left"/>
+        <w:rPr/>
+      </w:pPr>
+      <w:r>
+        <w:rPr>
+          <w:rtl w:val="0"/>
+        </w:rPr>
+        <w:t xml:space="preserve">         +   F u l l y Q u a l i f i e d E r r o r I d   :   N a t i v e C o m m a n d E r r o r </w:t>
+        <w:br w:type="textWrapping"/>
+        <w:t xml:space="preserve"> </w:t>
+      </w:r>
+    </w:p>
+    <w:p>
+      <w:pPr>
+        <w:keepNext w:val="0"/>
+        <w:keepLines w:val="0"/>
+        <w:pageBreakBefore w:val="0"/>
+        <w:widowControl w:val="0"/>
+        <w:pBdr>
+          <w:top w:space="0" w:sz="0" w:val="nil"/>
+          <w:left w:space="0" w:sz="0" w:val="nil"/>
+          <w:bottom w:space="0" w:sz="0" w:val="nil"/>
+          <w:right w:space="0" w:sz="0" w:val="nil"/>
+          <w:between w:space="0" w:sz="0" w:val="nil"/>
+        </w:pBdr>
+        <w:shd w:fill="auto" w:val="clear"/>
+        <w:spacing w:after="0" w:before="0" w:line="276" w:lineRule="auto"/>
+        <w:ind w:left="0" w:right="0" w:firstLine="0"/>
+        <w:jc w:val="left"/>
+        <w:rPr/>
+      </w:pPr>
+      <w:r>
+        <w:rPr>
+          <w:rtl w:val="0"/>
+        </w:rPr>
+        <w:t xml:space="preserve">   </w:t>
+        <w:br w:type="textWrapping"/>
+        <w:t xml:space="preserve"> </w:t>
+      </w:r>
+    </w:p>
+    <w:p>
+      <w:pPr>
+        <w:keepNext w:val="0"/>
+        <w:keepLines w:val="0"/>
+        <w:pageBreakBefore w:val="0"/>
+        <w:widowControl w:val="0"/>
+        <w:pBdr>
+          <w:top w:space="0" w:sz="0" w:val="nil"/>
+          <w:left w:space="0" w:sz="0" w:val="nil"/>
+          <w:bottom w:space="0" w:sz="0" w:val="nil"/>
+          <w:right w:space="0" w:sz="0" w:val="nil"/>
+          <w:between w:space="0" w:sz="0" w:val="nil"/>
+        </w:pBdr>
+        <w:shd w:fill="auto" w:val="clear"/>
+        <w:spacing w:after="0" w:before="0" w:line="276" w:lineRule="auto"/>
+        <w:ind w:left="0" w:right="0" w:firstLine="0"/>
+        <w:jc w:val="left"/>
+        <w:rPr/>
+      </w:pPr>
+      <w:r>
+        <w:rPr>
+          <w:rtl w:val="0"/>
+        </w:rPr>
+        <w:t xml:space="preserve"> 2 0 2 6 / 0 3 / 1 9   1 2 : 1 2 : 0 3   I N F O     :   l o g s :   S e t   d i r e c t o r y   m o d i f i c a t i o n   t i m e   ( u s i n g   S e t M o d T i m e ) </w:t>
+        <w:br w:type="textWrapping"/>
+        <w:t xml:space="preserve"> </w:t>
+      </w:r>
+    </w:p>
+    <w:p>
+      <w:pPr>
+        <w:keepNext w:val="0"/>
+        <w:keepLines w:val="0"/>
+        <w:pageBreakBefore w:val="0"/>
+        <w:widowControl w:val="0"/>
+        <w:pBdr>
+          <w:top w:space="0" w:sz="0" w:val="nil"/>
+          <w:left w:space="0" w:sz="0" w:val="nil"/>
+          <w:bottom w:space="0" w:sz="0" w:val="nil"/>
+          <w:right w:space="0" w:sz="0" w:val="nil"/>
+          <w:between w:space="0" w:sz="0" w:val="nil"/>
+        </w:pBdr>
+        <w:shd w:fill="auto" w:val="clear"/>
+        <w:spacing w:after="0" w:before="0" w:line="276" w:lineRule="auto"/>
+        <w:ind w:left="0" w:right="0" w:firstLine="0"/>
+        <w:jc w:val="left"/>
+        <w:rPr/>
+      </w:pPr>
+      <w:r>
+        <w:rPr>
+          <w:rtl w:val="0"/>
+        </w:rPr>
+        <w:t xml:space="preserve"> 2 0 2 6 / 0 3 / 1 9   1 2 : 1 2 : 0 3   I N F O     :   </w:t>
+        <w:br w:type="textWrapping"/>
+        <w:t xml:space="preserve"> </w:t>
+      </w:r>
+    </w:p>
+    <w:p>
+      <w:pPr>
+        <w:keepNext w:val="0"/>
+        <w:keepLines w:val="0"/>
+        <w:pageBreakBefore w:val="0"/>
+        <w:widowControl w:val="0"/>
+        <w:pBdr>
+          <w:top w:space="0" w:sz="0" w:val="nil"/>
+          <w:left w:space="0" w:sz="0" w:val="nil"/>
+          <w:bottom w:space="0" w:sz="0" w:val="nil"/>
+          <w:right w:space="0" w:sz="0" w:val="nil"/>
+          <w:between w:space="0" w:sz="0" w:val="nil"/>
+        </w:pBdr>
+        <w:shd w:fill="auto" w:val="clear"/>
+        <w:spacing w:after="0" w:before="0" w:line="276" w:lineRule="auto"/>
+        <w:ind w:left="0" w:right="0" w:firstLine="0"/>
+        <w:jc w:val="left"/>
+        <w:rPr/>
+      </w:pPr>
+      <w:r>
+        <w:rPr>
+          <w:rtl w:val="0"/>
+        </w:rPr>
+        <w:t xml:space="preserve"> T r a n s f e r r e d :       </w:t>
+        <w:tab/>
+        <w:t xml:space="preserve">       9 3 . 0 7 2   K i B   /   9 3 . 0 7 2   K i B ,   1 0 0 % ,   9 3 . 0 7 2   K i B / s ,   E T A   0 s </w:t>
+        <w:br w:type="textWrapping"/>
+        <w:t xml:space="preserve"> </w:t>
+      </w:r>
+    </w:p>
+    <w:p>
+      <w:pPr>
+        <w:keepNext w:val="0"/>
+        <w:keepLines w:val="0"/>
+        <w:pageBreakBefore w:val="0"/>
+        <w:widowControl w:val="0"/>
+        <w:pBdr>
+          <w:top w:space="0" w:sz="0" w:val="nil"/>
+          <w:left w:space="0" w:sz="0" w:val="nil"/>
+          <w:bottom w:space="0" w:sz="0" w:val="nil"/>
+          <w:right w:space="0" w:sz="0" w:val="nil"/>
+          <w:between w:space="0" w:sz="0" w:val="nil"/>
+        </w:pBdr>
+        <w:shd w:fill="auto" w:val="clear"/>
+        <w:spacing w:after="0" w:before="0" w:line="276" w:lineRule="auto"/>
+        <w:ind w:left="0" w:right="0" w:firstLine="0"/>
+        <w:jc w:val="left"/>
+        <w:rPr/>
+      </w:pPr>
+      <w:r>
+        <w:rPr>
+          <w:rtl w:val="0"/>
+        </w:rPr>
+        <w:t xml:space="preserve"> C h e c k s :                                   7   /   7 ,   1 0 0 % ,   L i s t e d   4 1 </w:t>
+        <w:br w:type="textWrapping"/>
+        <w:t xml:space="preserve"> </w:t>
+      </w:r>
+    </w:p>
+    <w:p>
+      <w:pPr>
+        <w:keepNext w:val="0"/>
+        <w:keepLines w:val="0"/>
+        <w:pageBreakBefore w:val="0"/>
+        <w:widowControl w:val="0"/>
+        <w:pBdr>
+          <w:top w:space="0" w:sz="0" w:val="nil"/>
+          <w:left w:space="0" w:sz="0" w:val="nil"/>
+          <w:bottom w:space="0" w:sz="0" w:val="nil"/>
+          <w:right w:space="0" w:sz="0" w:val="nil"/>
+          <w:between w:space="0" w:sz="0" w:val="nil"/>
+        </w:pBdr>
+        <w:shd w:fill="auto" w:val="clear"/>
+        <w:spacing w:after="0" w:before="0" w:line="276" w:lineRule="auto"/>
+        <w:ind w:left="0" w:right="0" w:firstLine="0"/>
+        <w:jc w:val="left"/>
+        <w:rPr/>
+      </w:pPr>
+      <w:r>
+        <w:rPr>
+          <w:rtl w:val="0"/>
+        </w:rPr>
+        <w:t xml:space="preserve"> T r a n s f e r r e d :                         1   /   1 ,   1 0 0 % </w:t>
+        <w:br w:type="textWrapping"/>
+        <w:t xml:space="preserve"> </w:t>
+      </w:r>
+    </w:p>
+    <w:p>
+      <w:pPr>
+        <w:keepNext w:val="0"/>
+        <w:keepLines w:val="0"/>
+        <w:pageBreakBefore w:val="0"/>
+        <w:widowControl w:val="0"/>
+        <w:pBdr>
+          <w:top w:space="0" w:sz="0" w:val="nil"/>
+          <w:left w:space="0" w:sz="0" w:val="nil"/>
+          <w:bottom w:space="0" w:sz="0" w:val="nil"/>
+          <w:right w:space="0" w:sz="0" w:val="nil"/>
+          <w:between w:space="0" w:sz="0" w:val="nil"/>
+        </w:pBdr>
+        <w:shd w:fill="auto" w:val="clear"/>
+        <w:spacing w:after="0" w:before="0" w:line="276" w:lineRule="auto"/>
+        <w:ind w:left="0" w:right="0" w:firstLine="0"/>
+        <w:jc w:val="left"/>
+        <w:rPr/>
+      </w:pPr>
+      <w:r>
+        <w:rPr>
+          <w:rtl w:val="0"/>
+        </w:rPr>
+        <w:t xml:space="preserve"> E l a p s e d   t i m e :                   2 . 4 s </w:t>
+        <w:br w:type="textWrapping"/>
+        <w:t xml:space="preserve"> </w:t>
+      </w:r>
+    </w:p>
+    <w:p>
+      <w:pPr>
+        <w:keepNext w:val="0"/>
+        <w:keepLines w:val="0"/>
+        <w:pageBreakBefore w:val="0"/>
+        <w:widowControl w:val="0"/>
+        <w:pBdr>
+          <w:top w:space="0" w:sz="0" w:val="nil"/>
+          <w:left w:space="0" w:sz="0" w:val="nil"/>
+          <w:bottom w:space="0" w:sz="0" w:val="nil"/>
+          <w:right w:space="0" w:sz="0" w:val="nil"/>
+          <w:between w:space="0" w:sz="0" w:val="nil"/>
+        </w:pBdr>
+        <w:shd w:fill="auto" w:val="clear"/>
+        <w:spacing w:after="0" w:before="0" w:line="276" w:lineRule="auto"/>
+        <w:ind w:left="0" w:right="0" w:firstLine="0"/>
+        <w:jc w:val="left"/>
+        <w:rPr/>
+      </w:pPr>
+      <w:r>
+        <w:rPr>
+          <w:rtl w:val="0"/>
+        </w:rPr>
+        <w:t xml:space="preserve"> </w:t>
+        <w:br w:type="textWrapping"/>
+        <w:t xml:space="preserve"> </w:t>
+      </w:r>
+    </w:p>
+    <w:p>
+      <w:pPr>
+        <w:keepNext w:val="0"/>
+        <w:keepLines w:val="0"/>
+        <w:pageBreakBefore w:val="0"/>
+        <w:widowControl w:val="0"/>
+        <w:pBdr>
+          <w:top w:space="0" w:sz="0" w:val="nil"/>
+          <w:left w:space="0" w:sz="0" w:val="nil"/>
+          <w:bottom w:space="0" w:sz="0" w:val="nil"/>
+          <w:right w:space="0" w:sz="0" w:val="nil"/>
+          <w:between w:space="0" w:sz="0" w:val="nil"/>
+        </w:pBdr>
+        <w:shd w:fill="auto" w:val="clear"/>
+        <w:spacing w:after="0" w:before="0" w:line="276" w:lineRule="auto"/>
+        <w:ind w:left="0" w:right="0" w:firstLine="0"/>
+        <w:jc w:val="left"/>
+        <w:rPr/>
+      </w:pPr>
+      <w:r>
+        <w:rPr>
+          <w:rtl w:val="0"/>
+        </w:rPr>
+        <w:t xml:space="preserve"> [Stage 7] CONDUIT sync complete</w:t>
+        <w:br w:type="textWrapping"/>
+      </w:r>
+    </w:p>
+    <w:p>
+      <w:pPr>
+        <w:keepNext w:val="0"/>
+        <w:keepLines w:val="0"/>
+        <w:pageBreakBefore w:val="0"/>
+        <w:widowControl w:val="0"/>
+        <w:pBdr>
+          <w:top w:space="0" w:sz="0" w:val="nil"/>
+          <w:left w:space="0" w:sz="0" w:val="nil"/>
+          <w:bottom w:space="0" w:sz="0" w:val="nil"/>
+          <w:right w:space="0" w:sz="0" w:val="nil"/>
+          <w:between w:space="0" w:sz="0" w:val="nil"/>
+        </w:pBdr>
+        <w:shd w:fill="auto" w:val="clear"/>
+        <w:spacing w:after="0" w:before="0" w:line="276" w:lineRule="auto"/>
+        <w:ind w:left="0" w:right="0" w:firstLine="0"/>
+        <w:jc w:val="left"/>
+        <w:rPr/>
+      </w:pPr>
+      <w:r>
+        <w:rPr>
+          <w:rtl w:val="0"/>
+        </w:rPr>
+        <w:t xml:space="preserve">r c l o n e . e x e   :   2 0 2 6 / 0 3 / 1 9   1 2 : 1 2 : 0 6   I N F O     :   T h e r e   w a s   n o t h i n g   t o   t r a n s f e r </w:t>
+        <w:br w:type="textWrapping"/>
+        <w:t xml:space="preserve"> </w:t>
+      </w:r>
+    </w:p>
+    <w:p>
+      <w:pPr>
+        <w:keepNext w:val="0"/>
+        <w:keepLines w:val="0"/>
+        <w:pageBreakBefore w:val="0"/>
+        <w:widowControl w:val="0"/>
+        <w:pBdr>
+          <w:top w:space="0" w:sz="0" w:val="nil"/>
+          <w:left w:space="0" w:sz="0" w:val="nil"/>
+          <w:bottom w:space="0" w:sz="0" w:val="nil"/>
+          <w:right w:space="0" w:sz="0" w:val="nil"/>
+          <w:between w:space="0" w:sz="0" w:val="nil"/>
+        </w:pBdr>
+        <w:shd w:fill="auto" w:val="clear"/>
+        <w:spacing w:after="0" w:before="0" w:line="276" w:lineRule="auto"/>
+        <w:ind w:left="0" w:right="0" w:firstLine="0"/>
+        <w:jc w:val="left"/>
+        <w:rPr/>
+      </w:pPr>
+      <w:r>
+        <w:rPr>
+          <w:rtl w:val="0"/>
+        </w:rPr>
+        <w:t xml:space="preserve"> A t   C : \ U s e r s \ S o u r c e - 1 \ D e s k t o p \ r c l o n e \ c o n d u i t _ s y n c . p s 1 : 5 9   c h a r : 1 </w:t>
+        <w:br w:type="textWrapping"/>
+        <w:t xml:space="preserve"> </w:t>
+      </w:r>
+    </w:p>
+    <w:p>
+      <w:pPr>
+        <w:keepNext w:val="0"/>
+        <w:keepLines w:val="0"/>
+        <w:pageBreakBefore w:val="0"/>
+        <w:widowControl w:val="0"/>
+        <w:pBdr>
+          <w:top w:space="0" w:sz="0" w:val="nil"/>
+          <w:left w:space="0" w:sz="0" w:val="nil"/>
+          <w:bottom w:space="0" w:sz="0" w:val="nil"/>
+          <w:right w:space="0" w:sz="0" w:val="nil"/>
+          <w:between w:space="0" w:sz="0" w:val="nil"/>
+        </w:pBdr>
+        <w:shd w:fill="auto" w:val="clear"/>
+        <w:spacing w:after="0" w:before="0" w:line="276" w:lineRule="auto"/>
+        <w:ind w:left="0" w:right="0" w:firstLine="0"/>
+        <w:jc w:val="left"/>
+        <w:rPr/>
+      </w:pPr>
+      <w:r>
+        <w:rPr>
+          <w:rtl w:val="0"/>
+        </w:rPr>
+        <w:t xml:space="preserve"> +   &amp;   $ r c l o n e   c o p y   - - f i l t e r - f r o m   $ f i l t e r   " $ s o u r c e N e x u s \ r e p o r t s "   g d r i v e : V 3   . . . </w:t>
+        <w:br w:type="textWrapping"/>
+        <w:t xml:space="preserve"> </w:t>
+      </w:r>
+    </w:p>
+    <w:p>
+      <w:pPr>
+        <w:keepNext w:val="0"/>
+        <w:keepLines w:val="0"/>
+        <w:pageBreakBefore w:val="0"/>
+        <w:widowControl w:val="0"/>
+        <w:pBdr>
+          <w:top w:space="0" w:sz="0" w:val="nil"/>
+          <w:left w:space="0" w:sz="0" w:val="nil"/>
+          <w:bottom w:space="0" w:sz="0" w:val="nil"/>
+          <w:right w:space="0" w:sz="0" w:val="nil"/>
+          <w:between w:space="0" w:sz="0" w:val="nil"/>
+        </w:pBdr>
+        <w:shd w:fill="auto" w:val="clear"/>
+        <w:spacing w:after="0" w:before="0" w:line="276" w:lineRule="auto"/>
+        <w:ind w:left="0" w:right="0" w:firstLine="0"/>
+        <w:jc w:val="left"/>
+        <w:rPr/>
+      </w:pPr>
+      <w:r>
+        <w:rPr>
+          <w:rtl w:val="0"/>
+        </w:rPr>
+        <w:t xml:space="preserve"> +   ~ ~ ~ ~ ~ ~ ~ ~ ~ ~ ~ ~ ~ ~ ~ ~ ~ ~ ~ ~ ~ ~ ~ ~ ~ ~ ~ ~ ~ ~ ~ ~ ~ ~ ~ ~ ~ ~ ~ ~ ~ ~ ~ ~ ~ ~ ~ ~ ~ ~ ~ ~ ~ ~ ~ ~ ~ ~ ~ ~ ~ ~ ~ ~ ~ ~ ~ ~ ~ </w:t>
+        <w:br w:type="textWrapping"/>
+        <w:t xml:space="preserve"> </w:t>
+      </w:r>
+    </w:p>
+    <w:p>
+      <w:pPr>
+        <w:keepNext w:val="0"/>
+        <w:keepLines w:val="0"/>
+        <w:pageBreakBefore w:val="0"/>
+        <w:widowControl w:val="0"/>
+        <w:pBdr>
+          <w:top w:space="0" w:sz="0" w:val="nil"/>
+          <w:left w:space="0" w:sz="0" w:val="nil"/>
+          <w:bottom w:space="0" w:sz="0" w:val="nil"/>
+          <w:right w:space="0" w:sz="0" w:val="nil"/>
+          <w:between w:space="0" w:sz="0" w:val="nil"/>
+        </w:pBdr>
+        <w:shd w:fill="auto" w:val="clear"/>
+        <w:spacing w:after="0" w:before="0" w:line="276" w:lineRule="auto"/>
+        <w:ind w:left="0" w:right="0" w:firstLine="0"/>
+        <w:jc w:val="left"/>
+        <w:rPr/>
+      </w:pPr>
+      <w:r>
+        <w:rPr>
+          <w:rtl w:val="0"/>
+        </w:rPr>
+        <w:t xml:space="preserve">         +   C a t e g o r y I n f o                     :   N o t S p e c i f i e d :   ( 2 0 2 6 / 0 3 / 1 9   1 2 : 1 . . . i n g   t o   t r a n s f e r : S t r i n g )   [ ] ,   R e m o t e E x c e p t i o n </w:t>
+        <w:br w:type="textWrapping"/>
+        <w:t xml:space="preserve"> </w:t>
+      </w:r>
+    </w:p>
+    <w:p>
+      <w:pPr>
+        <w:keepNext w:val="0"/>
+        <w:keepLines w:val="0"/>
+        <w:pageBreakBefore w:val="0"/>
+        <w:widowControl w:val="0"/>
+        <w:pBdr>
+          <w:top w:space="0" w:sz="0" w:val="nil"/>
+          <w:left w:space="0" w:sz="0" w:val="nil"/>
+          <w:bottom w:space="0" w:sz="0" w:val="nil"/>
+          <w:right w:space="0" w:sz="0" w:val="nil"/>
+          <w:between w:space="0" w:sz="0" w:val="nil"/>
+        </w:pBdr>
+        <w:shd w:fill="auto" w:val="clear"/>
+        <w:spacing w:after="0" w:before="0" w:line="276" w:lineRule="auto"/>
+        <w:ind w:left="0" w:right="0" w:firstLine="0"/>
+        <w:jc w:val="left"/>
+        <w:rPr/>
+      </w:pPr>
+      <w:r>
+        <w:rPr>
+          <w:rtl w:val="0"/>
+        </w:rPr>
+        <w:t xml:space="preserve">         +   F u l l y Q u a l i f i e d E r r o r I d   :   N a t i v e C o m m a n d E r r o r </w:t>
+        <w:br w:type="textWrapping"/>
+        <w:t xml:space="preserve"> </w:t>
+      </w:r>
+    </w:p>
+    <w:p>
+      <w:pPr>
+        <w:keepNext w:val="0"/>
+        <w:keepLines w:val="0"/>
+        <w:pageBreakBefore w:val="0"/>
+        <w:widowControl w:val="0"/>
+        <w:pBdr>
+          <w:top w:space="0" w:sz="0" w:val="nil"/>
+          <w:left w:space="0" w:sz="0" w:val="nil"/>
+          <w:bottom w:space="0" w:sz="0" w:val="nil"/>
+          <w:right w:space="0" w:sz="0" w:val="nil"/>
+          <w:between w:space="0" w:sz="0" w:val="nil"/>
+        </w:pBdr>
+        <w:shd w:fill="auto" w:val="clear"/>
+        <w:spacing w:after="0" w:before="0" w:line="276" w:lineRule="auto"/>
+        <w:ind w:left="0" w:right="0" w:firstLine="0"/>
+        <w:jc w:val="left"/>
+        <w:rPr/>
+      </w:pPr>
+      <w:r>
+        <w:rPr>
+          <w:rtl w:val="0"/>
+        </w:rPr>
+        <w:t xml:space="preserve">   </w:t>
+        <w:br w:type="textWrapping"/>
+        <w:t xml:space="preserve"> </w:t>
+      </w:r>
+    </w:p>
+    <w:p>
+      <w:pPr>
+        <w:keepNext w:val="0"/>
+        <w:keepLines w:val="0"/>
+        <w:pageBreakBefore w:val="0"/>
+        <w:widowControl w:val="0"/>
+        <w:pBdr>
+          <w:top w:space="0" w:sz="0" w:val="nil"/>
+          <w:left w:space="0" w:sz="0" w:val="nil"/>
+          <w:bottom w:space="0" w:sz="0" w:val="nil"/>
+          <w:right w:space="0" w:sz="0" w:val="nil"/>
+          <w:between w:space="0" w:sz="0" w:val="nil"/>
+        </w:pBdr>
+        <w:shd w:fill="auto" w:val="clear"/>
+        <w:spacing w:after="0" w:before="0" w:line="276" w:lineRule="auto"/>
+        <w:ind w:left="0" w:right="0" w:firstLine="0"/>
+        <w:jc w:val="left"/>
+        <w:rPr/>
+      </w:pPr>
+      <w:r>
+        <w:rPr>
+          <w:rtl w:val="0"/>
+        </w:rPr>
+        <w:t xml:space="preserve"> 2 0 2 6 / 0 3 / 1 9   1 2 : 1 2 : 0 6   I N F O     :   </w:t>
+        <w:br w:type="textWrapping"/>
+        <w:t xml:space="preserve"> </w:t>
+      </w:r>
+    </w:p>
+    <w:p>
+      <w:pPr>
+        <w:keepNext w:val="0"/>
+        <w:keepLines w:val="0"/>
+        <w:pageBreakBefore w:val="0"/>
+        <w:widowControl w:val="0"/>
+        <w:pBdr>
+          <w:top w:space="0" w:sz="0" w:val="nil"/>
+          <w:left w:space="0" w:sz="0" w:val="nil"/>
+          <w:bottom w:space="0" w:sz="0" w:val="nil"/>
+          <w:right w:space="0" w:sz="0" w:val="nil"/>
+          <w:between w:space="0" w:sz="0" w:val="nil"/>
+        </w:pBdr>
+        <w:shd w:fill="auto" w:val="clear"/>
+        <w:spacing w:after="0" w:before="0" w:line="276" w:lineRule="auto"/>
+        <w:ind w:left="0" w:right="0" w:firstLine="0"/>
+        <w:jc w:val="left"/>
+        <w:rPr/>
+      </w:pPr>
+      <w:r>
+        <w:rPr>
+          <w:rtl w:val="0"/>
+        </w:rPr>
+        <w:t xml:space="preserve"> T r a n s f e r r e d :       </w:t>
+        <w:tab/>
+        <w:t xml:space="preserve">                     0   B   /   0   B ,   - ,   0   B / s ,   E T A   - </w:t>
+        <w:br w:type="textWrapping"/>
+        <w:t xml:space="preserve"> </w:t>
+      </w:r>
+    </w:p>
+    <w:p>
+      <w:pPr>
+        <w:keepNext w:val="0"/>
+        <w:keepLines w:val="0"/>
+        <w:pageBreakBefore w:val="0"/>
+        <w:widowControl w:val="0"/>
+        <w:pBdr>
+          <w:top w:space="0" w:sz="0" w:val="nil"/>
+          <w:left w:space="0" w:sz="0" w:val="nil"/>
+          <w:bottom w:space="0" w:sz="0" w:val="nil"/>
+          <w:right w:space="0" w:sz="0" w:val="nil"/>
+          <w:between w:space="0" w:sz="0" w:val="nil"/>
+        </w:pBdr>
+        <w:shd w:fill="auto" w:val="clear"/>
+        <w:spacing w:after="0" w:before="0" w:line="276" w:lineRule="auto"/>
+        <w:ind w:left="0" w:right="0" w:firstLine="0"/>
+        <w:jc w:val="left"/>
+        <w:rPr/>
+      </w:pPr>
+      <w:r>
+        <w:rPr>
+          <w:rtl w:val="0"/>
+        </w:rPr>
+        <w:t xml:space="preserve"> C h e c k s :                                 1 2   /   1 2 ,   1 0 0 % ,   L i s t e d   4 1 </w:t>
+        <w:br w:type="textWrapping"/>
+        <w:t xml:space="preserve"> </w:t>
+      </w:r>
+    </w:p>
+    <w:p>
+      <w:pPr>
+        <w:keepNext w:val="0"/>
+        <w:keepLines w:val="0"/>
+        <w:pageBreakBefore w:val="0"/>
+        <w:widowControl w:val="0"/>
+        <w:pBdr>
+          <w:top w:space="0" w:sz="0" w:val="nil"/>
+          <w:left w:space="0" w:sz="0" w:val="nil"/>
+          <w:bottom w:space="0" w:sz="0" w:val="nil"/>
+          <w:right w:space="0" w:sz="0" w:val="nil"/>
+          <w:between w:space="0" w:sz="0" w:val="nil"/>
+        </w:pBdr>
+        <w:shd w:fill="auto" w:val="clear"/>
+        <w:spacing w:after="0" w:before="0" w:line="276" w:lineRule="auto"/>
+        <w:ind w:left="0" w:right="0" w:firstLine="0"/>
+        <w:jc w:val="left"/>
+        <w:rPr/>
+      </w:pPr>
+      <w:r>
+        <w:rPr>
+          <w:rtl w:val="0"/>
+        </w:rPr>
+        <w:t xml:space="preserve"> E l a p s e d   t i m e :                   0 . 5 s </w:t>
+        <w:br w:type="textWrapping"/>
+        <w:t xml:space="preserve"> </w:t>
+      </w:r>
+    </w:p>
+    <w:p>
+      <w:pPr>
+        <w:keepNext w:val="0"/>
+        <w:keepLines w:val="0"/>
+        <w:pageBreakBefore w:val="0"/>
+        <w:widowControl w:val="0"/>
+        <w:pBdr>
+          <w:top w:space="0" w:sz="0" w:val="nil"/>
+          <w:left w:space="0" w:sz="0" w:val="nil"/>
+          <w:bottom w:space="0" w:sz="0" w:val="nil"/>
+          <w:right w:space="0" w:sz="0" w:val="nil"/>
+          <w:between w:space="0" w:sz="0" w:val="nil"/>
+        </w:pBdr>
+        <w:shd w:fill="auto" w:val="clear"/>
+        <w:spacing w:after="0" w:before="0" w:line="276" w:lineRule="auto"/>
+        <w:ind w:left="0" w:right="0" w:firstLine="0"/>
+        <w:jc w:val="left"/>
+        <w:rPr/>
+      </w:pPr>
+      <w:r>
+        <w:rPr>
+          <w:rtl w:val="0"/>
+        </w:rPr>
+        <w:t xml:space="preserve"> </w:t>
+        <w:br w:type="textWrapping"/>
+        <w:t xml:space="preserve"> </w:t>
+      </w:r>
+    </w:p>
+    <w:p>
+      <w:pPr>
+        <w:keepNext w:val="0"/>
+        <w:keepLines w:val="0"/>
+        <w:pageBreakBefore w:val="0"/>
+        <w:widowControl w:val="0"/>
+        <w:pBdr>
+          <w:top w:space="0" w:sz="0" w:val="nil"/>
+          <w:left w:space="0" w:sz="0" w:val="nil"/>
+          <w:bottom w:space="0" w:sz="0" w:val="nil"/>
+          <w:right w:space="0" w:sz="0" w:val="nil"/>
+          <w:between w:space="0" w:sz="0" w:val="nil"/>
+        </w:pBdr>
+        <w:shd w:fill="auto" w:val="clear"/>
+        <w:spacing w:after="0" w:before="0" w:line="276" w:lineRule="auto"/>
+        <w:ind w:left="0" w:right="0" w:firstLine="0"/>
+        <w:jc w:val="left"/>
+        <w:rPr/>
+      </w:pPr>
+      <w:r>
+        <w:rPr>
+          <w:rtl w:val="0"/>
+        </w:rPr>
+        <w:t xml:space="preserve"> [Stage 8] NEXUS sync complete</w:t>
+        <w:br w:type="textWrapping"/>
+      </w:r>
+    </w:p>
+    <w:p>
+      <w:pPr>
+        <w:keepNext w:val="0"/>
+        <w:keepLines w:val="0"/>
+        <w:pageBreakBefore w:val="0"/>
+        <w:widowControl w:val="0"/>
+        <w:pBdr>
+          <w:top w:space="0" w:sz="0" w:val="nil"/>
+          <w:left w:space="0" w:sz="0" w:val="nil"/>
+          <w:bottom w:space="0" w:sz="0" w:val="nil"/>
+          <w:right w:space="0" w:sz="0" w:val="nil"/>
+          <w:between w:space="0" w:sz="0" w:val="nil"/>
+        </w:pBdr>
+        <w:shd w:fill="auto" w:val="clear"/>
+        <w:spacing w:after="0" w:before="0" w:line="276" w:lineRule="auto"/>
+        <w:ind w:left="0" w:right="0" w:firstLine="0"/>
+        <w:jc w:val="left"/>
+        <w:rPr/>
+      </w:pPr>
+      <w:r>
+        <w:rPr>
+          <w:rtl w:val="0"/>
+        </w:rPr>
+        <w:t xml:space="preserve">r c l o n e . e x e   :   2 0 2 6 / 0 3 / 1 9   1 2 : 1 2 : 0 7   I N F O     :   T h e r e   w a s   n o t h i n g   t o   t r a n s f e r </w:t>
+        <w:br w:type="textWrapping"/>
+        <w:t xml:space="preserve"> </w:t>
+      </w:r>
+    </w:p>
+    <w:p>
+      <w:pPr>
+        <w:keepNext w:val="0"/>
+        <w:keepLines w:val="0"/>
+        <w:pageBreakBefore w:val="0"/>
+        <w:widowControl w:val="0"/>
+        <w:pBdr>
+          <w:top w:space="0" w:sz="0" w:val="nil"/>
+          <w:left w:space="0" w:sz="0" w:val="nil"/>
+          <w:bottom w:space="0" w:sz="0" w:val="nil"/>
+          <w:right w:space="0" w:sz="0" w:val="nil"/>
+          <w:between w:space="0" w:sz="0" w:val="nil"/>
+        </w:pBdr>
+        <w:shd w:fill="auto" w:val="clear"/>
+        <w:spacing w:after="0" w:before="0" w:line="276" w:lineRule="auto"/>
+        <w:ind w:left="0" w:right="0" w:firstLine="0"/>
+        <w:jc w:val="left"/>
+        <w:rPr/>
+      </w:pPr>
+      <w:r>
+        <w:rPr>
+          <w:rtl w:val="0"/>
+        </w:rPr>
+        <w:t xml:space="preserve"> A t   C : \ U s e r s \ S o u r c e - 1 \ D e s k t o p \ r c l o n e \ c o n d u i t _ s y n c . p s 1 : 6 3   c h a r : 1 </w:t>
+        <w:br w:type="textWrapping"/>
+        <w:t xml:space="preserve"> </w:t>
+      </w:r>
+    </w:p>
+    <w:p>
+      <w:pPr>
+        <w:keepNext w:val="0"/>
+        <w:keepLines w:val="0"/>
+        <w:pageBreakBefore w:val="0"/>
+        <w:widowControl w:val="0"/>
+        <w:pBdr>
+          <w:top w:space="0" w:sz="0" w:val="nil"/>
+          <w:left w:space="0" w:sz="0" w:val="nil"/>
+          <w:bottom w:space="0" w:sz="0" w:val="nil"/>
+          <w:right w:space="0" w:sz="0" w:val="nil"/>
+          <w:between w:space="0" w:sz="0" w:val="nil"/>
+        </w:pBdr>
+        <w:shd w:fill="auto" w:val="clear"/>
+        <w:spacing w:after="0" w:before="0" w:line="276" w:lineRule="auto"/>
+        <w:ind w:left="0" w:right="0" w:firstLine="0"/>
+        <w:jc w:val="left"/>
+        <w:rPr/>
+      </w:pPr>
+      <w:r>
+        <w:rPr>
+          <w:rtl w:val="0"/>
+        </w:rPr>
+        <w:t xml:space="preserve"> +   &amp;   $ r c l o n e   c o p y   - - f i l t e r - f r o m   $ f i l t e r   $ s o u r c e D a t a   g d r i v e : V 3 R / d a t a /   - v     . . . </w:t>
+        <w:br w:type="textWrapping"/>
+        <w:t xml:space="preserve"> </w:t>
+      </w:r>
+    </w:p>
+    <w:p>
+      <w:pPr>
+        <w:keepNext w:val="0"/>
+        <w:keepLines w:val="0"/>
+        <w:pageBreakBefore w:val="0"/>
+        <w:widowControl w:val="0"/>
+        <w:pBdr>
+          <w:top w:space="0" w:sz="0" w:val="nil"/>
+          <w:left w:space="0" w:sz="0" w:val="nil"/>
+          <w:bottom w:space="0" w:sz="0" w:val="nil"/>
+          <w:right w:space="0" w:sz="0" w:val="nil"/>
+          <w:between w:space="0" w:sz="0" w:val="nil"/>
+        </w:pBdr>
+        <w:shd w:fill="auto" w:val="clear"/>
+        <w:spacing w:after="0" w:before="0" w:line="276" w:lineRule="auto"/>
+        <w:ind w:left="0" w:right="0" w:firstLine="0"/>
+        <w:jc w:val="left"/>
+        <w:rPr/>
+      </w:pPr>
+      <w:r>
+        <w:rPr>
+          <w:rtl w:val="0"/>
+        </w:rPr>
+        <w:t xml:space="preserve"> +   ~ ~ ~ ~ ~ ~ ~ ~ ~ ~ ~ ~ ~ ~ ~ ~ ~ ~ ~ ~ ~ ~ ~ ~ ~ ~ ~ ~ ~ ~ ~ ~ ~ ~ ~ ~ ~ ~ ~ ~ ~ ~ ~ ~ ~ ~ ~ ~ ~ ~ ~ ~ ~ ~ ~ ~ ~ ~ ~ ~ ~ ~ ~ ~ ~ ~ ~ ~ ~ </w:t>
+        <w:br w:type="textWrapping"/>
+        <w:t xml:space="preserve"> </w:t>
+      </w:r>
+    </w:p>
+    <w:p>
+      <w:pPr>
+        <w:keepNext w:val="0"/>
+        <w:keepLines w:val="0"/>
+        <w:pageBreakBefore w:val="0"/>
+        <w:widowControl w:val="0"/>
+        <w:pBdr>
+          <w:top w:space="0" w:sz="0" w:val="nil"/>
+          <w:left w:space="0" w:sz="0" w:val="nil"/>
+          <w:bottom w:space="0" w:sz="0" w:val="nil"/>
+          <w:right w:space="0" w:sz="0" w:val="nil"/>
+          <w:between w:space="0" w:sz="0" w:val="nil"/>
+        </w:pBdr>
+        <w:shd w:fill="auto" w:val="clear"/>
+        <w:spacing w:after="0" w:before="0" w:line="276" w:lineRule="auto"/>
+        <w:ind w:left="0" w:right="0" w:firstLine="0"/>
+        <w:jc w:val="left"/>
+        <w:rPr/>
+      </w:pPr>
+      <w:r>
+        <w:rPr>
+          <w:rtl w:val="0"/>
+        </w:rPr>
+        <w:t xml:space="preserve">         +   C a t e g o r y I n f o                     :   N o t S p e c i f i e d :   ( 2 0 2 6 / 0 3 / 1 9   1 2 : 1 . . . i n g   t o   t r a n s f e r : S t r i n g )   [ ] ,   R e m o t e E x c e p t i o n </w:t>
+        <w:br w:type="textWrapping"/>
+        <w:t xml:space="preserve"> </w:t>
+      </w:r>
+    </w:p>
+    <w:p>
+      <w:pPr>
+        <w:keepNext w:val="0"/>
+        <w:keepLines w:val="0"/>
+        <w:pageBreakBefore w:val="0"/>
+        <w:widowControl w:val="0"/>
+        <w:pBdr>
+          <w:top w:space="0" w:sz="0" w:val="nil"/>
+          <w:left w:space="0" w:sz="0" w:val="nil"/>
+          <w:bottom w:space="0" w:sz="0" w:val="nil"/>
+          <w:right w:space="0" w:sz="0" w:val="nil"/>
+          <w:between w:space="0" w:sz="0" w:val="nil"/>
+        </w:pBdr>
+        <w:shd w:fill="auto" w:val="clear"/>
+        <w:spacing w:after="0" w:before="0" w:line="276" w:lineRule="auto"/>
+        <w:ind w:left="0" w:right="0" w:firstLine="0"/>
+        <w:jc w:val="left"/>
+        <w:rPr/>
+      </w:pPr>
+      <w:r>
+        <w:rPr>
+          <w:rtl w:val="0"/>
+        </w:rPr>
+        <w:t xml:space="preserve">         +   F u l l y Q u a l i f i e d E r r o r I d   :   N a t i v e C o m m a n d E r r o r </w:t>
+        <w:br w:type="textWrapping"/>
+        <w:t xml:space="preserve"> </w:t>
+      </w:r>
+    </w:p>
+    <w:p>
+      <w:pPr>
+        <w:keepNext w:val="0"/>
+        <w:keepLines w:val="0"/>
+        <w:pageBreakBefore w:val="0"/>
+        <w:widowControl w:val="0"/>
+        <w:pBdr>
+          <w:top w:space="0" w:sz="0" w:val="nil"/>
+          <w:left w:space="0" w:sz="0" w:val="nil"/>
+          <w:bottom w:space="0" w:sz="0" w:val="nil"/>
+          <w:right w:space="0" w:sz="0" w:val="nil"/>
+          <w:between w:space="0" w:sz="0" w:val="nil"/>
+        </w:pBdr>
+        <w:shd w:fill="auto" w:val="clear"/>
+        <w:spacing w:after="0" w:before="0" w:line="276" w:lineRule="auto"/>
+        <w:ind w:left="0" w:right="0" w:firstLine="0"/>
+        <w:jc w:val="left"/>
+        <w:rPr/>
+      </w:pPr>
+      <w:r>
+        <w:rPr>
+          <w:rtl w:val="0"/>
+        </w:rPr>
+        <w:t xml:space="preserve">   </w:t>
+        <w:br w:type="textWrapping"/>
+        <w:t xml:space="preserve"> </w:t>
+      </w:r>
+    </w:p>
+    <w:p>
+      <w:pPr>
+        <w:keepNext w:val="0"/>
+        <w:keepLines w:val="0"/>
+        <w:pageBreakBefore w:val="0"/>
+        <w:widowControl w:val="0"/>
+        <w:pBdr>
+          <w:top w:space="0" w:sz="0" w:val="nil"/>
+          <w:left w:space="0" w:sz="0" w:val="nil"/>
+          <w:bottom w:space="0" w:sz="0" w:val="nil"/>
+          <w:right w:space="0" w:sz="0" w:val="nil"/>
+          <w:between w:space="0" w:sz="0" w:val="nil"/>
+        </w:pBdr>
+        <w:shd w:fill="auto" w:val="clear"/>
+        <w:spacing w:after="0" w:before="0" w:line="276" w:lineRule="auto"/>
+        <w:ind w:left="0" w:right="0" w:firstLine="0"/>
+        <w:jc w:val="left"/>
+        <w:rPr/>
+      </w:pPr>
+      <w:r>
+        <w:rPr>
+          <w:rtl w:val="0"/>
+        </w:rPr>
+        <w:t xml:space="preserve"> 2 0 2 6 / 0 3 / 1 9   1 2 : 1 2 : 0 7   I N F O     :   </w:t>
+        <w:br w:type="textWrapping"/>
+        <w:t xml:space="preserve"> </w:t>
+      </w:r>
+    </w:p>
+    <w:p>
+      <w:pPr>
+        <w:keepNext w:val="0"/>
+        <w:keepLines w:val="0"/>
+        <w:pageBreakBefore w:val="0"/>
+        <w:widowControl w:val="0"/>
+        <w:pBdr>
+          <w:top w:space="0" w:sz="0" w:val="nil"/>
+          <w:left w:space="0" w:sz="0" w:val="nil"/>
+          <w:bottom w:space="0" w:sz="0" w:val="nil"/>
+          <w:right w:space="0" w:sz="0" w:val="nil"/>
+          <w:between w:space="0" w:sz="0" w:val="nil"/>
+        </w:pBdr>
+        <w:shd w:fill="auto" w:val="clear"/>
+        <w:spacing w:after="0" w:before="0" w:line="276" w:lineRule="auto"/>
+        <w:ind w:left="0" w:right="0" w:firstLine="0"/>
+        <w:jc w:val="left"/>
+        <w:rPr/>
+      </w:pPr>
+      <w:r>
+        <w:rPr>
+          <w:rtl w:val="0"/>
+        </w:rPr>
+        <w:t xml:space="preserve"> T r a n s f e r r e d :       </w:t>
+        <w:tab/>
+        <w:t xml:space="preserve">                     0   B   /   0   B ,   - ,   0   B / s ,   E T A   - </w:t>
+        <w:br w:type="textWrapping"/>
+        <w:t xml:space="preserve"> </w:t>
+      </w:r>
+    </w:p>
+    <w:p>
+      <w:pPr>
+        <w:keepNext w:val="0"/>
+        <w:keepLines w:val="0"/>
+        <w:pageBreakBefore w:val="0"/>
+        <w:widowControl w:val="0"/>
+        <w:pBdr>
+          <w:top w:space="0" w:sz="0" w:val="nil"/>
+          <w:left w:space="0" w:sz="0" w:val="nil"/>
+          <w:bottom w:space="0" w:sz="0" w:val="nil"/>
+          <w:right w:space="0" w:sz="0" w:val="nil"/>
+          <w:between w:space="0" w:sz="0" w:val="nil"/>
+        </w:pBdr>
+        <w:shd w:fill="auto" w:val="clear"/>
+        <w:spacing w:after="0" w:before="0" w:line="276" w:lineRule="auto"/>
+        <w:ind w:left="0" w:right="0" w:firstLine="0"/>
+        <w:jc w:val="left"/>
+        <w:rPr/>
+      </w:pPr>
+      <w:r>
+        <w:rPr>
+          <w:rtl w:val="0"/>
+        </w:rPr>
+        <w:t xml:space="preserve"> C h e c k s :                                   5   /   5 ,   1 0 0 % ,   L i s t e d   1 5 </w:t>
+        <w:br w:type="textWrapping"/>
+        <w:t xml:space="preserve"> </w:t>
+      </w:r>
+    </w:p>
+    <w:p>
+      <w:pPr>
+        <w:keepNext w:val="0"/>
+        <w:keepLines w:val="0"/>
+        <w:pageBreakBefore w:val="0"/>
+        <w:widowControl w:val="0"/>
+        <w:pBdr>
+          <w:top w:space="0" w:sz="0" w:val="nil"/>
+          <w:left w:space="0" w:sz="0" w:val="nil"/>
+          <w:bottom w:space="0" w:sz="0" w:val="nil"/>
+          <w:right w:space="0" w:sz="0" w:val="nil"/>
+          <w:between w:space="0" w:sz="0" w:val="nil"/>
+        </w:pBdr>
+        <w:shd w:fill="auto" w:val="clear"/>
+        <w:spacing w:after="0" w:before="0" w:line="276" w:lineRule="auto"/>
+        <w:ind w:left="0" w:right="0" w:firstLine="0"/>
+        <w:jc w:val="left"/>
+        <w:rPr/>
+      </w:pPr>
+      <w:r>
+        <w:rPr>
+          <w:rtl w:val="0"/>
+        </w:rPr>
+        <w:t xml:space="preserve"> E l a p s e d   t i m e :                   0 . 3 s </w:t>
+        <w:br w:type="textWrapping"/>
+        <w:t xml:space="preserve"> </w:t>
+      </w:r>
+    </w:p>
+    <w:p>
+      <w:pPr>
+        <w:keepNext w:val="0"/>
+        <w:keepLines w:val="0"/>
+        <w:pageBreakBefore w:val="0"/>
+        <w:widowControl w:val="0"/>
+        <w:pBdr>
+          <w:top w:space="0" w:sz="0" w:val="nil"/>
+          <w:left w:space="0" w:sz="0" w:val="nil"/>
+          <w:bottom w:space="0" w:sz="0" w:val="nil"/>
+          <w:right w:space="0" w:sz="0" w:val="nil"/>
+          <w:between w:space="0" w:sz="0" w:val="nil"/>
+        </w:pBdr>
+        <w:shd w:fill="auto" w:val="clear"/>
+        <w:spacing w:after="0" w:before="0" w:line="276" w:lineRule="auto"/>
+        <w:ind w:left="0" w:right="0" w:firstLine="0"/>
+        <w:jc w:val="left"/>
+        <w:rPr/>
+      </w:pPr>
+      <w:r>
+        <w:rPr>
+          <w:rtl w:val="0"/>
+        </w:rPr>
+        <w:t xml:space="preserve"> </w:t>
+        <w:br w:type="textWrapping"/>
+        <w:t xml:space="preserve"> </w:t>
+      </w:r>
+    </w:p>
+    <w:p>
+      <w:pPr>
+        <w:keepNext w:val="0"/>
+        <w:keepLines w:val="0"/>
+        <w:pageBreakBefore w:val="0"/>
+        <w:widowControl w:val="0"/>
+        <w:pBdr>
+          <w:top w:space="0" w:sz="0" w:val="nil"/>
+          <w:left w:space="0" w:sz="0" w:val="nil"/>
+          <w:bottom w:space="0" w:sz="0" w:val="nil"/>
+          <w:right w:space="0" w:sz="0" w:val="nil"/>
+          <w:between w:space="0" w:sz="0" w:val="nil"/>
+        </w:pBdr>
+        <w:shd w:fill="auto" w:val="clear"/>
+        <w:spacing w:after="0" w:before="0" w:line="276" w:lineRule="auto"/>
+        <w:ind w:left="0" w:right="0" w:firstLine="0"/>
+        <w:jc w:val="left"/>
+        <w:rPr/>
+      </w:pPr>
+      <w:r>
+        <w:rPr>
+          <w:rtl w:val="0"/>
+        </w:rPr>
+        <w:t xml:space="preserve"> [Stage 9] Data sync complete</w:t>
+        <w:br w:type="textWrapping"/>
+      </w:r>
+    </w:p>
+    <w:p>
+      <w:pPr>
+        <w:keepNext w:val="0"/>
+        <w:keepLines w:val="0"/>
+        <w:pageBreakBefore w:val="0"/>
+        <w:widowControl w:val="0"/>
+        <w:pBdr>
+          <w:top w:space="0" w:sz="0" w:val="nil"/>
+          <w:left w:space="0" w:sz="0" w:val="nil"/>
+          <w:bottom w:space="0" w:sz="0" w:val="nil"/>
+          <w:right w:space="0" w:sz="0" w:val="nil"/>
+          <w:between w:space="0" w:sz="0" w:val="nil"/>
+        </w:pBdr>
+        <w:shd w:fill="auto" w:val="clear"/>
+        <w:spacing w:after="0" w:before="0" w:line="276" w:lineRule="auto"/>
+        <w:ind w:left="0" w:right="0" w:firstLine="0"/>
+        <w:jc w:val="left"/>
+        <w:rPr/>
+      </w:pPr>
+      <w:r>
+        <w:rPr>
+          <w:rtl w:val="0"/>
+        </w:rPr>
+        <w:t xml:space="preserve">Reminder: Run Apps Script converter for new Doc pairs.</w:t>
+        <w:br w:type="textWrapping"/>
+      </w:r>
+    </w:p>
+    <w:p>
+      <w:pPr>
+        <w:keepNext w:val="0"/>
+        <w:keepLines w:val="0"/>
+        <w:pageBreakBefore w:val="0"/>
+        <w:widowControl w:val="0"/>
+        <w:pBdr>
+          <w:top w:space="0" w:sz="0" w:val="nil"/>
+          <w:left w:space="0" w:sz="0" w:val="nil"/>
+          <w:bottom w:space="0" w:sz="0" w:val="nil"/>
+          <w:right w:space="0" w:sz="0" w:val="nil"/>
+          <w:between w:space="0" w:sz="0" w:val="nil"/>
+        </w:pBdr>
+        <w:shd w:fill="auto" w:val="clear"/>
+        <w:spacing w:after="0" w:before="0" w:line="276" w:lineRule="auto"/>
+        <w:ind w:left="0" w:right="0" w:firstLine="0"/>
+        <w:jc w:val="left"/>
+        <w:rPr/>
+      </w:pPr>
+      <w:r>
+        <w:rPr>
+          <w:rtl w:val="0"/>
+        </w:rPr>
+        <w:t xml:space="preserve">========================================</w:t>
+        <w:br w:type="textWrapping"/>
+      </w:r>
+    </w:p>
+    <w:p>
+      <w:pPr>
+        <w:keepNext w:val="0"/>
+        <w:keepLines w:val="0"/>
+        <w:pageBreakBefore w:val="0"/>
+        <w:widowControl w:val="0"/>
+        <w:pBdr>
+          <w:top w:space="0" w:sz="0" w:val="nil"/>
+          <w:left w:space="0" w:sz="0" w:val="nil"/>
+          <w:bottom w:space="0" w:sz="0" w:val="nil"/>
+          <w:right w:space="0" w:sz="0" w:val="nil"/>
+          <w:between w:space="0" w:sz="0" w:val="nil"/>
+        </w:pBdr>
+        <w:shd w:fill="auto" w:val="clear"/>
+        <w:spacing w:after="0" w:before="0" w:line="276" w:lineRule="auto"/>
+        <w:ind w:left="0" w:right="0" w:firstLine="0"/>
+        <w:jc w:val="left"/>
+        <w:rPr/>
+      </w:pPr>
+      <w:r>
+        <w:rPr>
+          <w:rtl w:val="0"/>
+        </w:rPr>
+        <w:t xml:space="preserve">[Stage 1] Version rotation complete</w:t>
+        <w:br w:type="textWrapping"/>
+      </w:r>
+    </w:p>
+    <w:p>
+      <w:pPr>
+        <w:keepNext w:val="0"/>
+        <w:keepLines w:val="0"/>
+        <w:pageBreakBefore w:val="0"/>
+        <w:widowControl w:val="0"/>
+        <w:pBdr>
+          <w:top w:space="0" w:sz="0" w:val="nil"/>
+          <w:left w:space="0" w:sz="0" w:val="nil"/>
+          <w:bottom w:space="0" w:sz="0" w:val="nil"/>
+          <w:right w:space="0" w:sz="0" w:val="nil"/>
+          <w:between w:space="0" w:sz="0" w:val="nil"/>
+        </w:pBdr>
+        <w:shd w:fill="auto" w:val="clear"/>
+        <w:spacing w:after="0" w:before="0" w:line="276" w:lineRule="auto"/>
+        <w:ind w:left="0" w:right="0" w:firstLine="0"/>
+        <w:jc w:val="left"/>
+        <w:rPr/>
+      </w:pPr>
+      <w:r>
+        <w:rPr>
+          <w:rtl w:val="0"/>
+        </w:rPr>
+        <w:t xml:space="preserve">r c l o n e . e x e   :   2 0 2 6 / 0 3 / 1 9   1 3 : 0 7 : 0 9   I N F O     :   s c r a t c h :   S e t   d i r e c t o r y   m o d i f i c a t i o n   t i m e   ( u s i n g   S e t M o d T i m e ) </w:t>
+        <w:br w:type="textWrapping"/>
+        <w:t xml:space="preserve"> </w:t>
+      </w:r>
+    </w:p>
+    <w:p>
+      <w:pPr>
+        <w:keepNext w:val="0"/>
+        <w:keepLines w:val="0"/>
+        <w:pageBreakBefore w:val="0"/>
+        <w:widowControl w:val="0"/>
+        <w:pBdr>
+          <w:top w:space="0" w:sz="0" w:val="nil"/>
+          <w:left w:space="0" w:sz="0" w:val="nil"/>
+          <w:bottom w:space="0" w:sz="0" w:val="nil"/>
+          <w:right w:space="0" w:sz="0" w:val="nil"/>
+          <w:between w:space="0" w:sz="0" w:val="nil"/>
+        </w:pBdr>
+        <w:shd w:fill="auto" w:val="clear"/>
+        <w:spacing w:after="0" w:before="0" w:line="276" w:lineRule="auto"/>
+        <w:ind w:left="0" w:right="0" w:firstLine="0"/>
+        <w:jc w:val="left"/>
+        <w:rPr/>
+      </w:pPr>
+      <w:r>
+        <w:rPr>
+          <w:rtl w:val="0"/>
+        </w:rPr>
+        <w:t xml:space="preserve"> A t   C : \ U s e r s \ S o u r c e - 1 \ D e s k t o p \ r c l o n e \ c o n d u i t _ s y n c . p s 1 : 3 2   c h a r : 1 </w:t>
+        <w:br w:type="textWrapping"/>
+        <w:t xml:space="preserve"> </w:t>
+      </w:r>
+    </w:p>
+    <w:p>
+      <w:pPr>
+        <w:keepNext w:val="0"/>
+        <w:keepLines w:val="0"/>
+        <w:pageBreakBefore w:val="0"/>
+        <w:widowControl w:val="0"/>
+        <w:pBdr>
+          <w:top w:space="0" w:sz="0" w:val="nil"/>
+          <w:left w:space="0" w:sz="0" w:val="nil"/>
+          <w:bottom w:space="0" w:sz="0" w:val="nil"/>
+          <w:right w:space="0" w:sz="0" w:val="nil"/>
+          <w:between w:space="0" w:sz="0" w:val="nil"/>
+        </w:pBdr>
+        <w:shd w:fill="auto" w:val="clear"/>
+        <w:spacing w:after="0" w:before="0" w:line="276" w:lineRule="auto"/>
+        <w:ind w:left="0" w:right="0" w:firstLine="0"/>
+        <w:jc w:val="left"/>
+        <w:rPr/>
+      </w:pPr>
+      <w:r>
+        <w:rPr>
+          <w:rtl w:val="0"/>
+        </w:rPr>
+        <w:t xml:space="preserve"> +   &amp;   $ r c l o n e   c o p y   - - f i l t e r - f r o m   $ f i l t e r   $ s o u r c e E c r   g d r i v e : V 3 R / c o d e / c u r r e   . . . </w:t>
+        <w:br w:type="textWrapping"/>
+        <w:t xml:space="preserve"> </w:t>
+      </w:r>
+    </w:p>
+    <w:p>
+      <w:pPr>
+        <w:keepNext w:val="0"/>
+        <w:keepLines w:val="0"/>
+        <w:pageBreakBefore w:val="0"/>
+        <w:widowControl w:val="0"/>
+        <w:pBdr>
+          <w:top w:space="0" w:sz="0" w:val="nil"/>
+          <w:left w:space="0" w:sz="0" w:val="nil"/>
+          <w:bottom w:space="0" w:sz="0" w:val="nil"/>
+          <w:right w:space="0" w:sz="0" w:val="nil"/>
+          <w:between w:space="0" w:sz="0" w:val="nil"/>
+        </w:pBdr>
+        <w:shd w:fill="auto" w:val="clear"/>
+        <w:spacing w:after="0" w:before="0" w:line="276" w:lineRule="auto"/>
+        <w:ind w:left="0" w:right="0" w:firstLine="0"/>
+        <w:jc w:val="left"/>
+        <w:rPr/>
+      </w:pPr>
+      <w:r>
+        <w:rPr>
+          <w:rtl w:val="0"/>
+        </w:rPr>
+        <w:t xml:space="preserve"> +   ~ ~ ~ ~ ~ ~ ~ ~ ~ ~ ~ ~ ~ ~ ~ ~ ~ ~ ~ ~ ~ ~ ~ ~ ~ ~ ~ ~ ~ ~ ~ ~ ~ ~ ~ ~ ~ ~ ~ ~ ~ ~ ~ ~ ~ ~ ~ ~ ~ ~ ~ ~ ~ ~ ~ ~ ~ ~ ~ ~ ~ ~ ~ ~ ~ ~ ~ ~ ~ </w:t>
+        <w:br w:type="textWrapping"/>
+        <w:t xml:space="preserve"> </w:t>
+      </w:r>
+    </w:p>
+    <w:p>
+      <w:pPr>
+        <w:keepNext w:val="0"/>
+        <w:keepLines w:val="0"/>
+        <w:pageBreakBefore w:val="0"/>
+        <w:widowControl w:val="0"/>
+        <w:pBdr>
+          <w:top w:space="0" w:sz="0" w:val="nil"/>
+          <w:left w:space="0" w:sz="0" w:val="nil"/>
+          <w:bottom w:space="0" w:sz="0" w:val="nil"/>
+          <w:right w:space="0" w:sz="0" w:val="nil"/>
+          <w:between w:space="0" w:sz="0" w:val="nil"/>
+        </w:pBdr>
+        <w:shd w:fill="auto" w:val="clear"/>
+        <w:spacing w:after="0" w:before="0" w:line="276" w:lineRule="auto"/>
+        <w:ind w:left="0" w:right="0" w:firstLine="0"/>
+        <w:jc w:val="left"/>
+        <w:rPr/>
+      </w:pPr>
+      <w:r>
+        <w:rPr>
+          <w:rtl w:val="0"/>
+        </w:rPr>
+        <w:t xml:space="preserve">         +   C a t e g o r y I n f o                     :   N o t S p e c i f i e d :   ( 2 0 2 6 / 0 3 / 1 9   1 3 : 0 . . . i n g   S e t M o d T i m e ) : S t r i n g )   [ ] ,   R e m o t e E x c e p t i o n </w:t>
+        <w:br w:type="textWrapping"/>
+        <w:t xml:space="preserve"> </w:t>
+      </w:r>
+    </w:p>
+    <w:p>
+      <w:pPr>
+        <w:keepNext w:val="0"/>
+        <w:keepLines w:val="0"/>
+        <w:pageBreakBefore w:val="0"/>
+        <w:widowControl w:val="0"/>
+        <w:pBdr>
+          <w:top w:space="0" w:sz="0" w:val="nil"/>
+          <w:left w:space="0" w:sz="0" w:val="nil"/>
+          <w:bottom w:space="0" w:sz="0" w:val="nil"/>
+          <w:right w:space="0" w:sz="0" w:val="nil"/>
+          <w:between w:space="0" w:sz="0" w:val="nil"/>
+        </w:pBdr>
+        <w:shd w:fill="auto" w:val="clear"/>
+        <w:spacing w:after="0" w:before="0" w:line="276" w:lineRule="auto"/>
+        <w:ind w:left="0" w:right="0" w:firstLine="0"/>
+        <w:jc w:val="left"/>
+        <w:rPr/>
+      </w:pPr>
+      <w:r>
+        <w:rPr>
+          <w:rtl w:val="0"/>
+        </w:rPr>
+        <w:t xml:space="preserve">         +   F u l l y Q u a l i f i e d E r r o r I d   :   N a t i v e C o m m a n d E r r o r </w:t>
+        <w:br w:type="textWrapping"/>
+        <w:t xml:space="preserve"> </w:t>
+      </w:r>
+    </w:p>
+    <w:p>
+      <w:pPr>
+        <w:keepNext w:val="0"/>
+        <w:keepLines w:val="0"/>
+        <w:pageBreakBefore w:val="0"/>
+        <w:widowControl w:val="0"/>
+        <w:pBdr>
+          <w:top w:space="0" w:sz="0" w:val="nil"/>
+          <w:left w:space="0" w:sz="0" w:val="nil"/>
+          <w:bottom w:space="0" w:sz="0" w:val="nil"/>
+          <w:right w:space="0" w:sz="0" w:val="nil"/>
+          <w:between w:space="0" w:sz="0" w:val="nil"/>
+        </w:pBdr>
+        <w:shd w:fill="auto" w:val="clear"/>
+        <w:spacing w:after="0" w:before="0" w:line="276" w:lineRule="auto"/>
+        <w:ind w:left="0" w:right="0" w:firstLine="0"/>
+        <w:jc w:val="left"/>
+        <w:rPr/>
+      </w:pPr>
+      <w:r>
+        <w:rPr>
+          <w:rtl w:val="0"/>
+        </w:rPr>
+        <w:t xml:space="preserve">   </w:t>
+        <w:br w:type="textWrapping"/>
+        <w:t xml:space="preserve"> </w:t>
+      </w:r>
+    </w:p>
+    <w:p>
+      <w:pPr>
+        <w:keepNext w:val="0"/>
+        <w:keepLines w:val="0"/>
+        <w:pageBreakBefore w:val="0"/>
+        <w:widowControl w:val="0"/>
+        <w:pBdr>
+          <w:top w:space="0" w:sz="0" w:val="nil"/>
+          <w:left w:space="0" w:sz="0" w:val="nil"/>
+          <w:bottom w:space="0" w:sz="0" w:val="nil"/>
+          <w:right w:space="0" w:sz="0" w:val="nil"/>
+          <w:between w:space="0" w:sz="0" w:val="nil"/>
+        </w:pBdr>
+        <w:shd w:fill="auto" w:val="clear"/>
+        <w:spacing w:after="0" w:before="0" w:line="276" w:lineRule="auto"/>
+        <w:ind w:left="0" w:right="0" w:firstLine="0"/>
+        <w:jc w:val="left"/>
+        <w:rPr/>
+      </w:pPr>
+      <w:r>
+        <w:rPr>
+          <w:rtl w:val="0"/>
+        </w:rPr>
+        <w:t xml:space="preserve"> 2 0 2 6 / 0 3 / 1 9   1 3 : 0 7 : 1 0   I N F O     :   s f _ t e s t . j s o n :   C o p i e d   ( n e w ) </w:t>
+        <w:br w:type="textWrapping"/>
+        <w:t xml:space="preserve"> </w:t>
+      </w:r>
+    </w:p>
+    <w:p>
+      <w:pPr>
+        <w:keepNext w:val="0"/>
+        <w:keepLines w:val="0"/>
+        <w:pageBreakBefore w:val="0"/>
+        <w:widowControl w:val="0"/>
+        <w:pBdr>
+          <w:top w:space="0" w:sz="0" w:val="nil"/>
+          <w:left w:space="0" w:sz="0" w:val="nil"/>
+          <w:bottom w:space="0" w:sz="0" w:val="nil"/>
+          <w:right w:space="0" w:sz="0" w:val="nil"/>
+          <w:between w:space="0" w:sz="0" w:val="nil"/>
+        </w:pBdr>
+        <w:shd w:fill="auto" w:val="clear"/>
+        <w:spacing w:after="0" w:before="0" w:line="276" w:lineRule="auto"/>
+        <w:ind w:left="0" w:right="0" w:firstLine="0"/>
+        <w:jc w:val="left"/>
+        <w:rPr/>
+      </w:pPr>
+      <w:r>
+        <w:rPr>
+          <w:rtl w:val="0"/>
+        </w:rPr>
+        <w:t xml:space="preserve"> 2 0 2 6 / 0 3 / 1 9   1 3 : 0 7 : 1 0   I N F O     :   s c r a t c h / s f _ t e s t . j s o n :   C o p i e d   ( n e w ) </w:t>
+        <w:br w:type="textWrapping"/>
+        <w:t xml:space="preserve"> </w:t>
+      </w:r>
+    </w:p>
+    <w:p>
+      <w:pPr>
+        <w:keepNext w:val="0"/>
+        <w:keepLines w:val="0"/>
+        <w:pageBreakBefore w:val="0"/>
+        <w:widowControl w:val="0"/>
+        <w:pBdr>
+          <w:top w:space="0" w:sz="0" w:val="nil"/>
+          <w:left w:space="0" w:sz="0" w:val="nil"/>
+          <w:bottom w:space="0" w:sz="0" w:val="nil"/>
+          <w:right w:space="0" w:sz="0" w:val="nil"/>
+          <w:between w:space="0" w:sz="0" w:val="nil"/>
+        </w:pBdr>
+        <w:shd w:fill="auto" w:val="clear"/>
+        <w:spacing w:after="0" w:before="0" w:line="276" w:lineRule="auto"/>
+        <w:ind w:left="0" w:right="0" w:firstLine="0"/>
+        <w:jc w:val="left"/>
+        <w:rPr/>
+      </w:pPr>
+      <w:r>
+        <w:rPr>
+          <w:rtl w:val="0"/>
+        </w:rPr>
+        <w:t xml:space="preserve"> 2 0 2 6 / 0 3 / 1 9   1 3 : 0 7 : 1 1   I N F O     :   s c r a t c h :   S e t   d i r e c t o r y   m o d i f i c a t i o n   t i m e   ( u s i n g   S e t M o d T i m e ) </w:t>
+        <w:br w:type="textWrapping"/>
+        <w:t xml:space="preserve"> </w:t>
+      </w:r>
+    </w:p>
+    <w:p>
+      <w:pPr>
+        <w:keepNext w:val="0"/>
+        <w:keepLines w:val="0"/>
+        <w:pageBreakBefore w:val="0"/>
+        <w:widowControl w:val="0"/>
+        <w:pBdr>
+          <w:top w:space="0" w:sz="0" w:val="nil"/>
+          <w:left w:space="0" w:sz="0" w:val="nil"/>
+          <w:bottom w:space="0" w:sz="0" w:val="nil"/>
+          <w:right w:space="0" w:sz="0" w:val="nil"/>
+          <w:between w:space="0" w:sz="0" w:val="nil"/>
+        </w:pBdr>
+        <w:shd w:fill="auto" w:val="clear"/>
+        <w:spacing w:after="0" w:before="0" w:line="276" w:lineRule="auto"/>
+        <w:ind w:left="0" w:right="0" w:firstLine="0"/>
+        <w:jc w:val="left"/>
+        <w:rPr/>
+      </w:pPr>
+      <w:r>
+        <w:rPr>
+          <w:rtl w:val="0"/>
+        </w:rPr>
+        <w:t xml:space="preserve"> 2 0 2 6 / 0 3 / 1 9   1 3 : 0 7 : 1 1   I N F O     :   </w:t>
+        <w:br w:type="textWrapping"/>
+        <w:t xml:space="preserve"> </w:t>
+      </w:r>
+    </w:p>
+    <w:p>
+      <w:pPr>
+        <w:keepNext w:val="0"/>
+        <w:keepLines w:val="0"/>
+        <w:pageBreakBefore w:val="0"/>
+        <w:widowControl w:val="0"/>
+        <w:pBdr>
+          <w:top w:space="0" w:sz="0" w:val="nil"/>
+          <w:left w:space="0" w:sz="0" w:val="nil"/>
+          <w:bottom w:space="0" w:sz="0" w:val="nil"/>
+          <w:right w:space="0" w:sz="0" w:val="nil"/>
+          <w:between w:space="0" w:sz="0" w:val="nil"/>
+        </w:pBdr>
+        <w:shd w:fill="auto" w:val="clear"/>
+        <w:spacing w:after="0" w:before="0" w:line="276" w:lineRule="auto"/>
+        <w:ind w:left="0" w:right="0" w:firstLine="0"/>
+        <w:jc w:val="left"/>
+        <w:rPr/>
+      </w:pPr>
+      <w:r>
+        <w:rPr>
+          <w:rtl w:val="0"/>
+        </w:rPr>
+        <w:t xml:space="preserve"> T r a n s f e r r e d :       </w:t>
+        <w:tab/>
+        <w:t xml:space="preserve">                 1 3 8   B   /   1 3 8   B ,   1 0 0 % ,   6 9   B / s ,   E T A   0 s </w:t>
+        <w:br w:type="textWrapping"/>
+        <w:t xml:space="preserve"> </w:t>
+      </w:r>
+    </w:p>
+    <w:p>
+      <w:pPr>
+        <w:keepNext w:val="0"/>
+        <w:keepLines w:val="0"/>
+        <w:pageBreakBefore w:val="0"/>
+        <w:widowControl w:val="0"/>
+        <w:pBdr>
+          <w:top w:space="0" w:sz="0" w:val="nil"/>
+          <w:left w:space="0" w:sz="0" w:val="nil"/>
+          <w:bottom w:space="0" w:sz="0" w:val="nil"/>
+          <w:right w:space="0" w:sz="0" w:val="nil"/>
+          <w:between w:space="0" w:sz="0" w:val="nil"/>
+        </w:pBdr>
+        <w:shd w:fill="auto" w:val="clear"/>
+        <w:spacing w:after="0" w:before="0" w:line="276" w:lineRule="auto"/>
+        <w:ind w:left="0" w:right="0" w:firstLine="0"/>
+        <w:jc w:val="left"/>
+        <w:rPr/>
+      </w:pPr>
+      <w:r>
+        <w:rPr>
+          <w:rtl w:val="0"/>
+        </w:rPr>
+        <w:t xml:space="preserve"> C h e c k s :                                 1 2   /   1 2 ,   1 0 0 % ,   L i s t e d   4 8 </w:t>
+        <w:br w:type="textWrapping"/>
+        <w:t xml:space="preserve"> </w:t>
+      </w:r>
+    </w:p>
+    <w:p>
+      <w:pPr>
+        <w:keepNext w:val="0"/>
+        <w:keepLines w:val="0"/>
+        <w:pageBreakBefore w:val="0"/>
+        <w:widowControl w:val="0"/>
+        <w:pBdr>
+          <w:top w:space="0" w:sz="0" w:val="nil"/>
+          <w:left w:space="0" w:sz="0" w:val="nil"/>
+          <w:bottom w:space="0" w:sz="0" w:val="nil"/>
+          <w:right w:space="0" w:sz="0" w:val="nil"/>
+          <w:between w:space="0" w:sz="0" w:val="nil"/>
+        </w:pBdr>
+        <w:shd w:fill="auto" w:val="clear"/>
+        <w:spacing w:after="0" w:before="0" w:line="276" w:lineRule="auto"/>
+        <w:ind w:left="0" w:right="0" w:firstLine="0"/>
+        <w:jc w:val="left"/>
+        <w:rPr/>
+      </w:pPr>
+      <w:r>
+        <w:rPr>
+          <w:rtl w:val="0"/>
+        </w:rPr>
+        <w:t xml:space="preserve"> T r a n s f e r r e d :                         2   /   2 ,   1 0 0 % </w:t>
+        <w:br w:type="textWrapping"/>
+        <w:t xml:space="preserve"> </w:t>
+      </w:r>
+    </w:p>
+    <w:p>
+      <w:pPr>
+        <w:keepNext w:val="0"/>
+        <w:keepLines w:val="0"/>
+        <w:pageBreakBefore w:val="0"/>
+        <w:widowControl w:val="0"/>
+        <w:pBdr>
+          <w:top w:space="0" w:sz="0" w:val="nil"/>
+          <w:left w:space="0" w:sz="0" w:val="nil"/>
+          <w:bottom w:space="0" w:sz="0" w:val="nil"/>
+          <w:right w:space="0" w:sz="0" w:val="nil"/>
+          <w:between w:space="0" w:sz="0" w:val="nil"/>
+        </w:pBdr>
+        <w:shd w:fill="auto" w:val="clear"/>
+        <w:spacing w:after="0" w:before="0" w:line="276" w:lineRule="auto"/>
+        <w:ind w:left="0" w:right="0" w:firstLine="0"/>
+        <w:jc w:val="left"/>
+        <w:rPr/>
+      </w:pPr>
+      <w:r>
+        <w:rPr>
+          <w:rtl w:val="0"/>
+        </w:rPr>
+        <w:t xml:space="preserve"> E l a p s e d   t i m e :                   2 . 8 s </w:t>
+        <w:br w:type="textWrapping"/>
+        <w:t xml:space="preserve"> </w:t>
+      </w:r>
+    </w:p>
+    <w:p>
+      <w:pPr>
+        <w:keepNext w:val="0"/>
+        <w:keepLines w:val="0"/>
+        <w:pageBreakBefore w:val="0"/>
+        <w:widowControl w:val="0"/>
+        <w:pBdr>
+          <w:top w:space="0" w:sz="0" w:val="nil"/>
+          <w:left w:space="0" w:sz="0" w:val="nil"/>
+          <w:bottom w:space="0" w:sz="0" w:val="nil"/>
+          <w:right w:space="0" w:sz="0" w:val="nil"/>
+          <w:between w:space="0" w:sz="0" w:val="nil"/>
+        </w:pBdr>
+        <w:shd w:fill="auto" w:val="clear"/>
+        <w:spacing w:after="0" w:before="0" w:line="276" w:lineRule="auto"/>
+        <w:ind w:left="0" w:right="0" w:firstLine="0"/>
+        <w:jc w:val="left"/>
+        <w:rPr/>
+      </w:pPr>
+      <w:r>
+        <w:rPr>
+          <w:rtl w:val="0"/>
+        </w:rPr>
+        <w:t xml:space="preserve"> </w:t>
+        <w:br w:type="textWrapping"/>
+        <w:t xml:space="preserve"> </w:t>
+      </w:r>
+    </w:p>
+    <w:p>
+      <w:pPr>
+        <w:keepNext w:val="0"/>
+        <w:keepLines w:val="0"/>
+        <w:pageBreakBefore w:val="0"/>
+        <w:widowControl w:val="0"/>
+        <w:pBdr>
+          <w:top w:space="0" w:sz="0" w:val="nil"/>
+          <w:left w:space="0" w:sz="0" w:val="nil"/>
+          <w:bottom w:space="0" w:sz="0" w:val="nil"/>
+          <w:right w:space="0" w:sz="0" w:val="nil"/>
+          <w:between w:space="0" w:sz="0" w:val="nil"/>
+        </w:pBdr>
+        <w:shd w:fill="auto" w:val="clear"/>
+        <w:spacing w:after="0" w:before="0" w:line="276" w:lineRule="auto"/>
+        <w:ind w:left="0" w:right="0" w:firstLine="0"/>
+        <w:jc w:val="left"/>
+        <w:rPr/>
+      </w:pPr>
+      <w:r>
+        <w:rPr>
+          <w:rtl w:val="0"/>
+        </w:rPr>
+        <w:t xml:space="preserve"> [Stage 2] ecr-build sync complete</w:t>
+        <w:br w:type="textWrapping"/>
+      </w:r>
+    </w:p>
+    <w:p>
+      <w:pPr>
+        <w:keepNext w:val="0"/>
+        <w:keepLines w:val="0"/>
+        <w:pageBreakBefore w:val="0"/>
+        <w:widowControl w:val="0"/>
+        <w:pBdr>
+          <w:top w:space="0" w:sz="0" w:val="nil"/>
+          <w:left w:space="0" w:sz="0" w:val="nil"/>
+          <w:bottom w:space="0" w:sz="0" w:val="nil"/>
+          <w:right w:space="0" w:sz="0" w:val="nil"/>
+          <w:between w:space="0" w:sz="0" w:val="nil"/>
+        </w:pBdr>
+        <w:shd w:fill="auto" w:val="clear"/>
+        <w:spacing w:after="0" w:before="0" w:line="276" w:lineRule="auto"/>
+        <w:ind w:left="0" w:right="0" w:firstLine="0"/>
+        <w:jc w:val="left"/>
+        <w:rPr/>
+      </w:pPr>
+      <w:r>
+        <w:rPr>
+          <w:rtl w:val="0"/>
+        </w:rPr>
+        <w:t xml:space="preserve">r c l o n e . e x e   :   2 0 2 6 / 0 3 / 1 9   1 3 : 0 7 : 2 4   I N F O     :   T h e r e   w a s   n o t h i n g   t o   t r a n s f e r </w:t>
+        <w:br w:type="textWrapping"/>
+        <w:t xml:space="preserve"> </w:t>
+      </w:r>
+    </w:p>
+    <w:p>
+      <w:pPr>
+        <w:keepNext w:val="0"/>
+        <w:keepLines w:val="0"/>
+        <w:pageBreakBefore w:val="0"/>
+        <w:widowControl w:val="0"/>
+        <w:pBdr>
+          <w:top w:space="0" w:sz="0" w:val="nil"/>
+          <w:left w:space="0" w:sz="0" w:val="nil"/>
+          <w:bottom w:space="0" w:sz="0" w:val="nil"/>
+          <w:right w:space="0" w:sz="0" w:val="nil"/>
+          <w:between w:space="0" w:sz="0" w:val="nil"/>
+        </w:pBdr>
+        <w:shd w:fill="auto" w:val="clear"/>
+        <w:spacing w:after="0" w:before="0" w:line="276" w:lineRule="auto"/>
+        <w:ind w:left="0" w:right="0" w:firstLine="0"/>
+        <w:jc w:val="left"/>
+        <w:rPr/>
+      </w:pPr>
+      <w:r>
+        <w:rPr>
+          <w:rtl w:val="0"/>
+        </w:rPr>
+        <w:t xml:space="preserve"> A t   C : \ U s e r s \ S o u r c e - 1 \ D e s k t o p \ r c l o n e \ c o n d u i t _ s y n c . p s 1 : 3 6   c h a r : 1 </w:t>
+        <w:br w:type="textWrapping"/>
+        <w:t xml:space="preserve"> </w:t>
+      </w:r>
+    </w:p>
+    <w:p>
+      <w:pPr>
+        <w:keepNext w:val="0"/>
+        <w:keepLines w:val="0"/>
+        <w:pageBreakBefore w:val="0"/>
+        <w:widowControl w:val="0"/>
+        <w:pBdr>
+          <w:top w:space="0" w:sz="0" w:val="nil"/>
+          <w:left w:space="0" w:sz="0" w:val="nil"/>
+          <w:bottom w:space="0" w:sz="0" w:val="nil"/>
+          <w:right w:space="0" w:sz="0" w:val="nil"/>
+          <w:between w:space="0" w:sz="0" w:val="nil"/>
+        </w:pBdr>
+        <w:shd w:fill="auto" w:val="clear"/>
+        <w:spacing w:after="0" w:before="0" w:line="276" w:lineRule="auto"/>
+        <w:ind w:left="0" w:right="0" w:firstLine="0"/>
+        <w:jc w:val="left"/>
+        <w:rPr/>
+      </w:pPr>
+      <w:r>
+        <w:rPr>
+          <w:rtl w:val="0"/>
+        </w:rPr>
+        <w:t xml:space="preserve"> +   &amp;   $ r c l o n e   c o p y   - - f i l t e r - f r o m   $ f i l t e r   $ s o u r c e H f   g d r i v e : V 3 R / c o d e / c u r r e n   . . . </w:t>
+        <w:br w:type="textWrapping"/>
+        <w:t xml:space="preserve"> </w:t>
+      </w:r>
+    </w:p>
+    <w:p>
+      <w:pPr>
+        <w:keepNext w:val="0"/>
+        <w:keepLines w:val="0"/>
+        <w:pageBreakBefore w:val="0"/>
+        <w:widowControl w:val="0"/>
+        <w:pBdr>
+          <w:top w:space="0" w:sz="0" w:val="nil"/>
+          <w:left w:space="0" w:sz="0" w:val="nil"/>
+          <w:bottom w:space="0" w:sz="0" w:val="nil"/>
+          <w:right w:space="0" w:sz="0" w:val="nil"/>
+          <w:between w:space="0" w:sz="0" w:val="nil"/>
+        </w:pBdr>
+        <w:shd w:fill="auto" w:val="clear"/>
+        <w:spacing w:after="0" w:before="0" w:line="276" w:lineRule="auto"/>
+        <w:ind w:left="0" w:right="0" w:firstLine="0"/>
+        <w:jc w:val="left"/>
+        <w:rPr/>
+      </w:pPr>
+      <w:r>
+        <w:rPr>
+          <w:rtl w:val="0"/>
+        </w:rPr>
+        <w:t xml:space="preserve"> +   ~ ~ ~ ~ ~ ~ ~ ~ ~ ~ ~ ~ ~ ~ ~ ~ ~ ~ ~ ~ ~ ~ ~ ~ ~ ~ ~ ~ ~ ~ ~ ~ ~ ~ ~ ~ ~ ~ ~ ~ ~ ~ ~ ~ ~ ~ ~ ~ ~ ~ ~ ~ ~ ~ ~ ~ ~ ~ ~ ~ ~ ~ ~ ~ ~ ~ ~ ~ ~ </w:t>
+        <w:br w:type="textWrapping"/>
+        <w:t xml:space="preserve"> </w:t>
+      </w:r>
+    </w:p>
+    <w:p>
+      <w:pPr>
+        <w:keepNext w:val="0"/>
+        <w:keepLines w:val="0"/>
+        <w:pageBreakBefore w:val="0"/>
+        <w:widowControl w:val="0"/>
+        <w:pBdr>
+          <w:top w:space="0" w:sz="0" w:val="nil"/>
+          <w:left w:space="0" w:sz="0" w:val="nil"/>
+          <w:bottom w:space="0" w:sz="0" w:val="nil"/>
+          <w:right w:space="0" w:sz="0" w:val="nil"/>
+          <w:between w:space="0" w:sz="0" w:val="nil"/>
+        </w:pBdr>
+        <w:shd w:fill="auto" w:val="clear"/>
+        <w:spacing w:after="0" w:before="0" w:line="276" w:lineRule="auto"/>
+        <w:ind w:left="0" w:right="0" w:firstLine="0"/>
+        <w:jc w:val="left"/>
+        <w:rPr/>
+      </w:pPr>
+      <w:r>
+        <w:rPr>
+          <w:rtl w:val="0"/>
+        </w:rPr>
+        <w:t xml:space="preserve">         +   C a t e g o r y I n f o                     :   N o t S p e c i f i e d :   ( 2 0 2 6 / 0 3 / 1 9   1 3 : 0 . . . i n g   t o   t r a n s f e r : S t r i n g )   [ ] ,   R e m o t e E x c e p t i o n </w:t>
+        <w:br w:type="textWrapping"/>
+        <w:t xml:space="preserve"> </w:t>
+      </w:r>
+    </w:p>
+    <w:p>
+      <w:pPr>
+        <w:keepNext w:val="0"/>
+        <w:keepLines w:val="0"/>
+        <w:pageBreakBefore w:val="0"/>
+        <w:widowControl w:val="0"/>
+        <w:pBdr>
+          <w:top w:space="0" w:sz="0" w:val="nil"/>
+          <w:left w:space="0" w:sz="0" w:val="nil"/>
+          <w:bottom w:space="0" w:sz="0" w:val="nil"/>
+          <w:right w:space="0" w:sz="0" w:val="nil"/>
+          <w:between w:space="0" w:sz="0" w:val="nil"/>
+        </w:pBdr>
+        <w:shd w:fill="auto" w:val="clear"/>
+        <w:spacing w:after="0" w:before="0" w:line="276" w:lineRule="auto"/>
+        <w:ind w:left="0" w:right="0" w:firstLine="0"/>
+        <w:jc w:val="left"/>
+        <w:rPr/>
+      </w:pPr>
+      <w:r>
+        <w:rPr>
+          <w:rtl w:val="0"/>
+        </w:rPr>
+        <w:t xml:space="preserve">         +   F u l l y Q u a l i f i e d E r r o r I d   :   N a t i v e C o m m a n d E r r o r </w:t>
+        <w:br w:type="textWrapping"/>
+        <w:t xml:space="preserve"> </w:t>
+      </w:r>
+    </w:p>
+    <w:p>
+      <w:pPr>
+        <w:keepNext w:val="0"/>
+        <w:keepLines w:val="0"/>
+        <w:pageBreakBefore w:val="0"/>
+        <w:widowControl w:val="0"/>
+        <w:pBdr>
+          <w:top w:space="0" w:sz="0" w:val="nil"/>
+          <w:left w:space="0" w:sz="0" w:val="nil"/>
+          <w:bottom w:space="0" w:sz="0" w:val="nil"/>
+          <w:right w:space="0" w:sz="0" w:val="nil"/>
+          <w:between w:space="0" w:sz="0" w:val="nil"/>
+        </w:pBdr>
+        <w:shd w:fill="auto" w:val="clear"/>
+        <w:spacing w:after="0" w:before="0" w:line="276" w:lineRule="auto"/>
+        <w:ind w:left="0" w:right="0" w:firstLine="0"/>
+        <w:jc w:val="left"/>
+        <w:rPr/>
+      </w:pPr>
+      <w:r>
+        <w:rPr>
+          <w:rtl w:val="0"/>
+        </w:rPr>
+        <w:t xml:space="preserve">   </w:t>
+        <w:br w:type="textWrapping"/>
+        <w:t xml:space="preserve"> </w:t>
+      </w:r>
+    </w:p>
+    <w:p>
+      <w:pPr>
+        <w:keepNext w:val="0"/>
+        <w:keepLines w:val="0"/>
+        <w:pageBreakBefore w:val="0"/>
+        <w:widowControl w:val="0"/>
+        <w:pBdr>
+          <w:top w:space="0" w:sz="0" w:val="nil"/>
+          <w:left w:space="0" w:sz="0" w:val="nil"/>
+          <w:bottom w:space="0" w:sz="0" w:val="nil"/>
+          <w:right w:space="0" w:sz="0" w:val="nil"/>
+          <w:between w:space="0" w:sz="0" w:val="nil"/>
+        </w:pBdr>
+        <w:shd w:fill="auto" w:val="clear"/>
+        <w:spacing w:after="0" w:before="0" w:line="276" w:lineRule="auto"/>
+        <w:ind w:left="0" w:right="0" w:firstLine="0"/>
+        <w:jc w:val="left"/>
+        <w:rPr/>
+      </w:pPr>
+      <w:r>
+        <w:rPr>
+          <w:rtl w:val="0"/>
+        </w:rPr>
+        <w:t xml:space="preserve"> 2 0 2 6 / 0 3 / 1 9   1 3 : 0 7 : 2 4   I N F O     :   </w:t>
+        <w:br w:type="textWrapping"/>
+        <w:t xml:space="preserve"> </w:t>
+      </w:r>
+    </w:p>
+    <w:p>
+      <w:pPr>
+        <w:keepNext w:val="0"/>
+        <w:keepLines w:val="0"/>
+        <w:pageBreakBefore w:val="0"/>
+        <w:widowControl w:val="0"/>
+        <w:pBdr>
+          <w:top w:space="0" w:sz="0" w:val="nil"/>
+          <w:left w:space="0" w:sz="0" w:val="nil"/>
+          <w:bottom w:space="0" w:sz="0" w:val="nil"/>
+          <w:right w:space="0" w:sz="0" w:val="nil"/>
+          <w:between w:space="0" w:sz="0" w:val="nil"/>
+        </w:pBdr>
+        <w:shd w:fill="auto" w:val="clear"/>
+        <w:spacing w:after="0" w:before="0" w:line="276" w:lineRule="auto"/>
+        <w:ind w:left="0" w:right="0" w:firstLine="0"/>
+        <w:jc w:val="left"/>
+        <w:rPr/>
+      </w:pPr>
+      <w:r>
+        <w:rPr>
+          <w:rtl w:val="0"/>
+        </w:rPr>
+        <w:t xml:space="preserve"> T r a n s f e r r e d :       </w:t>
+        <w:tab/>
+        <w:t xml:space="preserve">                     0   B   /   0   B ,   - ,   0   B / s ,   E T A   - </w:t>
+        <w:br w:type="textWrapping"/>
+        <w:t xml:space="preserve"> </w:t>
+      </w:r>
+    </w:p>
+    <w:p>
+      <w:pPr>
+        <w:keepNext w:val="0"/>
+        <w:keepLines w:val="0"/>
+        <w:pageBreakBefore w:val="0"/>
+        <w:widowControl w:val="0"/>
+        <w:pBdr>
+          <w:top w:space="0" w:sz="0" w:val="nil"/>
+          <w:left w:space="0" w:sz="0" w:val="nil"/>
+          <w:bottom w:space="0" w:sz="0" w:val="nil"/>
+          <w:right w:space="0" w:sz="0" w:val="nil"/>
+          <w:between w:space="0" w:sz="0" w:val="nil"/>
+        </w:pBdr>
+        <w:shd w:fill="auto" w:val="clear"/>
+        <w:spacing w:after="0" w:before="0" w:line="276" w:lineRule="auto"/>
+        <w:ind w:left="0" w:right="0" w:firstLine="0"/>
+        <w:jc w:val="left"/>
+        <w:rPr/>
+      </w:pPr>
+      <w:r>
+        <w:rPr>
+          <w:rtl w:val="0"/>
+        </w:rPr>
+        <w:t xml:space="preserve"> C h e c k s :                                   3   /   3 ,   1 0 0 % ,   L i s t e d   3 0 </w:t>
+        <w:br w:type="textWrapping"/>
+        <w:t xml:space="preserve"> </w:t>
+      </w:r>
+    </w:p>
+    <w:p>
+      <w:pPr>
+        <w:keepNext w:val="0"/>
+        <w:keepLines w:val="0"/>
+        <w:pageBreakBefore w:val="0"/>
+        <w:widowControl w:val="0"/>
+        <w:pBdr>
+          <w:top w:space="0" w:sz="0" w:val="nil"/>
+          <w:left w:space="0" w:sz="0" w:val="nil"/>
+          <w:bottom w:space="0" w:sz="0" w:val="nil"/>
+          <w:right w:space="0" w:sz="0" w:val="nil"/>
+          <w:between w:space="0" w:sz="0" w:val="nil"/>
+        </w:pBdr>
+        <w:shd w:fill="auto" w:val="clear"/>
+        <w:spacing w:after="0" w:before="0" w:line="276" w:lineRule="auto"/>
+        <w:ind w:left="0" w:right="0" w:firstLine="0"/>
+        <w:jc w:val="left"/>
+        <w:rPr/>
+      </w:pPr>
+      <w:r>
+        <w:rPr>
+          <w:rtl w:val="0"/>
+        </w:rPr>
+        <w:t xml:space="preserve"> E l a p s e d   t i m e :                   9 . 5 s </w:t>
+        <w:br w:type="textWrapping"/>
+        <w:t xml:space="preserve"> </w:t>
+      </w:r>
+    </w:p>
+    <w:p>
+      <w:pPr>
+        <w:keepNext w:val="0"/>
+        <w:keepLines w:val="0"/>
+        <w:pageBreakBefore w:val="0"/>
+        <w:widowControl w:val="0"/>
+        <w:pBdr>
+          <w:top w:space="0" w:sz="0" w:val="nil"/>
+          <w:left w:space="0" w:sz="0" w:val="nil"/>
+          <w:bottom w:space="0" w:sz="0" w:val="nil"/>
+          <w:right w:space="0" w:sz="0" w:val="nil"/>
+          <w:between w:space="0" w:sz="0" w:val="nil"/>
+        </w:pBdr>
+        <w:shd w:fill="auto" w:val="clear"/>
+        <w:spacing w:after="0" w:before="0" w:line="276" w:lineRule="auto"/>
+        <w:ind w:left="0" w:right="0" w:firstLine="0"/>
+        <w:jc w:val="left"/>
+        <w:rPr/>
+      </w:pPr>
+      <w:r>
+        <w:rPr>
+          <w:rtl w:val="0"/>
+        </w:rPr>
+        <w:t xml:space="preserve"> </w:t>
+        <w:br w:type="textWrapping"/>
+        <w:t xml:space="preserve"> </w:t>
+      </w:r>
+    </w:p>
+    <w:p>
+      <w:pPr>
+        <w:keepNext w:val="0"/>
+        <w:keepLines w:val="0"/>
+        <w:pageBreakBefore w:val="0"/>
+        <w:widowControl w:val="0"/>
+        <w:pBdr>
+          <w:top w:space="0" w:sz="0" w:val="nil"/>
+          <w:left w:space="0" w:sz="0" w:val="nil"/>
+          <w:bottom w:space="0" w:sz="0" w:val="nil"/>
+          <w:right w:space="0" w:sz="0" w:val="nil"/>
+          <w:between w:space="0" w:sz="0" w:val="nil"/>
+        </w:pBdr>
+        <w:shd w:fill="auto" w:val="clear"/>
+        <w:spacing w:after="0" w:before="0" w:line="276" w:lineRule="auto"/>
+        <w:ind w:left="0" w:right="0" w:firstLine="0"/>
+        <w:jc w:val="left"/>
+        <w:rPr/>
+      </w:pPr>
+      <w:r>
+        <w:rPr>
+          <w:rtl w:val="0"/>
+        </w:rPr>
+        <w:t xml:space="preserve"> [Stage 3] hf-space sync complete</w:t>
+        <w:br w:type="textWrapping"/>
+      </w:r>
+    </w:p>
+    <w:p>
+      <w:pPr>
+        <w:keepNext w:val="0"/>
+        <w:keepLines w:val="0"/>
+        <w:pageBreakBefore w:val="0"/>
+        <w:widowControl w:val="0"/>
+        <w:pBdr>
+          <w:top w:space="0" w:sz="0" w:val="nil"/>
+          <w:left w:space="0" w:sz="0" w:val="nil"/>
+          <w:bottom w:space="0" w:sz="0" w:val="nil"/>
+          <w:right w:space="0" w:sz="0" w:val="nil"/>
+          <w:between w:space="0" w:sz="0" w:val="nil"/>
+        </w:pBdr>
+        <w:shd w:fill="auto" w:val="clear"/>
+        <w:spacing w:after="0" w:before="0" w:line="276" w:lineRule="auto"/>
+        <w:ind w:left="0" w:right="0" w:firstLine="0"/>
+        <w:jc w:val="left"/>
+        <w:rPr/>
+      </w:pPr>
+      <w:r>
+        <w:rPr>
+          <w:rtl w:val="0"/>
+        </w:rPr>
+        <w:t xml:space="preserve">r c l o n e . e x e   :   2 0 2 6 / 0 3 / 1 9   1 3 : 0 7 : 2 8   I N F O     :   l a m b d a _ o r c h e s t r a t o r . p y :   C o p i e d   ( r e p l a c e d   e x i s t i n g ) </w:t>
+        <w:br w:type="textWrapping"/>
+        <w:t xml:space="preserve"> </w:t>
+      </w:r>
+    </w:p>
+    <w:p>
+      <w:pPr>
+        <w:keepNext w:val="0"/>
+        <w:keepLines w:val="0"/>
+        <w:pageBreakBefore w:val="0"/>
+        <w:widowControl w:val="0"/>
+        <w:pBdr>
+          <w:top w:space="0" w:sz="0" w:val="nil"/>
+          <w:left w:space="0" w:sz="0" w:val="nil"/>
+          <w:bottom w:space="0" w:sz="0" w:val="nil"/>
+          <w:right w:space="0" w:sz="0" w:val="nil"/>
+          <w:between w:space="0" w:sz="0" w:val="nil"/>
+        </w:pBdr>
+        <w:shd w:fill="auto" w:val="clear"/>
+        <w:spacing w:after="0" w:before="0" w:line="276" w:lineRule="auto"/>
+        <w:ind w:left="0" w:right="0" w:firstLine="0"/>
+        <w:jc w:val="left"/>
+        <w:rPr/>
+      </w:pPr>
+      <w:r>
+        <w:rPr>
+          <w:rtl w:val="0"/>
+        </w:rPr>
+        <w:t xml:space="preserve"> A t   C : \ U s e r s \ S o u r c e - 1 \ D e s k t o p \ r c l o n e \ c o n d u i t _ s y n c . p s 1 : 4 0   c h a r : 1 </w:t>
+        <w:br w:type="textWrapping"/>
+        <w:t xml:space="preserve"> </w:t>
+      </w:r>
+    </w:p>
+    <w:p>
+      <w:pPr>
+        <w:keepNext w:val="0"/>
+        <w:keepLines w:val="0"/>
+        <w:pageBreakBefore w:val="0"/>
+        <w:widowControl w:val="0"/>
+        <w:pBdr>
+          <w:top w:space="0" w:sz="0" w:val="nil"/>
+          <w:left w:space="0" w:sz="0" w:val="nil"/>
+          <w:bottom w:space="0" w:sz="0" w:val="nil"/>
+          <w:right w:space="0" w:sz="0" w:val="nil"/>
+          <w:between w:space="0" w:sz="0" w:val="nil"/>
+        </w:pBdr>
+        <w:shd w:fill="auto" w:val="clear"/>
+        <w:spacing w:after="0" w:before="0" w:line="276" w:lineRule="auto"/>
+        <w:ind w:left="0" w:right="0" w:firstLine="0"/>
+        <w:jc w:val="left"/>
+        <w:rPr/>
+      </w:pPr>
+      <w:r>
+        <w:rPr>
+          <w:rtl w:val="0"/>
+        </w:rPr>
+        <w:t xml:space="preserve"> +   &amp;   $ r c l o n e   c o p y     " C : \ U s e r s \ S o u r c e - 1 \ D e s k t o p \ V 3 R \ c o d e \ l a s t "   g d r i v e : V 3 R /   . . . </w:t>
+        <w:br w:type="textWrapping"/>
+        <w:t xml:space="preserve"> </w:t>
+      </w:r>
+    </w:p>
+    <w:p>
+      <w:pPr>
+        <w:keepNext w:val="0"/>
+        <w:keepLines w:val="0"/>
+        <w:pageBreakBefore w:val="0"/>
+        <w:widowControl w:val="0"/>
+        <w:pBdr>
+          <w:top w:space="0" w:sz="0" w:val="nil"/>
+          <w:left w:space="0" w:sz="0" w:val="nil"/>
+          <w:bottom w:space="0" w:sz="0" w:val="nil"/>
+          <w:right w:space="0" w:sz="0" w:val="nil"/>
+          <w:between w:space="0" w:sz="0" w:val="nil"/>
+        </w:pBdr>
+        <w:shd w:fill="auto" w:val="clear"/>
+        <w:spacing w:after="0" w:before="0" w:line="276" w:lineRule="auto"/>
+        <w:ind w:left="0" w:right="0" w:firstLine="0"/>
+        <w:jc w:val="left"/>
+        <w:rPr/>
+      </w:pPr>
+      <w:r>
+        <w:rPr>
+          <w:rtl w:val="0"/>
+        </w:rPr>
+        <w:t xml:space="preserve"> +   ~ ~ ~ ~ ~ ~ ~ ~ ~ ~ ~ ~ ~ ~ ~ ~ ~ ~ ~ ~ ~ ~ ~ ~ ~ ~ ~ ~ ~ ~ ~ ~ ~ ~ ~ ~ ~ ~ ~ ~ ~ ~ ~ ~ ~ ~ ~ ~ ~ ~ ~ ~ ~ ~ ~ ~ ~ ~ ~ ~ ~ ~ ~ ~ ~ ~ ~ ~ ~ </w:t>
+        <w:br w:type="textWrapping"/>
+        <w:t xml:space="preserve"> </w:t>
+      </w:r>
+    </w:p>
+    <w:p>
+      <w:pPr>
+        <w:keepNext w:val="0"/>
+        <w:keepLines w:val="0"/>
+        <w:pageBreakBefore w:val="0"/>
+        <w:widowControl w:val="0"/>
+        <w:pBdr>
+          <w:top w:space="0" w:sz="0" w:val="nil"/>
+          <w:left w:space="0" w:sz="0" w:val="nil"/>
+          <w:bottom w:space="0" w:sz="0" w:val="nil"/>
+          <w:right w:space="0" w:sz="0" w:val="nil"/>
+          <w:between w:space="0" w:sz="0" w:val="nil"/>
+        </w:pBdr>
+        <w:shd w:fill="auto" w:val="clear"/>
+        <w:spacing w:after="0" w:before="0" w:line="276" w:lineRule="auto"/>
+        <w:ind w:left="0" w:right="0" w:firstLine="0"/>
+        <w:jc w:val="left"/>
+        <w:rPr/>
+      </w:pPr>
+      <w:r>
+        <w:rPr>
+          <w:rtl w:val="0"/>
+        </w:rPr>
+        <w:t xml:space="preserve">         +   C a t e g o r y I n f o                     :   N o t S p e c i f i e d :   ( 2 0 2 6 / 0 3 / 1 9   1 3 : 0 . . . l a c e d   e x i s t i n g ) : S t r i n g )   [ ] ,   R e m o t e E x c e p t i o n </w:t>
+        <w:br w:type="textWrapping"/>
+        <w:t xml:space="preserve"> </w:t>
+      </w:r>
+    </w:p>
+    <w:p>
+      <w:pPr>
+        <w:keepNext w:val="0"/>
+        <w:keepLines w:val="0"/>
+        <w:pageBreakBefore w:val="0"/>
+        <w:widowControl w:val="0"/>
+        <w:pBdr>
+          <w:top w:space="0" w:sz="0" w:val="nil"/>
+          <w:left w:space="0" w:sz="0" w:val="nil"/>
+          <w:bottom w:space="0" w:sz="0" w:val="nil"/>
+          <w:right w:space="0" w:sz="0" w:val="nil"/>
+          <w:between w:space="0" w:sz="0" w:val="nil"/>
+        </w:pBdr>
+        <w:shd w:fill="auto" w:val="clear"/>
+        <w:spacing w:after="0" w:before="0" w:line="276" w:lineRule="auto"/>
+        <w:ind w:left="0" w:right="0" w:firstLine="0"/>
+        <w:jc w:val="left"/>
+        <w:rPr/>
+      </w:pPr>
+      <w:r>
+        <w:rPr>
+          <w:rtl w:val="0"/>
+        </w:rPr>
+        <w:t xml:space="preserve">         +   F u l l y Q u a l i f i e d E r r o r I d   :   N a t i v e C o m m a n d E r r o r </w:t>
+        <w:br w:type="textWrapping"/>
+        <w:t xml:space="preserve"> </w:t>
+      </w:r>
+    </w:p>
+    <w:p>
+      <w:pPr>
+        <w:keepNext w:val="0"/>
+        <w:keepLines w:val="0"/>
+        <w:pageBreakBefore w:val="0"/>
+        <w:widowControl w:val="0"/>
+        <w:pBdr>
+          <w:top w:space="0" w:sz="0" w:val="nil"/>
+          <w:left w:space="0" w:sz="0" w:val="nil"/>
+          <w:bottom w:space="0" w:sz="0" w:val="nil"/>
+          <w:right w:space="0" w:sz="0" w:val="nil"/>
+          <w:between w:space="0" w:sz="0" w:val="nil"/>
+        </w:pBdr>
+        <w:shd w:fill="auto" w:val="clear"/>
+        <w:spacing w:after="0" w:before="0" w:line="276" w:lineRule="auto"/>
+        <w:ind w:left="0" w:right="0" w:firstLine="0"/>
+        <w:jc w:val="left"/>
+        <w:rPr/>
+      </w:pPr>
+      <w:r>
+        <w:rPr>
+          <w:rtl w:val="0"/>
+        </w:rPr>
+        <w:t xml:space="preserve">   </w:t>
+        <w:br w:type="textWrapping"/>
+        <w:t xml:space="preserve"> </w:t>
+      </w:r>
+    </w:p>
+    <w:p>
+      <w:pPr>
+        <w:keepNext w:val="0"/>
+        <w:keepLines w:val="0"/>
+        <w:pageBreakBefore w:val="0"/>
+        <w:widowControl w:val="0"/>
+        <w:pBdr>
+          <w:top w:space="0" w:sz="0" w:val="nil"/>
+          <w:left w:space="0" w:sz="0" w:val="nil"/>
+          <w:bottom w:space="0" w:sz="0" w:val="nil"/>
+          <w:right w:space="0" w:sz="0" w:val="nil"/>
+          <w:between w:space="0" w:sz="0" w:val="nil"/>
+        </w:pBdr>
+        <w:shd w:fill="auto" w:val="clear"/>
+        <w:spacing w:after="0" w:before="0" w:line="276" w:lineRule="auto"/>
+        <w:ind w:left="0" w:right="0" w:firstLine="0"/>
+        <w:jc w:val="left"/>
+        <w:rPr/>
+      </w:pPr>
+      <w:r>
+        <w:rPr>
+          <w:rtl w:val="0"/>
+        </w:rPr>
+        <w:t xml:space="preserve"> 2 0 2 6 / 0 3 / 1 9   1 3 : 0 7 : 2 8   I N F O     :   </w:t>
+        <w:br w:type="textWrapping"/>
+        <w:t xml:space="preserve"> </w:t>
+      </w:r>
+    </w:p>
+    <w:p>
+      <w:pPr>
+        <w:keepNext w:val="0"/>
+        <w:keepLines w:val="0"/>
+        <w:pageBreakBefore w:val="0"/>
+        <w:widowControl w:val="0"/>
+        <w:pBdr>
+          <w:top w:space="0" w:sz="0" w:val="nil"/>
+          <w:left w:space="0" w:sz="0" w:val="nil"/>
+          <w:bottom w:space="0" w:sz="0" w:val="nil"/>
+          <w:right w:space="0" w:sz="0" w:val="nil"/>
+          <w:between w:space="0" w:sz="0" w:val="nil"/>
+        </w:pBdr>
+        <w:shd w:fill="auto" w:val="clear"/>
+        <w:spacing w:after="0" w:before="0" w:line="276" w:lineRule="auto"/>
+        <w:ind w:left="0" w:right="0" w:firstLine="0"/>
+        <w:jc w:val="left"/>
+        <w:rPr/>
+      </w:pPr>
+      <w:r>
+        <w:rPr>
+          <w:rtl w:val="0"/>
+        </w:rPr>
+        <w:t xml:space="preserve"> T r a n s f e r r e d :       </w:t>
+        <w:tab/>
+        <w:t xml:space="preserve">         9 . 4 5 4   K i B   /   9 . 4 5 4   K i B ,   1 0 0 % ,   9 . 4 5 4   K i B / s ,   E T A   0 s </w:t>
+        <w:br w:type="textWrapping"/>
+        <w:t xml:space="preserve"> </w:t>
+      </w:r>
+    </w:p>
+    <w:p>
+      <w:pPr>
+        <w:keepNext w:val="0"/>
+        <w:keepLines w:val="0"/>
+        <w:pageBreakBefore w:val="0"/>
+        <w:widowControl w:val="0"/>
+        <w:pBdr>
+          <w:top w:space="0" w:sz="0" w:val="nil"/>
+          <w:left w:space="0" w:sz="0" w:val="nil"/>
+          <w:bottom w:space="0" w:sz="0" w:val="nil"/>
+          <w:right w:space="0" w:sz="0" w:val="nil"/>
+          <w:between w:space="0" w:sz="0" w:val="nil"/>
+        </w:pBdr>
+        <w:shd w:fill="auto" w:val="clear"/>
+        <w:spacing w:after="0" w:before="0" w:line="276" w:lineRule="auto"/>
+        <w:ind w:left="0" w:right="0" w:firstLine="0"/>
+        <w:jc w:val="left"/>
+        <w:rPr/>
+      </w:pPr>
+      <w:r>
+        <w:rPr>
+          <w:rtl w:val="0"/>
+        </w:rPr>
+        <w:t xml:space="preserve"> C h e c k s :                                   8   /   8 ,   1 0 0 % ,   L i s t e d   2 4 </w:t>
+        <w:br w:type="textWrapping"/>
+        <w:t xml:space="preserve"> </w:t>
+      </w:r>
+    </w:p>
+    <w:p>
+      <w:pPr>
+        <w:keepNext w:val="0"/>
+        <w:keepLines w:val="0"/>
+        <w:pageBreakBefore w:val="0"/>
+        <w:widowControl w:val="0"/>
+        <w:pBdr>
+          <w:top w:space="0" w:sz="0" w:val="nil"/>
+          <w:left w:space="0" w:sz="0" w:val="nil"/>
+          <w:bottom w:space="0" w:sz="0" w:val="nil"/>
+          <w:right w:space="0" w:sz="0" w:val="nil"/>
+          <w:between w:space="0" w:sz="0" w:val="nil"/>
+        </w:pBdr>
+        <w:shd w:fill="auto" w:val="clear"/>
+        <w:spacing w:after="0" w:before="0" w:line="276" w:lineRule="auto"/>
+        <w:ind w:left="0" w:right="0" w:firstLine="0"/>
+        <w:jc w:val="left"/>
+        <w:rPr/>
+      </w:pPr>
+      <w:r>
+        <w:rPr>
+          <w:rtl w:val="0"/>
+        </w:rPr>
+        <w:t xml:space="preserve"> T r a n s f e r r e d :                         1   /   1 ,   1 0 0 % </w:t>
+        <w:br w:type="textWrapping"/>
+        <w:t xml:space="preserve"> </w:t>
+      </w:r>
+    </w:p>
+    <w:p>
+      <w:pPr>
+        <w:keepNext w:val="0"/>
+        <w:keepLines w:val="0"/>
+        <w:pageBreakBefore w:val="0"/>
+        <w:widowControl w:val="0"/>
+        <w:pBdr>
+          <w:top w:space="0" w:sz="0" w:val="nil"/>
+          <w:left w:space="0" w:sz="0" w:val="nil"/>
+          <w:bottom w:space="0" w:sz="0" w:val="nil"/>
+          <w:right w:space="0" w:sz="0" w:val="nil"/>
+          <w:between w:space="0" w:sz="0" w:val="nil"/>
+        </w:pBdr>
+        <w:shd w:fill="auto" w:val="clear"/>
+        <w:spacing w:after="0" w:before="0" w:line="276" w:lineRule="auto"/>
+        <w:ind w:left="0" w:right="0" w:firstLine="0"/>
+        <w:jc w:val="left"/>
+        <w:rPr/>
+      </w:pPr>
+      <w:r>
+        <w:rPr>
+          <w:rtl w:val="0"/>
+        </w:rPr>
+        <w:t xml:space="preserve"> E l a p s e d   t i m e :                   1 . 7 s </w:t>
+        <w:br w:type="textWrapping"/>
+        <w:t xml:space="preserve"> </w:t>
+      </w:r>
+    </w:p>
+    <w:p>
+      <w:pPr>
+        <w:keepNext w:val="0"/>
+        <w:keepLines w:val="0"/>
+        <w:pageBreakBefore w:val="0"/>
+        <w:widowControl w:val="0"/>
+        <w:pBdr>
+          <w:top w:space="0" w:sz="0" w:val="nil"/>
+          <w:left w:space="0" w:sz="0" w:val="nil"/>
+          <w:bottom w:space="0" w:sz="0" w:val="nil"/>
+          <w:right w:space="0" w:sz="0" w:val="nil"/>
+          <w:between w:space="0" w:sz="0" w:val="nil"/>
+        </w:pBdr>
+        <w:shd w:fill="auto" w:val="clear"/>
+        <w:spacing w:after="0" w:before="0" w:line="276" w:lineRule="auto"/>
+        <w:ind w:left="0" w:right="0" w:firstLine="0"/>
+        <w:jc w:val="left"/>
+        <w:rPr/>
+      </w:pPr>
+      <w:r>
+        <w:rPr>
+          <w:rtl w:val="0"/>
+        </w:rPr>
+        <w:t xml:space="preserve"> </w:t>
+        <w:br w:type="textWrapping"/>
+        <w:t xml:space="preserve"> </w:t>
+      </w:r>
+    </w:p>
+    <w:p>
+      <w:pPr>
+        <w:keepNext w:val="0"/>
+        <w:keepLines w:val="0"/>
+        <w:pageBreakBefore w:val="0"/>
+        <w:widowControl w:val="0"/>
+        <w:pBdr>
+          <w:top w:space="0" w:sz="0" w:val="nil"/>
+          <w:left w:space="0" w:sz="0" w:val="nil"/>
+          <w:bottom w:space="0" w:sz="0" w:val="nil"/>
+          <w:right w:space="0" w:sz="0" w:val="nil"/>
+          <w:between w:space="0" w:sz="0" w:val="nil"/>
+        </w:pBdr>
+        <w:shd w:fill="auto" w:val="clear"/>
+        <w:spacing w:after="0" w:before="0" w:line="276" w:lineRule="auto"/>
+        <w:ind w:left="0" w:right="0" w:firstLine="0"/>
+        <w:jc w:val="left"/>
+        <w:rPr/>
+      </w:pPr>
+      <w:r>
+        <w:rPr>
+          <w:rtl w:val="0"/>
+        </w:rPr>
+        <w:t xml:space="preserve"> r c l o n e . e x e   :   2 0 2 6 / 0 3 / 1 9   1 3 : 0 7 : 2 9   I N F O     :   T h e r e   w a s   n o t h i n g   t o   t r a n s f e r </w:t>
+        <w:br w:type="textWrapping"/>
+        <w:t xml:space="preserve"> </w:t>
+      </w:r>
+    </w:p>
+    <w:p>
+      <w:pPr>
+        <w:keepNext w:val="0"/>
+        <w:keepLines w:val="0"/>
+        <w:pageBreakBefore w:val="0"/>
+        <w:widowControl w:val="0"/>
+        <w:pBdr>
+          <w:top w:space="0" w:sz="0" w:val="nil"/>
+          <w:left w:space="0" w:sz="0" w:val="nil"/>
+          <w:bottom w:space="0" w:sz="0" w:val="nil"/>
+          <w:right w:space="0" w:sz="0" w:val="nil"/>
+          <w:between w:space="0" w:sz="0" w:val="nil"/>
+        </w:pBdr>
+        <w:shd w:fill="auto" w:val="clear"/>
+        <w:spacing w:after="0" w:before="0" w:line="276" w:lineRule="auto"/>
+        <w:ind w:left="0" w:right="0" w:firstLine="0"/>
+        <w:jc w:val="left"/>
+        <w:rPr/>
+      </w:pPr>
+      <w:r>
+        <w:rPr>
+          <w:rtl w:val="0"/>
+        </w:rPr>
+        <w:t xml:space="preserve"> A t   C : \ U s e r s \ S o u r c e - 1 \ D e s k t o p \ r c l o n e \ c o n d u i t _ s y n c . p s 1 : 4 1   c h a r : 1 </w:t>
+        <w:br w:type="textWrapping"/>
+        <w:t xml:space="preserve"> </w:t>
+      </w:r>
+    </w:p>
+    <w:p>
+      <w:pPr>
+        <w:keepNext w:val="0"/>
+        <w:keepLines w:val="0"/>
+        <w:pageBreakBefore w:val="0"/>
+        <w:widowControl w:val="0"/>
+        <w:pBdr>
+          <w:top w:space="0" w:sz="0" w:val="nil"/>
+          <w:left w:space="0" w:sz="0" w:val="nil"/>
+          <w:bottom w:space="0" w:sz="0" w:val="nil"/>
+          <w:right w:space="0" w:sz="0" w:val="nil"/>
+          <w:between w:space="0" w:sz="0" w:val="nil"/>
+        </w:pBdr>
+        <w:shd w:fill="auto" w:val="clear"/>
+        <w:spacing w:after="0" w:before="0" w:line="276" w:lineRule="auto"/>
+        <w:ind w:left="0" w:right="0" w:firstLine="0"/>
+        <w:jc w:val="left"/>
+        <w:rPr/>
+      </w:pPr>
+      <w:r>
+        <w:rPr>
+          <w:rtl w:val="0"/>
+        </w:rPr>
+        <w:t xml:space="preserve"> +   &amp;   $ r c l o n e   c o p y     " C : \ U s e r s \ S o u r c e - 1 \ D e s k t o p \ V 3 R \ c o d e \ p r e v i o u s "   g d r i v e :   . . . </w:t>
+        <w:br w:type="textWrapping"/>
+        <w:t xml:space="preserve"> </w:t>
+      </w:r>
+    </w:p>
+    <w:p>
+      <w:pPr>
+        <w:keepNext w:val="0"/>
+        <w:keepLines w:val="0"/>
+        <w:pageBreakBefore w:val="0"/>
+        <w:widowControl w:val="0"/>
+        <w:pBdr>
+          <w:top w:space="0" w:sz="0" w:val="nil"/>
+          <w:left w:space="0" w:sz="0" w:val="nil"/>
+          <w:bottom w:space="0" w:sz="0" w:val="nil"/>
+          <w:right w:space="0" w:sz="0" w:val="nil"/>
+          <w:between w:space="0" w:sz="0" w:val="nil"/>
+        </w:pBdr>
+        <w:shd w:fill="auto" w:val="clear"/>
+        <w:spacing w:after="0" w:before="0" w:line="276" w:lineRule="auto"/>
+        <w:ind w:left="0" w:right="0" w:firstLine="0"/>
+        <w:jc w:val="left"/>
+        <w:rPr/>
+      </w:pPr>
+      <w:r>
+        <w:rPr>
+          <w:rtl w:val="0"/>
+        </w:rPr>
+        <w:t xml:space="preserve"> +   ~ ~ ~ ~ ~ ~ ~ ~ ~ ~ ~ ~ ~ ~ ~ ~ ~ ~ ~ ~ ~ ~ ~ ~ ~ ~ ~ ~ ~ ~ ~ ~ ~ ~ ~ ~ ~ ~ ~ ~ ~ ~ ~ ~ ~ ~ ~ ~ ~ ~ ~ ~ ~ ~ ~ ~ ~ ~ ~ ~ ~ ~ ~ ~ ~ ~ ~ ~ ~ </w:t>
+        <w:br w:type="textWrapping"/>
+        <w:t xml:space="preserve"> </w:t>
+      </w:r>
+    </w:p>
+    <w:p>
+      <w:pPr>
+        <w:keepNext w:val="0"/>
+        <w:keepLines w:val="0"/>
+        <w:pageBreakBefore w:val="0"/>
+        <w:widowControl w:val="0"/>
+        <w:pBdr>
+          <w:top w:space="0" w:sz="0" w:val="nil"/>
+          <w:left w:space="0" w:sz="0" w:val="nil"/>
+          <w:bottom w:space="0" w:sz="0" w:val="nil"/>
+          <w:right w:space="0" w:sz="0" w:val="nil"/>
+          <w:between w:space="0" w:sz="0" w:val="nil"/>
+        </w:pBdr>
+        <w:shd w:fill="auto" w:val="clear"/>
+        <w:spacing w:after="0" w:before="0" w:line="276" w:lineRule="auto"/>
+        <w:ind w:left="0" w:right="0" w:firstLine="0"/>
+        <w:jc w:val="left"/>
+        <w:rPr/>
+      </w:pPr>
+      <w:r>
+        <w:rPr>
+          <w:rtl w:val="0"/>
+        </w:rPr>
+        <w:t xml:space="preserve">         +   C a t e g o r y I n f o                     :   N o t S p e c i f i e d :   ( 2 0 2 6 / 0 3 / 1 9   1 3 : 0 . . . i n g   t o   t r a n s f e r : S t r i n g )   [ ] ,   R e m o t e E x c e p t i o n </w:t>
+        <w:br w:type="textWrapping"/>
+        <w:t xml:space="preserve"> </w:t>
+      </w:r>
+    </w:p>
+    <w:p>
+      <w:pPr>
+        <w:keepNext w:val="0"/>
+        <w:keepLines w:val="0"/>
+        <w:pageBreakBefore w:val="0"/>
+        <w:widowControl w:val="0"/>
+        <w:pBdr>
+          <w:top w:space="0" w:sz="0" w:val="nil"/>
+          <w:left w:space="0" w:sz="0" w:val="nil"/>
+          <w:bottom w:space="0" w:sz="0" w:val="nil"/>
+          <w:right w:space="0" w:sz="0" w:val="nil"/>
+          <w:between w:space="0" w:sz="0" w:val="nil"/>
+        </w:pBdr>
+        <w:shd w:fill="auto" w:val="clear"/>
+        <w:spacing w:after="0" w:before="0" w:line="276" w:lineRule="auto"/>
+        <w:ind w:left="0" w:right="0" w:firstLine="0"/>
+        <w:jc w:val="left"/>
+        <w:rPr/>
+      </w:pPr>
+      <w:r>
+        <w:rPr>
+          <w:rtl w:val="0"/>
+        </w:rPr>
+        <w:t xml:space="preserve">         +   F u l l y Q u a l i f i e d E r r o r I d   :   N a t i v e C o m m a n d E r r o r </w:t>
+        <w:br w:type="textWrapping"/>
+        <w:t xml:space="preserve"> </w:t>
+      </w:r>
+    </w:p>
+    <w:p>
+      <w:pPr>
+        <w:keepNext w:val="0"/>
+        <w:keepLines w:val="0"/>
+        <w:pageBreakBefore w:val="0"/>
+        <w:widowControl w:val="0"/>
+        <w:pBdr>
+          <w:top w:space="0" w:sz="0" w:val="nil"/>
+          <w:left w:space="0" w:sz="0" w:val="nil"/>
+          <w:bottom w:space="0" w:sz="0" w:val="nil"/>
+          <w:right w:space="0" w:sz="0" w:val="nil"/>
+          <w:between w:space="0" w:sz="0" w:val="nil"/>
+        </w:pBdr>
+        <w:shd w:fill="auto" w:val="clear"/>
+        <w:spacing w:after="0" w:before="0" w:line="276" w:lineRule="auto"/>
+        <w:ind w:left="0" w:right="0" w:firstLine="0"/>
+        <w:jc w:val="left"/>
+        <w:rPr/>
+      </w:pPr>
+      <w:r>
+        <w:rPr>
+          <w:rtl w:val="0"/>
+        </w:rPr>
+        <w:t xml:space="preserve">   </w:t>
+        <w:br w:type="textWrapping"/>
+        <w:t xml:space="preserve"> </w:t>
+      </w:r>
+    </w:p>
+    <w:p>
+      <w:pPr>
+        <w:keepNext w:val="0"/>
+        <w:keepLines w:val="0"/>
+        <w:pageBreakBefore w:val="0"/>
+        <w:widowControl w:val="0"/>
+        <w:pBdr>
+          <w:top w:space="0" w:sz="0" w:val="nil"/>
+          <w:left w:space="0" w:sz="0" w:val="nil"/>
+          <w:bottom w:space="0" w:sz="0" w:val="nil"/>
+          <w:right w:space="0" w:sz="0" w:val="nil"/>
+          <w:between w:space="0" w:sz="0" w:val="nil"/>
+        </w:pBdr>
+        <w:shd w:fill="auto" w:val="clear"/>
+        <w:spacing w:after="0" w:before="0" w:line="276" w:lineRule="auto"/>
+        <w:ind w:left="0" w:right="0" w:firstLine="0"/>
+        <w:jc w:val="left"/>
+        <w:rPr/>
+      </w:pPr>
+      <w:r>
+        <w:rPr>
+          <w:rtl w:val="0"/>
+        </w:rPr>
+        <w:t xml:space="preserve"> 2 0 2 6 / 0 3 / 1 9   1 3 : 0 7 : 2 9   I N F O     :   </w:t>
+        <w:br w:type="textWrapping"/>
+        <w:t xml:space="preserve"> </w:t>
+      </w:r>
+    </w:p>
+    <w:p>
+      <w:pPr>
+        <w:keepNext w:val="0"/>
+        <w:keepLines w:val="0"/>
+        <w:pageBreakBefore w:val="0"/>
+        <w:widowControl w:val="0"/>
+        <w:pBdr>
+          <w:top w:space="0" w:sz="0" w:val="nil"/>
+          <w:left w:space="0" w:sz="0" w:val="nil"/>
+          <w:bottom w:space="0" w:sz="0" w:val="nil"/>
+          <w:right w:space="0" w:sz="0" w:val="nil"/>
+          <w:between w:space="0" w:sz="0" w:val="nil"/>
+        </w:pBdr>
+        <w:shd w:fill="auto" w:val="clear"/>
+        <w:spacing w:after="0" w:before="0" w:line="276" w:lineRule="auto"/>
+        <w:ind w:left="0" w:right="0" w:firstLine="0"/>
+        <w:jc w:val="left"/>
+        <w:rPr/>
+      </w:pPr>
+      <w:r>
+        <w:rPr>
+          <w:rtl w:val="0"/>
+        </w:rPr>
+        <w:t xml:space="preserve"> T r a n s f e r r e d :       </w:t>
+        <w:tab/>
+        <w:t xml:space="preserve">                     0   B   /   0   B ,   - ,   0   B / s ,   E T A   - </w:t>
+        <w:br w:type="textWrapping"/>
+        <w:t xml:space="preserve"> </w:t>
+      </w:r>
+    </w:p>
+    <w:p>
+      <w:pPr>
+        <w:keepNext w:val="0"/>
+        <w:keepLines w:val="0"/>
+        <w:pageBreakBefore w:val="0"/>
+        <w:widowControl w:val="0"/>
+        <w:pBdr>
+          <w:top w:space="0" w:sz="0" w:val="nil"/>
+          <w:left w:space="0" w:sz="0" w:val="nil"/>
+          <w:bottom w:space="0" w:sz="0" w:val="nil"/>
+          <w:right w:space="0" w:sz="0" w:val="nil"/>
+          <w:between w:space="0" w:sz="0" w:val="nil"/>
+        </w:pBdr>
+        <w:shd w:fill="auto" w:val="clear"/>
+        <w:spacing w:after="0" w:before="0" w:line="276" w:lineRule="auto"/>
+        <w:ind w:left="0" w:right="0" w:firstLine="0"/>
+        <w:jc w:val="left"/>
+        <w:rPr/>
+      </w:pPr>
+      <w:r>
+        <w:rPr>
+          <w:rtl w:val="0"/>
+        </w:rPr>
+        <w:t xml:space="preserve"> C h e c k s :                                   8   /   8 ,   1 0 0 % ,   L i s t e d   2 4 </w:t>
+        <w:br w:type="textWrapping"/>
+        <w:t xml:space="preserve"> </w:t>
+      </w:r>
+    </w:p>
+    <w:p>
+      <w:pPr>
+        <w:keepNext w:val="0"/>
+        <w:keepLines w:val="0"/>
+        <w:pageBreakBefore w:val="0"/>
+        <w:widowControl w:val="0"/>
+        <w:pBdr>
+          <w:top w:space="0" w:sz="0" w:val="nil"/>
+          <w:left w:space="0" w:sz="0" w:val="nil"/>
+          <w:bottom w:space="0" w:sz="0" w:val="nil"/>
+          <w:right w:space="0" w:sz="0" w:val="nil"/>
+          <w:between w:space="0" w:sz="0" w:val="nil"/>
+        </w:pBdr>
+        <w:shd w:fill="auto" w:val="clear"/>
+        <w:spacing w:after="0" w:before="0" w:line="276" w:lineRule="auto"/>
+        <w:ind w:left="0" w:right="0" w:firstLine="0"/>
+        <w:jc w:val="left"/>
+        <w:rPr/>
+      </w:pPr>
+      <w:r>
+        <w:rPr>
+          <w:rtl w:val="0"/>
+        </w:rPr>
+        <w:t xml:space="preserve"> E l a p s e d   t i m e :                   0 . 3 s </w:t>
+        <w:br w:type="textWrapping"/>
+        <w:t xml:space="preserve"> </w:t>
+      </w:r>
+    </w:p>
+    <w:p>
+      <w:pPr>
+        <w:keepNext w:val="0"/>
+        <w:keepLines w:val="0"/>
+        <w:pageBreakBefore w:val="0"/>
+        <w:widowControl w:val="0"/>
+        <w:pBdr>
+          <w:top w:space="0" w:sz="0" w:val="nil"/>
+          <w:left w:space="0" w:sz="0" w:val="nil"/>
+          <w:bottom w:space="0" w:sz="0" w:val="nil"/>
+          <w:right w:space="0" w:sz="0" w:val="nil"/>
+          <w:between w:space="0" w:sz="0" w:val="nil"/>
+        </w:pBdr>
+        <w:shd w:fill="auto" w:val="clear"/>
+        <w:spacing w:after="0" w:before="0" w:line="276" w:lineRule="auto"/>
+        <w:ind w:left="0" w:right="0" w:firstLine="0"/>
+        <w:jc w:val="left"/>
+        <w:rPr/>
+      </w:pPr>
+      <w:r>
+        <w:rPr>
+          <w:rtl w:val="0"/>
+        </w:rPr>
+        <w:t xml:space="preserve"> </w:t>
+        <w:br w:type="textWrapping"/>
+        <w:t xml:space="preserve"> </w:t>
+      </w:r>
+    </w:p>
+    <w:p>
+      <w:pPr>
+        <w:keepNext w:val="0"/>
+        <w:keepLines w:val="0"/>
+        <w:pageBreakBefore w:val="0"/>
+        <w:widowControl w:val="0"/>
+        <w:pBdr>
+          <w:top w:space="0" w:sz="0" w:val="nil"/>
+          <w:left w:space="0" w:sz="0" w:val="nil"/>
+          <w:bottom w:space="0" w:sz="0" w:val="nil"/>
+          <w:right w:space="0" w:sz="0" w:val="nil"/>
+          <w:between w:space="0" w:sz="0" w:val="nil"/>
+        </w:pBdr>
+        <w:shd w:fill="auto" w:val="clear"/>
+        <w:spacing w:after="0" w:before="0" w:line="276" w:lineRule="auto"/>
+        <w:ind w:left="0" w:right="0" w:firstLine="0"/>
+        <w:jc w:val="left"/>
+        <w:rPr/>
+      </w:pPr>
+      <w:r>
+        <w:rPr>
+          <w:rtl w:val="0"/>
+        </w:rPr>
+        <w:t xml:space="preserve"> [Stage 4] Version backup sync complete</w:t>
+        <w:br w:type="textWrapping"/>
+      </w:r>
+    </w:p>
+    <w:p>
+      <w:pPr>
+        <w:keepNext w:val="0"/>
+        <w:keepLines w:val="0"/>
+        <w:pageBreakBefore w:val="0"/>
+        <w:widowControl w:val="0"/>
+        <w:pBdr>
+          <w:top w:space="0" w:sz="0" w:val="nil"/>
+          <w:left w:space="0" w:sz="0" w:val="nil"/>
+          <w:bottom w:space="0" w:sz="0" w:val="nil"/>
+          <w:right w:space="0" w:sz="0" w:val="nil"/>
+          <w:between w:space="0" w:sz="0" w:val="nil"/>
+        </w:pBdr>
+        <w:shd w:fill="auto" w:val="clear"/>
+        <w:spacing w:after="0" w:before="0" w:line="276" w:lineRule="auto"/>
+        <w:ind w:left="0" w:right="0" w:firstLine="0"/>
+        <w:jc w:val="left"/>
+        <w:rPr/>
+      </w:pPr>
+      <w:r>
+        <w:rPr>
+          <w:rtl w:val="0"/>
+        </w:rPr>
+        <w:t xml:space="preserve">r c l o n e . e x e   :   2 0 2 6 / 0 3 / 1 9   1 3 : 0 7 : 3 1   I N F O     :   T h e r e   w a s   n o t h i n g   t o   t r a n s f e r </w:t>
+        <w:br w:type="textWrapping"/>
+        <w:t xml:space="preserve"> </w:t>
+      </w:r>
+    </w:p>
+    <w:p>
+      <w:pPr>
+        <w:keepNext w:val="0"/>
+        <w:keepLines w:val="0"/>
+        <w:pageBreakBefore w:val="0"/>
+        <w:widowControl w:val="0"/>
+        <w:pBdr>
+          <w:top w:space="0" w:sz="0" w:val="nil"/>
+          <w:left w:space="0" w:sz="0" w:val="nil"/>
+          <w:bottom w:space="0" w:sz="0" w:val="nil"/>
+          <w:right w:space="0" w:sz="0" w:val="nil"/>
+          <w:between w:space="0" w:sz="0" w:val="nil"/>
+        </w:pBdr>
+        <w:shd w:fill="auto" w:val="clear"/>
+        <w:spacing w:after="0" w:before="0" w:line="276" w:lineRule="auto"/>
+        <w:ind w:left="0" w:right="0" w:firstLine="0"/>
+        <w:jc w:val="left"/>
+        <w:rPr/>
+      </w:pPr>
+      <w:r>
+        <w:rPr>
+          <w:rtl w:val="0"/>
+        </w:rPr>
+        <w:t xml:space="preserve"> A t   C : \ U s e r s \ S o u r c e - 1 \ D e s k t o p \ r c l o n e \ c o n d u i t _ s y n c . p s 1 : 4 5   c h a r : 1 </w:t>
+        <w:br w:type="textWrapping"/>
+        <w:t xml:space="preserve"> </w:t>
+      </w:r>
+    </w:p>
+    <w:p>
+      <w:pPr>
+        <w:keepNext w:val="0"/>
+        <w:keepLines w:val="0"/>
+        <w:pageBreakBefore w:val="0"/>
+        <w:widowControl w:val="0"/>
+        <w:pBdr>
+          <w:top w:space="0" w:sz="0" w:val="nil"/>
+          <w:left w:space="0" w:sz="0" w:val="nil"/>
+          <w:bottom w:space="0" w:sz="0" w:val="nil"/>
+          <w:right w:space="0" w:sz="0" w:val="nil"/>
+          <w:between w:space="0" w:sz="0" w:val="nil"/>
+        </w:pBdr>
+        <w:shd w:fill="auto" w:val="clear"/>
+        <w:spacing w:after="0" w:before="0" w:line="276" w:lineRule="auto"/>
+        <w:ind w:left="0" w:right="0" w:firstLine="0"/>
+        <w:jc w:val="left"/>
+        <w:rPr/>
+      </w:pPr>
+      <w:r>
+        <w:rPr>
+          <w:rtl w:val="0"/>
+        </w:rPr>
+        <w:t xml:space="preserve"> +   &amp;   $ r c l o n e   c o p y   - - f i l t e r - f r o m   $ f i l t e r   " $ s o u r c e R e p o r t s C o r e \ p r o j e c t "   g d r   . . . </w:t>
+        <w:br w:type="textWrapping"/>
+        <w:t xml:space="preserve"> </w:t>
+      </w:r>
+    </w:p>
+    <w:p>
+      <w:pPr>
+        <w:keepNext w:val="0"/>
+        <w:keepLines w:val="0"/>
+        <w:pageBreakBefore w:val="0"/>
+        <w:widowControl w:val="0"/>
+        <w:pBdr>
+          <w:top w:space="0" w:sz="0" w:val="nil"/>
+          <w:left w:space="0" w:sz="0" w:val="nil"/>
+          <w:bottom w:space="0" w:sz="0" w:val="nil"/>
+          <w:right w:space="0" w:sz="0" w:val="nil"/>
+          <w:between w:space="0" w:sz="0" w:val="nil"/>
+        </w:pBdr>
+        <w:shd w:fill="auto" w:val="clear"/>
+        <w:spacing w:after="0" w:before="0" w:line="276" w:lineRule="auto"/>
+        <w:ind w:left="0" w:right="0" w:firstLine="0"/>
+        <w:jc w:val="left"/>
+        <w:rPr/>
+      </w:pPr>
+      <w:r>
+        <w:rPr>
+          <w:rtl w:val="0"/>
+        </w:rPr>
+        <w:t xml:space="preserve"> +   ~ ~ ~ ~ ~ ~ ~ ~ ~ ~ ~ ~ ~ ~ ~ ~ ~ ~ ~ ~ ~ ~ ~ ~ ~ ~ ~ ~ ~ ~ ~ ~ ~ ~ ~ ~ ~ ~ ~ ~ ~ ~ ~ ~ ~ ~ ~ ~ ~ ~ ~ ~ ~ ~ ~ ~ ~ ~ ~ ~ ~ ~ ~ ~ ~ ~ ~ ~ ~ </w:t>
+        <w:br w:type="textWrapping"/>
+        <w:t xml:space="preserve"> </w:t>
+      </w:r>
+    </w:p>
+    <w:p>
+      <w:pPr>
+        <w:keepNext w:val="0"/>
+        <w:keepLines w:val="0"/>
+        <w:pageBreakBefore w:val="0"/>
+        <w:widowControl w:val="0"/>
+        <w:pBdr>
+          <w:top w:space="0" w:sz="0" w:val="nil"/>
+          <w:left w:space="0" w:sz="0" w:val="nil"/>
+          <w:bottom w:space="0" w:sz="0" w:val="nil"/>
+          <w:right w:space="0" w:sz="0" w:val="nil"/>
+          <w:between w:space="0" w:sz="0" w:val="nil"/>
+        </w:pBdr>
+        <w:shd w:fill="auto" w:val="clear"/>
+        <w:spacing w:after="0" w:before="0" w:line="276" w:lineRule="auto"/>
+        <w:ind w:left="0" w:right="0" w:firstLine="0"/>
+        <w:jc w:val="left"/>
+        <w:rPr/>
+      </w:pPr>
+      <w:r>
+        <w:rPr>
+          <w:rtl w:val="0"/>
+        </w:rPr>
+        <w:t xml:space="preserve">         +   C a t e g o r y I n f o                     :   N o t S p e c i f i e d :   ( 2 0 2 6 / 0 3 / 1 9   1 3 : 0 . . . i n g   t o   t r a n s f e r : S t r i n g )   [ ] ,   R e m o t e E x c e p t i o n </w:t>
+        <w:br w:type="textWrapping"/>
+        <w:t xml:space="preserve"> </w:t>
+      </w:r>
+    </w:p>
+    <w:p>
+      <w:pPr>
+        <w:keepNext w:val="0"/>
+        <w:keepLines w:val="0"/>
+        <w:pageBreakBefore w:val="0"/>
+        <w:widowControl w:val="0"/>
+        <w:pBdr>
+          <w:top w:space="0" w:sz="0" w:val="nil"/>
+          <w:left w:space="0" w:sz="0" w:val="nil"/>
+          <w:bottom w:space="0" w:sz="0" w:val="nil"/>
+          <w:right w:space="0" w:sz="0" w:val="nil"/>
+          <w:between w:space="0" w:sz="0" w:val="nil"/>
+        </w:pBdr>
+        <w:shd w:fill="auto" w:val="clear"/>
+        <w:spacing w:after="0" w:before="0" w:line="276" w:lineRule="auto"/>
+        <w:ind w:left="0" w:right="0" w:firstLine="0"/>
+        <w:jc w:val="left"/>
+        <w:rPr/>
+      </w:pPr>
+      <w:r>
+        <w:rPr>
+          <w:rtl w:val="0"/>
+        </w:rPr>
+        <w:t xml:space="preserve">         +   F u l l y Q u a l i f i e d E r r o r I d   :   N a t i v e C o m m a n d E r r o r </w:t>
+        <w:br w:type="textWrapping"/>
+        <w:t xml:space="preserve"> </w:t>
+      </w:r>
+    </w:p>
+    <w:p>
+      <w:pPr>
+        <w:keepNext w:val="0"/>
+        <w:keepLines w:val="0"/>
+        <w:pageBreakBefore w:val="0"/>
+        <w:widowControl w:val="0"/>
+        <w:pBdr>
+          <w:top w:space="0" w:sz="0" w:val="nil"/>
+          <w:left w:space="0" w:sz="0" w:val="nil"/>
+          <w:bottom w:space="0" w:sz="0" w:val="nil"/>
+          <w:right w:space="0" w:sz="0" w:val="nil"/>
+          <w:between w:space="0" w:sz="0" w:val="nil"/>
+        </w:pBdr>
+        <w:shd w:fill="auto" w:val="clear"/>
+        <w:spacing w:after="0" w:before="0" w:line="276" w:lineRule="auto"/>
+        <w:ind w:left="0" w:right="0" w:firstLine="0"/>
+        <w:jc w:val="left"/>
+        <w:rPr/>
+      </w:pPr>
+      <w:r>
+        <w:rPr>
+          <w:rtl w:val="0"/>
+        </w:rPr>
+        <w:t xml:space="preserve">   </w:t>
+        <w:br w:type="textWrapping"/>
+        <w:t xml:space="preserve"> </w:t>
+      </w:r>
+    </w:p>
+    <w:p>
+      <w:pPr>
+        <w:keepNext w:val="0"/>
+        <w:keepLines w:val="0"/>
+        <w:pageBreakBefore w:val="0"/>
+        <w:widowControl w:val="0"/>
+        <w:pBdr>
+          <w:top w:space="0" w:sz="0" w:val="nil"/>
+          <w:left w:space="0" w:sz="0" w:val="nil"/>
+          <w:bottom w:space="0" w:sz="0" w:val="nil"/>
+          <w:right w:space="0" w:sz="0" w:val="nil"/>
+          <w:between w:space="0" w:sz="0" w:val="nil"/>
+        </w:pBdr>
+        <w:shd w:fill="auto" w:val="clear"/>
+        <w:spacing w:after="0" w:before="0" w:line="276" w:lineRule="auto"/>
+        <w:ind w:left="0" w:right="0" w:firstLine="0"/>
+        <w:jc w:val="left"/>
+        <w:rPr/>
+      </w:pPr>
+      <w:r>
+        <w:rPr>
+          <w:rtl w:val="0"/>
+        </w:rPr>
+        <w:t xml:space="preserve"> 2 0 2 6 / 0 3 / 1 9   1 3 : 0 7 : 3 1   I N F O     :   </w:t>
+        <w:br w:type="textWrapping"/>
+        <w:t xml:space="preserve"> </w:t>
+      </w:r>
+    </w:p>
+    <w:p>
+      <w:pPr>
+        <w:keepNext w:val="0"/>
+        <w:keepLines w:val="0"/>
+        <w:pageBreakBefore w:val="0"/>
+        <w:widowControl w:val="0"/>
+        <w:pBdr>
+          <w:top w:space="0" w:sz="0" w:val="nil"/>
+          <w:left w:space="0" w:sz="0" w:val="nil"/>
+          <w:bottom w:space="0" w:sz="0" w:val="nil"/>
+          <w:right w:space="0" w:sz="0" w:val="nil"/>
+          <w:between w:space="0" w:sz="0" w:val="nil"/>
+        </w:pBdr>
+        <w:shd w:fill="auto" w:val="clear"/>
+        <w:spacing w:after="0" w:before="0" w:line="276" w:lineRule="auto"/>
+        <w:ind w:left="0" w:right="0" w:firstLine="0"/>
+        <w:jc w:val="left"/>
+        <w:rPr/>
+      </w:pPr>
+      <w:r>
+        <w:rPr>
+          <w:rtl w:val="0"/>
+        </w:rPr>
+        <w:t xml:space="preserve"> T r a n s f e r r e d :       </w:t>
+        <w:tab/>
+        <w:t xml:space="preserve">                     0   B   /   0   B ,   - ,   0   B / s ,   E T A   - </w:t>
+        <w:br w:type="textWrapping"/>
+        <w:t xml:space="preserve"> </w:t>
+      </w:r>
+    </w:p>
+    <w:p>
+      <w:pPr>
+        <w:keepNext w:val="0"/>
+        <w:keepLines w:val="0"/>
+        <w:pageBreakBefore w:val="0"/>
+        <w:widowControl w:val="0"/>
+        <w:pBdr>
+          <w:top w:space="0" w:sz="0" w:val="nil"/>
+          <w:left w:space="0" w:sz="0" w:val="nil"/>
+          <w:bottom w:space="0" w:sz="0" w:val="nil"/>
+          <w:right w:space="0" w:sz="0" w:val="nil"/>
+          <w:between w:space="0" w:sz="0" w:val="nil"/>
+        </w:pBdr>
+        <w:shd w:fill="auto" w:val="clear"/>
+        <w:spacing w:after="0" w:before="0" w:line="276" w:lineRule="auto"/>
+        <w:ind w:left="0" w:right="0" w:firstLine="0"/>
+        <w:jc w:val="left"/>
+        <w:rPr/>
+      </w:pPr>
+      <w:r>
+        <w:rPr>
+          <w:rtl w:val="0"/>
+        </w:rPr>
+        <w:t xml:space="preserve"> C h e c k s :                                 1 3   /   1 3 ,   1 0 0 % ,   L i s t e d   3 9 </w:t>
+        <w:br w:type="textWrapping"/>
+        <w:t xml:space="preserve"> </w:t>
+      </w:r>
+    </w:p>
+    <w:p>
+      <w:pPr>
+        <w:keepNext w:val="0"/>
+        <w:keepLines w:val="0"/>
+        <w:pageBreakBefore w:val="0"/>
+        <w:widowControl w:val="0"/>
+        <w:pBdr>
+          <w:top w:space="0" w:sz="0" w:val="nil"/>
+          <w:left w:space="0" w:sz="0" w:val="nil"/>
+          <w:bottom w:space="0" w:sz="0" w:val="nil"/>
+          <w:right w:space="0" w:sz="0" w:val="nil"/>
+          <w:between w:space="0" w:sz="0" w:val="nil"/>
+        </w:pBdr>
+        <w:shd w:fill="auto" w:val="clear"/>
+        <w:spacing w:after="0" w:before="0" w:line="276" w:lineRule="auto"/>
+        <w:ind w:left="0" w:right="0" w:firstLine="0"/>
+        <w:jc w:val="left"/>
+        <w:rPr/>
+      </w:pPr>
+      <w:r>
+        <w:rPr>
+          <w:rtl w:val="0"/>
+        </w:rPr>
+        <w:t xml:space="preserve"> E l a p s e d   t i m e :                   0 . 4 s </w:t>
+        <w:br w:type="textWrapping"/>
+        <w:t xml:space="preserve"> </w:t>
+      </w:r>
+    </w:p>
+    <w:p>
+      <w:pPr>
+        <w:keepNext w:val="0"/>
+        <w:keepLines w:val="0"/>
+        <w:pageBreakBefore w:val="0"/>
+        <w:widowControl w:val="0"/>
+        <w:pBdr>
+          <w:top w:space="0" w:sz="0" w:val="nil"/>
+          <w:left w:space="0" w:sz="0" w:val="nil"/>
+          <w:bottom w:space="0" w:sz="0" w:val="nil"/>
+          <w:right w:space="0" w:sz="0" w:val="nil"/>
+          <w:between w:space="0" w:sz="0" w:val="nil"/>
+        </w:pBdr>
+        <w:shd w:fill="auto" w:val="clear"/>
+        <w:spacing w:after="0" w:before="0" w:line="276" w:lineRule="auto"/>
+        <w:ind w:left="0" w:right="0" w:firstLine="0"/>
+        <w:jc w:val="left"/>
+        <w:rPr/>
+      </w:pPr>
+      <w:r>
+        <w:rPr>
+          <w:rtl w:val="0"/>
+        </w:rPr>
+        <w:t xml:space="preserve"> </w:t>
+        <w:br w:type="textWrapping"/>
+        <w:t xml:space="preserve"> </w:t>
+      </w:r>
+    </w:p>
+    <w:p>
+      <w:pPr>
+        <w:keepNext w:val="0"/>
+        <w:keepLines w:val="0"/>
+        <w:pageBreakBefore w:val="0"/>
+        <w:widowControl w:val="0"/>
+        <w:pBdr>
+          <w:top w:space="0" w:sz="0" w:val="nil"/>
+          <w:left w:space="0" w:sz="0" w:val="nil"/>
+          <w:bottom w:space="0" w:sz="0" w:val="nil"/>
+          <w:right w:space="0" w:sz="0" w:val="nil"/>
+          <w:between w:space="0" w:sz="0" w:val="nil"/>
+        </w:pBdr>
+        <w:shd w:fill="auto" w:val="clear"/>
+        <w:spacing w:after="0" w:before="0" w:line="276" w:lineRule="auto"/>
+        <w:ind w:left="0" w:right="0" w:firstLine="0"/>
+        <w:jc w:val="left"/>
+        <w:rPr/>
+      </w:pPr>
+      <w:r>
+        <w:rPr>
+          <w:rtl w:val="0"/>
+        </w:rPr>
+        <w:t xml:space="preserve"> r c l o n e . e x e   :   2 0 2 6 / 0 3 / 1 9   1 3 : 0 7 : 3 4   I N F O     :   T h e r e   w a s   n o t h i n g   t o   t r a n s f e r </w:t>
+        <w:br w:type="textWrapping"/>
+        <w:t xml:space="preserve"> </w:t>
+      </w:r>
+    </w:p>
+    <w:p>
+      <w:pPr>
+        <w:keepNext w:val="0"/>
+        <w:keepLines w:val="0"/>
+        <w:pageBreakBefore w:val="0"/>
+        <w:widowControl w:val="0"/>
+        <w:pBdr>
+          <w:top w:space="0" w:sz="0" w:val="nil"/>
+          <w:left w:space="0" w:sz="0" w:val="nil"/>
+          <w:bottom w:space="0" w:sz="0" w:val="nil"/>
+          <w:right w:space="0" w:sz="0" w:val="nil"/>
+          <w:between w:space="0" w:sz="0" w:val="nil"/>
+        </w:pBdr>
+        <w:shd w:fill="auto" w:val="clear"/>
+        <w:spacing w:after="0" w:before="0" w:line="276" w:lineRule="auto"/>
+        <w:ind w:left="0" w:right="0" w:firstLine="0"/>
+        <w:jc w:val="left"/>
+        <w:rPr/>
+      </w:pPr>
+      <w:r>
+        <w:rPr>
+          <w:rtl w:val="0"/>
+        </w:rPr>
+        <w:t xml:space="preserve"> A t   C : \ U s e r s \ S o u r c e - 1 \ D e s k t o p \ r c l o n e \ c o n d u i t _ s y n c . p s 1 : 4 6   c h a r : 1 </w:t>
+        <w:br w:type="textWrapping"/>
+        <w:t xml:space="preserve"> </w:t>
+      </w:r>
+    </w:p>
+    <w:p>
+      <w:pPr>
+        <w:keepNext w:val="0"/>
+        <w:keepLines w:val="0"/>
+        <w:pageBreakBefore w:val="0"/>
+        <w:widowControl w:val="0"/>
+        <w:pBdr>
+          <w:top w:space="0" w:sz="0" w:val="nil"/>
+          <w:left w:space="0" w:sz="0" w:val="nil"/>
+          <w:bottom w:space="0" w:sz="0" w:val="nil"/>
+          <w:right w:space="0" w:sz="0" w:val="nil"/>
+          <w:between w:space="0" w:sz="0" w:val="nil"/>
+        </w:pBdr>
+        <w:shd w:fill="auto" w:val="clear"/>
+        <w:spacing w:after="0" w:before="0" w:line="276" w:lineRule="auto"/>
+        <w:ind w:left="0" w:right="0" w:firstLine="0"/>
+        <w:jc w:val="left"/>
+        <w:rPr/>
+      </w:pPr>
+      <w:r>
+        <w:rPr>
+          <w:rtl w:val="0"/>
+        </w:rPr>
+        <w:t xml:space="preserve"> +   &amp;   $ r c l o n e   c o p y   - - f i l t e r - f r o m   $ f i l t e r   " $ s o u r c e R e p o r t s C o r e \ c o d i n g "   g d r i   . . . </w:t>
+        <w:br w:type="textWrapping"/>
+        <w:t xml:space="preserve"> </w:t>
+      </w:r>
+    </w:p>
+    <w:p>
+      <w:pPr>
+        <w:keepNext w:val="0"/>
+        <w:keepLines w:val="0"/>
+        <w:pageBreakBefore w:val="0"/>
+        <w:widowControl w:val="0"/>
+        <w:pBdr>
+          <w:top w:space="0" w:sz="0" w:val="nil"/>
+          <w:left w:space="0" w:sz="0" w:val="nil"/>
+          <w:bottom w:space="0" w:sz="0" w:val="nil"/>
+          <w:right w:space="0" w:sz="0" w:val="nil"/>
+          <w:between w:space="0" w:sz="0" w:val="nil"/>
+        </w:pBdr>
+        <w:shd w:fill="auto" w:val="clear"/>
+        <w:spacing w:after="0" w:before="0" w:line="276" w:lineRule="auto"/>
+        <w:ind w:left="0" w:right="0" w:firstLine="0"/>
+        <w:jc w:val="left"/>
+        <w:rPr/>
+      </w:pPr>
+      <w:r>
+        <w:rPr>
+          <w:rtl w:val="0"/>
+        </w:rPr>
+        <w:t xml:space="preserve"> +   ~ ~ ~ ~ ~ ~ ~ ~ ~ ~ ~ ~ ~ ~ ~ ~ ~ ~ ~ ~ ~ ~ ~ ~ ~ ~ ~ ~ ~ ~ ~ ~ ~ ~ ~ ~ ~ ~ ~ ~ ~ ~ ~ ~ ~ ~ ~ ~ ~ ~ ~ ~ ~ ~ ~ ~ ~ ~ ~ ~ ~ ~ ~ ~ ~ ~ ~ ~ ~ </w:t>
+        <w:br w:type="textWrapping"/>
+        <w:t xml:space="preserve"> </w:t>
+      </w:r>
+    </w:p>
+    <w:p>
+      <w:pPr>
+        <w:keepNext w:val="0"/>
+        <w:keepLines w:val="0"/>
+        <w:pageBreakBefore w:val="0"/>
+        <w:widowControl w:val="0"/>
+        <w:pBdr>
+          <w:top w:space="0" w:sz="0" w:val="nil"/>
+          <w:left w:space="0" w:sz="0" w:val="nil"/>
+          <w:bottom w:space="0" w:sz="0" w:val="nil"/>
+          <w:right w:space="0" w:sz="0" w:val="nil"/>
+          <w:between w:space="0" w:sz="0" w:val="nil"/>
+        </w:pBdr>
+        <w:shd w:fill="auto" w:val="clear"/>
+        <w:spacing w:after="0" w:before="0" w:line="276" w:lineRule="auto"/>
+        <w:ind w:left="0" w:right="0" w:firstLine="0"/>
+        <w:jc w:val="left"/>
+        <w:rPr/>
+      </w:pPr>
+      <w:r>
+        <w:rPr>
+          <w:rtl w:val="0"/>
+        </w:rPr>
+        <w:t xml:space="preserve">         +   C a t e g o r y I n f o                     :   N o t S p e c i f i e d :   ( 2 0 2 6 / 0 3 / 1 9   1 3 : 0 . . . i n g   t o   t r a n s f e r : S t r i n g )   [ ] ,   R e m o t e E x c e p t i o n </w:t>
+        <w:br w:type="textWrapping"/>
+        <w:t xml:space="preserve"> </w:t>
+      </w:r>
+    </w:p>
+    <w:p>
+      <w:pPr>
+        <w:keepNext w:val="0"/>
+        <w:keepLines w:val="0"/>
+        <w:pageBreakBefore w:val="0"/>
+        <w:widowControl w:val="0"/>
+        <w:pBdr>
+          <w:top w:space="0" w:sz="0" w:val="nil"/>
+          <w:left w:space="0" w:sz="0" w:val="nil"/>
+          <w:bottom w:space="0" w:sz="0" w:val="nil"/>
+          <w:right w:space="0" w:sz="0" w:val="nil"/>
+          <w:between w:space="0" w:sz="0" w:val="nil"/>
+        </w:pBdr>
+        <w:shd w:fill="auto" w:val="clear"/>
+        <w:spacing w:after="0" w:before="0" w:line="276" w:lineRule="auto"/>
+        <w:ind w:left="0" w:right="0" w:firstLine="0"/>
+        <w:jc w:val="left"/>
+        <w:rPr/>
+      </w:pPr>
+      <w:r>
+        <w:rPr>
+          <w:rtl w:val="0"/>
+        </w:rPr>
+        <w:t xml:space="preserve">         +   F u l l y Q u a l i f i e d E r r o r I d   :   N a t i v e C o m m a n d E r r o r </w:t>
+        <w:br w:type="textWrapping"/>
+        <w:t xml:space="preserve"> </w:t>
+      </w:r>
+    </w:p>
+    <w:p>
+      <w:pPr>
+        <w:keepNext w:val="0"/>
+        <w:keepLines w:val="0"/>
+        <w:pageBreakBefore w:val="0"/>
+        <w:widowControl w:val="0"/>
+        <w:pBdr>
+          <w:top w:space="0" w:sz="0" w:val="nil"/>
+          <w:left w:space="0" w:sz="0" w:val="nil"/>
+          <w:bottom w:space="0" w:sz="0" w:val="nil"/>
+          <w:right w:space="0" w:sz="0" w:val="nil"/>
+          <w:between w:space="0" w:sz="0" w:val="nil"/>
+        </w:pBdr>
+        <w:shd w:fill="auto" w:val="clear"/>
+        <w:spacing w:after="0" w:before="0" w:line="276" w:lineRule="auto"/>
+        <w:ind w:left="0" w:right="0" w:firstLine="0"/>
+        <w:jc w:val="left"/>
+        <w:rPr/>
+      </w:pPr>
+      <w:r>
+        <w:rPr>
+          <w:rtl w:val="0"/>
+        </w:rPr>
+        <w:t xml:space="preserve">   </w:t>
+        <w:br w:type="textWrapping"/>
+        <w:t xml:space="preserve"> </w:t>
+      </w:r>
+    </w:p>
+    <w:p>
+      <w:pPr>
+        <w:keepNext w:val="0"/>
+        <w:keepLines w:val="0"/>
+        <w:pageBreakBefore w:val="0"/>
+        <w:widowControl w:val="0"/>
+        <w:pBdr>
+          <w:top w:space="0" w:sz="0" w:val="nil"/>
+          <w:left w:space="0" w:sz="0" w:val="nil"/>
+          <w:bottom w:space="0" w:sz="0" w:val="nil"/>
+          <w:right w:space="0" w:sz="0" w:val="nil"/>
+          <w:between w:space="0" w:sz="0" w:val="nil"/>
+        </w:pBdr>
+        <w:shd w:fill="auto" w:val="clear"/>
+        <w:spacing w:after="0" w:before="0" w:line="276" w:lineRule="auto"/>
+        <w:ind w:left="0" w:right="0" w:firstLine="0"/>
+        <w:jc w:val="left"/>
+        <w:rPr/>
+      </w:pPr>
+      <w:r>
+        <w:rPr>
+          <w:rtl w:val="0"/>
+        </w:rPr>
+        <w:t xml:space="preserve"> 2 0 2 6 / 0 3 / 1 9   1 3 : 0 7 : 3 4   I N F O     :   </w:t>
+        <w:br w:type="textWrapping"/>
+        <w:t xml:space="preserve"> </w:t>
+      </w:r>
+    </w:p>
+    <w:p>
+      <w:pPr>
+        <w:keepNext w:val="0"/>
+        <w:keepLines w:val="0"/>
+        <w:pageBreakBefore w:val="0"/>
+        <w:widowControl w:val="0"/>
+        <w:pBdr>
+          <w:top w:space="0" w:sz="0" w:val="nil"/>
+          <w:left w:space="0" w:sz="0" w:val="nil"/>
+          <w:bottom w:space="0" w:sz="0" w:val="nil"/>
+          <w:right w:space="0" w:sz="0" w:val="nil"/>
+          <w:between w:space="0" w:sz="0" w:val="nil"/>
+        </w:pBdr>
+        <w:shd w:fill="auto" w:val="clear"/>
+        <w:spacing w:after="0" w:before="0" w:line="276" w:lineRule="auto"/>
+        <w:ind w:left="0" w:right="0" w:firstLine="0"/>
+        <w:jc w:val="left"/>
+        <w:rPr/>
+      </w:pPr>
+      <w:r>
+        <w:rPr>
+          <w:rtl w:val="0"/>
+        </w:rPr>
+        <w:t xml:space="preserve"> T r a n s f e r r e d :       </w:t>
+        <w:tab/>
+        <w:t xml:space="preserve">                     0   B   /   0   B ,   - ,   0   B / s ,   E T A   - </w:t>
+        <w:br w:type="textWrapping"/>
+        <w:t xml:space="preserve"> </w:t>
+      </w:r>
+    </w:p>
+    <w:p>
+      <w:pPr>
+        <w:keepNext w:val="0"/>
+        <w:keepLines w:val="0"/>
+        <w:pageBreakBefore w:val="0"/>
+        <w:widowControl w:val="0"/>
+        <w:pBdr>
+          <w:top w:space="0" w:sz="0" w:val="nil"/>
+          <w:left w:space="0" w:sz="0" w:val="nil"/>
+          <w:bottom w:space="0" w:sz="0" w:val="nil"/>
+          <w:right w:space="0" w:sz="0" w:val="nil"/>
+          <w:between w:space="0" w:sz="0" w:val="nil"/>
+        </w:pBdr>
+        <w:shd w:fill="auto" w:val="clear"/>
+        <w:spacing w:after="0" w:before="0" w:line="276" w:lineRule="auto"/>
+        <w:ind w:left="0" w:right="0" w:firstLine="0"/>
+        <w:jc w:val="left"/>
+        <w:rPr/>
+      </w:pPr>
+      <w:r>
+        <w:rPr>
+          <w:rtl w:val="0"/>
+        </w:rPr>
+        <w:t xml:space="preserve"> C h e c k s :                                   5   /   5 ,   1 0 0 % ,   L i s t e d   1 5 </w:t>
+        <w:br w:type="textWrapping"/>
+        <w:t xml:space="preserve"> </w:t>
+      </w:r>
+    </w:p>
+    <w:p>
+      <w:pPr>
+        <w:keepNext w:val="0"/>
+        <w:keepLines w:val="0"/>
+        <w:pageBreakBefore w:val="0"/>
+        <w:widowControl w:val="0"/>
+        <w:pBdr>
+          <w:top w:space="0" w:sz="0" w:val="nil"/>
+          <w:left w:space="0" w:sz="0" w:val="nil"/>
+          <w:bottom w:space="0" w:sz="0" w:val="nil"/>
+          <w:right w:space="0" w:sz="0" w:val="nil"/>
+          <w:between w:space="0" w:sz="0" w:val="nil"/>
+        </w:pBdr>
+        <w:shd w:fill="auto" w:val="clear"/>
+        <w:spacing w:after="0" w:before="0" w:line="276" w:lineRule="auto"/>
+        <w:ind w:left="0" w:right="0" w:firstLine="0"/>
+        <w:jc w:val="left"/>
+        <w:rPr/>
+      </w:pPr>
+      <w:r>
+        <w:rPr>
+          <w:rtl w:val="0"/>
+        </w:rPr>
+        <w:t xml:space="preserve"> E l a p s e d   t i m e :                   0 . 3 s </w:t>
+        <w:br w:type="textWrapping"/>
+        <w:t xml:space="preserve"> </w:t>
+      </w:r>
+    </w:p>
+    <w:p>
+      <w:pPr>
+        <w:keepNext w:val="0"/>
+        <w:keepLines w:val="0"/>
+        <w:pageBreakBefore w:val="0"/>
+        <w:widowControl w:val="0"/>
+        <w:pBdr>
+          <w:top w:space="0" w:sz="0" w:val="nil"/>
+          <w:left w:space="0" w:sz="0" w:val="nil"/>
+          <w:bottom w:space="0" w:sz="0" w:val="nil"/>
+          <w:right w:space="0" w:sz="0" w:val="nil"/>
+          <w:between w:space="0" w:sz="0" w:val="nil"/>
+        </w:pBdr>
+        <w:shd w:fill="auto" w:val="clear"/>
+        <w:spacing w:after="0" w:before="0" w:line="276" w:lineRule="auto"/>
+        <w:ind w:left="0" w:right="0" w:firstLine="0"/>
+        <w:jc w:val="left"/>
+        <w:rPr/>
+      </w:pPr>
+      <w:r>
+        <w:rPr>
+          <w:rtl w:val="0"/>
+        </w:rPr>
+        <w:t xml:space="preserve"> </w:t>
+        <w:br w:type="textWrapping"/>
+        <w:t xml:space="preserve"> </w:t>
+      </w:r>
+    </w:p>
+    <w:p>
+      <w:pPr>
+        <w:keepNext w:val="0"/>
+        <w:keepLines w:val="0"/>
+        <w:pageBreakBefore w:val="0"/>
+        <w:widowControl w:val="0"/>
+        <w:pBdr>
+          <w:top w:space="0" w:sz="0" w:val="nil"/>
+          <w:left w:space="0" w:sz="0" w:val="nil"/>
+          <w:bottom w:space="0" w:sz="0" w:val="nil"/>
+          <w:right w:space="0" w:sz="0" w:val="nil"/>
+          <w:between w:space="0" w:sz="0" w:val="nil"/>
+        </w:pBdr>
+        <w:shd w:fill="auto" w:val="clear"/>
+        <w:spacing w:after="0" w:before="0" w:line="276" w:lineRule="auto"/>
+        <w:ind w:left="0" w:right="0" w:firstLine="0"/>
+        <w:jc w:val="left"/>
+        <w:rPr/>
+      </w:pPr>
+      <w:r>
+        <w:rPr>
+          <w:rtl w:val="0"/>
+        </w:rPr>
+        <w:t xml:space="preserve"> r c l o n e . e x e   :   2 0 2 6 / 0 3 / 1 9   1 3 : 0 7 : 3 6   I N F O     :   T h e r e   w a s   n o t h i n g   t o   t r a n s f e r </w:t>
+        <w:br w:type="textWrapping"/>
+        <w:t xml:space="preserve"> </w:t>
+      </w:r>
+    </w:p>
+    <w:p>
+      <w:pPr>
+        <w:keepNext w:val="0"/>
+        <w:keepLines w:val="0"/>
+        <w:pageBreakBefore w:val="0"/>
+        <w:widowControl w:val="0"/>
+        <w:pBdr>
+          <w:top w:space="0" w:sz="0" w:val="nil"/>
+          <w:left w:space="0" w:sz="0" w:val="nil"/>
+          <w:bottom w:space="0" w:sz="0" w:val="nil"/>
+          <w:right w:space="0" w:sz="0" w:val="nil"/>
+          <w:between w:space="0" w:sz="0" w:val="nil"/>
+        </w:pBdr>
+        <w:shd w:fill="auto" w:val="clear"/>
+        <w:spacing w:after="0" w:before="0" w:line="276" w:lineRule="auto"/>
+        <w:ind w:left="0" w:right="0" w:firstLine="0"/>
+        <w:jc w:val="left"/>
+        <w:rPr/>
+      </w:pPr>
+      <w:r>
+        <w:rPr>
+          <w:rtl w:val="0"/>
+        </w:rPr>
+        <w:t xml:space="preserve"> A t   C : \ U s e r s \ S o u r c e - 1 \ D e s k t o p \ r c l o n e \ c o n d u i t _ s y n c . p s 1 : 4 7   c h a r : 1 </w:t>
+        <w:br w:type="textWrapping"/>
+        <w:t xml:space="preserve"> </w:t>
+      </w:r>
+    </w:p>
+    <w:p>
+      <w:pPr>
+        <w:keepNext w:val="0"/>
+        <w:keepLines w:val="0"/>
+        <w:pageBreakBefore w:val="0"/>
+        <w:widowControl w:val="0"/>
+        <w:pBdr>
+          <w:top w:space="0" w:sz="0" w:val="nil"/>
+          <w:left w:space="0" w:sz="0" w:val="nil"/>
+          <w:bottom w:space="0" w:sz="0" w:val="nil"/>
+          <w:right w:space="0" w:sz="0" w:val="nil"/>
+          <w:between w:space="0" w:sz="0" w:val="nil"/>
+        </w:pBdr>
+        <w:shd w:fill="auto" w:val="clear"/>
+        <w:spacing w:after="0" w:before="0" w:line="276" w:lineRule="auto"/>
+        <w:ind w:left="0" w:right="0" w:firstLine="0"/>
+        <w:jc w:val="left"/>
+        <w:rPr/>
+      </w:pPr>
+      <w:r>
+        <w:rPr>
+          <w:rtl w:val="0"/>
+        </w:rPr>
+        <w:t xml:space="preserve"> +   &amp;   $ r c l o n e   c o p y   - - f i l t e r - f r o m   $ f i l t e r   " $ s o u r c e R e p o r t s C o r e \ h a n d o f f s "   g d   . . . </w:t>
+        <w:br w:type="textWrapping"/>
+        <w:t xml:space="preserve"> </w:t>
+      </w:r>
+    </w:p>
+    <w:p>
+      <w:pPr>
+        <w:keepNext w:val="0"/>
+        <w:keepLines w:val="0"/>
+        <w:pageBreakBefore w:val="0"/>
+        <w:widowControl w:val="0"/>
+        <w:pBdr>
+          <w:top w:space="0" w:sz="0" w:val="nil"/>
+          <w:left w:space="0" w:sz="0" w:val="nil"/>
+          <w:bottom w:space="0" w:sz="0" w:val="nil"/>
+          <w:right w:space="0" w:sz="0" w:val="nil"/>
+          <w:between w:space="0" w:sz="0" w:val="nil"/>
+        </w:pBdr>
+        <w:shd w:fill="auto" w:val="clear"/>
+        <w:spacing w:after="0" w:before="0" w:line="276" w:lineRule="auto"/>
+        <w:ind w:left="0" w:right="0" w:firstLine="0"/>
+        <w:jc w:val="left"/>
+        <w:rPr/>
+      </w:pPr>
+      <w:r>
+        <w:rPr>
+          <w:rtl w:val="0"/>
+        </w:rPr>
+        <w:t xml:space="preserve"> +   ~ ~ ~ ~ ~ ~ ~ ~ ~ ~ ~ ~ ~ ~ ~ ~ ~ ~ ~ ~ ~ ~ ~ ~ ~ ~ ~ ~ ~ ~ ~ ~ ~ ~ ~ ~ ~ ~ ~ ~ ~ ~ ~ ~ ~ ~ ~ ~ ~ ~ ~ ~ ~ ~ ~ ~ ~ ~ ~ ~ ~ ~ ~ ~ ~ ~ ~ ~ ~ </w:t>
+        <w:br w:type="textWrapping"/>
+        <w:t xml:space="preserve"> </w:t>
+      </w:r>
+    </w:p>
+    <w:p>
+      <w:pPr>
+        <w:keepNext w:val="0"/>
+        <w:keepLines w:val="0"/>
+        <w:pageBreakBefore w:val="0"/>
+        <w:widowControl w:val="0"/>
+        <w:pBdr>
+          <w:top w:space="0" w:sz="0" w:val="nil"/>
+          <w:left w:space="0" w:sz="0" w:val="nil"/>
+          <w:bottom w:space="0" w:sz="0" w:val="nil"/>
+          <w:right w:space="0" w:sz="0" w:val="nil"/>
+          <w:between w:space="0" w:sz="0" w:val="nil"/>
+        </w:pBdr>
+        <w:shd w:fill="auto" w:val="clear"/>
+        <w:spacing w:after="0" w:before="0" w:line="276" w:lineRule="auto"/>
+        <w:ind w:left="0" w:right="0" w:firstLine="0"/>
+        <w:jc w:val="left"/>
+        <w:rPr/>
+      </w:pPr>
+      <w:r>
+        <w:rPr>
+          <w:rtl w:val="0"/>
+        </w:rPr>
+        <w:t xml:space="preserve">         +   C a t e g o r y I n f o                     :   N o t S p e c i f i e d :   ( 2 0 2 6 / 0 3 / 1 9   1 3 : 0 . . . i n g   t o   t r a n s f e r : S t r i n g )   [ ] ,   R e m o t e E x c e p t i o n </w:t>
+        <w:br w:type="textWrapping"/>
+        <w:t xml:space="preserve"> </w:t>
+      </w:r>
+    </w:p>
+    <w:p>
+      <w:pPr>
+        <w:keepNext w:val="0"/>
+        <w:keepLines w:val="0"/>
+        <w:pageBreakBefore w:val="0"/>
+        <w:widowControl w:val="0"/>
+        <w:pBdr>
+          <w:top w:space="0" w:sz="0" w:val="nil"/>
+          <w:left w:space="0" w:sz="0" w:val="nil"/>
+          <w:bottom w:space="0" w:sz="0" w:val="nil"/>
+          <w:right w:space="0" w:sz="0" w:val="nil"/>
+          <w:between w:space="0" w:sz="0" w:val="nil"/>
+        </w:pBdr>
+        <w:shd w:fill="auto" w:val="clear"/>
+        <w:spacing w:after="0" w:before="0" w:line="276" w:lineRule="auto"/>
+        <w:ind w:left="0" w:right="0" w:firstLine="0"/>
+        <w:jc w:val="left"/>
+        <w:rPr/>
+      </w:pPr>
+      <w:r>
+        <w:rPr>
+          <w:rtl w:val="0"/>
+        </w:rPr>
+        <w:t xml:space="preserve">         +   F u l l y Q u a l i f i e d E r r o r I d   :   N a t i v e C o m m a n d E r r o r </w:t>
+        <w:br w:type="textWrapping"/>
+        <w:t xml:space="preserve"> </w:t>
+      </w:r>
+    </w:p>
+    <w:p>
+      <w:pPr>
+        <w:keepNext w:val="0"/>
+        <w:keepLines w:val="0"/>
+        <w:pageBreakBefore w:val="0"/>
+        <w:widowControl w:val="0"/>
+        <w:pBdr>
+          <w:top w:space="0" w:sz="0" w:val="nil"/>
+          <w:left w:space="0" w:sz="0" w:val="nil"/>
+          <w:bottom w:space="0" w:sz="0" w:val="nil"/>
+          <w:right w:space="0" w:sz="0" w:val="nil"/>
+          <w:between w:space="0" w:sz="0" w:val="nil"/>
+        </w:pBdr>
+        <w:shd w:fill="auto" w:val="clear"/>
+        <w:spacing w:after="0" w:before="0" w:line="276" w:lineRule="auto"/>
+        <w:ind w:left="0" w:right="0" w:firstLine="0"/>
+        <w:jc w:val="left"/>
+        <w:rPr/>
+      </w:pPr>
+      <w:r>
+        <w:rPr>
+          <w:rtl w:val="0"/>
+        </w:rPr>
+        <w:t xml:space="preserve">   </w:t>
+        <w:br w:type="textWrapping"/>
+        <w:t xml:space="preserve"> </w:t>
+      </w:r>
+    </w:p>
+    <w:p>
+      <w:pPr>
+        <w:keepNext w:val="0"/>
+        <w:keepLines w:val="0"/>
+        <w:pageBreakBefore w:val="0"/>
+        <w:widowControl w:val="0"/>
+        <w:pBdr>
+          <w:top w:space="0" w:sz="0" w:val="nil"/>
+          <w:left w:space="0" w:sz="0" w:val="nil"/>
+          <w:bottom w:space="0" w:sz="0" w:val="nil"/>
+          <w:right w:space="0" w:sz="0" w:val="nil"/>
+          <w:between w:space="0" w:sz="0" w:val="nil"/>
+        </w:pBdr>
+        <w:shd w:fill="auto" w:val="clear"/>
+        <w:spacing w:after="0" w:before="0" w:line="276" w:lineRule="auto"/>
+        <w:ind w:left="0" w:right="0" w:firstLine="0"/>
+        <w:jc w:val="left"/>
+        <w:rPr/>
+      </w:pPr>
+      <w:r>
+        <w:rPr>
+          <w:rtl w:val="0"/>
+        </w:rPr>
+        <w:t xml:space="preserve"> 2 0 2 6 / 0 3 / 1 9   1 3 : 0 7 : 3 6   I N F O     :   </w:t>
+        <w:br w:type="textWrapping"/>
+        <w:t xml:space="preserve"> </w:t>
+      </w:r>
+    </w:p>
+    <w:p>
+      <w:pPr>
+        <w:keepNext w:val="0"/>
+        <w:keepLines w:val="0"/>
+        <w:pageBreakBefore w:val="0"/>
+        <w:widowControl w:val="0"/>
+        <w:pBdr>
+          <w:top w:space="0" w:sz="0" w:val="nil"/>
+          <w:left w:space="0" w:sz="0" w:val="nil"/>
+          <w:bottom w:space="0" w:sz="0" w:val="nil"/>
+          <w:right w:space="0" w:sz="0" w:val="nil"/>
+          <w:between w:space="0" w:sz="0" w:val="nil"/>
+        </w:pBdr>
+        <w:shd w:fill="auto" w:val="clear"/>
+        <w:spacing w:after="0" w:before="0" w:line="276" w:lineRule="auto"/>
+        <w:ind w:left="0" w:right="0" w:firstLine="0"/>
+        <w:jc w:val="left"/>
+        <w:rPr/>
+      </w:pPr>
+      <w:r>
+        <w:rPr>
+          <w:rtl w:val="0"/>
+        </w:rPr>
+        <w:t xml:space="preserve"> T r a n s f e r r e d :       </w:t>
+        <w:tab/>
+        <w:t xml:space="preserve">                     0   B   /   0   B ,   - ,   0   B / s ,   E T A   - </w:t>
+        <w:br w:type="textWrapping"/>
+        <w:t xml:space="preserve"> </w:t>
+      </w:r>
+    </w:p>
+    <w:p>
+      <w:pPr>
+        <w:keepNext w:val="0"/>
+        <w:keepLines w:val="0"/>
+        <w:pageBreakBefore w:val="0"/>
+        <w:widowControl w:val="0"/>
+        <w:pBdr>
+          <w:top w:space="0" w:sz="0" w:val="nil"/>
+          <w:left w:space="0" w:sz="0" w:val="nil"/>
+          <w:bottom w:space="0" w:sz="0" w:val="nil"/>
+          <w:right w:space="0" w:sz="0" w:val="nil"/>
+          <w:between w:space="0" w:sz="0" w:val="nil"/>
+        </w:pBdr>
+        <w:shd w:fill="auto" w:val="clear"/>
+        <w:spacing w:after="0" w:before="0" w:line="276" w:lineRule="auto"/>
+        <w:ind w:left="0" w:right="0" w:firstLine="0"/>
+        <w:jc w:val="left"/>
+        <w:rPr/>
+      </w:pPr>
+      <w:r>
+        <w:rPr>
+          <w:rtl w:val="0"/>
+        </w:rPr>
+        <w:t xml:space="preserve"> C h e c k s :                                   1   /   1 ,   1 0 0 % ,   L i s t e d   3 </w:t>
+        <w:br w:type="textWrapping"/>
+        <w:t xml:space="preserve"> </w:t>
+      </w:r>
+    </w:p>
+    <w:p>
+      <w:pPr>
+        <w:keepNext w:val="0"/>
+        <w:keepLines w:val="0"/>
+        <w:pageBreakBefore w:val="0"/>
+        <w:widowControl w:val="0"/>
+        <w:pBdr>
+          <w:top w:space="0" w:sz="0" w:val="nil"/>
+          <w:left w:space="0" w:sz="0" w:val="nil"/>
+          <w:bottom w:space="0" w:sz="0" w:val="nil"/>
+          <w:right w:space="0" w:sz="0" w:val="nil"/>
+          <w:between w:space="0" w:sz="0" w:val="nil"/>
+        </w:pBdr>
+        <w:shd w:fill="auto" w:val="clear"/>
+        <w:spacing w:after="0" w:before="0" w:line="276" w:lineRule="auto"/>
+        <w:ind w:left="0" w:right="0" w:firstLine="0"/>
+        <w:jc w:val="left"/>
+        <w:rPr/>
+      </w:pPr>
+      <w:r>
+        <w:rPr>
+          <w:rtl w:val="0"/>
+        </w:rPr>
+        <w:t xml:space="preserve"> E l a p s e d   t i m e :                   0 . 2 s </w:t>
+        <w:br w:type="textWrapping"/>
+        <w:t xml:space="preserve"> </w:t>
+      </w:r>
+    </w:p>
+    <w:p>
+      <w:pPr>
+        <w:keepNext w:val="0"/>
+        <w:keepLines w:val="0"/>
+        <w:pageBreakBefore w:val="0"/>
+        <w:widowControl w:val="0"/>
+        <w:pBdr>
+          <w:top w:space="0" w:sz="0" w:val="nil"/>
+          <w:left w:space="0" w:sz="0" w:val="nil"/>
+          <w:bottom w:space="0" w:sz="0" w:val="nil"/>
+          <w:right w:space="0" w:sz="0" w:val="nil"/>
+          <w:between w:space="0" w:sz="0" w:val="nil"/>
+        </w:pBdr>
+        <w:shd w:fill="auto" w:val="clear"/>
+        <w:spacing w:after="0" w:before="0" w:line="276" w:lineRule="auto"/>
+        <w:ind w:left="0" w:right="0" w:firstLine="0"/>
+        <w:jc w:val="left"/>
+        <w:rPr/>
+      </w:pPr>
+      <w:r>
+        <w:rPr>
+          <w:rtl w:val="0"/>
+        </w:rPr>
+        <w:t xml:space="preserve"> </w:t>
+        <w:br w:type="textWrapping"/>
+        <w:t xml:space="preserve"> </w:t>
+      </w:r>
+    </w:p>
+    <w:p>
+      <w:pPr>
+        <w:keepNext w:val="0"/>
+        <w:keepLines w:val="0"/>
+        <w:pageBreakBefore w:val="0"/>
+        <w:widowControl w:val="0"/>
+        <w:pBdr>
+          <w:top w:space="0" w:sz="0" w:val="nil"/>
+          <w:left w:space="0" w:sz="0" w:val="nil"/>
+          <w:bottom w:space="0" w:sz="0" w:val="nil"/>
+          <w:right w:space="0" w:sz="0" w:val="nil"/>
+          <w:between w:space="0" w:sz="0" w:val="nil"/>
+        </w:pBdr>
+        <w:shd w:fill="auto" w:val="clear"/>
+        <w:spacing w:after="0" w:before="0" w:line="276" w:lineRule="auto"/>
+        <w:ind w:left="0" w:right="0" w:firstLine="0"/>
+        <w:jc w:val="left"/>
+        <w:rPr/>
+      </w:pPr>
+      <w:r>
+        <w:rPr>
+          <w:rtl w:val="0"/>
+        </w:rPr>
+        <w:t xml:space="preserve"> [Stage 5] Core reports sync complete</w:t>
+        <w:br w:type="textWrapping"/>
+      </w:r>
+    </w:p>
+    <w:p>
+      <w:pPr>
+        <w:keepNext w:val="0"/>
+        <w:keepLines w:val="0"/>
+        <w:pageBreakBefore w:val="0"/>
+        <w:widowControl w:val="0"/>
+        <w:pBdr>
+          <w:top w:space="0" w:sz="0" w:val="nil"/>
+          <w:left w:space="0" w:sz="0" w:val="nil"/>
+          <w:bottom w:space="0" w:sz="0" w:val="nil"/>
+          <w:right w:space="0" w:sz="0" w:val="nil"/>
+          <w:between w:space="0" w:sz="0" w:val="nil"/>
+        </w:pBdr>
+        <w:shd w:fill="auto" w:val="clear"/>
+        <w:spacing w:after="0" w:before="0" w:line="276" w:lineRule="auto"/>
+        <w:ind w:left="0" w:right="0" w:firstLine="0"/>
+        <w:jc w:val="left"/>
+        <w:rPr/>
+      </w:pPr>
+      <w:r>
+        <w:rPr>
+          <w:rtl w:val="0"/>
+        </w:rPr>
+        <w:t xml:space="preserve">r c l o n e . e x e   :   2 0 2 6 / 0 3 / 1 9   1 3 : 0 7 : 3 7   I N F O     :   T h e r e   w a s   n o t h i n g   t o   t r a n s f e r </w:t>
+        <w:br w:type="textWrapping"/>
+        <w:t xml:space="preserve"> </w:t>
+      </w:r>
+    </w:p>
+    <w:p>
+      <w:pPr>
+        <w:keepNext w:val="0"/>
+        <w:keepLines w:val="0"/>
+        <w:pageBreakBefore w:val="0"/>
+        <w:widowControl w:val="0"/>
+        <w:pBdr>
+          <w:top w:space="0" w:sz="0" w:val="nil"/>
+          <w:left w:space="0" w:sz="0" w:val="nil"/>
+          <w:bottom w:space="0" w:sz="0" w:val="nil"/>
+          <w:right w:space="0" w:sz="0" w:val="nil"/>
+          <w:between w:space="0" w:sz="0" w:val="nil"/>
+        </w:pBdr>
+        <w:shd w:fill="auto" w:val="clear"/>
+        <w:spacing w:after="0" w:before="0" w:line="276" w:lineRule="auto"/>
+        <w:ind w:left="0" w:right="0" w:firstLine="0"/>
+        <w:jc w:val="left"/>
+        <w:rPr/>
+      </w:pPr>
+      <w:r>
+        <w:rPr>
+          <w:rtl w:val="0"/>
+        </w:rPr>
+        <w:t xml:space="preserve"> A t   C : \ U s e r s \ S o u r c e - 1 \ D e s k t o p \ r c l o n e \ c o n d u i t _ s y n c . p s 1 : 5 1   c h a r : 1 </w:t>
+        <w:br w:type="textWrapping"/>
+        <w:t xml:space="preserve"> </w:t>
+      </w:r>
+    </w:p>
+    <w:p>
+      <w:pPr>
+        <w:keepNext w:val="0"/>
+        <w:keepLines w:val="0"/>
+        <w:pageBreakBefore w:val="0"/>
+        <w:widowControl w:val="0"/>
+        <w:pBdr>
+          <w:top w:space="0" w:sz="0" w:val="nil"/>
+          <w:left w:space="0" w:sz="0" w:val="nil"/>
+          <w:bottom w:space="0" w:sz="0" w:val="nil"/>
+          <w:right w:space="0" w:sz="0" w:val="nil"/>
+          <w:between w:space="0" w:sz="0" w:val="nil"/>
+        </w:pBdr>
+        <w:shd w:fill="auto" w:val="clear"/>
+        <w:spacing w:after="0" w:before="0" w:line="276" w:lineRule="auto"/>
+        <w:ind w:left="0" w:right="0" w:firstLine="0"/>
+        <w:jc w:val="left"/>
+        <w:rPr/>
+      </w:pPr>
+      <w:r>
+        <w:rPr>
+          <w:rtl w:val="0"/>
+        </w:rPr>
+        <w:t xml:space="preserve"> +   &amp;   $ r c l o n e   c o p y   - - f i l t e r - f r o m   $ f i l t e r   " $ s o u r c e F r a m e w o r k s \ c u r r e n t "   g d r i   . . . </w:t>
+        <w:br w:type="textWrapping"/>
+        <w:t xml:space="preserve"> </w:t>
+      </w:r>
+    </w:p>
+    <w:p>
+      <w:pPr>
+        <w:keepNext w:val="0"/>
+        <w:keepLines w:val="0"/>
+        <w:pageBreakBefore w:val="0"/>
+        <w:widowControl w:val="0"/>
+        <w:pBdr>
+          <w:top w:space="0" w:sz="0" w:val="nil"/>
+          <w:left w:space="0" w:sz="0" w:val="nil"/>
+          <w:bottom w:space="0" w:sz="0" w:val="nil"/>
+          <w:right w:space="0" w:sz="0" w:val="nil"/>
+          <w:between w:space="0" w:sz="0" w:val="nil"/>
+        </w:pBdr>
+        <w:shd w:fill="auto" w:val="clear"/>
+        <w:spacing w:after="0" w:before="0" w:line="276" w:lineRule="auto"/>
+        <w:ind w:left="0" w:right="0" w:firstLine="0"/>
+        <w:jc w:val="left"/>
+        <w:rPr/>
+      </w:pPr>
+      <w:r>
+        <w:rPr>
+          <w:rtl w:val="0"/>
+        </w:rPr>
+        <w:t xml:space="preserve"> +   ~ ~ ~ ~ ~ ~ ~ ~ ~ ~ ~ ~ ~ ~ ~ ~ ~ ~ ~ ~ ~ ~ ~ ~ ~ ~ ~ ~ ~ ~ ~ ~ ~ ~ ~ ~ ~ ~ ~ ~ ~ ~ ~ ~ ~ ~ ~ ~ ~ ~ ~ ~ ~ ~ ~ ~ ~ ~ ~ ~ ~ ~ ~ ~ ~ ~ ~ ~ ~ </w:t>
+        <w:br w:type="textWrapping"/>
+        <w:t xml:space="preserve"> </w:t>
+      </w:r>
+    </w:p>
+    <w:p>
+      <w:pPr>
+        <w:keepNext w:val="0"/>
+        <w:keepLines w:val="0"/>
+        <w:pageBreakBefore w:val="0"/>
+        <w:widowControl w:val="0"/>
+        <w:pBdr>
+          <w:top w:space="0" w:sz="0" w:val="nil"/>
+          <w:left w:space="0" w:sz="0" w:val="nil"/>
+          <w:bottom w:space="0" w:sz="0" w:val="nil"/>
+          <w:right w:space="0" w:sz="0" w:val="nil"/>
+          <w:between w:space="0" w:sz="0" w:val="nil"/>
+        </w:pBdr>
+        <w:shd w:fill="auto" w:val="clear"/>
+        <w:spacing w:after="0" w:before="0" w:line="276" w:lineRule="auto"/>
+        <w:ind w:left="0" w:right="0" w:firstLine="0"/>
+        <w:jc w:val="left"/>
+        <w:rPr/>
+      </w:pPr>
+      <w:r>
+        <w:rPr>
+          <w:rtl w:val="0"/>
+        </w:rPr>
+        <w:t xml:space="preserve">         +   C a t e g o r y I n f o                     :   N o t S p e c i f i e d :   ( 2 0 2 6 / 0 3 / 1 9   1 3 : 0 . . . i n g   t o   t r a n s f e r : S t r i n g )   [ ] ,   R e m o t e E x c e p t i o n </w:t>
+        <w:br w:type="textWrapping"/>
+        <w:t xml:space="preserve"> </w:t>
+      </w:r>
+    </w:p>
+    <w:p>
+      <w:pPr>
+        <w:keepNext w:val="0"/>
+        <w:keepLines w:val="0"/>
+        <w:pageBreakBefore w:val="0"/>
+        <w:widowControl w:val="0"/>
+        <w:pBdr>
+          <w:top w:space="0" w:sz="0" w:val="nil"/>
+          <w:left w:space="0" w:sz="0" w:val="nil"/>
+          <w:bottom w:space="0" w:sz="0" w:val="nil"/>
+          <w:right w:space="0" w:sz="0" w:val="nil"/>
+          <w:between w:space="0" w:sz="0" w:val="nil"/>
+        </w:pBdr>
+        <w:shd w:fill="auto" w:val="clear"/>
+        <w:spacing w:after="0" w:before="0" w:line="276" w:lineRule="auto"/>
+        <w:ind w:left="0" w:right="0" w:firstLine="0"/>
+        <w:jc w:val="left"/>
+        <w:rPr/>
+      </w:pPr>
+      <w:r>
+        <w:rPr>
+          <w:rtl w:val="0"/>
+        </w:rPr>
+        <w:t xml:space="preserve">         +   F u l l y Q u a l i f i e d E r r o r I d   :   N a t i v e C o m m a n d E r r o r </w:t>
+        <w:br w:type="textWrapping"/>
+        <w:t xml:space="preserve"> </w:t>
+      </w:r>
+    </w:p>
+    <w:p>
+      <w:pPr>
+        <w:keepNext w:val="0"/>
+        <w:keepLines w:val="0"/>
+        <w:pageBreakBefore w:val="0"/>
+        <w:widowControl w:val="0"/>
+        <w:pBdr>
+          <w:top w:space="0" w:sz="0" w:val="nil"/>
+          <w:left w:space="0" w:sz="0" w:val="nil"/>
+          <w:bottom w:space="0" w:sz="0" w:val="nil"/>
+          <w:right w:space="0" w:sz="0" w:val="nil"/>
+          <w:between w:space="0" w:sz="0" w:val="nil"/>
+        </w:pBdr>
+        <w:shd w:fill="auto" w:val="clear"/>
+        <w:spacing w:after="0" w:before="0" w:line="276" w:lineRule="auto"/>
+        <w:ind w:left="0" w:right="0" w:firstLine="0"/>
+        <w:jc w:val="left"/>
+        <w:rPr/>
+      </w:pPr>
+      <w:r>
+        <w:rPr>
+          <w:rtl w:val="0"/>
+        </w:rPr>
+        <w:t xml:space="preserve">   </w:t>
+        <w:br w:type="textWrapping"/>
+        <w:t xml:space="preserve"> </w:t>
+      </w:r>
+    </w:p>
+    <w:p>
+      <w:pPr>
+        <w:keepNext w:val="0"/>
+        <w:keepLines w:val="0"/>
+        <w:pageBreakBefore w:val="0"/>
+        <w:widowControl w:val="0"/>
+        <w:pBdr>
+          <w:top w:space="0" w:sz="0" w:val="nil"/>
+          <w:left w:space="0" w:sz="0" w:val="nil"/>
+          <w:bottom w:space="0" w:sz="0" w:val="nil"/>
+          <w:right w:space="0" w:sz="0" w:val="nil"/>
+          <w:between w:space="0" w:sz="0" w:val="nil"/>
+        </w:pBdr>
+        <w:shd w:fill="auto" w:val="clear"/>
+        <w:spacing w:after="0" w:before="0" w:line="276" w:lineRule="auto"/>
+        <w:ind w:left="0" w:right="0" w:firstLine="0"/>
+        <w:jc w:val="left"/>
+        <w:rPr/>
+      </w:pPr>
+      <w:r>
+        <w:rPr>
+          <w:rtl w:val="0"/>
+        </w:rPr>
+        <w:t xml:space="preserve"> 2 0 2 6 / 0 3 / 1 9   1 3 : 0 7 : 3 7   I N F O     :   </w:t>
         <w:br w:type="textWrapping"/>
         <w:t xml:space="preserve"> </w:t>
       </w:r>

</xml_diff>